<commit_message>
docs: adiciona link do repositorio na capa, abaixo do nome do autor
Link clicavel do GitHub inserido sob o nome na capa para acesso imediato
do professor. Ajuste de espacamento mantem a capa em pagina unica (27 pags).
</commit_message>
<xml_diff>
--- a/SolucaoClinicaTEA/relatorio_final.docx
+++ b/SolucaoClinicaTEA/relatorio_final.docx
@@ -65,7 +65,18 @@
     <w:p>
       <w:pPr>
         <w:spacing w:after="0" w:line="360" w:lineRule="auto"/>
-      </w:pPr>
+        <w:jc w:val="center"/>
+      </w:pPr>
+      <w:hyperlink r:id="rId7" w:history="1">
+        <w:r>
+          <w:rPr>
+            <w:rFonts w:ascii="Times New Roman" w:hAnsi="Times New Roman" w:cs="Times New Roman"/>
+            <w:color w:val="0563C1"/>
+            <w:u w:val="single"/>
+          </w:rPr>
+          <w:t>https://github.com/JVissani/SolucaoClinicaTEA</w:t>
+        </w:r>
+      </w:hyperlink>
     </w:p>
     <w:p>
       <w:pPr>
@@ -419,7 +430,7 @@
         <w:jc w:val="center"/>
         <w:outlineLvl w:val="0"/>
       </w:pPr>
-      <w:bookmarkStart w:id="0" w:name="_Toc230984064"/>
+      <w:bookmarkStart w:id="0" w:name="_Toc231037129"/>
       <w:r>
         <w:rPr>
           <w:rFonts w:ascii="Times New Roman" w:hAnsi="Times New Roman" w:cs="Times New Roman"/>
@@ -444,23 +455,7 @@
           <w:sz w:val="24"/>
           <w:szCs w:val="24"/>
         </w:rPr>
-        <w:t xml:space="preserve">Este trabalho apresenta o ClinicaTEA, um sistema desktop de gestão clínica voltado a clínicas e centros terapêuticos especializados no atendimento ao Transtorno do Espectro Autista (TEA). O objetivo é substituir controles fragmentados em planilhas e agendas de papel por uma solução integrada que cubra o ciclo completo do atendimento: cadastro de pacientes com dados clínicos específicos do TEA, agendamento com verificação automática de conflitos, registro de evoluções de sessão e acompanhamento de objetivos </w:t>
-      </w:r>
-      <w:r>
-        <w:rPr>
-          <w:rFonts w:ascii="Times New Roman" w:hAnsi="Times New Roman" w:cs="Times New Roman"/>
-          <w:sz w:val="24"/>
-          <w:szCs w:val="24"/>
-        </w:rPr>
-        <w:t>terapêuticos por especialidade. O sistema foi desenvolvido em C# com .NET Framework 4.7.2 e interface Windows Forms, utilizando o micro-ORM Dapper sobre banco de dados Microsoft SQL Server Express, organizado em duas camadas independentes (negócio e apresentação). Entre os resultados, destacam-se o controle de acesso por perfis com senhas protegidas por hash SHA-256, a regra de bloqueio de conflitos de horário entre profissionais e salas, o registro estruturado de evoluções vinculadas a sessões realizadas e</w:t>
-      </w:r>
-      <w:r>
-        <w:rPr>
-          <w:rFonts w:ascii="Times New Roman" w:hAnsi="Times New Roman" w:cs="Times New Roman"/>
-          <w:sz w:val="24"/>
-          <w:szCs w:val="24"/>
-        </w:rPr>
-        <w:t xml:space="preserve"> um módulo de relatórios com sete análises gerenciais e impressão paginada. Conclui-se que a solução oferece às clínicas de pequeno e médio porte uma ferramenta confiável, de uso local e adequada à sensibilidade dos dados clínicos, apoiando tanto a operação diária quanto a tomada de decisão gerencial.</w:t>
+        <w:t>Este trabalho apresenta o ClinicaTEA, um sistema desktop de gestão clínica voltado a clínicas e centros terapêuticos especializados no atendimento ao Transtorno do Espectro Autista (TEA). O objetivo é substituir controles fragmentados em planilhas e agendas de papel por uma solução integrada que cubra o ciclo completo do atendimento: cadastro de pacientes com dados clínicos específicos do TEA, agendamento com verificação automática de conflitos, registro de evoluções de sessão e acompanhamento de objetivos terapêuticos por especialidade. O sistema foi desenvolvido em C# com .NET Framework 4.7.2 e interface Windows Forms, utilizando o micro-ORM Dapper sobre banco de dados Microsoft SQL Server Express, organizado em duas camadas independentes (negócio e apresentação). Entre os resultados, destacam-se o controle de acesso por perfis com senhas protegidas por hash SHA-256, a regra de bloqueio de conflitos de horário entre profissionais e salas, o registro estruturado de evoluções vinculadas a sessões realizadas e um módulo de relatórios com sete análises gerenciais e impressão paginada. Conclui-se que a solução oferece às clínicas de pequeno e médio porte uma ferramenta confiável, de uso local e adequada à sensibilidade dos dados clínicos, apoiando tanto a operação diária quanto a tomada de decisão gerencial.</w:t>
       </w:r>
     </w:p>
     <w:p>
@@ -498,7 +493,7 @@
         <w:jc w:val="center"/>
         <w:outlineLvl w:val="0"/>
       </w:pPr>
-      <w:bookmarkStart w:id="1" w:name="_Toc230984065"/>
+      <w:bookmarkStart w:id="1" w:name="_Toc231037130"/>
       <w:r>
         <w:rPr>
           <w:rFonts w:ascii="Times New Roman" w:hAnsi="Times New Roman" w:cs="Times New Roman"/>
@@ -535,7 +530,7 @@
       <w:r>
         <w:fldChar w:fldCharType="separate"/>
       </w:r>
-      <w:hyperlink w:anchor="_Toc230984064" w:history="1">
+      <w:hyperlink w:anchor="_Toc231037129" w:history="1">
         <w:r>
           <w:rPr>
             <w:rStyle w:val="Hyperlink"/>
@@ -565,7 +560,7 @@
             <w:noProof/>
             <w:webHidden/>
           </w:rPr>
-          <w:instrText xml:space="preserve"> PAGEREF _Toc230984064 \h </w:instrText>
+          <w:instrText xml:space="preserve"> PAGEREF _Toc231037129 \h </w:instrText>
         </w:r>
         <w:r>
           <w:rPr>
@@ -610,7 +605,7 @@
           <w:lang w:eastAsia="pt-BR"/>
         </w:rPr>
       </w:pPr>
-      <w:hyperlink w:anchor="_Toc230984065" w:history="1">
+      <w:hyperlink w:anchor="_Toc231037130" w:history="1">
         <w:r>
           <w:rPr>
             <w:rStyle w:val="Hyperlink"/>
@@ -640,7 +635,7 @@
             <w:noProof/>
             <w:webHidden/>
           </w:rPr>
-          <w:instrText xml:space="preserve"> PAGEREF _Toc230984065 \h </w:instrText>
+          <w:instrText xml:space="preserve"> PAGEREF _Toc231037130 \h </w:instrText>
         </w:r>
         <w:r>
           <w:rPr>
@@ -685,7 +680,7 @@
           <w:lang w:eastAsia="pt-BR"/>
         </w:rPr>
       </w:pPr>
-      <w:hyperlink w:anchor="_Toc230984066" w:history="1">
+      <w:hyperlink w:anchor="_Toc231037131" w:history="1">
         <w:r>
           <w:rPr>
             <w:rStyle w:val="Hyperlink"/>
@@ -715,7 +710,7 @@
             <w:noProof/>
             <w:webHidden/>
           </w:rPr>
-          <w:instrText xml:space="preserve"> PAGEREF _Toc230984066 \h </w:instrText>
+          <w:instrText xml:space="preserve"> PAGEREF _Toc231037131 \h </w:instrText>
         </w:r>
         <w:r>
           <w:rPr>
@@ -760,7 +755,7 @@
           <w:lang w:eastAsia="pt-BR"/>
         </w:rPr>
       </w:pPr>
-      <w:hyperlink w:anchor="_Toc230984067" w:history="1">
+      <w:hyperlink w:anchor="_Toc231037132" w:history="1">
         <w:r>
           <w:rPr>
             <w:rStyle w:val="Hyperlink"/>
@@ -790,7 +785,7 @@
             <w:noProof/>
             <w:webHidden/>
           </w:rPr>
-          <w:instrText xml:space="preserve"> PAGEREF _Toc230984067 \h </w:instrText>
+          <w:instrText xml:space="preserve"> PAGEREF _Toc231037132 \h </w:instrText>
         </w:r>
         <w:r>
           <w:rPr>
@@ -835,7 +830,7 @@
           <w:lang w:eastAsia="pt-BR"/>
         </w:rPr>
       </w:pPr>
-      <w:hyperlink w:anchor="_Toc230984068" w:history="1">
+      <w:hyperlink w:anchor="_Toc231037133" w:history="1">
         <w:r>
           <w:rPr>
             <w:rStyle w:val="Hyperlink"/>
@@ -864,7 +859,7 @@
             <w:noProof/>
             <w:webHidden/>
           </w:rPr>
-          <w:instrText xml:space="preserve"> PAGEREF _Toc230984068 \h </w:instrText>
+          <w:instrText xml:space="preserve"> PAGEREF _Toc231037133 \h </w:instrText>
         </w:r>
         <w:r>
           <w:rPr>
@@ -909,7 +904,7 @@
           <w:lang w:eastAsia="pt-BR"/>
         </w:rPr>
       </w:pPr>
-      <w:hyperlink w:anchor="_Toc230984069" w:history="1">
+      <w:hyperlink w:anchor="_Toc231037134" w:history="1">
         <w:r>
           <w:rPr>
             <w:rStyle w:val="Hyperlink"/>
@@ -938,7 +933,7 @@
             <w:noProof/>
             <w:webHidden/>
           </w:rPr>
-          <w:instrText xml:space="preserve"> PAGEREF _Toc230984069 \h </w:instrText>
+          <w:instrText xml:space="preserve"> PAGEREF _Toc231037134 \h </w:instrText>
         </w:r>
         <w:r>
           <w:rPr>
@@ -983,7 +978,7 @@
           <w:lang w:eastAsia="pt-BR"/>
         </w:rPr>
       </w:pPr>
-      <w:hyperlink w:anchor="_Toc230984070" w:history="1">
+      <w:hyperlink w:anchor="_Toc231037135" w:history="1">
         <w:r>
           <w:rPr>
             <w:rStyle w:val="Hyperlink"/>
@@ -1012,7 +1007,7 @@
             <w:noProof/>
             <w:webHidden/>
           </w:rPr>
-          <w:instrText xml:space="preserve"> PAGEREF _Toc230984070 \h </w:instrText>
+          <w:instrText xml:space="preserve"> PAGEREF _Toc231037135 \h </w:instrText>
         </w:r>
         <w:r>
           <w:rPr>
@@ -1057,7 +1052,7 @@
           <w:lang w:eastAsia="pt-BR"/>
         </w:rPr>
       </w:pPr>
-      <w:hyperlink w:anchor="_Toc230984071" w:history="1">
+      <w:hyperlink w:anchor="_Toc231037136" w:history="1">
         <w:r>
           <w:rPr>
             <w:rStyle w:val="Hyperlink"/>
@@ -1086,7 +1081,7 @@
             <w:noProof/>
             <w:webHidden/>
           </w:rPr>
-          <w:instrText xml:space="preserve"> PAGEREF _Toc230984071 \h </w:instrText>
+          <w:instrText xml:space="preserve"> PAGEREF _Toc231037136 \h </w:instrText>
         </w:r>
         <w:r>
           <w:rPr>
@@ -1131,7 +1126,7 @@
           <w:lang w:eastAsia="pt-BR"/>
         </w:rPr>
       </w:pPr>
-      <w:hyperlink w:anchor="_Toc230984072" w:history="1">
+      <w:hyperlink w:anchor="_Toc231037137" w:history="1">
         <w:r>
           <w:rPr>
             <w:rStyle w:val="Hyperlink"/>
@@ -1160,7 +1155,7 @@
             <w:noProof/>
             <w:webHidden/>
           </w:rPr>
-          <w:instrText xml:space="preserve"> PAGEREF _Toc230984072 \h </w:instrText>
+          <w:instrText xml:space="preserve"> PAGEREF _Toc231037137 \h </w:instrText>
         </w:r>
         <w:r>
           <w:rPr>
@@ -1205,7 +1200,7 @@
           <w:lang w:eastAsia="pt-BR"/>
         </w:rPr>
       </w:pPr>
-      <w:hyperlink w:anchor="_Toc230984073" w:history="1">
+      <w:hyperlink w:anchor="_Toc231037138" w:history="1">
         <w:r>
           <w:rPr>
             <w:rStyle w:val="Hyperlink"/>
@@ -1235,7 +1230,7 @@
             <w:noProof/>
             <w:webHidden/>
           </w:rPr>
-          <w:instrText xml:space="preserve"> PAGEREF _Toc230984073 \h </w:instrText>
+          <w:instrText xml:space="preserve"> PAGEREF _Toc231037138 \h </w:instrText>
         </w:r>
         <w:r>
           <w:rPr>
@@ -1280,7 +1275,7 @@
           <w:lang w:eastAsia="pt-BR"/>
         </w:rPr>
       </w:pPr>
-      <w:hyperlink w:anchor="_Toc230984074" w:history="1">
+      <w:hyperlink w:anchor="_Toc231037139" w:history="1">
         <w:r>
           <w:rPr>
             <w:rStyle w:val="Hyperlink"/>
@@ -1309,7 +1304,7 @@
             <w:noProof/>
             <w:webHidden/>
           </w:rPr>
-          <w:instrText xml:space="preserve"> PAGEREF _Toc230984074 \h </w:instrText>
+          <w:instrText xml:space="preserve"> PAGEREF _Toc231037139 \h </w:instrText>
         </w:r>
         <w:r>
           <w:rPr>
@@ -1354,7 +1349,7 @@
           <w:lang w:eastAsia="pt-BR"/>
         </w:rPr>
       </w:pPr>
-      <w:hyperlink w:anchor="_Toc230984075" w:history="1">
+      <w:hyperlink w:anchor="_Toc231037140" w:history="1">
         <w:r>
           <w:rPr>
             <w:rStyle w:val="Hyperlink"/>
@@ -1383,7 +1378,7 @@
             <w:noProof/>
             <w:webHidden/>
           </w:rPr>
-          <w:instrText xml:space="preserve"> PAGEREF _Toc230984075 \h </w:instrText>
+          <w:instrText xml:space="preserve"> PAGEREF _Toc231037140 \h </w:instrText>
         </w:r>
         <w:r>
           <w:rPr>
@@ -1428,7 +1423,7 @@
           <w:lang w:eastAsia="pt-BR"/>
         </w:rPr>
       </w:pPr>
-      <w:hyperlink w:anchor="_Toc230984076" w:history="1">
+      <w:hyperlink w:anchor="_Toc231037141" w:history="1">
         <w:r>
           <w:rPr>
             <w:rStyle w:val="Hyperlink"/>
@@ -1457,7 +1452,7 @@
             <w:noProof/>
             <w:webHidden/>
           </w:rPr>
-          <w:instrText xml:space="preserve"> PAGEREF _Toc230984076 \h </w:instrText>
+          <w:instrText xml:space="preserve"> PAGEREF _Toc231037141 \h </w:instrText>
         </w:r>
         <w:r>
           <w:rPr>
@@ -1502,7 +1497,7 @@
           <w:lang w:eastAsia="pt-BR"/>
         </w:rPr>
       </w:pPr>
-      <w:hyperlink w:anchor="_Toc230984077" w:history="1">
+      <w:hyperlink w:anchor="_Toc231037142" w:history="1">
         <w:r>
           <w:rPr>
             <w:rStyle w:val="Hyperlink"/>
@@ -1531,7 +1526,7 @@
             <w:noProof/>
             <w:webHidden/>
           </w:rPr>
-          <w:instrText xml:space="preserve"> PAGEREF _Toc230984077 \h </w:instrText>
+          <w:instrText xml:space="preserve"> PAGEREF _Toc231037142 \h </w:instrText>
         </w:r>
         <w:r>
           <w:rPr>
@@ -1576,7 +1571,7 @@
           <w:lang w:eastAsia="pt-BR"/>
         </w:rPr>
       </w:pPr>
-      <w:hyperlink w:anchor="_Toc230984078" w:history="1">
+      <w:hyperlink w:anchor="_Toc231037143" w:history="1">
         <w:r>
           <w:rPr>
             <w:rStyle w:val="Hyperlink"/>
@@ -1605,7 +1600,7 @@
             <w:noProof/>
             <w:webHidden/>
           </w:rPr>
-          <w:instrText xml:space="preserve"> PAGEREF _Toc230984078 \h </w:instrText>
+          <w:instrText xml:space="preserve"> PAGEREF _Toc231037143 \h </w:instrText>
         </w:r>
         <w:r>
           <w:rPr>
@@ -1650,7 +1645,7 @@
           <w:lang w:eastAsia="pt-BR"/>
         </w:rPr>
       </w:pPr>
-      <w:hyperlink w:anchor="_Toc230984079" w:history="1">
+      <w:hyperlink w:anchor="_Toc231037144" w:history="1">
         <w:r>
           <w:rPr>
             <w:rStyle w:val="Hyperlink"/>
@@ -1679,7 +1674,7 @@
             <w:noProof/>
             <w:webHidden/>
           </w:rPr>
-          <w:instrText xml:space="preserve"> PAGEREF _Toc230984079 \h </w:instrText>
+          <w:instrText xml:space="preserve"> PAGEREF _Toc231037144 \h </w:instrText>
         </w:r>
         <w:r>
           <w:rPr>
@@ -1724,7 +1719,7 @@
           <w:lang w:eastAsia="pt-BR"/>
         </w:rPr>
       </w:pPr>
-      <w:hyperlink w:anchor="_Toc230984080" w:history="1">
+      <w:hyperlink w:anchor="_Toc231037145" w:history="1">
         <w:r>
           <w:rPr>
             <w:rStyle w:val="Hyperlink"/>
@@ -1753,7 +1748,7 @@
             <w:noProof/>
             <w:webHidden/>
           </w:rPr>
-          <w:instrText xml:space="preserve"> PAGEREF _Toc230984080 \h </w:instrText>
+          <w:instrText xml:space="preserve"> PAGEREF _Toc231037145 \h </w:instrText>
         </w:r>
         <w:r>
           <w:rPr>
@@ -1798,7 +1793,7 @@
           <w:lang w:eastAsia="pt-BR"/>
         </w:rPr>
       </w:pPr>
-      <w:hyperlink w:anchor="_Toc230984081" w:history="1">
+      <w:hyperlink w:anchor="_Toc231037146" w:history="1">
         <w:r>
           <w:rPr>
             <w:rStyle w:val="Hyperlink"/>
@@ -1827,7 +1822,7 @@
             <w:noProof/>
             <w:webHidden/>
           </w:rPr>
-          <w:instrText xml:space="preserve"> PAGEREF _Toc230984081 \h </w:instrText>
+          <w:instrText xml:space="preserve"> PAGEREF _Toc231037146 \h </w:instrText>
         </w:r>
         <w:r>
           <w:rPr>
@@ -1872,7 +1867,7 @@
           <w:lang w:eastAsia="pt-BR"/>
         </w:rPr>
       </w:pPr>
-      <w:hyperlink w:anchor="_Toc230984082" w:history="1">
+      <w:hyperlink w:anchor="_Toc231037147" w:history="1">
         <w:r>
           <w:rPr>
             <w:rStyle w:val="Hyperlink"/>
@@ -1901,7 +1896,7 @@
             <w:noProof/>
             <w:webHidden/>
           </w:rPr>
-          <w:instrText xml:space="preserve"> PAGEREF _Toc230984082 \h </w:instrText>
+          <w:instrText xml:space="preserve"> PAGEREF _Toc231037147 \h </w:instrText>
         </w:r>
         <w:r>
           <w:rPr>
@@ -1946,7 +1941,7 @@
           <w:lang w:eastAsia="pt-BR"/>
         </w:rPr>
       </w:pPr>
-      <w:hyperlink w:anchor="_Toc230984083" w:history="1">
+      <w:hyperlink w:anchor="_Toc231037148" w:history="1">
         <w:r>
           <w:rPr>
             <w:rStyle w:val="Hyperlink"/>
@@ -1975,7 +1970,7 @@
             <w:noProof/>
             <w:webHidden/>
           </w:rPr>
-          <w:instrText xml:space="preserve"> PAGEREF _Toc230984083 \h </w:instrText>
+          <w:instrText xml:space="preserve"> PAGEREF _Toc231037148 \h </w:instrText>
         </w:r>
         <w:r>
           <w:rPr>
@@ -2020,7 +2015,7 @@
           <w:lang w:eastAsia="pt-BR"/>
         </w:rPr>
       </w:pPr>
-      <w:hyperlink w:anchor="_Toc230984084" w:history="1">
+      <w:hyperlink w:anchor="_Toc231037149" w:history="1">
         <w:r>
           <w:rPr>
             <w:rStyle w:val="Hyperlink"/>
@@ -2049,7 +2044,7 @@
             <w:noProof/>
             <w:webHidden/>
           </w:rPr>
-          <w:instrText xml:space="preserve"> PAGEREF _Toc230984084 \h </w:instrText>
+          <w:instrText xml:space="preserve"> PAGEREF _Toc231037149 \h </w:instrText>
         </w:r>
         <w:r>
           <w:rPr>
@@ -2094,7 +2089,7 @@
           <w:lang w:eastAsia="pt-BR"/>
         </w:rPr>
       </w:pPr>
-      <w:hyperlink w:anchor="_Toc230984085" w:history="1">
+      <w:hyperlink w:anchor="_Toc231037150" w:history="1">
         <w:r>
           <w:rPr>
             <w:rStyle w:val="Hyperlink"/>
@@ -2123,7 +2118,7 @@
             <w:noProof/>
             <w:webHidden/>
           </w:rPr>
-          <w:instrText xml:space="preserve"> PAGEREF _Toc230984085 \h </w:instrText>
+          <w:instrText xml:space="preserve"> PAGEREF _Toc231037150 \h </w:instrText>
         </w:r>
         <w:r>
           <w:rPr>
@@ -2168,7 +2163,7 @@
           <w:lang w:eastAsia="pt-BR"/>
         </w:rPr>
       </w:pPr>
-      <w:hyperlink w:anchor="_Toc230984086" w:history="1">
+      <w:hyperlink w:anchor="_Toc231037151" w:history="1">
         <w:r>
           <w:rPr>
             <w:rStyle w:val="Hyperlink"/>
@@ -2197,7 +2192,7 @@
             <w:noProof/>
             <w:webHidden/>
           </w:rPr>
-          <w:instrText xml:space="preserve"> PAGEREF _Toc230984086 \h </w:instrText>
+          <w:instrText xml:space="preserve"> PAGEREF _Toc231037151 \h </w:instrText>
         </w:r>
         <w:r>
           <w:rPr>
@@ -2242,7 +2237,7 @@
           <w:lang w:eastAsia="pt-BR"/>
         </w:rPr>
       </w:pPr>
-      <w:hyperlink w:anchor="_Toc230984087" w:history="1">
+      <w:hyperlink w:anchor="_Toc231037152" w:history="1">
         <w:r>
           <w:rPr>
             <w:rStyle w:val="Hyperlink"/>
@@ -2271,7 +2266,7 @@
             <w:noProof/>
             <w:webHidden/>
           </w:rPr>
-          <w:instrText xml:space="preserve"> PAGEREF _Toc230984087 \h </w:instrText>
+          <w:instrText xml:space="preserve"> PAGEREF _Toc231037152 \h </w:instrText>
         </w:r>
         <w:r>
           <w:rPr>
@@ -2316,7 +2311,7 @@
           <w:lang w:eastAsia="pt-BR"/>
         </w:rPr>
       </w:pPr>
-      <w:hyperlink w:anchor="_Toc230984088" w:history="1">
+      <w:hyperlink w:anchor="_Toc231037153" w:history="1">
         <w:r>
           <w:rPr>
             <w:rStyle w:val="Hyperlink"/>
@@ -2345,7 +2340,7 @@
             <w:noProof/>
             <w:webHidden/>
           </w:rPr>
-          <w:instrText xml:space="preserve"> PAGEREF _Toc230984088 \h </w:instrText>
+          <w:instrText xml:space="preserve"> PAGEREF _Toc231037153 \h </w:instrText>
         </w:r>
         <w:r>
           <w:rPr>
@@ -2390,7 +2385,7 @@
           <w:lang w:eastAsia="pt-BR"/>
         </w:rPr>
       </w:pPr>
-      <w:hyperlink w:anchor="_Toc230984089" w:history="1">
+      <w:hyperlink w:anchor="_Toc231037154" w:history="1">
         <w:r>
           <w:rPr>
             <w:rStyle w:val="Hyperlink"/>
@@ -2419,7 +2414,7 @@
             <w:noProof/>
             <w:webHidden/>
           </w:rPr>
-          <w:instrText xml:space="preserve"> PAGEREF _Toc230984089 \h </w:instrText>
+          <w:instrText xml:space="preserve"> PAGEREF _Toc231037154 \h </w:instrText>
         </w:r>
         <w:r>
           <w:rPr>
@@ -2464,7 +2459,7 @@
           <w:lang w:eastAsia="pt-BR"/>
         </w:rPr>
       </w:pPr>
-      <w:hyperlink w:anchor="_Toc230984090" w:history="1">
+      <w:hyperlink w:anchor="_Toc231037155" w:history="1">
         <w:r>
           <w:rPr>
             <w:rStyle w:val="Hyperlink"/>
@@ -2494,7 +2489,7 @@
             <w:noProof/>
             <w:webHidden/>
           </w:rPr>
-          <w:instrText xml:space="preserve"> PAGEREF _Toc230984090 \h </w:instrText>
+          <w:instrText xml:space="preserve"> PAGEREF _Toc231037155 \h </w:instrText>
         </w:r>
         <w:r>
           <w:rPr>
@@ -2539,7 +2534,7 @@
           <w:lang w:eastAsia="pt-BR"/>
         </w:rPr>
       </w:pPr>
-      <w:hyperlink w:anchor="_Toc230984091" w:history="1">
+      <w:hyperlink w:anchor="_Toc231037156" w:history="1">
         <w:r>
           <w:rPr>
             <w:rStyle w:val="Hyperlink"/>
@@ -2569,7 +2564,7 @@
             <w:noProof/>
             <w:webHidden/>
           </w:rPr>
-          <w:instrText xml:space="preserve"> PAGEREF _Toc230984091 \h </w:instrText>
+          <w:instrText xml:space="preserve"> PAGEREF _Toc231037156 \h </w:instrText>
         </w:r>
         <w:r>
           <w:rPr>
@@ -2615,7 +2610,7 @@
         <w:spacing w:before="360" w:after="360" w:line="360" w:lineRule="auto"/>
         <w:outlineLvl w:val="0"/>
       </w:pPr>
-      <w:bookmarkStart w:id="2" w:name="_Toc230984066"/>
+      <w:bookmarkStart w:id="2" w:name="_Toc231037131"/>
       <w:r>
         <w:rPr>
           <w:rFonts w:ascii="Times New Roman" w:hAnsi="Times New Roman" w:cs="Times New Roman"/>
@@ -2641,15 +2636,7 @@
           <w:sz w:val="24"/>
           <w:szCs w:val="24"/>
         </w:rPr>
-        <w:t>O Transtorno do Espectro Autista (TEA) é uma condição neurológica permanente que afeta o desenvolvimento da comunicação, da interação social e do comportamento. No Brasil, estima-se que mais de dois milhões de pessoas sejam diagnosticadas com TEA, número que vem crescendo à medida que os critérios diagnósticos do DSM-5 se consolidam na prática clínica. Clínicas especializadas no atendimento a essas pessoas enfrentam um desafio operacional específico: gerenciar equipes multidisciplinares — psicólogos, fonoau</w:t>
-      </w:r>
-      <w:r>
-        <w:rPr>
-          <w:rFonts w:ascii="Times New Roman" w:hAnsi="Times New Roman" w:cs="Times New Roman"/>
-          <w:sz w:val="24"/>
-          <w:szCs w:val="24"/>
-        </w:rPr>
-        <w:t>diólogos, terapeutas ocupacionais, fisioterapeutas e psicopedagogos — que atendem o mesmo paciente de forma simultânea e integrada.</w:t>
+        <w:t>O Transtorno do Espectro Autista (TEA) é uma condição neurológica permanente que afeta o desenvolvimento da comunicação, da interação social e do comportamento. No Brasil, estima-se que mais de dois milhões de pessoas sejam diagnosticadas com TEA, número que vem crescendo à medida que os critérios diagnósticos do DSM-5 se consolidam na prática clínica. Clínicas especializadas no atendimento a essas pessoas enfrentam um desafio operacional específico: gerenciar equipes multidisciplinares — psicólogos, fonoaudiólogos, terapeutas ocupacionais, fisioterapeutas e psicopedagogos — que atendem o mesmo paciente de forma simultânea e integrada.</w:t>
       </w:r>
     </w:p>
     <w:p>
@@ -2696,15 +2683,7 @@
           <w:sz w:val="24"/>
           <w:szCs w:val="24"/>
         </w:rPr>
-        <w:t>, um sistema desktop de gestão clínica desenvolvido em C# Windows Forms com banco de dados relacional. O sistema cobre o ciclo completo de um atendimento: desde o cadastro do paciente com dados clínicos específicos do TEA, passando pelo agendamento com verificação automática de conflitos, até o registro de evoluções de sessão e acompanhamento de objetivos terapêuticos por especialidade. Um módulo de relatórios fornece indicadores quantitativos sobre frequência, faltas, ocupação de salas e progress</w:t>
-      </w:r>
-      <w:r>
-        <w:rPr>
-          <w:rFonts w:ascii="Times New Roman" w:hAnsi="Times New Roman" w:cs="Times New Roman"/>
-          <w:sz w:val="24"/>
-          <w:szCs w:val="24"/>
-        </w:rPr>
-        <w:t>o dos objetivos, apoiando decisões de gestão.</w:t>
+        <w:t>, um sistema desktop de gestão clínica desenvolvido em C# Windows Forms com banco de dados relacional. O sistema cobre o ciclo completo de um atendimento: desde o cadastro do paciente com dados clínicos específicos do TEA, passando pelo agendamento com verificação automática de conflitos, até o registro de evoluções de sessão e acompanhamento de objetivos terapêuticos por especialidade. Um módulo de relatórios fornece indicadores quantitativos sobre frequência, faltas, ocupação de salas e progresso dos objetivos, apoiando decisões de gestão.</w:t>
       </w:r>
     </w:p>
     <w:p>
@@ -2719,15 +2698,7 @@
           <w:sz w:val="24"/>
           <w:szCs w:val="24"/>
         </w:rPr>
-        <w:t xml:space="preserve">O público-alvo são clínicas de reabilitação e centros terapêuticos especializados em TEA. Os usuários diretos do sistema são recepcionistas (responsáveis pelo agendamento e cadastro de pacientes), profissionais de saúde (que registram evoluções e objetivos terapêuticos) e administradores (que gerenciam equipe, salas e relatórios). O cenário de uso típico inicia com a chegada de um novo paciente: a recepcionista cadastra seus dados clínicos, o profissional responsável define objetivos terapêuticos e, a cada </w:t>
-      </w:r>
-      <w:r>
-        <w:rPr>
-          <w:rFonts w:ascii="Times New Roman" w:hAnsi="Times New Roman" w:cs="Times New Roman"/>
-          <w:sz w:val="24"/>
-          <w:szCs w:val="24"/>
-        </w:rPr>
-        <w:t>sessão realizada, registra uma evolução estruturada. O gestor, ao final do mês, consulta os relatórios para analisar taxa de realização e desempenho da equipe.</w:t>
+        <w:t>O público-alvo são clínicas de reabilitação e centros terapêuticos especializados em TEA. Os usuários diretos do sistema são recepcionistas (responsáveis pelo agendamento e cadastro de pacientes), profissionais de saúde (que registram evoluções e objetivos terapêuticos) e administradores (que gerenciam equipe, salas e relatórios). O cenário de uso típico inicia com a chegada de um novo paciente: a recepcionista cadastra seus dados clínicos, o profissional responsável define objetivos terapêuticos e, a cada sessão realizada, registra uma evolução estruturada. O gestor, ao final do mês, consulta os relatórios para analisar taxa de realização e desempenho da equipe.</w:t>
       </w:r>
     </w:p>
     <w:p>
@@ -2737,7 +2708,7 @@
         <w:spacing w:before="360" w:after="360" w:line="360" w:lineRule="auto"/>
         <w:outlineLvl w:val="0"/>
       </w:pPr>
-      <w:bookmarkStart w:id="3" w:name="_Toc230984067"/>
+      <w:bookmarkStart w:id="3" w:name="_Toc231037132"/>
       <w:r>
         <w:rPr>
           <w:rFonts w:ascii="Times New Roman" w:hAnsi="Times New Roman" w:cs="Times New Roman"/>
@@ -2757,7 +2728,7 @@
         <w:spacing w:before="360" w:after="360" w:line="360" w:lineRule="auto"/>
         <w:outlineLvl w:val="1"/>
       </w:pPr>
-      <w:bookmarkStart w:id="4" w:name="_Toc230984068"/>
+      <w:bookmarkStart w:id="4" w:name="_Toc231037133"/>
       <w:r>
         <w:rPr>
           <w:rFonts w:ascii="Times New Roman" w:hAnsi="Times New Roman" w:cs="Times New Roman"/>
@@ -2945,7 +2916,7 @@
         <w:spacing w:before="360" w:after="360" w:line="360" w:lineRule="auto"/>
         <w:outlineLvl w:val="1"/>
       </w:pPr>
-      <w:bookmarkStart w:id="5" w:name="_Toc230984069"/>
+      <w:bookmarkStart w:id="5" w:name="_Toc231037134"/>
       <w:r>
         <w:rPr>
           <w:rFonts w:ascii="Times New Roman" w:hAnsi="Times New Roman" w:cs="Times New Roman"/>
@@ -3076,7 +3047,7 @@
         <w:spacing w:before="360" w:after="360" w:line="360" w:lineRule="auto"/>
         <w:outlineLvl w:val="1"/>
       </w:pPr>
-      <w:bookmarkStart w:id="6" w:name="_Toc230984070"/>
+      <w:bookmarkStart w:id="6" w:name="_Toc231037135"/>
       <w:r>
         <w:rPr>
           <w:rFonts w:ascii="Times New Roman" w:hAnsi="Times New Roman" w:cs="Times New Roman"/>
@@ -3187,7 +3158,7 @@
         <w:spacing w:before="360" w:after="360" w:line="360" w:lineRule="auto"/>
         <w:outlineLvl w:val="1"/>
       </w:pPr>
-      <w:bookmarkStart w:id="7" w:name="_Toc230984071"/>
+      <w:bookmarkStart w:id="7" w:name="_Toc231037136"/>
       <w:r>
         <w:rPr>
           <w:rFonts w:ascii="Times New Roman" w:hAnsi="Times New Roman" w:cs="Times New Roman"/>
@@ -3350,7 +3321,7 @@
         <w:spacing w:before="360" w:after="360" w:line="360" w:lineRule="auto"/>
         <w:outlineLvl w:val="1"/>
       </w:pPr>
-      <w:bookmarkStart w:id="8" w:name="_Toc230984072"/>
+      <w:bookmarkStart w:id="8" w:name="_Toc231037137"/>
       <w:r>
         <w:rPr>
           <w:rFonts w:ascii="Times New Roman" w:hAnsi="Times New Roman" w:cs="Times New Roman"/>
@@ -3513,7 +3484,7 @@
         <w:spacing w:before="360" w:after="360" w:line="360" w:lineRule="auto"/>
         <w:outlineLvl w:val="0"/>
       </w:pPr>
-      <w:bookmarkStart w:id="9" w:name="_Toc230984073"/>
+      <w:bookmarkStart w:id="9" w:name="_Toc231037138"/>
       <w:r>
         <w:rPr>
           <w:rFonts w:ascii="Times New Roman" w:hAnsi="Times New Roman" w:cs="Times New Roman"/>
@@ -3548,7 +3519,7 @@
         <w:spacing w:before="360" w:after="360" w:line="360" w:lineRule="auto"/>
         <w:outlineLvl w:val="1"/>
       </w:pPr>
-      <w:bookmarkStart w:id="10" w:name="_Toc230984074"/>
+      <w:bookmarkStart w:id="10" w:name="_Toc231037139"/>
       <w:r>
         <w:rPr>
           <w:rFonts w:ascii="Times New Roman" w:hAnsi="Times New Roman" w:cs="Times New Roman"/>
@@ -3635,7 +3606,7 @@
                     <pic:cNvPicPr/>
                   </pic:nvPicPr>
                   <pic:blipFill>
-                    <a:blip r:embed="rId7"/>
+                    <a:blip r:embed="rId8"/>
                     <a:stretch>
                       <a:fillRect/>
                     </a:stretch>
@@ -3685,7 +3656,7 @@
         <w:spacing w:before="360" w:after="360" w:line="360" w:lineRule="auto"/>
         <w:outlineLvl w:val="1"/>
       </w:pPr>
-      <w:bookmarkStart w:id="11" w:name="_Toc230984075"/>
+      <w:bookmarkStart w:id="11" w:name="_Toc231037140"/>
       <w:r>
         <w:rPr>
           <w:rFonts w:ascii="Times New Roman" w:hAnsi="Times New Roman" w:cs="Times New Roman"/>
@@ -3772,7 +3743,7 @@
                     <pic:cNvPicPr/>
                   </pic:nvPicPr>
                   <pic:blipFill>
-                    <a:blip r:embed="rId8"/>
+                    <a:blip r:embed="rId9"/>
                     <a:stretch>
                       <a:fillRect/>
                     </a:stretch>
@@ -3822,7 +3793,7 @@
         <w:spacing w:before="360" w:after="360" w:line="360" w:lineRule="auto"/>
         <w:outlineLvl w:val="1"/>
       </w:pPr>
-      <w:bookmarkStart w:id="12" w:name="_Toc230984076"/>
+      <w:bookmarkStart w:id="12" w:name="_Toc231037141"/>
       <w:r>
         <w:rPr>
           <w:rFonts w:ascii="Times New Roman" w:hAnsi="Times New Roman" w:cs="Times New Roman"/>
@@ -3909,7 +3880,7 @@
                     <pic:cNvPicPr/>
                   </pic:nvPicPr>
                   <pic:blipFill>
-                    <a:blip r:embed="rId9"/>
+                    <a:blip r:embed="rId10"/>
                     <a:stretch>
                       <a:fillRect/>
                     </a:stretch>
@@ -3959,7 +3930,7 @@
         <w:spacing w:before="360" w:after="360" w:line="360" w:lineRule="auto"/>
         <w:outlineLvl w:val="1"/>
       </w:pPr>
-      <w:bookmarkStart w:id="13" w:name="_Toc230984077"/>
+      <w:bookmarkStart w:id="13" w:name="_Toc231037142"/>
       <w:r>
         <w:rPr>
           <w:rFonts w:ascii="Times New Roman" w:hAnsi="Times New Roman" w:cs="Times New Roman"/>
@@ -4046,7 +4017,7 @@
                     <pic:cNvPicPr/>
                   </pic:nvPicPr>
                   <pic:blipFill>
-                    <a:blip r:embed="rId10"/>
+                    <a:blip r:embed="rId11"/>
                     <a:stretch>
                       <a:fillRect/>
                     </a:stretch>
@@ -4096,7 +4067,7 @@
         <w:spacing w:before="360" w:after="360" w:line="360" w:lineRule="auto"/>
         <w:outlineLvl w:val="1"/>
       </w:pPr>
-      <w:bookmarkStart w:id="14" w:name="_Toc230984078"/>
+      <w:bookmarkStart w:id="14" w:name="_Toc231037143"/>
       <w:r>
         <w:rPr>
           <w:rFonts w:ascii="Times New Roman" w:hAnsi="Times New Roman" w:cs="Times New Roman"/>
@@ -4180,143 +4151,6 @@
                 <pic:pic xmlns:pic="http://schemas.openxmlformats.org/drawingml/2006/picture">
                   <pic:nvPicPr>
                     <pic:cNvPr id="1005" name="Figura 5"/>
-                    <pic:cNvPicPr/>
-                  </pic:nvPicPr>
-                  <pic:blipFill>
-                    <a:blip r:embed="rId11"/>
-                    <a:stretch>
-                      <a:fillRect/>
-                    </a:stretch>
-                  </pic:blipFill>
-                  <pic:spPr>
-                    <a:xfrm>
-                      <a:off x="0" y="0"/>
-                      <a:ext cx="5768975" cy="3386791"/>
-                    </a:xfrm>
-                    <a:prstGeom prst="rect">
-                      <a:avLst/>
-                    </a:prstGeom>
-                  </pic:spPr>
-                </pic:pic>
-              </a:graphicData>
-            </a:graphic>
-          </wp:inline>
-        </w:drawing>
-      </w:r>
-    </w:p>
-    <w:p>
-      <w:pPr>
-        <w:spacing w:after="240" w:line="240" w:lineRule="auto"/>
-        <w:jc w:val="center"/>
-      </w:pPr>
-      <w:r>
-        <w:rPr>
-          <w:rFonts w:ascii="Times New Roman" w:hAnsi="Times New Roman" w:cs="Times New Roman"/>
-          <w:b/>
-          <w:sz w:val="20"/>
-          <w:szCs w:val="20"/>
-        </w:rPr>
-        <w:t xml:space="preserve">Fonte: </w:t>
-      </w:r>
-      <w:r>
-        <w:rPr>
-          <w:rFonts w:ascii="Times New Roman" w:hAnsi="Times New Roman" w:cs="Times New Roman"/>
-          <w:sz w:val="20"/>
-          <w:szCs w:val="20"/>
-        </w:rPr>
-        <w:t>o autor (2026).</w:t>
-      </w:r>
-    </w:p>
-    <w:p>
-      <w:pPr>
-        <w:keepNext/>
-        <w:spacing w:before="360" w:after="360" w:line="360" w:lineRule="auto"/>
-        <w:outlineLvl w:val="1"/>
-      </w:pPr>
-      <w:bookmarkStart w:id="15" w:name="_Toc230984079"/>
-      <w:r>
-        <w:rPr>
-          <w:rFonts w:ascii="Times New Roman" w:hAnsi="Times New Roman" w:cs="Times New Roman"/>
-          <w:caps/>
-          <w:sz w:val="24"/>
-          <w:szCs w:val="24"/>
-        </w:rPr>
-        <w:t>3.6 Formulário de Cadastro/Edição de Profissional</w:t>
-      </w:r>
-      <w:bookmarkEnd w:id="15"/>
-    </w:p>
-    <w:p>
-      <w:pPr>
-        <w:spacing w:after="0" w:line="360" w:lineRule="auto"/>
-        <w:ind w:firstLine="709"/>
-        <w:jc w:val="both"/>
-      </w:pPr>
-      <w:r>
-        <w:rPr>
-          <w:rFonts w:ascii="Times New Roman" w:hAnsi="Times New Roman" w:cs="Times New Roman"/>
-          <w:b/>
-          <w:sz w:val="24"/>
-          <w:szCs w:val="24"/>
-        </w:rPr>
-        <w:t xml:space="preserve">Objetivo e funcionamento. </w:t>
-      </w:r>
-      <w:r>
-        <w:rPr>
-          <w:rFonts w:ascii="Times New Roman" w:hAnsi="Times New Roman" w:cs="Times New Roman"/>
-          <w:sz w:val="24"/>
-          <w:szCs w:val="24"/>
-        </w:rPr>
-        <w:t>Registrar ou atualizar os dados de um membro da equipe, com nome, registro de conselho, contato e especialidade (selecionada entre as ativas).</w:t>
-      </w:r>
-    </w:p>
-    <w:p>
-      <w:pPr>
-        <w:keepNext/>
-        <w:spacing w:before="240" w:after="60" w:line="240" w:lineRule="auto"/>
-        <w:jc w:val="center"/>
-      </w:pPr>
-      <w:r>
-        <w:rPr>
-          <w:rFonts w:ascii="Times New Roman" w:hAnsi="Times New Roman" w:cs="Times New Roman"/>
-          <w:b/>
-          <w:sz w:val="24"/>
-          <w:szCs w:val="24"/>
-        </w:rPr>
-        <w:lastRenderedPageBreak/>
-        <w:t>Figura 6</w:t>
-      </w:r>
-      <w:r>
-        <w:rPr>
-          <w:rFonts w:ascii="Times New Roman" w:hAnsi="Times New Roman" w:cs="Times New Roman"/>
-          <w:sz w:val="24"/>
-          <w:szCs w:val="24"/>
-        </w:rPr>
-        <w:t xml:space="preserve"> – Formulário de Cadastro/Edição de Profissional</w:t>
-      </w:r>
-    </w:p>
-    <w:p>
-      <w:pPr>
-        <w:keepNext/>
-        <w:spacing w:after="60" w:line="240" w:lineRule="auto"/>
-        <w:jc w:val="center"/>
-      </w:pPr>
-      <w:r>
-        <w:rPr>
-          <w:noProof/>
-        </w:rPr>
-        <w:drawing>
-          <wp:inline distT="0" distB="0" distL="0" distR="0" wp14:anchorId="5A37EE1D" wp14:editId="2EB6A36E">
-            <wp:extent cx="5768975" cy="3386791"/>
-            <wp:effectExtent l="0" t="0" r="0" b="0"/>
-            <wp:docPr id="1006" name="Figura 6"/>
-            <wp:cNvGraphicFramePr>
-              <a:graphicFrameLocks xmlns:a="http://schemas.openxmlformats.org/drawingml/2006/main" noChangeAspect="1"/>
-            </wp:cNvGraphicFramePr>
-            <a:graphic xmlns:a="http://schemas.openxmlformats.org/drawingml/2006/main">
-              <a:graphicData uri="http://schemas.openxmlformats.org/drawingml/2006/picture">
-                <pic:pic xmlns:pic="http://schemas.openxmlformats.org/drawingml/2006/picture">
-                  <pic:nvPicPr>
-                    <pic:cNvPr id="1006" name="Figura 6"/>
                     <pic:cNvPicPr/>
                   </pic:nvPicPr>
                   <pic:blipFill>
@@ -4370,7 +4204,7 @@
         <w:spacing w:before="360" w:after="360" w:line="360" w:lineRule="auto"/>
         <w:outlineLvl w:val="1"/>
       </w:pPr>
-      <w:bookmarkStart w:id="16" w:name="_Toc230984080"/>
+      <w:bookmarkStart w:id="15" w:name="_Toc231037144"/>
       <w:r>
         <w:rPr>
           <w:rFonts w:ascii="Times New Roman" w:hAnsi="Times New Roman" w:cs="Times New Roman"/>
@@ -4378,9 +4212,9 @@
           <w:sz w:val="24"/>
           <w:szCs w:val="24"/>
         </w:rPr>
-        <w:t>3.7 Módulo de Especialidades</w:t>
-      </w:r>
-      <w:bookmarkEnd w:id="16"/>
+        <w:t>3.6 Formulário de Cadastro/Edição de Profissional</w:t>
+      </w:r>
+      <w:bookmarkEnd w:id="15"/>
     </w:p>
     <w:p>
       <w:pPr>
@@ -4403,7 +4237,7 @@
           <w:sz w:val="24"/>
           <w:szCs w:val="24"/>
         </w:rPr>
-        <w:t>Gerenciar as especialidades clínicas cadastradas (ex.: Psicologia, Fonoaudiologia), cada uma com cor de identificação visual e sigla de conselho.</w:t>
+        <w:t>Registrar ou atualizar os dados de um membro da equipe, com nome, registro de conselho, contato e especialidade (selecionada entre as ativas).</w:t>
       </w:r>
     </w:p>
     <w:p>
@@ -4420,15 +4254,15 @@
           <w:szCs w:val="24"/>
         </w:rPr>
         <w:lastRenderedPageBreak/>
-        <w:t>Figura 7</w:t>
-      </w:r>
-      <w:r>
-        <w:rPr>
-          <w:rFonts w:ascii="Times New Roman" w:hAnsi="Times New Roman" w:cs="Times New Roman"/>
-          <w:sz w:val="24"/>
-          <w:szCs w:val="24"/>
-        </w:rPr>
-        <w:t xml:space="preserve"> – Módulo de Especialidades</w:t>
+        <w:t>Figura 6</w:t>
+      </w:r>
+      <w:r>
+        <w:rPr>
+          <w:rFonts w:ascii="Times New Roman" w:hAnsi="Times New Roman" w:cs="Times New Roman"/>
+          <w:sz w:val="24"/>
+          <w:szCs w:val="24"/>
+        </w:rPr>
+        <w:t xml:space="preserve"> – Formulário de Cadastro/Edição de Profissional</w:t>
       </w:r>
     </w:p>
     <w:p>
@@ -4442,10 +4276,10 @@
           <w:noProof/>
         </w:rPr>
         <w:drawing>
-          <wp:inline distT="0" distB="0" distL="0" distR="0" wp14:anchorId="2FA88515" wp14:editId="6F065376">
+          <wp:inline distT="0" distB="0" distL="0" distR="0" wp14:anchorId="5A37EE1D" wp14:editId="2EB6A36E">
             <wp:extent cx="5768975" cy="3386791"/>
             <wp:effectExtent l="0" t="0" r="0" b="0"/>
-            <wp:docPr id="1007" name="Figura 7"/>
+            <wp:docPr id="1006" name="Figura 6"/>
             <wp:cNvGraphicFramePr>
               <a:graphicFrameLocks xmlns:a="http://schemas.openxmlformats.org/drawingml/2006/main" noChangeAspect="1"/>
             </wp:cNvGraphicFramePr>
@@ -4453,7 +4287,7 @@
               <a:graphicData uri="http://schemas.openxmlformats.org/drawingml/2006/picture">
                 <pic:pic xmlns:pic="http://schemas.openxmlformats.org/drawingml/2006/picture">
                   <pic:nvPicPr>
-                    <pic:cNvPr id="1007" name="Figura 7"/>
+                    <pic:cNvPr id="1006" name="Figura 6"/>
                     <pic:cNvPicPr/>
                   </pic:nvPicPr>
                   <pic:blipFill>
@@ -4507,7 +4341,144 @@
         <w:spacing w:before="360" w:after="360" w:line="360" w:lineRule="auto"/>
         <w:outlineLvl w:val="1"/>
       </w:pPr>
-      <w:bookmarkStart w:id="17" w:name="_Toc230984081"/>
+      <w:bookmarkStart w:id="16" w:name="_Toc231037145"/>
+      <w:r>
+        <w:rPr>
+          <w:rFonts w:ascii="Times New Roman" w:hAnsi="Times New Roman" w:cs="Times New Roman"/>
+          <w:caps/>
+          <w:sz w:val="24"/>
+          <w:szCs w:val="24"/>
+        </w:rPr>
+        <w:t>3.7 Módulo de Especialidades</w:t>
+      </w:r>
+      <w:bookmarkEnd w:id="16"/>
+    </w:p>
+    <w:p>
+      <w:pPr>
+        <w:spacing w:after="0" w:line="360" w:lineRule="auto"/>
+        <w:ind w:firstLine="709"/>
+        <w:jc w:val="both"/>
+      </w:pPr>
+      <w:r>
+        <w:rPr>
+          <w:rFonts w:ascii="Times New Roman" w:hAnsi="Times New Roman" w:cs="Times New Roman"/>
+          <w:b/>
+          <w:sz w:val="24"/>
+          <w:szCs w:val="24"/>
+        </w:rPr>
+        <w:t xml:space="preserve">Objetivo e funcionamento. </w:t>
+      </w:r>
+      <w:r>
+        <w:rPr>
+          <w:rFonts w:ascii="Times New Roman" w:hAnsi="Times New Roman" w:cs="Times New Roman"/>
+          <w:sz w:val="24"/>
+          <w:szCs w:val="24"/>
+        </w:rPr>
+        <w:t>Gerenciar as especialidades clínicas cadastradas (ex.: Psicologia, Fonoaudiologia), cada uma com cor de identificação visual e sigla de conselho.</w:t>
+      </w:r>
+    </w:p>
+    <w:p>
+      <w:pPr>
+        <w:keepNext/>
+        <w:spacing w:before="240" w:after="60" w:line="240" w:lineRule="auto"/>
+        <w:jc w:val="center"/>
+      </w:pPr>
+      <w:r>
+        <w:rPr>
+          <w:rFonts w:ascii="Times New Roman" w:hAnsi="Times New Roman" w:cs="Times New Roman"/>
+          <w:b/>
+          <w:sz w:val="24"/>
+          <w:szCs w:val="24"/>
+        </w:rPr>
+        <w:lastRenderedPageBreak/>
+        <w:t>Figura 7</w:t>
+      </w:r>
+      <w:r>
+        <w:rPr>
+          <w:rFonts w:ascii="Times New Roman" w:hAnsi="Times New Roman" w:cs="Times New Roman"/>
+          <w:sz w:val="24"/>
+          <w:szCs w:val="24"/>
+        </w:rPr>
+        <w:t xml:space="preserve"> – Módulo de Especialidades</w:t>
+      </w:r>
+    </w:p>
+    <w:p>
+      <w:pPr>
+        <w:keepNext/>
+        <w:spacing w:after="60" w:line="240" w:lineRule="auto"/>
+        <w:jc w:val="center"/>
+      </w:pPr>
+      <w:r>
+        <w:rPr>
+          <w:noProof/>
+        </w:rPr>
+        <w:drawing>
+          <wp:inline distT="0" distB="0" distL="0" distR="0" wp14:anchorId="2FA88515" wp14:editId="6F065376">
+            <wp:extent cx="5768975" cy="3386791"/>
+            <wp:effectExtent l="0" t="0" r="0" b="0"/>
+            <wp:docPr id="1007" name="Figura 7"/>
+            <wp:cNvGraphicFramePr>
+              <a:graphicFrameLocks xmlns:a="http://schemas.openxmlformats.org/drawingml/2006/main" noChangeAspect="1"/>
+            </wp:cNvGraphicFramePr>
+            <a:graphic xmlns:a="http://schemas.openxmlformats.org/drawingml/2006/main">
+              <a:graphicData uri="http://schemas.openxmlformats.org/drawingml/2006/picture">
+                <pic:pic xmlns:pic="http://schemas.openxmlformats.org/drawingml/2006/picture">
+                  <pic:nvPicPr>
+                    <pic:cNvPr id="1007" name="Figura 7"/>
+                    <pic:cNvPicPr/>
+                  </pic:nvPicPr>
+                  <pic:blipFill>
+                    <a:blip r:embed="rId14"/>
+                    <a:stretch>
+                      <a:fillRect/>
+                    </a:stretch>
+                  </pic:blipFill>
+                  <pic:spPr>
+                    <a:xfrm>
+                      <a:off x="0" y="0"/>
+                      <a:ext cx="5768975" cy="3386791"/>
+                    </a:xfrm>
+                    <a:prstGeom prst="rect">
+                      <a:avLst/>
+                    </a:prstGeom>
+                  </pic:spPr>
+                </pic:pic>
+              </a:graphicData>
+            </a:graphic>
+          </wp:inline>
+        </w:drawing>
+      </w:r>
+    </w:p>
+    <w:p>
+      <w:pPr>
+        <w:spacing w:after="240" w:line="240" w:lineRule="auto"/>
+        <w:jc w:val="center"/>
+      </w:pPr>
+      <w:r>
+        <w:rPr>
+          <w:rFonts w:ascii="Times New Roman" w:hAnsi="Times New Roman" w:cs="Times New Roman"/>
+          <w:b/>
+          <w:sz w:val="20"/>
+          <w:szCs w:val="20"/>
+        </w:rPr>
+        <w:t xml:space="preserve">Fonte: </w:t>
+      </w:r>
+      <w:r>
+        <w:rPr>
+          <w:rFonts w:ascii="Times New Roman" w:hAnsi="Times New Roman" w:cs="Times New Roman"/>
+          <w:sz w:val="20"/>
+          <w:szCs w:val="20"/>
+        </w:rPr>
+        <w:t>o autor (2026).</w:t>
+      </w:r>
+    </w:p>
+    <w:p>
+      <w:pPr>
+        <w:keepNext/>
+        <w:spacing w:before="360" w:after="360" w:line="360" w:lineRule="auto"/>
+        <w:outlineLvl w:val="1"/>
+      </w:pPr>
+      <w:bookmarkStart w:id="17" w:name="_Toc231037146"/>
       <w:r>
         <w:rPr>
           <w:rFonts w:ascii="Times New Roman" w:hAnsi="Times New Roman" w:cs="Times New Roman"/>
@@ -4594,7 +4565,7 @@
                     <pic:cNvPicPr/>
                   </pic:nvPicPr>
                   <pic:blipFill>
-                    <a:blip r:embed="rId14"/>
+                    <a:blip r:embed="rId15"/>
                     <a:stretch>
                       <a:fillRect/>
                     </a:stretch>
@@ -4644,7 +4615,7 @@
         <w:spacing w:before="360" w:after="360" w:line="360" w:lineRule="auto"/>
         <w:outlineLvl w:val="1"/>
       </w:pPr>
-      <w:bookmarkStart w:id="18" w:name="_Toc230984082"/>
+      <w:bookmarkStart w:id="18" w:name="_Toc231037147"/>
       <w:r>
         <w:rPr>
           <w:rFonts w:ascii="Times New Roman" w:hAnsi="Times New Roman" w:cs="Times New Roman"/>
@@ -4731,7 +4702,7 @@
                     <pic:cNvPicPr/>
                   </pic:nvPicPr>
                   <pic:blipFill>
-                    <a:blip r:embed="rId15"/>
+                    <a:blip r:embed="rId16"/>
                     <a:stretch>
                       <a:fillRect/>
                     </a:stretch>
@@ -4781,7 +4752,7 @@
         <w:spacing w:before="360" w:after="360" w:line="360" w:lineRule="auto"/>
         <w:outlineLvl w:val="1"/>
       </w:pPr>
-      <w:bookmarkStart w:id="19" w:name="_Toc230984083"/>
+      <w:bookmarkStart w:id="19" w:name="_Toc231037148"/>
       <w:r>
         <w:rPr>
           <w:rFonts w:ascii="Times New Roman" w:hAnsi="Times New Roman" w:cs="Times New Roman"/>
@@ -4868,7 +4839,7 @@
                     <pic:cNvPicPr/>
                   </pic:nvPicPr>
                   <pic:blipFill>
-                    <a:blip r:embed="rId16"/>
+                    <a:blip r:embed="rId17"/>
                     <a:stretch>
                       <a:fillRect/>
                     </a:stretch>
@@ -4918,7 +4889,7 @@
         <w:spacing w:before="360" w:after="360" w:line="360" w:lineRule="auto"/>
         <w:outlineLvl w:val="1"/>
       </w:pPr>
-      <w:bookmarkStart w:id="20" w:name="_Toc230984084"/>
+      <w:bookmarkStart w:id="20" w:name="_Toc231037149"/>
       <w:r>
         <w:rPr>
           <w:rFonts w:ascii="Times New Roman" w:hAnsi="Times New Roman" w:cs="Times New Roman"/>
@@ -5005,7 +4976,7 @@
                     <pic:cNvPicPr/>
                   </pic:nvPicPr>
                   <pic:blipFill>
-                    <a:blip r:embed="rId17"/>
+                    <a:blip r:embed="rId18"/>
                     <a:stretch>
                       <a:fillRect/>
                     </a:stretch>
@@ -5055,7 +5026,7 @@
         <w:spacing w:before="360" w:after="360" w:line="360" w:lineRule="auto"/>
         <w:outlineLvl w:val="1"/>
       </w:pPr>
-      <w:bookmarkStart w:id="21" w:name="_Toc230984085"/>
+      <w:bookmarkStart w:id="21" w:name="_Toc231037150"/>
       <w:r>
         <w:rPr>
           <w:rFonts w:ascii="Times New Roman" w:hAnsi="Times New Roman" w:cs="Times New Roman"/>
@@ -5142,7 +5113,7 @@
                     <pic:cNvPicPr/>
                   </pic:nvPicPr>
                   <pic:blipFill>
-                    <a:blip r:embed="rId18"/>
+                    <a:blip r:embed="rId19"/>
                     <a:stretch>
                       <a:fillRect/>
                     </a:stretch>
@@ -5192,7 +5163,7 @@
         <w:spacing w:before="360" w:after="360" w:line="360" w:lineRule="auto"/>
         <w:outlineLvl w:val="1"/>
       </w:pPr>
-      <w:bookmarkStart w:id="22" w:name="_Toc230984086"/>
+      <w:bookmarkStart w:id="22" w:name="_Toc231037151"/>
       <w:r>
         <w:rPr>
           <w:rFonts w:ascii="Times New Roman" w:hAnsi="Times New Roman" w:cs="Times New Roman"/>
@@ -5279,7 +5250,7 @@
                     <pic:cNvPicPr/>
                   </pic:nvPicPr>
                   <pic:blipFill>
-                    <a:blip r:embed="rId19"/>
+                    <a:blip r:embed="rId20"/>
                     <a:stretch>
                       <a:fillRect/>
                     </a:stretch>
@@ -5329,7 +5300,7 @@
         <w:spacing w:before="360" w:after="360" w:line="360" w:lineRule="auto"/>
         <w:outlineLvl w:val="1"/>
       </w:pPr>
-      <w:bookmarkStart w:id="23" w:name="_Toc230984087"/>
+      <w:bookmarkStart w:id="23" w:name="_Toc231037152"/>
       <w:r>
         <w:rPr>
           <w:rFonts w:ascii="Times New Roman" w:hAnsi="Times New Roman" w:cs="Times New Roman"/>
@@ -5416,7 +5387,7 @@
                     <pic:cNvPicPr/>
                   </pic:nvPicPr>
                   <pic:blipFill>
-                    <a:blip r:embed="rId20"/>
+                    <a:blip r:embed="rId21"/>
                     <a:stretch>
                       <a:fillRect/>
                     </a:stretch>
@@ -5466,7 +5437,7 @@
         <w:spacing w:before="360" w:after="360" w:line="360" w:lineRule="auto"/>
         <w:outlineLvl w:val="1"/>
       </w:pPr>
-      <w:bookmarkStart w:id="24" w:name="_Toc230984088"/>
+      <w:bookmarkStart w:id="24" w:name="_Toc231037153"/>
       <w:r>
         <w:rPr>
           <w:rFonts w:ascii="Times New Roman" w:hAnsi="Times New Roman" w:cs="Times New Roman"/>
@@ -5553,7 +5524,7 @@
                     <pic:cNvPicPr/>
                   </pic:nvPicPr>
                   <pic:blipFill>
-                    <a:blip r:embed="rId21"/>
+                    <a:blip r:embed="rId22"/>
                     <a:stretch>
                       <a:fillRect/>
                     </a:stretch>
@@ -5603,7 +5574,7 @@
         <w:spacing w:before="360" w:after="360" w:line="360" w:lineRule="auto"/>
         <w:outlineLvl w:val="1"/>
       </w:pPr>
-      <w:bookmarkStart w:id="25" w:name="_Toc230984089"/>
+      <w:bookmarkStart w:id="25" w:name="_Toc231037154"/>
       <w:r>
         <w:rPr>
           <w:rFonts w:ascii="Times New Roman" w:hAnsi="Times New Roman" w:cs="Times New Roman"/>
@@ -5690,7 +5661,7 @@
                     <pic:cNvPicPr/>
                   </pic:nvPicPr>
                   <pic:blipFill>
-                    <a:blip r:embed="rId22"/>
+                    <a:blip r:embed="rId23"/>
                     <a:stretch>
                       <a:fillRect/>
                     </a:stretch>
@@ -5741,7 +5712,7 @@
         <w:spacing w:before="360" w:after="360" w:line="360" w:lineRule="auto"/>
         <w:outlineLvl w:val="0"/>
       </w:pPr>
-      <w:bookmarkStart w:id="26" w:name="_Toc230984090"/>
+      <w:bookmarkStart w:id="26" w:name="_Toc231037155"/>
       <w:r>
         <w:rPr>
           <w:rFonts w:ascii="Times New Roman" w:hAnsi="Times New Roman" w:cs="Times New Roman"/>
@@ -5777,7 +5748,7 @@
         <w:jc w:val="center"/>
         <w:outlineLvl w:val="0"/>
       </w:pPr>
-      <w:bookmarkStart w:id="27" w:name="_Toc230984091"/>
+      <w:bookmarkStart w:id="27" w:name="_Toc231037156"/>
       <w:r>
         <w:rPr>
           <w:rFonts w:ascii="Times New Roman" w:hAnsi="Times New Roman" w:cs="Times New Roman"/>
@@ -5848,7 +5819,7 @@
       </w:r>
     </w:p>
     <w:sectPr>
-      <w:headerReference w:type="default" r:id="rId23"/>
+      <w:headerReference w:type="default" r:id="rId24"/>
       <w:pgSz w:w="11920" w:h="16838"/>
       <w:pgMar w:top="1701" w:right="1134" w:bottom="1134" w:left="1701" w:header="709" w:footer="720" w:gutter="0"/>
       <w:cols w:space="720"/>

</xml_diff>

<commit_message>
docs: estrutura completa do projeto e script SQL no relatorio
- substitui a arvore de diretorios simplificada pela estrutura completa
  (todos os arquivos de CT_Negocio e CT_Win), igual ao markdown
- inclui o script de criacao do banco (schema.sql) na secao 2.3:
  9 tabelas, chaves/relacionamentos, indices e seed inicial
</commit_message>
<xml_diff>
--- a/SolucaoClinicaTEA/relatorio_final.docx
+++ b/SolucaoClinicaTEA/relatorio_final.docx
@@ -430,7 +430,7 @@
         <w:jc w:val="center"/>
         <w:outlineLvl w:val="0"/>
       </w:pPr>
-      <w:bookmarkStart w:id="0" w:name="_Toc231037129"/>
+      <w:bookmarkStart w:id="0" w:name="_Toc231039344"/>
       <w:r>
         <w:rPr>
           <w:rFonts w:ascii="Times New Roman" w:hAnsi="Times New Roman" w:cs="Times New Roman"/>
@@ -493,7 +493,7 @@
         <w:jc w:val="center"/>
         <w:outlineLvl w:val="0"/>
       </w:pPr>
-      <w:bookmarkStart w:id="1" w:name="_Toc231037130"/>
+      <w:bookmarkStart w:id="1" w:name="_Toc231039345"/>
       <w:r>
         <w:rPr>
           <w:rFonts w:ascii="Times New Roman" w:hAnsi="Times New Roman" w:cs="Times New Roman"/>
@@ -530,7 +530,7 @@
       <w:r>
         <w:fldChar w:fldCharType="separate"/>
       </w:r>
-      <w:hyperlink w:anchor="_Toc231037129" w:history="1">
+      <w:hyperlink w:anchor="_Toc231039344" w:history="1">
         <w:r>
           <w:rPr>
             <w:rStyle w:val="Hyperlink"/>
@@ -560,7 +560,7 @@
             <w:noProof/>
             <w:webHidden/>
           </w:rPr>
-          <w:instrText xml:space="preserve"> PAGEREF _Toc231037129 \h </w:instrText>
+          <w:instrText xml:space="preserve"> PAGEREF _Toc231039344 \h </w:instrText>
         </w:r>
         <w:r>
           <w:rPr>
@@ -605,7 +605,7 @@
           <w:lang w:eastAsia="pt-BR"/>
         </w:rPr>
       </w:pPr>
-      <w:hyperlink w:anchor="_Toc231037130" w:history="1">
+      <w:hyperlink w:anchor="_Toc231039345" w:history="1">
         <w:r>
           <w:rPr>
             <w:rStyle w:val="Hyperlink"/>
@@ -635,7 +635,7 @@
             <w:noProof/>
             <w:webHidden/>
           </w:rPr>
-          <w:instrText xml:space="preserve"> PAGEREF _Toc231037130 \h </w:instrText>
+          <w:instrText xml:space="preserve"> PAGEREF _Toc231039345 \h </w:instrText>
         </w:r>
         <w:r>
           <w:rPr>
@@ -680,7 +680,7 @@
           <w:lang w:eastAsia="pt-BR"/>
         </w:rPr>
       </w:pPr>
-      <w:hyperlink w:anchor="_Toc231037131" w:history="1">
+      <w:hyperlink w:anchor="_Toc231039346" w:history="1">
         <w:r>
           <w:rPr>
             <w:rStyle w:val="Hyperlink"/>
@@ -710,7 +710,7 @@
             <w:noProof/>
             <w:webHidden/>
           </w:rPr>
-          <w:instrText xml:space="preserve"> PAGEREF _Toc231037131 \h </w:instrText>
+          <w:instrText xml:space="preserve"> PAGEREF _Toc231039346 \h </w:instrText>
         </w:r>
         <w:r>
           <w:rPr>
@@ -755,7 +755,7 @@
           <w:lang w:eastAsia="pt-BR"/>
         </w:rPr>
       </w:pPr>
-      <w:hyperlink w:anchor="_Toc231037132" w:history="1">
+      <w:hyperlink w:anchor="_Toc231039347" w:history="1">
         <w:r>
           <w:rPr>
             <w:rStyle w:val="Hyperlink"/>
@@ -785,7 +785,7 @@
             <w:noProof/>
             <w:webHidden/>
           </w:rPr>
-          <w:instrText xml:space="preserve"> PAGEREF _Toc231037132 \h </w:instrText>
+          <w:instrText xml:space="preserve"> PAGEREF _Toc231039347 \h </w:instrText>
         </w:r>
         <w:r>
           <w:rPr>
@@ -830,7 +830,7 @@
           <w:lang w:eastAsia="pt-BR"/>
         </w:rPr>
       </w:pPr>
-      <w:hyperlink w:anchor="_Toc231037133" w:history="1">
+      <w:hyperlink w:anchor="_Toc231039348" w:history="1">
         <w:r>
           <w:rPr>
             <w:rStyle w:val="Hyperlink"/>
@@ -859,7 +859,7 @@
             <w:noProof/>
             <w:webHidden/>
           </w:rPr>
-          <w:instrText xml:space="preserve"> PAGEREF _Toc231037133 \h </w:instrText>
+          <w:instrText xml:space="preserve"> PAGEREF _Toc231039348 \h </w:instrText>
         </w:r>
         <w:r>
           <w:rPr>
@@ -904,7 +904,7 @@
           <w:lang w:eastAsia="pt-BR"/>
         </w:rPr>
       </w:pPr>
-      <w:hyperlink w:anchor="_Toc231037134" w:history="1">
+      <w:hyperlink w:anchor="_Toc231039349" w:history="1">
         <w:r>
           <w:rPr>
             <w:rStyle w:val="Hyperlink"/>
@@ -933,7 +933,7 @@
             <w:noProof/>
             <w:webHidden/>
           </w:rPr>
-          <w:instrText xml:space="preserve"> PAGEREF _Toc231037134 \h </w:instrText>
+          <w:instrText xml:space="preserve"> PAGEREF _Toc231039349 \h </w:instrText>
         </w:r>
         <w:r>
           <w:rPr>
@@ -953,7 +953,7 @@
             <w:noProof/>
             <w:webHidden/>
           </w:rPr>
-          <w:t>6</w:t>
+          <w:t>7</w:t>
         </w:r>
         <w:r>
           <w:rPr>
@@ -978,7 +978,7 @@
           <w:lang w:eastAsia="pt-BR"/>
         </w:rPr>
       </w:pPr>
-      <w:hyperlink w:anchor="_Toc231037135" w:history="1">
+      <w:hyperlink w:anchor="_Toc231039350" w:history="1">
         <w:r>
           <w:rPr>
             <w:rStyle w:val="Hyperlink"/>
@@ -1007,7 +1007,7 @@
             <w:noProof/>
             <w:webHidden/>
           </w:rPr>
-          <w:instrText xml:space="preserve"> PAGEREF _Toc231037135 \h </w:instrText>
+          <w:instrText xml:space="preserve"> PAGEREF _Toc231039350 \h </w:instrText>
         </w:r>
         <w:r>
           <w:rPr>
@@ -1052,7 +1052,7 @@
           <w:lang w:eastAsia="pt-BR"/>
         </w:rPr>
       </w:pPr>
-      <w:hyperlink w:anchor="_Toc231037136" w:history="1">
+      <w:hyperlink w:anchor="_Toc231039351" w:history="1">
         <w:r>
           <w:rPr>
             <w:rStyle w:val="Hyperlink"/>
@@ -1081,7 +1081,7 @@
             <w:noProof/>
             <w:webHidden/>
           </w:rPr>
-          <w:instrText xml:space="preserve"> PAGEREF _Toc231037136 \h </w:instrText>
+          <w:instrText xml:space="preserve"> PAGEREF _Toc231039351 \h </w:instrText>
         </w:r>
         <w:r>
           <w:rPr>
@@ -1101,7 +1101,7 @@
             <w:noProof/>
             <w:webHidden/>
           </w:rPr>
-          <w:t>7</w:t>
+          <w:t>10</w:t>
         </w:r>
         <w:r>
           <w:rPr>
@@ -1126,7 +1126,7 @@
           <w:lang w:eastAsia="pt-BR"/>
         </w:rPr>
       </w:pPr>
-      <w:hyperlink w:anchor="_Toc231037137" w:history="1">
+      <w:hyperlink w:anchor="_Toc231039352" w:history="1">
         <w:r>
           <w:rPr>
             <w:rStyle w:val="Hyperlink"/>
@@ -1155,7 +1155,7 @@
             <w:noProof/>
             <w:webHidden/>
           </w:rPr>
-          <w:instrText xml:space="preserve"> PAGEREF _Toc231037137 \h </w:instrText>
+          <w:instrText xml:space="preserve"> PAGEREF _Toc231039352 \h </w:instrText>
         </w:r>
         <w:r>
           <w:rPr>
@@ -1175,7 +1175,7 @@
             <w:noProof/>
             <w:webHidden/>
           </w:rPr>
-          <w:t>8</w:t>
+          <w:t>11</w:t>
         </w:r>
         <w:r>
           <w:rPr>
@@ -1200,7 +1200,7 @@
           <w:lang w:eastAsia="pt-BR"/>
         </w:rPr>
       </w:pPr>
-      <w:hyperlink w:anchor="_Toc231037138" w:history="1">
+      <w:hyperlink w:anchor="_Toc231039353" w:history="1">
         <w:r>
           <w:rPr>
             <w:rStyle w:val="Hyperlink"/>
@@ -1230,7 +1230,7 @@
             <w:noProof/>
             <w:webHidden/>
           </w:rPr>
-          <w:instrText xml:space="preserve"> PAGEREF _Toc231037138 \h </w:instrText>
+          <w:instrText xml:space="preserve"> PAGEREF _Toc231039353 \h </w:instrText>
         </w:r>
         <w:r>
           <w:rPr>
@@ -1250,7 +1250,7 @@
             <w:noProof/>
             <w:webHidden/>
           </w:rPr>
-          <w:t>9</w:t>
+          <w:t>12</w:t>
         </w:r>
         <w:r>
           <w:rPr>
@@ -1275,7 +1275,7 @@
           <w:lang w:eastAsia="pt-BR"/>
         </w:rPr>
       </w:pPr>
-      <w:hyperlink w:anchor="_Toc231037139" w:history="1">
+      <w:hyperlink w:anchor="_Toc231039354" w:history="1">
         <w:r>
           <w:rPr>
             <w:rStyle w:val="Hyperlink"/>
@@ -1304,7 +1304,7 @@
             <w:noProof/>
             <w:webHidden/>
           </w:rPr>
-          <w:instrText xml:space="preserve"> PAGEREF _Toc231037139 \h </w:instrText>
+          <w:instrText xml:space="preserve"> PAGEREF _Toc231039354 \h </w:instrText>
         </w:r>
         <w:r>
           <w:rPr>
@@ -1324,7 +1324,7 @@
             <w:noProof/>
             <w:webHidden/>
           </w:rPr>
-          <w:t>9</w:t>
+          <w:t>12</w:t>
         </w:r>
         <w:r>
           <w:rPr>
@@ -1349,7 +1349,7 @@
           <w:lang w:eastAsia="pt-BR"/>
         </w:rPr>
       </w:pPr>
-      <w:hyperlink w:anchor="_Toc231037140" w:history="1">
+      <w:hyperlink w:anchor="_Toc231039355" w:history="1">
         <w:r>
           <w:rPr>
             <w:rStyle w:val="Hyperlink"/>
@@ -1378,7 +1378,7 @@
             <w:noProof/>
             <w:webHidden/>
           </w:rPr>
-          <w:instrText xml:space="preserve"> PAGEREF _Toc231037140 \h </w:instrText>
+          <w:instrText xml:space="preserve"> PAGEREF _Toc231039355 \h </w:instrText>
         </w:r>
         <w:r>
           <w:rPr>
@@ -1398,7 +1398,7 @@
             <w:noProof/>
             <w:webHidden/>
           </w:rPr>
-          <w:t>10</w:t>
+          <w:t>13</w:t>
         </w:r>
         <w:r>
           <w:rPr>
@@ -1423,7 +1423,7 @@
           <w:lang w:eastAsia="pt-BR"/>
         </w:rPr>
       </w:pPr>
-      <w:hyperlink w:anchor="_Toc231037141" w:history="1">
+      <w:hyperlink w:anchor="_Toc231039356" w:history="1">
         <w:r>
           <w:rPr>
             <w:rStyle w:val="Hyperlink"/>
@@ -1452,7 +1452,7 @@
             <w:noProof/>
             <w:webHidden/>
           </w:rPr>
-          <w:instrText xml:space="preserve"> PAGEREF _Toc231037141 \h </w:instrText>
+          <w:instrText xml:space="preserve"> PAGEREF _Toc231039356 \h </w:instrText>
         </w:r>
         <w:r>
           <w:rPr>
@@ -1472,7 +1472,7 @@
             <w:noProof/>
             <w:webHidden/>
           </w:rPr>
-          <w:t>11</w:t>
+          <w:t>14</w:t>
         </w:r>
         <w:r>
           <w:rPr>
@@ -1497,7 +1497,7 @@
           <w:lang w:eastAsia="pt-BR"/>
         </w:rPr>
       </w:pPr>
-      <w:hyperlink w:anchor="_Toc231037142" w:history="1">
+      <w:hyperlink w:anchor="_Toc231039357" w:history="1">
         <w:r>
           <w:rPr>
             <w:rStyle w:val="Hyperlink"/>
@@ -1526,7 +1526,7 @@
             <w:noProof/>
             <w:webHidden/>
           </w:rPr>
-          <w:instrText xml:space="preserve"> PAGEREF _Toc231037142 \h </w:instrText>
+          <w:instrText xml:space="preserve"> PAGEREF _Toc231039357 \h </w:instrText>
         </w:r>
         <w:r>
           <w:rPr>
@@ -1546,7 +1546,7 @@
             <w:noProof/>
             <w:webHidden/>
           </w:rPr>
-          <w:t>12</w:t>
+          <w:t>15</w:t>
         </w:r>
         <w:r>
           <w:rPr>
@@ -1571,7 +1571,7 @@
           <w:lang w:eastAsia="pt-BR"/>
         </w:rPr>
       </w:pPr>
-      <w:hyperlink w:anchor="_Toc231037143" w:history="1">
+      <w:hyperlink w:anchor="_Toc231039358" w:history="1">
         <w:r>
           <w:rPr>
             <w:rStyle w:val="Hyperlink"/>
@@ -1600,7 +1600,7 @@
             <w:noProof/>
             <w:webHidden/>
           </w:rPr>
-          <w:instrText xml:space="preserve"> PAGEREF _Toc231037143 \h </w:instrText>
+          <w:instrText xml:space="preserve"> PAGEREF _Toc231039358 \h </w:instrText>
         </w:r>
         <w:r>
           <w:rPr>
@@ -1620,7 +1620,7 @@
             <w:noProof/>
             <w:webHidden/>
           </w:rPr>
-          <w:t>13</w:t>
+          <w:t>16</w:t>
         </w:r>
         <w:r>
           <w:rPr>
@@ -1645,7 +1645,7 @@
           <w:lang w:eastAsia="pt-BR"/>
         </w:rPr>
       </w:pPr>
-      <w:hyperlink w:anchor="_Toc231037144" w:history="1">
+      <w:hyperlink w:anchor="_Toc231039359" w:history="1">
         <w:r>
           <w:rPr>
             <w:rStyle w:val="Hyperlink"/>
@@ -1674,7 +1674,7 @@
             <w:noProof/>
             <w:webHidden/>
           </w:rPr>
-          <w:instrText xml:space="preserve"> PAGEREF _Toc231037144 \h </w:instrText>
+          <w:instrText xml:space="preserve"> PAGEREF _Toc231039359 \h </w:instrText>
         </w:r>
         <w:r>
           <w:rPr>
@@ -1694,7 +1694,7 @@
             <w:noProof/>
             <w:webHidden/>
           </w:rPr>
-          <w:t>14</w:t>
+          <w:t>17</w:t>
         </w:r>
         <w:r>
           <w:rPr>
@@ -1719,7 +1719,7 @@
           <w:lang w:eastAsia="pt-BR"/>
         </w:rPr>
       </w:pPr>
-      <w:hyperlink w:anchor="_Toc231037145" w:history="1">
+      <w:hyperlink w:anchor="_Toc231039360" w:history="1">
         <w:r>
           <w:rPr>
             <w:rStyle w:val="Hyperlink"/>
@@ -1748,7 +1748,7 @@
             <w:noProof/>
             <w:webHidden/>
           </w:rPr>
-          <w:instrText xml:space="preserve"> PAGEREF _Toc231037145 \h </w:instrText>
+          <w:instrText xml:space="preserve"> PAGEREF _Toc231039360 \h </w:instrText>
         </w:r>
         <w:r>
           <w:rPr>
@@ -1768,7 +1768,7 @@
             <w:noProof/>
             <w:webHidden/>
           </w:rPr>
-          <w:t>15</w:t>
+          <w:t>18</w:t>
         </w:r>
         <w:r>
           <w:rPr>
@@ -1793,7 +1793,7 @@
           <w:lang w:eastAsia="pt-BR"/>
         </w:rPr>
       </w:pPr>
-      <w:hyperlink w:anchor="_Toc231037146" w:history="1">
+      <w:hyperlink w:anchor="_Toc231039361" w:history="1">
         <w:r>
           <w:rPr>
             <w:rStyle w:val="Hyperlink"/>
@@ -1822,7 +1822,7 @@
             <w:noProof/>
             <w:webHidden/>
           </w:rPr>
-          <w:instrText xml:space="preserve"> PAGEREF _Toc231037146 \h </w:instrText>
+          <w:instrText xml:space="preserve"> PAGEREF _Toc231039361 \h </w:instrText>
         </w:r>
         <w:r>
           <w:rPr>
@@ -1842,7 +1842,7 @@
             <w:noProof/>
             <w:webHidden/>
           </w:rPr>
-          <w:t>16</w:t>
+          <w:t>19</w:t>
         </w:r>
         <w:r>
           <w:rPr>
@@ -1867,7 +1867,7 @@
           <w:lang w:eastAsia="pt-BR"/>
         </w:rPr>
       </w:pPr>
-      <w:hyperlink w:anchor="_Toc231037147" w:history="1">
+      <w:hyperlink w:anchor="_Toc231039362" w:history="1">
         <w:r>
           <w:rPr>
             <w:rStyle w:val="Hyperlink"/>
@@ -1896,7 +1896,7 @@
             <w:noProof/>
             <w:webHidden/>
           </w:rPr>
-          <w:instrText xml:space="preserve"> PAGEREF _Toc231037147 \h </w:instrText>
+          <w:instrText xml:space="preserve"> PAGEREF _Toc231039362 \h </w:instrText>
         </w:r>
         <w:r>
           <w:rPr>
@@ -1916,7 +1916,7 @@
             <w:noProof/>
             <w:webHidden/>
           </w:rPr>
-          <w:t>17</w:t>
+          <w:t>20</w:t>
         </w:r>
         <w:r>
           <w:rPr>
@@ -1941,7 +1941,7 @@
           <w:lang w:eastAsia="pt-BR"/>
         </w:rPr>
       </w:pPr>
-      <w:hyperlink w:anchor="_Toc231037148" w:history="1">
+      <w:hyperlink w:anchor="_Toc231039363" w:history="1">
         <w:r>
           <w:rPr>
             <w:rStyle w:val="Hyperlink"/>
@@ -1970,7 +1970,7 @@
             <w:noProof/>
             <w:webHidden/>
           </w:rPr>
-          <w:instrText xml:space="preserve"> PAGEREF _Toc231037148 \h </w:instrText>
+          <w:instrText xml:space="preserve"> PAGEREF _Toc231039363 \h </w:instrText>
         </w:r>
         <w:r>
           <w:rPr>
@@ -1990,7 +1990,7 @@
             <w:noProof/>
             <w:webHidden/>
           </w:rPr>
-          <w:t>18</w:t>
+          <w:t>21</w:t>
         </w:r>
         <w:r>
           <w:rPr>
@@ -2015,7 +2015,7 @@
           <w:lang w:eastAsia="pt-BR"/>
         </w:rPr>
       </w:pPr>
-      <w:hyperlink w:anchor="_Toc231037149" w:history="1">
+      <w:hyperlink w:anchor="_Toc231039364" w:history="1">
         <w:r>
           <w:rPr>
             <w:rStyle w:val="Hyperlink"/>
@@ -2044,7 +2044,7 @@
             <w:noProof/>
             <w:webHidden/>
           </w:rPr>
-          <w:instrText xml:space="preserve"> PAGEREF _Toc231037149 \h </w:instrText>
+          <w:instrText xml:space="preserve"> PAGEREF _Toc231039364 \h </w:instrText>
         </w:r>
         <w:r>
           <w:rPr>
@@ -2064,7 +2064,7 @@
             <w:noProof/>
             <w:webHidden/>
           </w:rPr>
-          <w:t>19</w:t>
+          <w:t>22</w:t>
         </w:r>
         <w:r>
           <w:rPr>
@@ -2089,7 +2089,7 @@
           <w:lang w:eastAsia="pt-BR"/>
         </w:rPr>
       </w:pPr>
-      <w:hyperlink w:anchor="_Toc231037150" w:history="1">
+      <w:hyperlink w:anchor="_Toc231039365" w:history="1">
         <w:r>
           <w:rPr>
             <w:rStyle w:val="Hyperlink"/>
@@ -2118,7 +2118,7 @@
             <w:noProof/>
             <w:webHidden/>
           </w:rPr>
-          <w:instrText xml:space="preserve"> PAGEREF _Toc231037150 \h </w:instrText>
+          <w:instrText xml:space="preserve"> PAGEREF _Toc231039365 \h </w:instrText>
         </w:r>
         <w:r>
           <w:rPr>
@@ -2138,7 +2138,7 @@
             <w:noProof/>
             <w:webHidden/>
           </w:rPr>
-          <w:t>20</w:t>
+          <w:t>23</w:t>
         </w:r>
         <w:r>
           <w:rPr>
@@ -2163,7 +2163,7 @@
           <w:lang w:eastAsia="pt-BR"/>
         </w:rPr>
       </w:pPr>
-      <w:hyperlink w:anchor="_Toc231037151" w:history="1">
+      <w:hyperlink w:anchor="_Toc231039366" w:history="1">
         <w:r>
           <w:rPr>
             <w:rStyle w:val="Hyperlink"/>
@@ -2192,7 +2192,7 @@
             <w:noProof/>
             <w:webHidden/>
           </w:rPr>
-          <w:instrText xml:space="preserve"> PAGEREF _Toc231037151 \h </w:instrText>
+          <w:instrText xml:space="preserve"> PAGEREF _Toc231039366 \h </w:instrText>
         </w:r>
         <w:r>
           <w:rPr>
@@ -2212,7 +2212,7 @@
             <w:noProof/>
             <w:webHidden/>
           </w:rPr>
-          <w:t>21</w:t>
+          <w:t>24</w:t>
         </w:r>
         <w:r>
           <w:rPr>
@@ -2237,7 +2237,7 @@
           <w:lang w:eastAsia="pt-BR"/>
         </w:rPr>
       </w:pPr>
-      <w:hyperlink w:anchor="_Toc231037152" w:history="1">
+      <w:hyperlink w:anchor="_Toc231039367" w:history="1">
         <w:r>
           <w:rPr>
             <w:rStyle w:val="Hyperlink"/>
@@ -2266,7 +2266,7 @@
             <w:noProof/>
             <w:webHidden/>
           </w:rPr>
-          <w:instrText xml:space="preserve"> PAGEREF _Toc231037152 \h </w:instrText>
+          <w:instrText xml:space="preserve"> PAGEREF _Toc231039367 \h </w:instrText>
         </w:r>
         <w:r>
           <w:rPr>
@@ -2286,7 +2286,7 @@
             <w:noProof/>
             <w:webHidden/>
           </w:rPr>
-          <w:t>22</w:t>
+          <w:t>25</w:t>
         </w:r>
         <w:r>
           <w:rPr>
@@ -2311,7 +2311,7 @@
           <w:lang w:eastAsia="pt-BR"/>
         </w:rPr>
       </w:pPr>
-      <w:hyperlink w:anchor="_Toc231037153" w:history="1">
+      <w:hyperlink w:anchor="_Toc231039368" w:history="1">
         <w:r>
           <w:rPr>
             <w:rStyle w:val="Hyperlink"/>
@@ -2340,7 +2340,7 @@
             <w:noProof/>
             <w:webHidden/>
           </w:rPr>
-          <w:instrText xml:space="preserve"> PAGEREF _Toc231037153 \h </w:instrText>
+          <w:instrText xml:space="preserve"> PAGEREF _Toc231039368 \h </w:instrText>
         </w:r>
         <w:r>
           <w:rPr>
@@ -2360,7 +2360,7 @@
             <w:noProof/>
             <w:webHidden/>
           </w:rPr>
-          <w:t>23</w:t>
+          <w:t>26</w:t>
         </w:r>
         <w:r>
           <w:rPr>
@@ -2385,7 +2385,7 @@
           <w:lang w:eastAsia="pt-BR"/>
         </w:rPr>
       </w:pPr>
-      <w:hyperlink w:anchor="_Toc231037154" w:history="1">
+      <w:hyperlink w:anchor="_Toc231039369" w:history="1">
         <w:r>
           <w:rPr>
             <w:rStyle w:val="Hyperlink"/>
@@ -2414,7 +2414,7 @@
             <w:noProof/>
             <w:webHidden/>
           </w:rPr>
-          <w:instrText xml:space="preserve"> PAGEREF _Toc231037154 \h </w:instrText>
+          <w:instrText xml:space="preserve"> PAGEREF _Toc231039369 \h </w:instrText>
         </w:r>
         <w:r>
           <w:rPr>
@@ -2434,7 +2434,7 @@
             <w:noProof/>
             <w:webHidden/>
           </w:rPr>
-          <w:t>24</w:t>
+          <w:t>27</w:t>
         </w:r>
         <w:r>
           <w:rPr>
@@ -2459,7 +2459,7 @@
           <w:lang w:eastAsia="pt-BR"/>
         </w:rPr>
       </w:pPr>
-      <w:hyperlink w:anchor="_Toc231037155" w:history="1">
+      <w:hyperlink w:anchor="_Toc231039370" w:history="1">
         <w:r>
           <w:rPr>
             <w:rStyle w:val="Hyperlink"/>
@@ -2489,7 +2489,7 @@
             <w:noProof/>
             <w:webHidden/>
           </w:rPr>
-          <w:instrText xml:space="preserve"> PAGEREF _Toc231037155 \h </w:instrText>
+          <w:instrText xml:space="preserve"> PAGEREF _Toc231039370 \h </w:instrText>
         </w:r>
         <w:r>
           <w:rPr>
@@ -2509,7 +2509,7 @@
             <w:noProof/>
             <w:webHidden/>
           </w:rPr>
-          <w:t>26</w:t>
+          <w:t>29</w:t>
         </w:r>
         <w:r>
           <w:rPr>
@@ -2534,7 +2534,7 @@
           <w:lang w:eastAsia="pt-BR"/>
         </w:rPr>
       </w:pPr>
-      <w:hyperlink w:anchor="_Toc231037156" w:history="1">
+      <w:hyperlink w:anchor="_Toc231039371" w:history="1">
         <w:r>
           <w:rPr>
             <w:rStyle w:val="Hyperlink"/>
@@ -2564,7 +2564,7 @@
             <w:noProof/>
             <w:webHidden/>
           </w:rPr>
-          <w:instrText xml:space="preserve"> PAGEREF _Toc231037156 \h </w:instrText>
+          <w:instrText xml:space="preserve"> PAGEREF _Toc231039371 \h </w:instrText>
         </w:r>
         <w:r>
           <w:rPr>
@@ -2584,7 +2584,7 @@
             <w:noProof/>
             <w:webHidden/>
           </w:rPr>
-          <w:t>27</w:t>
+          <w:t>30</w:t>
         </w:r>
         <w:r>
           <w:rPr>
@@ -2610,7 +2610,7 @@
         <w:spacing w:before="360" w:after="360" w:line="360" w:lineRule="auto"/>
         <w:outlineLvl w:val="0"/>
       </w:pPr>
-      <w:bookmarkStart w:id="2" w:name="_Toc231037131"/>
+      <w:bookmarkStart w:id="2" w:name="_Toc231039346"/>
       <w:r>
         <w:rPr>
           <w:rFonts w:ascii="Times New Roman" w:hAnsi="Times New Roman" w:cs="Times New Roman"/>
@@ -2708,7 +2708,7 @@
         <w:spacing w:before="360" w:after="360" w:line="360" w:lineRule="auto"/>
         <w:outlineLvl w:val="0"/>
       </w:pPr>
-      <w:bookmarkStart w:id="3" w:name="_Toc231037132"/>
+      <w:bookmarkStart w:id="3" w:name="_Toc231039347"/>
       <w:r>
         <w:rPr>
           <w:rFonts w:ascii="Times New Roman" w:hAnsi="Times New Roman" w:cs="Times New Roman"/>
@@ -2728,7 +2728,7 @@
         <w:spacing w:before="360" w:after="360" w:line="360" w:lineRule="auto"/>
         <w:outlineLvl w:val="1"/>
       </w:pPr>
-      <w:bookmarkStart w:id="4" w:name="_Toc231037133"/>
+      <w:bookmarkStart w:id="4" w:name="_Toc231039348"/>
       <w:r>
         <w:rPr>
           <w:rFonts w:ascii="Times New Roman" w:hAnsi="Times New Roman" w:cs="Times New Roman"/>
@@ -2763,8 +2763,8 @@
       <w:r>
         <w:rPr>
           <w:rFonts w:ascii="Courier New" w:hAnsi="Courier New" w:cs="Courier New"/>
-          <w:sz w:val="18"/>
-          <w:szCs w:val="18"/>
+          <w:sz w:val="16"/>
+          <w:szCs w:val="16"/>
         </w:rPr>
         <w:t>SolucaoClinicaTEA/</w:t>
       </w:r>
@@ -2777,10 +2777,10 @@
       <w:r>
         <w:rPr>
           <w:rFonts w:ascii="Courier New" w:hAnsi="Courier New" w:cs="Courier New"/>
-          <w:sz w:val="18"/>
-          <w:szCs w:val="18"/>
-        </w:rPr>
-        <w:t xml:space="preserve"> CT_Negocio/              (camada de negocio e dados)</w:t>
+          <w:sz w:val="16"/>
+          <w:szCs w:val="16"/>
+        </w:rPr>
+        <w:t>├── CT_Negocio/              ← Camada de negócio e dados</w:t>
       </w:r>
     </w:p>
     <w:p>
@@ -2791,10 +2791,10 @@
       <w:r>
         <w:rPr>
           <w:rFonts w:ascii="Courier New" w:hAnsi="Courier New" w:cs="Courier New"/>
-          <w:sz w:val="18"/>
-          <w:szCs w:val="18"/>
-        </w:rPr>
-        <w:t xml:space="preserve">   Infraestrutura/        Conexao.cs, CriptografiaSenha.cs</w:t>
+          <w:sz w:val="16"/>
+          <w:szCs w:val="16"/>
+        </w:rPr>
+        <w:t>│   ├── Infraestrutura/</w:t>
       </w:r>
     </w:p>
     <w:p>
@@ -2805,10 +2805,10 @@
       <w:r>
         <w:rPr>
           <w:rFonts w:ascii="Courier New" w:hAnsi="Courier New" w:cs="Courier New"/>
-          <w:sz w:val="18"/>
-          <w:szCs w:val="18"/>
-        </w:rPr>
-        <w:t xml:space="preserve">   Mapeamento/            classes POCO (espelham as tabelas)</w:t>
+          <w:sz w:val="16"/>
+          <w:szCs w:val="16"/>
+        </w:rPr>
+        <w:t>│   │   ├── Conexao.cs           (fábrica de conexões, lê App.config)</w:t>
       </w:r>
     </w:p>
     <w:p>
@@ -2819,10 +2819,10 @@
       <w:r>
         <w:rPr>
           <w:rFonts w:ascii="Courier New" w:hAnsi="Courier New" w:cs="Courier New"/>
-          <w:sz w:val="18"/>
-          <w:szCs w:val="18"/>
-        </w:rPr>
-        <w:t xml:space="preserve">   DAO/                   acesso a dados via Dapper</w:t>
+          <w:sz w:val="16"/>
+          <w:szCs w:val="16"/>
+        </w:rPr>
+        <w:t>│   │   └── CriptografiaSenha.cs (SHA-256 + salt para senhas)</w:t>
       </w:r>
     </w:p>
     <w:p>
@@ -2833,10 +2833,10 @@
       <w:r>
         <w:rPr>
           <w:rFonts w:ascii="Courier New" w:hAnsi="Courier New" w:cs="Courier New"/>
-          <w:sz w:val="18"/>
-          <w:szCs w:val="18"/>
-        </w:rPr>
-        <w:t xml:space="preserve">   Servicos/              AutenticacaoServico.cs</w:t>
+          <w:sz w:val="16"/>
+          <w:szCs w:val="16"/>
+        </w:rPr>
+        <w:t>│   ├── Mapeamento/              (classes POCO — espelham as tabelas do banco)</w:t>
       </w:r>
     </w:p>
     <w:p>
@@ -2847,10 +2847,10 @@
       <w:r>
         <w:rPr>
           <w:rFonts w:ascii="Courier New" w:hAnsi="Courier New" w:cs="Courier New"/>
-          <w:sz w:val="18"/>
-          <w:szCs w:val="18"/>
-        </w:rPr>
-        <w:t xml:space="preserve"> CT_Win/                  (camada de apresentacao - Windows Forms)</w:t>
+          <w:sz w:val="16"/>
+          <w:szCs w:val="16"/>
+        </w:rPr>
+        <w:t>│   │   ├── Agendamento.cs</w:t>
       </w:r>
     </w:p>
     <w:p>
@@ -2861,10 +2861,10 @@
       <w:r>
         <w:rPr>
           <w:rFonts w:ascii="Courier New" w:hAnsi="Courier New" w:cs="Courier New"/>
-          <w:sz w:val="18"/>
-          <w:szCs w:val="18"/>
-        </w:rPr>
-        <w:t xml:space="preserve">   Forms/                 formularios e modais</w:t>
+          <w:sz w:val="16"/>
+          <w:szCs w:val="16"/>
+        </w:rPr>
+        <w:t>│   │   ├── Cidade.cs</w:t>
       </w:r>
     </w:p>
     <w:p>
@@ -2875,10 +2875,10 @@
       <w:r>
         <w:rPr>
           <w:rFonts w:ascii="Courier New" w:hAnsi="Courier New" w:cs="Courier New"/>
-          <w:sz w:val="18"/>
-          <w:szCs w:val="18"/>
-        </w:rPr>
-        <w:t xml:space="preserve">   UserControls/          modulos de tela cheia</w:t>
+          <w:sz w:val="16"/>
+          <w:szCs w:val="16"/>
+        </w:rPr>
+        <w:t>│   │   ├── Especialidade.cs</w:t>
       </w:r>
     </w:p>
     <w:p>
@@ -2889,10 +2889,598 @@
       <w:r>
         <w:rPr>
           <w:rFonts w:ascii="Courier New" w:hAnsi="Courier New" w:cs="Courier New"/>
-          <w:sz w:val="18"/>
-          <w:szCs w:val="18"/>
-        </w:rPr>
-        <w:t xml:space="preserve">   Recursos/              Theme.cs (paleta de cores e fontes)</w:t>
+          <w:sz w:val="16"/>
+          <w:szCs w:val="16"/>
+        </w:rPr>
+        <w:t>│   │   ├── EvolucaoSessao.cs</w:t>
+      </w:r>
+    </w:p>
+    <w:p>
+      <w:pPr>
+        <w:spacing w:after="0" w:line="240" w:lineRule="auto"/>
+        <w:ind w:left="357"/>
+      </w:pPr>
+      <w:r>
+        <w:rPr>
+          <w:rFonts w:ascii="Courier New" w:hAnsi="Courier New" w:cs="Courier New"/>
+          <w:sz w:val="16"/>
+          <w:szCs w:val="16"/>
+        </w:rPr>
+        <w:t>│   │   ├── ObjetivoTerapeutico.cs</w:t>
+      </w:r>
+    </w:p>
+    <w:p>
+      <w:pPr>
+        <w:spacing w:after="0" w:line="240" w:lineRule="auto"/>
+        <w:ind w:left="357"/>
+      </w:pPr>
+      <w:r>
+        <w:rPr>
+          <w:rFonts w:ascii="Courier New" w:hAnsi="Courier New" w:cs="Courier New"/>
+          <w:sz w:val="16"/>
+          <w:szCs w:val="16"/>
+        </w:rPr>
+        <w:t>│   │   ├── Paciente.cs</w:t>
+      </w:r>
+    </w:p>
+    <w:p>
+      <w:pPr>
+        <w:spacing w:after="0" w:line="240" w:lineRule="auto"/>
+        <w:ind w:left="357"/>
+      </w:pPr>
+      <w:r>
+        <w:rPr>
+          <w:rFonts w:ascii="Courier New" w:hAnsi="Courier New" w:cs="Courier New"/>
+          <w:sz w:val="16"/>
+          <w:szCs w:val="16"/>
+        </w:rPr>
+        <w:t>│   │   ├── Profissional.cs</w:t>
+      </w:r>
+    </w:p>
+    <w:p>
+      <w:pPr>
+        <w:spacing w:after="0" w:line="240" w:lineRule="auto"/>
+        <w:ind w:left="357"/>
+      </w:pPr>
+      <w:r>
+        <w:rPr>
+          <w:rFonts w:ascii="Courier New" w:hAnsi="Courier New" w:cs="Courier New"/>
+          <w:sz w:val="16"/>
+          <w:szCs w:val="16"/>
+        </w:rPr>
+        <w:t>│   │   ├── Sala.cs</w:t>
+      </w:r>
+    </w:p>
+    <w:p>
+      <w:pPr>
+        <w:spacing w:after="0" w:line="240" w:lineRule="auto"/>
+        <w:ind w:left="357"/>
+      </w:pPr>
+      <w:r>
+        <w:rPr>
+          <w:rFonts w:ascii="Courier New" w:hAnsi="Courier New" w:cs="Courier New"/>
+          <w:sz w:val="16"/>
+          <w:szCs w:val="16"/>
+        </w:rPr>
+        <w:t>│   │   └── Usuario.cs</w:t>
+      </w:r>
+    </w:p>
+    <w:p>
+      <w:pPr>
+        <w:spacing w:after="0" w:line="240" w:lineRule="auto"/>
+        <w:ind w:left="357"/>
+      </w:pPr>
+      <w:r>
+        <w:rPr>
+          <w:rFonts w:ascii="Courier New" w:hAnsi="Courier New" w:cs="Courier New"/>
+          <w:sz w:val="16"/>
+          <w:szCs w:val="16"/>
+        </w:rPr>
+        <w:t>│   ├── DAO/                     (acesso a dados via Dapper)</w:t>
+      </w:r>
+    </w:p>
+    <w:p>
+      <w:pPr>
+        <w:spacing w:after="0" w:line="240" w:lineRule="auto"/>
+        <w:ind w:left="357"/>
+      </w:pPr>
+      <w:r>
+        <w:rPr>
+          <w:rFonts w:ascii="Courier New" w:hAnsi="Courier New" w:cs="Courier New"/>
+          <w:sz w:val="16"/>
+          <w:szCs w:val="16"/>
+        </w:rPr>
+        <w:t>│   │   ├── AgendamentoDAO.cs</w:t>
+      </w:r>
+    </w:p>
+    <w:p>
+      <w:pPr>
+        <w:spacing w:after="0" w:line="240" w:lineRule="auto"/>
+        <w:ind w:left="357"/>
+      </w:pPr>
+      <w:r>
+        <w:rPr>
+          <w:rFonts w:ascii="Courier New" w:hAnsi="Courier New" w:cs="Courier New"/>
+          <w:sz w:val="16"/>
+          <w:szCs w:val="16"/>
+        </w:rPr>
+        <w:t>│   │   ├── CidadeDAO.cs</w:t>
+      </w:r>
+    </w:p>
+    <w:p>
+      <w:pPr>
+        <w:spacing w:after="0" w:line="240" w:lineRule="auto"/>
+        <w:ind w:left="357"/>
+      </w:pPr>
+      <w:r>
+        <w:rPr>
+          <w:rFonts w:ascii="Courier New" w:hAnsi="Courier New" w:cs="Courier New"/>
+          <w:sz w:val="16"/>
+          <w:szCs w:val="16"/>
+        </w:rPr>
+        <w:t>│   │   ├── EspecialidadeDAO.cs</w:t>
+      </w:r>
+    </w:p>
+    <w:p>
+      <w:pPr>
+        <w:spacing w:after="0" w:line="240" w:lineRule="auto"/>
+        <w:ind w:left="357"/>
+      </w:pPr>
+      <w:r>
+        <w:rPr>
+          <w:rFonts w:ascii="Courier New" w:hAnsi="Courier New" w:cs="Courier New"/>
+          <w:sz w:val="16"/>
+          <w:szCs w:val="16"/>
+        </w:rPr>
+        <w:t>│   │   ├── EvolucaoSessaoDAO.cs</w:t>
+      </w:r>
+    </w:p>
+    <w:p>
+      <w:pPr>
+        <w:spacing w:after="0" w:line="240" w:lineRule="auto"/>
+        <w:ind w:left="357"/>
+      </w:pPr>
+      <w:r>
+        <w:rPr>
+          <w:rFonts w:ascii="Courier New" w:hAnsi="Courier New" w:cs="Courier New"/>
+          <w:sz w:val="16"/>
+          <w:szCs w:val="16"/>
+        </w:rPr>
+        <w:t>│   │   ├── ObjetivoTerapeuticoDAO.cs</w:t>
+      </w:r>
+    </w:p>
+    <w:p>
+      <w:pPr>
+        <w:spacing w:after="0" w:line="240" w:lineRule="auto"/>
+        <w:ind w:left="357"/>
+      </w:pPr>
+      <w:r>
+        <w:rPr>
+          <w:rFonts w:ascii="Courier New" w:hAnsi="Courier New" w:cs="Courier New"/>
+          <w:sz w:val="16"/>
+          <w:szCs w:val="16"/>
+        </w:rPr>
+        <w:t>│   │   ├── PacienteDAO.cs</w:t>
+      </w:r>
+    </w:p>
+    <w:p>
+      <w:pPr>
+        <w:spacing w:after="0" w:line="240" w:lineRule="auto"/>
+        <w:ind w:left="357"/>
+      </w:pPr>
+      <w:r>
+        <w:rPr>
+          <w:rFonts w:ascii="Courier New" w:hAnsi="Courier New" w:cs="Courier New"/>
+          <w:sz w:val="16"/>
+          <w:szCs w:val="16"/>
+        </w:rPr>
+        <w:t>│   │   ├── ProfissionalDAO.cs</w:t>
+      </w:r>
+    </w:p>
+    <w:p>
+      <w:pPr>
+        <w:spacing w:after="0" w:line="240" w:lineRule="auto"/>
+        <w:ind w:left="357"/>
+      </w:pPr>
+      <w:r>
+        <w:rPr>
+          <w:rFonts w:ascii="Courier New" w:hAnsi="Courier New" w:cs="Courier New"/>
+          <w:sz w:val="16"/>
+          <w:szCs w:val="16"/>
+        </w:rPr>
+        <w:t>│   │   ├── RelatorioDAO.cs</w:t>
+      </w:r>
+    </w:p>
+    <w:p>
+      <w:pPr>
+        <w:spacing w:after="0" w:line="240" w:lineRule="auto"/>
+        <w:ind w:left="357"/>
+      </w:pPr>
+      <w:r>
+        <w:rPr>
+          <w:rFonts w:ascii="Courier New" w:hAnsi="Courier New" w:cs="Courier New"/>
+          <w:sz w:val="16"/>
+          <w:szCs w:val="16"/>
+        </w:rPr>
+        <w:t>│   │   ├── SalaDAO.cs</w:t>
+      </w:r>
+    </w:p>
+    <w:p>
+      <w:pPr>
+        <w:spacing w:after="0" w:line="240" w:lineRule="auto"/>
+        <w:ind w:left="357"/>
+      </w:pPr>
+      <w:r>
+        <w:rPr>
+          <w:rFonts w:ascii="Courier New" w:hAnsi="Courier New" w:cs="Courier New"/>
+          <w:sz w:val="16"/>
+          <w:szCs w:val="16"/>
+        </w:rPr>
+        <w:t>│   │   └── UsuarioDAO.cs</w:t>
+      </w:r>
+    </w:p>
+    <w:p>
+      <w:pPr>
+        <w:spacing w:after="0" w:line="240" w:lineRule="auto"/>
+        <w:ind w:left="357"/>
+      </w:pPr>
+      <w:r>
+        <w:rPr>
+          <w:rFonts w:ascii="Courier New" w:hAnsi="Courier New" w:cs="Courier New"/>
+          <w:sz w:val="16"/>
+          <w:szCs w:val="16"/>
+        </w:rPr>
+        <w:t>│   └── Servicos/</w:t>
+      </w:r>
+    </w:p>
+    <w:p>
+      <w:pPr>
+        <w:spacing w:after="0" w:line="240" w:lineRule="auto"/>
+        <w:ind w:left="357"/>
+      </w:pPr>
+      <w:r>
+        <w:rPr>
+          <w:rFonts w:ascii="Courier New" w:hAnsi="Courier New" w:cs="Courier New"/>
+          <w:sz w:val="16"/>
+          <w:szCs w:val="16"/>
+        </w:rPr>
+        <w:t>│       ├── AutenticacaoServico.cs</w:t>
+      </w:r>
+    </w:p>
+    <w:p>
+      <w:pPr>
+        <w:spacing w:after="0" w:line="240" w:lineRule="auto"/>
+        <w:ind w:left="357"/>
+      </w:pPr>
+      <w:r>
+        <w:rPr>
+          <w:rFonts w:ascii="Courier New" w:hAnsi="Courier New" w:cs="Courier New"/>
+          <w:sz w:val="16"/>
+          <w:szCs w:val="16"/>
+        </w:rPr>
+        <w:t>│       └── ResultadoAutenticacao.cs</w:t>
+      </w:r>
+    </w:p>
+    <w:p>
+      <w:pPr>
+        <w:spacing w:after="0" w:line="240" w:lineRule="auto"/>
+        <w:ind w:left="357"/>
+      </w:pPr>
+      <w:r>
+        <w:rPr>
+          <w:rFonts w:ascii="Courier New" w:hAnsi="Courier New" w:cs="Courier New"/>
+          <w:sz w:val="16"/>
+          <w:szCs w:val="16"/>
+        </w:rPr>
+        <w:t>│</w:t>
+      </w:r>
+    </w:p>
+    <w:p>
+      <w:pPr>
+        <w:spacing w:after="0" w:line="240" w:lineRule="auto"/>
+        <w:ind w:left="357"/>
+      </w:pPr>
+      <w:r>
+        <w:rPr>
+          <w:rFonts w:ascii="Courier New" w:hAnsi="Courier New" w:cs="Courier New"/>
+          <w:sz w:val="16"/>
+          <w:szCs w:val="16"/>
+        </w:rPr>
+        <w:t>└── CT_Win/                  ← Camada de apresentação (Windows Forms)</w:t>
+      </w:r>
+    </w:p>
+    <w:p>
+      <w:pPr>
+        <w:spacing w:after="0" w:line="240" w:lineRule="auto"/>
+        <w:ind w:left="357"/>
+      </w:pPr>
+      <w:r>
+        <w:rPr>
+          <w:rFonts w:ascii="Courier New" w:hAnsi="Courier New" w:cs="Courier New"/>
+          <w:sz w:val="16"/>
+          <w:szCs w:val="16"/>
+        </w:rPr>
+        <w:t xml:space="preserve">    ├── Forms/</w:t>
+      </w:r>
+    </w:p>
+    <w:p>
+      <w:pPr>
+        <w:spacing w:after="0" w:line="240" w:lineRule="auto"/>
+        <w:ind w:left="357"/>
+      </w:pPr>
+      <w:r>
+        <w:rPr>
+          <w:rFonts w:ascii="Courier New" w:hAnsi="Courier New" w:cs="Courier New"/>
+          <w:sz w:val="16"/>
+          <w:szCs w:val="16"/>
+        </w:rPr>
+        <w:t xml:space="preserve">    │   ├── LoginForm              (autenticação)</w:t>
+      </w:r>
+    </w:p>
+    <w:p>
+      <w:pPr>
+        <w:spacing w:after="0" w:line="240" w:lineRule="auto"/>
+        <w:ind w:left="357"/>
+      </w:pPr>
+      <w:r>
+        <w:rPr>
+          <w:rFonts w:ascii="Courier New" w:hAnsi="Courier New" w:cs="Courier New"/>
+          <w:sz w:val="16"/>
+          <w:szCs w:val="16"/>
+        </w:rPr>
+        <w:t xml:space="preserve">    │   ├── PrincipalForm          (janela principal / dashboard)</w:t>
+      </w:r>
+    </w:p>
+    <w:p>
+      <w:pPr>
+        <w:spacing w:after="0" w:line="240" w:lineRule="auto"/>
+        <w:ind w:left="357"/>
+      </w:pPr>
+      <w:r>
+        <w:rPr>
+          <w:rFonts w:ascii="Courier New" w:hAnsi="Courier New" w:cs="Courier New"/>
+          <w:sz w:val="16"/>
+          <w:szCs w:val="16"/>
+        </w:rPr>
+        <w:t xml:space="preserve">    │   ├── AgendamentoForm        (modal de novo/editar agendamento)</w:t>
+      </w:r>
+    </w:p>
+    <w:p>
+      <w:pPr>
+        <w:spacing w:after="0" w:line="240" w:lineRule="auto"/>
+        <w:ind w:left="357"/>
+      </w:pPr>
+      <w:r>
+        <w:rPr>
+          <w:rFonts w:ascii="Courier New" w:hAnsi="Courier New" w:cs="Courier New"/>
+          <w:sz w:val="16"/>
+          <w:szCs w:val="16"/>
+        </w:rPr>
+        <w:t xml:space="preserve">    │   ├── PacienteForm           (modal de cadastro/edição de paciente)</w:t>
+      </w:r>
+    </w:p>
+    <w:p>
+      <w:pPr>
+        <w:spacing w:after="0" w:line="240" w:lineRule="auto"/>
+        <w:ind w:left="357"/>
+      </w:pPr>
+      <w:r>
+        <w:rPr>
+          <w:rFonts w:ascii="Courier New" w:hAnsi="Courier New" w:cs="Courier New"/>
+          <w:sz w:val="16"/>
+          <w:szCs w:val="16"/>
+        </w:rPr>
+        <w:t xml:space="preserve">    │   ├── ProfissionalForm       (modal de cadastro/edição de profissional)</w:t>
+      </w:r>
+    </w:p>
+    <w:p>
+      <w:pPr>
+        <w:spacing w:after="0" w:line="240" w:lineRule="auto"/>
+        <w:ind w:left="357"/>
+      </w:pPr>
+      <w:r>
+        <w:rPr>
+          <w:rFonts w:ascii="Courier New" w:hAnsi="Courier New" w:cs="Courier New"/>
+          <w:sz w:val="16"/>
+          <w:szCs w:val="16"/>
+        </w:rPr>
+        <w:t xml:space="preserve">    │   ├── SalaForm               (modal de cadastro/edição de sala)</w:t>
+      </w:r>
+    </w:p>
+    <w:p>
+      <w:pPr>
+        <w:spacing w:after="0" w:line="240" w:lineRule="auto"/>
+        <w:ind w:left="357"/>
+      </w:pPr>
+      <w:r>
+        <w:rPr>
+          <w:rFonts w:ascii="Courier New" w:hAnsi="Courier New" w:cs="Courier New"/>
+          <w:sz w:val="16"/>
+          <w:szCs w:val="16"/>
+        </w:rPr>
+        <w:t xml:space="preserve">    │   ├── EspecialidadeForm      (modal de especialidade com preview de cor)</w:t>
+      </w:r>
+    </w:p>
+    <w:p>
+      <w:pPr>
+        <w:spacing w:after="0" w:line="240" w:lineRule="auto"/>
+        <w:ind w:left="357"/>
+      </w:pPr>
+      <w:r>
+        <w:rPr>
+          <w:rFonts w:ascii="Courier New" w:hAnsi="Courier New" w:cs="Courier New"/>
+          <w:sz w:val="16"/>
+          <w:szCs w:val="16"/>
+        </w:rPr>
+        <w:t xml:space="preserve">    │   ├── EvolucaoSessaoForm     (modal de registro de evolução)</w:t>
+      </w:r>
+    </w:p>
+    <w:p>
+      <w:pPr>
+        <w:spacing w:after="0" w:line="240" w:lineRule="auto"/>
+        <w:ind w:left="357"/>
+      </w:pPr>
+      <w:r>
+        <w:rPr>
+          <w:rFonts w:ascii="Courier New" w:hAnsi="Courier New" w:cs="Courier New"/>
+          <w:sz w:val="16"/>
+          <w:szCs w:val="16"/>
+        </w:rPr>
+        <w:t xml:space="preserve">    │   ├── ObjetivoItemForm       (modal de objetivo terapêutico)</w:t>
+      </w:r>
+    </w:p>
+    <w:p>
+      <w:pPr>
+        <w:spacing w:after="0" w:line="240" w:lineRule="auto"/>
+        <w:ind w:left="357"/>
+      </w:pPr>
+      <w:r>
+        <w:rPr>
+          <w:rFonts w:ascii="Courier New" w:hAnsi="Courier New" w:cs="Courier New"/>
+          <w:sz w:val="16"/>
+          <w:szCs w:val="16"/>
+        </w:rPr>
+        <w:t xml:space="preserve">    │   ├── ObjetivosForm          (lista de objetivos de um paciente)</w:t>
+      </w:r>
+    </w:p>
+    <w:p>
+      <w:pPr>
+        <w:spacing w:after="0" w:line="240" w:lineRule="auto"/>
+        <w:ind w:left="357"/>
+      </w:pPr>
+      <w:r>
+        <w:rPr>
+          <w:rFonts w:ascii="Courier New" w:hAnsi="Courier New" w:cs="Courier New"/>
+          <w:sz w:val="16"/>
+          <w:szCs w:val="16"/>
+        </w:rPr>
+        <w:t xml:space="preserve">    │   └── RelatorioViewerForm    (visualizador genérico com impressão)</w:t>
+      </w:r>
+    </w:p>
+    <w:p>
+      <w:pPr>
+        <w:spacing w:after="0" w:line="240" w:lineRule="auto"/>
+        <w:ind w:left="357"/>
+      </w:pPr>
+      <w:r>
+        <w:rPr>
+          <w:rFonts w:ascii="Courier New" w:hAnsi="Courier New" w:cs="Courier New"/>
+          <w:sz w:val="16"/>
+          <w:szCs w:val="16"/>
+        </w:rPr>
+        <w:t xml:space="preserve">    ├── UserControls/</w:t>
+      </w:r>
+    </w:p>
+    <w:p>
+      <w:pPr>
+        <w:spacing w:after="0" w:line="240" w:lineRule="auto"/>
+        <w:ind w:left="357"/>
+      </w:pPr>
+      <w:r>
+        <w:rPr>
+          <w:rFonts w:ascii="Courier New" w:hAnsi="Courier New" w:cs="Courier New"/>
+          <w:sz w:val="16"/>
+          <w:szCs w:val="16"/>
+        </w:rPr>
+        <w:t xml:space="preserve">    │   ├── AgendaUserControl      (módulo de agenda — tela cheia)</w:t>
+      </w:r>
+    </w:p>
+    <w:p>
+      <w:pPr>
+        <w:spacing w:after="0" w:line="240" w:lineRule="auto"/>
+        <w:ind w:left="357"/>
+      </w:pPr>
+      <w:r>
+        <w:rPr>
+          <w:rFonts w:ascii="Courier New" w:hAnsi="Courier New" w:cs="Courier New"/>
+          <w:sz w:val="16"/>
+          <w:szCs w:val="16"/>
+        </w:rPr>
+        <w:t xml:space="preserve">    │   ├── PacienteUserControl    (módulo de pacientes)</w:t>
+      </w:r>
+    </w:p>
+    <w:p>
+      <w:pPr>
+        <w:spacing w:after="0" w:line="240" w:lineRule="auto"/>
+        <w:ind w:left="357"/>
+      </w:pPr>
+      <w:r>
+        <w:rPr>
+          <w:rFonts w:ascii="Courier New" w:hAnsi="Courier New" w:cs="Courier New"/>
+          <w:sz w:val="16"/>
+          <w:szCs w:val="16"/>
+        </w:rPr>
+        <w:t xml:space="preserve">    │   ├── ProfissionalUserControl</w:t>
+      </w:r>
+    </w:p>
+    <w:p>
+      <w:pPr>
+        <w:spacing w:after="0" w:line="240" w:lineRule="auto"/>
+        <w:ind w:left="357"/>
+      </w:pPr>
+      <w:r>
+        <w:rPr>
+          <w:rFonts w:ascii="Courier New" w:hAnsi="Courier New" w:cs="Courier New"/>
+          <w:sz w:val="16"/>
+          <w:szCs w:val="16"/>
+        </w:rPr>
+        <w:t xml:space="preserve">    │   ├── EspecialidadeUserControl</w:t>
+      </w:r>
+    </w:p>
+    <w:p>
+      <w:pPr>
+        <w:spacing w:after="0" w:line="240" w:lineRule="auto"/>
+        <w:ind w:left="357"/>
+      </w:pPr>
+      <w:r>
+        <w:rPr>
+          <w:rFonts w:ascii="Courier New" w:hAnsi="Courier New" w:cs="Courier New"/>
+          <w:sz w:val="16"/>
+          <w:szCs w:val="16"/>
+        </w:rPr>
+        <w:t xml:space="preserve">    │   ├── SalaUserControl</w:t>
+      </w:r>
+    </w:p>
+    <w:p>
+      <w:pPr>
+        <w:spacing w:after="0" w:line="240" w:lineRule="auto"/>
+        <w:ind w:left="357"/>
+      </w:pPr>
+      <w:r>
+        <w:rPr>
+          <w:rFonts w:ascii="Courier New" w:hAnsi="Courier New" w:cs="Courier New"/>
+          <w:sz w:val="16"/>
+          <w:szCs w:val="16"/>
+        </w:rPr>
+        <w:t xml:space="preserve">    │   └── RelatorioUserControl   (painel de seleção de relatórios)</w:t>
+      </w:r>
+    </w:p>
+    <w:p>
+      <w:pPr>
+        <w:spacing w:after="0" w:line="240" w:lineRule="auto"/>
+        <w:ind w:left="357"/>
+      </w:pPr>
+      <w:r>
+        <w:rPr>
+          <w:rFonts w:ascii="Courier New" w:hAnsi="Courier New" w:cs="Courier New"/>
+          <w:sz w:val="16"/>
+          <w:szCs w:val="16"/>
+        </w:rPr>
+        <w:t xml:space="preserve">    └── Recursos/</w:t>
+      </w:r>
+    </w:p>
+    <w:p>
+      <w:pPr>
+        <w:spacing w:after="0" w:line="240" w:lineRule="auto"/>
+        <w:ind w:left="357"/>
+      </w:pPr>
+      <w:r>
+        <w:rPr>
+          <w:rFonts w:ascii="Courier New" w:hAnsi="Courier New" w:cs="Courier New"/>
+          <w:sz w:val="16"/>
+          <w:szCs w:val="16"/>
+        </w:rPr>
+        <w:t xml:space="preserve">        └── Theme.cs               (paleta de cores e fontes centralizada)</w:t>
       </w:r>
     </w:p>
     <w:p>
@@ -2916,7 +3504,7 @@
         <w:spacing w:before="360" w:after="360" w:line="360" w:lineRule="auto"/>
         <w:outlineLvl w:val="1"/>
       </w:pPr>
-      <w:bookmarkStart w:id="5" w:name="_Toc231037134"/>
+      <w:bookmarkStart w:id="5" w:name="_Toc231039349"/>
       <w:r>
         <w:rPr>
           <w:rFonts w:ascii="Times New Roman" w:hAnsi="Times New Roman" w:cs="Times New Roman"/>
@@ -2924,6 +3512,7 @@
           <w:sz w:val="24"/>
           <w:szCs w:val="24"/>
         </w:rPr>
+        <w:lastRenderedPageBreak/>
         <w:t>2.2 Linguagem e Framework</w:t>
       </w:r>
       <w:bookmarkEnd w:id="5"/>
@@ -3047,7 +3636,7 @@
         <w:spacing w:before="360" w:after="360" w:line="360" w:lineRule="auto"/>
         <w:outlineLvl w:val="1"/>
       </w:pPr>
-      <w:bookmarkStart w:id="6" w:name="_Toc231037135"/>
+      <w:bookmarkStart w:id="6" w:name="_Toc231039350"/>
       <w:r>
         <w:rPr>
           <w:rFonts w:ascii="Times New Roman" w:hAnsi="Times New Roman" w:cs="Times New Roman"/>
@@ -3055,7 +3644,6 @@
           <w:sz w:val="24"/>
           <w:szCs w:val="24"/>
         </w:rPr>
-        <w:lastRenderedPageBreak/>
         <w:t>2.3 Banco de Dados e Justificativa</w:t>
       </w:r>
       <w:bookmarkEnd w:id="6"/>
@@ -3150,6 +3738,2415 @@
           <w:szCs w:val="24"/>
         </w:rPr>
         <w:t>O banco possui nove tabelas inter-relacionadas: Cidades, Pacientes, Agendamentos, EvolucoesSessao, Profissionais, Especialidades, Salas, Usuarios e ObjetivosTerapeuticos.</w:t>
+      </w:r>
+    </w:p>
+    <w:p>
+      <w:pPr>
+        <w:spacing w:after="0" w:line="360" w:lineRule="auto"/>
+        <w:ind w:firstLine="709"/>
+        <w:jc w:val="both"/>
+      </w:pPr>
+      <w:r>
+        <w:rPr>
+          <w:rFonts w:ascii="Times New Roman" w:hAnsi="Times New Roman" w:cs="Times New Roman"/>
+          <w:sz w:val="24"/>
+          <w:szCs w:val="24"/>
+        </w:rPr>
+        <w:t>Para fins de reprodutibilidade, apresenta-se a seguir o script de criação do banco de dados (arquivo schema.sql), com a definição das nove tabelas, suas chaves e relacionamentos, os índices de desempenho e a carga inicial de dados (seed):</w:t>
+      </w:r>
+    </w:p>
+    <w:p>
+      <w:pPr>
+        <w:spacing w:after="0" w:line="240" w:lineRule="auto"/>
+      </w:pPr>
+      <w:r>
+        <w:rPr>
+          <w:rFonts w:ascii="Courier New" w:hAnsi="Courier New" w:cs="Courier New"/>
+          <w:sz w:val="14"/>
+          <w:szCs w:val="14"/>
+        </w:rPr>
+        <w:lastRenderedPageBreak/>
+        <w:t>-- =============================================================================</w:t>
+      </w:r>
+    </w:p>
+    <w:p>
+      <w:pPr>
+        <w:spacing w:after="0" w:line="240" w:lineRule="auto"/>
+      </w:pPr>
+      <w:r>
+        <w:rPr>
+          <w:rFonts w:ascii="Courier New" w:hAnsi="Courier New" w:cs="Courier New"/>
+          <w:sz w:val="14"/>
+          <w:szCs w:val="14"/>
+        </w:rPr>
+        <w:t>-- ClinicaTEA -- Schema do Banco de Dados</w:t>
+      </w:r>
+    </w:p>
+    <w:p>
+      <w:pPr>
+        <w:spacing w:after="0" w:line="240" w:lineRule="auto"/>
+      </w:pPr>
+      <w:r>
+        <w:rPr>
+          <w:rFonts w:ascii="Courier New" w:hAnsi="Courier New" w:cs="Courier New"/>
+          <w:sz w:val="14"/>
+          <w:szCs w:val="14"/>
+        </w:rPr>
+        <w:t>-- SQL Server Express  |  Banco: ClinicaTEA</w:t>
+      </w:r>
+    </w:p>
+    <w:p>
+      <w:pPr>
+        <w:spacing w:after="0" w:line="240" w:lineRule="auto"/>
+      </w:pPr>
+      <w:r>
+        <w:rPr>
+          <w:rFonts w:ascii="Courier New" w:hAnsi="Courier New" w:cs="Courier New"/>
+          <w:sz w:val="14"/>
+          <w:szCs w:val="14"/>
+        </w:rPr>
+        <w:t>-- Gerado a partir do código-fonte do projeto CT_Negocio</w:t>
+      </w:r>
+    </w:p>
+    <w:p>
+      <w:pPr>
+        <w:spacing w:after="0" w:line="240" w:lineRule="auto"/>
+      </w:pPr>
+      <w:r>
+        <w:rPr>
+          <w:rFonts w:ascii="Courier New" w:hAnsi="Courier New" w:cs="Courier New"/>
+          <w:sz w:val="14"/>
+          <w:szCs w:val="14"/>
+        </w:rPr>
+        <w:t>-- =============================================================================</w:t>
+      </w:r>
+    </w:p>
+    <w:p>
+      <w:pPr>
+        <w:spacing w:after="0" w:line="240" w:lineRule="auto"/>
+      </w:pPr>
+    </w:p>
+    <w:p>
+      <w:pPr>
+        <w:spacing w:after="0" w:line="240" w:lineRule="auto"/>
+      </w:pPr>
+      <w:r>
+        <w:rPr>
+          <w:rFonts w:ascii="Courier New" w:hAnsi="Courier New" w:cs="Courier New"/>
+          <w:sz w:val="14"/>
+          <w:szCs w:val="14"/>
+        </w:rPr>
+        <w:t>USE master;</w:t>
+      </w:r>
+    </w:p>
+    <w:p>
+      <w:pPr>
+        <w:spacing w:after="0" w:line="240" w:lineRule="auto"/>
+      </w:pPr>
+      <w:r>
+        <w:rPr>
+          <w:rFonts w:ascii="Courier New" w:hAnsi="Courier New" w:cs="Courier New"/>
+          <w:sz w:val="14"/>
+          <w:szCs w:val="14"/>
+        </w:rPr>
+        <w:t>GO</w:t>
+      </w:r>
+    </w:p>
+    <w:p>
+      <w:pPr>
+        <w:spacing w:after="0" w:line="240" w:lineRule="auto"/>
+      </w:pPr>
+    </w:p>
+    <w:p>
+      <w:pPr>
+        <w:spacing w:after="0" w:line="240" w:lineRule="auto"/>
+      </w:pPr>
+      <w:r>
+        <w:rPr>
+          <w:rFonts w:ascii="Courier New" w:hAnsi="Courier New" w:cs="Courier New"/>
+          <w:sz w:val="14"/>
+          <w:szCs w:val="14"/>
+        </w:rPr>
+        <w:t>IF NOT EXISTS (SELECT name FROM sys.databases WHERE name = 'ClinicaTEA')</w:t>
+      </w:r>
+    </w:p>
+    <w:p>
+      <w:pPr>
+        <w:spacing w:after="0" w:line="240" w:lineRule="auto"/>
+      </w:pPr>
+      <w:r>
+        <w:rPr>
+          <w:rFonts w:ascii="Courier New" w:hAnsi="Courier New" w:cs="Courier New"/>
+          <w:sz w:val="14"/>
+          <w:szCs w:val="14"/>
+        </w:rPr>
+        <w:t xml:space="preserve">    CREATE DATABASE ClinicaTEA</w:t>
+      </w:r>
+    </w:p>
+    <w:p>
+      <w:pPr>
+        <w:spacing w:after="0" w:line="240" w:lineRule="auto"/>
+      </w:pPr>
+      <w:r>
+        <w:rPr>
+          <w:rFonts w:ascii="Courier New" w:hAnsi="Courier New" w:cs="Courier New"/>
+          <w:sz w:val="14"/>
+          <w:szCs w:val="14"/>
+        </w:rPr>
+        <w:t xml:space="preserve">        COLLATE Latin1_General_CI_AS;</w:t>
+      </w:r>
+    </w:p>
+    <w:p>
+      <w:pPr>
+        <w:spacing w:after="0" w:line="240" w:lineRule="auto"/>
+      </w:pPr>
+      <w:r>
+        <w:rPr>
+          <w:rFonts w:ascii="Courier New" w:hAnsi="Courier New" w:cs="Courier New"/>
+          <w:sz w:val="14"/>
+          <w:szCs w:val="14"/>
+        </w:rPr>
+        <w:t>GO</w:t>
+      </w:r>
+    </w:p>
+    <w:p>
+      <w:pPr>
+        <w:spacing w:after="0" w:line="240" w:lineRule="auto"/>
+      </w:pPr>
+    </w:p>
+    <w:p>
+      <w:pPr>
+        <w:spacing w:after="0" w:line="240" w:lineRule="auto"/>
+      </w:pPr>
+      <w:r>
+        <w:rPr>
+          <w:rFonts w:ascii="Courier New" w:hAnsi="Courier New" w:cs="Courier New"/>
+          <w:sz w:val="14"/>
+          <w:szCs w:val="14"/>
+        </w:rPr>
+        <w:t>USE ClinicaTEA;</w:t>
+      </w:r>
+    </w:p>
+    <w:p>
+      <w:pPr>
+        <w:spacing w:after="0" w:line="240" w:lineRule="auto"/>
+      </w:pPr>
+      <w:r>
+        <w:rPr>
+          <w:rFonts w:ascii="Courier New" w:hAnsi="Courier New" w:cs="Courier New"/>
+          <w:sz w:val="14"/>
+          <w:szCs w:val="14"/>
+        </w:rPr>
+        <w:t>GO</w:t>
+      </w:r>
+    </w:p>
+    <w:p>
+      <w:pPr>
+        <w:spacing w:after="0" w:line="240" w:lineRule="auto"/>
+      </w:pPr>
+    </w:p>
+    <w:p>
+      <w:pPr>
+        <w:spacing w:after="0" w:line="240" w:lineRule="auto"/>
+      </w:pPr>
+      <w:r>
+        <w:rPr>
+          <w:rFonts w:ascii="Courier New" w:hAnsi="Courier New" w:cs="Courier New"/>
+          <w:sz w:val="14"/>
+          <w:szCs w:val="14"/>
+        </w:rPr>
+        <w:t>-- ─── Cidades ──────────────────────────────────────────────────────────────────</w:t>
+      </w:r>
+    </w:p>
+    <w:p>
+      <w:pPr>
+        <w:spacing w:after="0" w:line="240" w:lineRule="auto"/>
+      </w:pPr>
+      <w:r>
+        <w:rPr>
+          <w:rFonts w:ascii="Courier New" w:hAnsi="Courier New" w:cs="Courier New"/>
+          <w:sz w:val="14"/>
+          <w:szCs w:val="14"/>
+        </w:rPr>
+        <w:t>CREATE TABLE Cidades (</w:t>
+      </w:r>
+    </w:p>
+    <w:p>
+      <w:pPr>
+        <w:spacing w:after="0" w:line="240" w:lineRule="auto"/>
+      </w:pPr>
+      <w:r>
+        <w:rPr>
+          <w:rFonts w:ascii="Courier New" w:hAnsi="Courier New" w:cs="Courier New"/>
+          <w:sz w:val="14"/>
+          <w:szCs w:val="14"/>
+        </w:rPr>
+        <w:t xml:space="preserve">    ID    INT           NOT NULL IDENTITY(1,1) PRIMARY KEY,</w:t>
+      </w:r>
+    </w:p>
+    <w:p>
+      <w:pPr>
+        <w:spacing w:after="0" w:line="240" w:lineRule="auto"/>
+      </w:pPr>
+      <w:r>
+        <w:rPr>
+          <w:rFonts w:ascii="Courier New" w:hAnsi="Courier New" w:cs="Courier New"/>
+          <w:sz w:val="14"/>
+          <w:szCs w:val="14"/>
+        </w:rPr>
+        <w:t xml:space="preserve">    Nome  NVARCHAR(100) NOT NULL,</w:t>
+      </w:r>
+    </w:p>
+    <w:p>
+      <w:pPr>
+        <w:spacing w:after="0" w:line="240" w:lineRule="auto"/>
+      </w:pPr>
+      <w:r>
+        <w:rPr>
+          <w:rFonts w:ascii="Courier New" w:hAnsi="Courier New" w:cs="Courier New"/>
+          <w:sz w:val="14"/>
+          <w:szCs w:val="14"/>
+        </w:rPr>
+        <w:t xml:space="preserve">    UF    CHAR(2)       NOT NULL</w:t>
+      </w:r>
+    </w:p>
+    <w:p>
+      <w:pPr>
+        <w:spacing w:after="0" w:line="240" w:lineRule="auto"/>
+      </w:pPr>
+      <w:r>
+        <w:rPr>
+          <w:rFonts w:ascii="Courier New" w:hAnsi="Courier New" w:cs="Courier New"/>
+          <w:sz w:val="14"/>
+          <w:szCs w:val="14"/>
+        </w:rPr>
+        <w:t>);</w:t>
+      </w:r>
+    </w:p>
+    <w:p>
+      <w:pPr>
+        <w:spacing w:after="0" w:line="240" w:lineRule="auto"/>
+      </w:pPr>
+      <w:r>
+        <w:rPr>
+          <w:rFonts w:ascii="Courier New" w:hAnsi="Courier New" w:cs="Courier New"/>
+          <w:sz w:val="14"/>
+          <w:szCs w:val="14"/>
+        </w:rPr>
+        <w:t>GO</w:t>
+      </w:r>
+    </w:p>
+    <w:p>
+      <w:pPr>
+        <w:spacing w:after="0" w:line="240" w:lineRule="auto"/>
+      </w:pPr>
+    </w:p>
+    <w:p>
+      <w:pPr>
+        <w:spacing w:after="0" w:line="240" w:lineRule="auto"/>
+      </w:pPr>
+      <w:r>
+        <w:rPr>
+          <w:rFonts w:ascii="Courier New" w:hAnsi="Courier New" w:cs="Courier New"/>
+          <w:sz w:val="14"/>
+          <w:szCs w:val="14"/>
+        </w:rPr>
+        <w:t>-- ─── Especialidades ───────────────────────────────────────────────────────────</w:t>
+      </w:r>
+    </w:p>
+    <w:p>
+      <w:pPr>
+        <w:spacing w:after="0" w:line="240" w:lineRule="auto"/>
+      </w:pPr>
+      <w:r>
+        <w:rPr>
+          <w:rFonts w:ascii="Courier New" w:hAnsi="Courier New" w:cs="Courier New"/>
+          <w:sz w:val="14"/>
+          <w:szCs w:val="14"/>
+        </w:rPr>
+        <w:t>-- ConselhoSigla: ex. CRP, CREFITO, CRM ...</w:t>
+      </w:r>
+    </w:p>
+    <w:p>
+      <w:pPr>
+        <w:spacing w:after="0" w:line="240" w:lineRule="auto"/>
+      </w:pPr>
+      <w:r>
+        <w:rPr>
+          <w:rFonts w:ascii="Courier New" w:hAnsi="Courier New" w:cs="Courier New"/>
+          <w:sz w:val="14"/>
+          <w:szCs w:val="14"/>
+        </w:rPr>
+        <w:t>-- CorHex       : cor #RRGGBB para exibição visual (chips coloridos na agenda)</w:t>
+      </w:r>
+    </w:p>
+    <w:p>
+      <w:pPr>
+        <w:spacing w:after="0" w:line="240" w:lineRule="auto"/>
+      </w:pPr>
+      <w:r>
+        <w:rPr>
+          <w:rFonts w:ascii="Courier New" w:hAnsi="Courier New" w:cs="Courier New"/>
+          <w:sz w:val="14"/>
+          <w:szCs w:val="14"/>
+        </w:rPr>
+        <w:t>CREATE TABLE Especialidades (</w:t>
+      </w:r>
+    </w:p>
+    <w:p>
+      <w:pPr>
+        <w:spacing w:after="0" w:line="240" w:lineRule="auto"/>
+      </w:pPr>
+      <w:r>
+        <w:rPr>
+          <w:rFonts w:ascii="Courier New" w:hAnsi="Courier New" w:cs="Courier New"/>
+          <w:sz w:val="14"/>
+          <w:szCs w:val="14"/>
+        </w:rPr>
+        <w:t xml:space="preserve">    ID            INT           NOT NULL IDENTITY(1,1) PRIMARY KEY,</w:t>
+      </w:r>
+    </w:p>
+    <w:p>
+      <w:pPr>
+        <w:spacing w:after="0" w:line="240" w:lineRule="auto"/>
+      </w:pPr>
+      <w:r>
+        <w:rPr>
+          <w:rFonts w:ascii="Courier New" w:hAnsi="Courier New" w:cs="Courier New"/>
+          <w:sz w:val="14"/>
+          <w:szCs w:val="14"/>
+        </w:rPr>
+        <w:t xml:space="preserve">    Nome          NVARCHAR(100) NOT NULL,</w:t>
+      </w:r>
+    </w:p>
+    <w:p>
+      <w:pPr>
+        <w:spacing w:after="0" w:line="240" w:lineRule="auto"/>
+      </w:pPr>
+      <w:r>
+        <w:rPr>
+          <w:rFonts w:ascii="Courier New" w:hAnsi="Courier New" w:cs="Courier New"/>
+          <w:sz w:val="14"/>
+          <w:szCs w:val="14"/>
+        </w:rPr>
+        <w:t xml:space="preserve">    ConselhoSigla NVARCHAR(20)  NULL,</w:t>
+      </w:r>
+    </w:p>
+    <w:p>
+      <w:pPr>
+        <w:spacing w:after="0" w:line="240" w:lineRule="auto"/>
+      </w:pPr>
+      <w:r>
+        <w:rPr>
+          <w:rFonts w:ascii="Courier New" w:hAnsi="Courier New" w:cs="Courier New"/>
+          <w:sz w:val="14"/>
+          <w:szCs w:val="14"/>
+        </w:rPr>
+        <w:t xml:space="preserve">    CorHex        NVARCHAR(7)   NULL,</w:t>
+      </w:r>
+    </w:p>
+    <w:p>
+      <w:pPr>
+        <w:spacing w:after="0" w:line="240" w:lineRule="auto"/>
+      </w:pPr>
+      <w:r>
+        <w:rPr>
+          <w:rFonts w:ascii="Courier New" w:hAnsi="Courier New" w:cs="Courier New"/>
+          <w:sz w:val="14"/>
+          <w:szCs w:val="14"/>
+        </w:rPr>
+        <w:t xml:space="preserve">    Ativo         BIT           NOT NULL DEFAULT 1</w:t>
+      </w:r>
+    </w:p>
+    <w:p>
+      <w:pPr>
+        <w:spacing w:after="0" w:line="240" w:lineRule="auto"/>
+      </w:pPr>
+      <w:r>
+        <w:rPr>
+          <w:rFonts w:ascii="Courier New" w:hAnsi="Courier New" w:cs="Courier New"/>
+          <w:sz w:val="14"/>
+          <w:szCs w:val="14"/>
+        </w:rPr>
+        <w:t>);</w:t>
+      </w:r>
+    </w:p>
+    <w:p>
+      <w:pPr>
+        <w:spacing w:after="0" w:line="240" w:lineRule="auto"/>
+      </w:pPr>
+      <w:r>
+        <w:rPr>
+          <w:rFonts w:ascii="Courier New" w:hAnsi="Courier New" w:cs="Courier New"/>
+          <w:sz w:val="14"/>
+          <w:szCs w:val="14"/>
+        </w:rPr>
+        <w:t>GO</w:t>
+      </w:r>
+    </w:p>
+    <w:p>
+      <w:pPr>
+        <w:spacing w:after="0" w:line="240" w:lineRule="auto"/>
+      </w:pPr>
+    </w:p>
+    <w:p>
+      <w:pPr>
+        <w:spacing w:after="0" w:line="240" w:lineRule="auto"/>
+      </w:pPr>
+      <w:r>
+        <w:rPr>
+          <w:rFonts w:ascii="Courier New" w:hAnsi="Courier New" w:cs="Courier New"/>
+          <w:sz w:val="14"/>
+          <w:szCs w:val="14"/>
+        </w:rPr>
+        <w:t>-- ─── Usuarios ─────────────────────────────────────────────────────────────────</w:t>
+      </w:r>
+    </w:p>
+    <w:p>
+      <w:pPr>
+        <w:spacing w:after="0" w:line="240" w:lineRule="auto"/>
+      </w:pPr>
+      <w:r>
+        <w:rPr>
+          <w:rFonts w:ascii="Courier New" w:hAnsi="Courier New" w:cs="Courier New"/>
+          <w:sz w:val="14"/>
+          <w:szCs w:val="14"/>
+        </w:rPr>
+        <w:t>-- Perfil: Admin | Recepcao | Profissional</w:t>
+      </w:r>
+    </w:p>
+    <w:p>
+      <w:pPr>
+        <w:spacing w:after="0" w:line="240" w:lineRule="auto"/>
+      </w:pPr>
+      <w:r>
+        <w:rPr>
+          <w:rFonts w:ascii="Courier New" w:hAnsi="Courier New" w:cs="Courier New"/>
+          <w:sz w:val="14"/>
+          <w:szCs w:val="14"/>
+        </w:rPr>
+        <w:t>-- SenhaHash: SHA-256 hexadecimal uppercase (salt + senha, Unicode/UTF-16 LE)</w:t>
+      </w:r>
+    </w:p>
+    <w:p>
+      <w:pPr>
+        <w:spacing w:after="0" w:line="240" w:lineRule="auto"/>
+      </w:pPr>
+      <w:r>
+        <w:rPr>
+          <w:rFonts w:ascii="Courier New" w:hAnsi="Courier New" w:cs="Courier New"/>
+          <w:sz w:val="14"/>
+          <w:szCs w:val="14"/>
+        </w:rPr>
+        <w:t>-- Salt     : GUID gerado aleatoriamente por CriptografiaSenha.GerarSalt()</w:t>
+      </w:r>
+    </w:p>
+    <w:p>
+      <w:pPr>
+        <w:spacing w:after="0" w:line="240" w:lineRule="auto"/>
+      </w:pPr>
+      <w:r>
+        <w:rPr>
+          <w:rFonts w:ascii="Courier New" w:hAnsi="Courier New" w:cs="Courier New"/>
+          <w:sz w:val="14"/>
+          <w:szCs w:val="14"/>
+        </w:rPr>
+        <w:t>CREATE TABLE Usuarios (</w:t>
+      </w:r>
+    </w:p>
+    <w:p>
+      <w:pPr>
+        <w:spacing w:after="0" w:line="240" w:lineRule="auto"/>
+      </w:pPr>
+      <w:r>
+        <w:rPr>
+          <w:rFonts w:ascii="Courier New" w:hAnsi="Courier New" w:cs="Courier New"/>
+          <w:sz w:val="14"/>
+          <w:szCs w:val="14"/>
+        </w:rPr>
+        <w:t xml:space="preserve">    ID        INT           NOT NULL IDENTITY(1,1) PRIMARY KEY,</w:t>
+      </w:r>
+    </w:p>
+    <w:p>
+      <w:pPr>
+        <w:spacing w:after="0" w:line="240" w:lineRule="auto"/>
+      </w:pPr>
+      <w:r>
+        <w:rPr>
+          <w:rFonts w:ascii="Courier New" w:hAnsi="Courier New" w:cs="Courier New"/>
+          <w:sz w:val="14"/>
+          <w:szCs w:val="14"/>
+        </w:rPr>
+        <w:t xml:space="preserve">    Login     NVARCHAR(60)  NOT NULL UNIQUE,</w:t>
+      </w:r>
+    </w:p>
+    <w:p>
+      <w:pPr>
+        <w:spacing w:after="0" w:line="240" w:lineRule="auto"/>
+      </w:pPr>
+      <w:r>
+        <w:rPr>
+          <w:rFonts w:ascii="Courier New" w:hAnsi="Courier New" w:cs="Courier New"/>
+          <w:sz w:val="14"/>
+          <w:szCs w:val="14"/>
+        </w:rPr>
+        <w:t xml:space="preserve">    SenhaHash NVARCHAR(64)  NOT NULL,</w:t>
+      </w:r>
+    </w:p>
+    <w:p>
+      <w:pPr>
+        <w:spacing w:after="0" w:line="240" w:lineRule="auto"/>
+      </w:pPr>
+      <w:r>
+        <w:rPr>
+          <w:rFonts w:ascii="Courier New" w:hAnsi="Courier New" w:cs="Courier New"/>
+          <w:sz w:val="14"/>
+          <w:szCs w:val="14"/>
+        </w:rPr>
+        <w:t xml:space="preserve">    Salt      NVARCHAR(50)  NOT NULL,</w:t>
+      </w:r>
+    </w:p>
+    <w:p>
+      <w:pPr>
+        <w:spacing w:after="0" w:line="240" w:lineRule="auto"/>
+      </w:pPr>
+      <w:r>
+        <w:rPr>
+          <w:rFonts w:ascii="Courier New" w:hAnsi="Courier New" w:cs="Courier New"/>
+          <w:sz w:val="14"/>
+          <w:szCs w:val="14"/>
+        </w:rPr>
+        <w:t xml:space="preserve">    Nome      NVARCHAR(150) NOT NULL,</w:t>
+      </w:r>
+    </w:p>
+    <w:p>
+      <w:pPr>
+        <w:spacing w:after="0" w:line="240" w:lineRule="auto"/>
+      </w:pPr>
+      <w:r>
+        <w:rPr>
+          <w:rFonts w:ascii="Courier New" w:hAnsi="Courier New" w:cs="Courier New"/>
+          <w:sz w:val="14"/>
+          <w:szCs w:val="14"/>
+        </w:rPr>
+        <w:t xml:space="preserve">    Perfil    NVARCHAR(20)  NOT NULL,</w:t>
+      </w:r>
+    </w:p>
+    <w:p>
+      <w:pPr>
+        <w:spacing w:after="0" w:line="240" w:lineRule="auto"/>
+      </w:pPr>
+      <w:r>
+        <w:rPr>
+          <w:rFonts w:ascii="Courier New" w:hAnsi="Courier New" w:cs="Courier New"/>
+          <w:sz w:val="14"/>
+          <w:szCs w:val="14"/>
+        </w:rPr>
+        <w:t xml:space="preserve">    Ativo     BIT           NOT NULL DEFAULT 1</w:t>
+      </w:r>
+    </w:p>
+    <w:p>
+      <w:pPr>
+        <w:spacing w:after="0" w:line="240" w:lineRule="auto"/>
+      </w:pPr>
+      <w:r>
+        <w:rPr>
+          <w:rFonts w:ascii="Courier New" w:hAnsi="Courier New" w:cs="Courier New"/>
+          <w:sz w:val="14"/>
+          <w:szCs w:val="14"/>
+        </w:rPr>
+        <w:t>);</w:t>
+      </w:r>
+    </w:p>
+    <w:p>
+      <w:pPr>
+        <w:spacing w:after="0" w:line="240" w:lineRule="auto"/>
+      </w:pPr>
+      <w:r>
+        <w:rPr>
+          <w:rFonts w:ascii="Courier New" w:hAnsi="Courier New" w:cs="Courier New"/>
+          <w:sz w:val="14"/>
+          <w:szCs w:val="14"/>
+        </w:rPr>
+        <w:t>GO</w:t>
+      </w:r>
+    </w:p>
+    <w:p>
+      <w:pPr>
+        <w:spacing w:after="0" w:line="240" w:lineRule="auto"/>
+      </w:pPr>
+    </w:p>
+    <w:p>
+      <w:pPr>
+        <w:spacing w:after="0" w:line="240" w:lineRule="auto"/>
+      </w:pPr>
+      <w:r>
+        <w:rPr>
+          <w:rFonts w:ascii="Courier New" w:hAnsi="Courier New" w:cs="Courier New"/>
+          <w:sz w:val="14"/>
+          <w:szCs w:val="14"/>
+        </w:rPr>
+        <w:t>-- ─── Pacientes ────────────────────────────────────────────────────────────────</w:t>
+      </w:r>
+    </w:p>
+    <w:p>
+      <w:pPr>
+        <w:spacing w:after="0" w:line="240" w:lineRule="auto"/>
+      </w:pPr>
+      <w:r>
+        <w:rPr>
+          <w:rFonts w:ascii="Courier New" w:hAnsi="Courier New" w:cs="Courier New"/>
+          <w:sz w:val="14"/>
+          <w:szCs w:val="14"/>
+        </w:rPr>
+        <w:t>-- NivelSuporte : 1 = Exigindo apoio | 2 = Apoio substancial | 3 = Apoio muito substancial (DSM-5)</w:t>
+      </w:r>
+    </w:p>
+    <w:p>
+      <w:pPr>
+        <w:spacing w:after="0" w:line="240" w:lineRule="auto"/>
+      </w:pPr>
+      <w:r>
+        <w:rPr>
+          <w:rFonts w:ascii="Courier New" w:hAnsi="Courier New" w:cs="Courier New"/>
+          <w:sz w:val="14"/>
+          <w:szCs w:val="14"/>
+        </w:rPr>
+        <w:t>-- NumeroCIPTEA : Certificado de Identificação da Pessoa com TEA</w:t>
+      </w:r>
+    </w:p>
+    <w:p>
+      <w:pPr>
+        <w:spacing w:after="0" w:line="240" w:lineRule="auto"/>
+      </w:pPr>
+      <w:r>
+        <w:rPr>
+          <w:rFonts w:ascii="Courier New" w:hAnsi="Courier New" w:cs="Courier New"/>
+          <w:sz w:val="14"/>
+          <w:szCs w:val="14"/>
+        </w:rPr>
+        <w:t>-- Ativo        : soft-delete — histórico clínico é preservado</w:t>
+      </w:r>
+    </w:p>
+    <w:p>
+      <w:pPr>
+        <w:spacing w:after="0" w:line="240" w:lineRule="auto"/>
+      </w:pPr>
+      <w:r>
+        <w:rPr>
+          <w:rFonts w:ascii="Courier New" w:hAnsi="Courier New" w:cs="Courier New"/>
+          <w:sz w:val="14"/>
+          <w:szCs w:val="14"/>
+        </w:rPr>
+        <w:t>CREATE TABLE Pacientes (</w:t>
+      </w:r>
+    </w:p>
+    <w:p>
+      <w:pPr>
+        <w:spacing w:after="0" w:line="240" w:lineRule="auto"/>
+      </w:pPr>
+      <w:r>
+        <w:rPr>
+          <w:rFonts w:ascii="Courier New" w:hAnsi="Courier New" w:cs="Courier New"/>
+          <w:sz w:val="14"/>
+          <w:szCs w:val="14"/>
+        </w:rPr>
+        <w:t xml:space="preserve">    ID                  INT           NOT NULL IDENTITY(1,1) PRIMARY KEY,</w:t>
+      </w:r>
+    </w:p>
+    <w:p>
+      <w:pPr>
+        <w:spacing w:after="0" w:line="240" w:lineRule="auto"/>
+      </w:pPr>
+      <w:r>
+        <w:rPr>
+          <w:rFonts w:ascii="Courier New" w:hAnsi="Courier New" w:cs="Courier New"/>
+          <w:sz w:val="14"/>
+          <w:szCs w:val="14"/>
+        </w:rPr>
+        <w:t xml:space="preserve">    IDCidade            INT           NULL REFERENCES Cidades(ID),</w:t>
+      </w:r>
+    </w:p>
+    <w:p>
+      <w:pPr>
+        <w:spacing w:after="0" w:line="240" w:lineRule="auto"/>
+      </w:pPr>
+      <w:r>
+        <w:rPr>
+          <w:rFonts w:ascii="Courier New" w:hAnsi="Courier New" w:cs="Courier New"/>
+          <w:sz w:val="14"/>
+          <w:szCs w:val="14"/>
+        </w:rPr>
+        <w:t xml:space="preserve">    Nome                NVARCHAR(150) NOT NULL,</w:t>
+      </w:r>
+    </w:p>
+    <w:p>
+      <w:pPr>
+        <w:spacing w:after="0" w:line="240" w:lineRule="auto"/>
+      </w:pPr>
+      <w:r>
+        <w:rPr>
+          <w:rFonts w:ascii="Courier New" w:hAnsi="Courier New" w:cs="Courier New"/>
+          <w:sz w:val="14"/>
+          <w:szCs w:val="14"/>
+        </w:rPr>
+        <w:t xml:space="preserve">    NomeSocial          NVARCHAR(150) NULL,</w:t>
+      </w:r>
+    </w:p>
+    <w:p>
+      <w:pPr>
+        <w:spacing w:after="0" w:line="240" w:lineRule="auto"/>
+      </w:pPr>
+      <w:r>
+        <w:rPr>
+          <w:rFonts w:ascii="Courier New" w:hAnsi="Courier New" w:cs="Courier New"/>
+          <w:sz w:val="14"/>
+          <w:szCs w:val="14"/>
+        </w:rPr>
+        <w:t xml:space="preserve">    CPF                 CHAR(11)      NULL UNIQUE,</w:t>
+      </w:r>
+    </w:p>
+    <w:p>
+      <w:pPr>
+        <w:spacing w:after="0" w:line="240" w:lineRule="auto"/>
+      </w:pPr>
+      <w:r>
+        <w:rPr>
+          <w:rFonts w:ascii="Courier New" w:hAnsi="Courier New" w:cs="Courier New"/>
+          <w:sz w:val="14"/>
+          <w:szCs w:val="14"/>
+        </w:rPr>
+        <w:t xml:space="preserve">    DataNascimento      DATE          NOT NULL,</w:t>
+      </w:r>
+    </w:p>
+    <w:p>
+      <w:pPr>
+        <w:spacing w:after="0" w:line="240" w:lineRule="auto"/>
+      </w:pPr>
+      <w:r>
+        <w:rPr>
+          <w:rFonts w:ascii="Courier New" w:hAnsi="Courier New" w:cs="Courier New"/>
+          <w:sz w:val="14"/>
+          <w:szCs w:val="14"/>
+        </w:rPr>
+        <w:t xml:space="preserve">    Sexo                CHAR(1)       NULL,           -- M | F | O</w:t>
+      </w:r>
+    </w:p>
+    <w:p>
+      <w:pPr>
+        <w:spacing w:after="0" w:line="240" w:lineRule="auto"/>
+      </w:pPr>
+      <w:r>
+        <w:rPr>
+          <w:rFonts w:ascii="Courier New" w:hAnsi="Courier New" w:cs="Courier New"/>
+          <w:sz w:val="14"/>
+          <w:szCs w:val="14"/>
+        </w:rPr>
+        <w:t xml:space="preserve">    NivelSuporte        TINYINT       NULL,</w:t>
+      </w:r>
+    </w:p>
+    <w:p>
+      <w:pPr>
+        <w:spacing w:after="0" w:line="240" w:lineRule="auto"/>
+      </w:pPr>
+      <w:r>
+        <w:rPr>
+          <w:rFonts w:ascii="Courier New" w:hAnsi="Courier New" w:cs="Courier New"/>
+          <w:sz w:val="14"/>
+          <w:szCs w:val="14"/>
+        </w:rPr>
+        <w:t xml:space="preserve">    DataDiagnostico     DATE          NULL,</w:t>
+      </w:r>
+    </w:p>
+    <w:p>
+      <w:pPr>
+        <w:spacing w:after="0" w:line="240" w:lineRule="auto"/>
+      </w:pPr>
+      <w:r>
+        <w:rPr>
+          <w:rFonts w:ascii="Courier New" w:hAnsi="Courier New" w:cs="Courier New"/>
+          <w:sz w:val="14"/>
+          <w:szCs w:val="14"/>
+        </w:rPr>
+        <w:t xml:space="preserve">    NumeroCIPTEA        NVARCHAR(30)  NULL,</w:t>
+      </w:r>
+    </w:p>
+    <w:p>
+      <w:pPr>
+        <w:spacing w:after="0" w:line="240" w:lineRule="auto"/>
+      </w:pPr>
+      <w:r>
+        <w:rPr>
+          <w:rFonts w:ascii="Courier New" w:hAnsi="Courier New" w:cs="Courier New"/>
+          <w:sz w:val="14"/>
+          <w:szCs w:val="14"/>
+        </w:rPr>
+        <w:t xml:space="preserve">    Telefone            NVARCHAR(20)  NULL,</w:t>
+      </w:r>
+    </w:p>
+    <w:p>
+      <w:pPr>
+        <w:spacing w:after="0" w:line="240" w:lineRule="auto"/>
+      </w:pPr>
+      <w:r>
+        <w:rPr>
+          <w:rFonts w:ascii="Courier New" w:hAnsi="Courier New" w:cs="Courier New"/>
+          <w:sz w:val="14"/>
+          <w:szCs w:val="14"/>
+        </w:rPr>
+        <w:t xml:space="preserve">    Email               NVARCHAR(200) NULL,</w:t>
+      </w:r>
+    </w:p>
+    <w:p>
+      <w:pPr>
+        <w:spacing w:after="0" w:line="240" w:lineRule="auto"/>
+      </w:pPr>
+      <w:r>
+        <w:rPr>
+          <w:rFonts w:ascii="Courier New" w:hAnsi="Courier New" w:cs="Courier New"/>
+          <w:sz w:val="14"/>
+          <w:szCs w:val="14"/>
+        </w:rPr>
+        <w:t xml:space="preserve">    NomeResponsavel     NVARCHAR(150) NULL,</w:t>
+      </w:r>
+    </w:p>
+    <w:p>
+      <w:pPr>
+        <w:spacing w:after="0" w:line="240" w:lineRule="auto"/>
+      </w:pPr>
+      <w:r>
+        <w:rPr>
+          <w:rFonts w:ascii="Courier New" w:hAnsi="Courier New" w:cs="Courier New"/>
+          <w:sz w:val="14"/>
+          <w:szCs w:val="14"/>
+        </w:rPr>
+        <w:t xml:space="preserve">    CPFResponsavel      CHAR(11)      NULL,</w:t>
+      </w:r>
+    </w:p>
+    <w:p>
+      <w:pPr>
+        <w:spacing w:after="0" w:line="240" w:lineRule="auto"/>
+      </w:pPr>
+      <w:r>
+        <w:rPr>
+          <w:rFonts w:ascii="Courier New" w:hAnsi="Courier New" w:cs="Courier New"/>
+          <w:sz w:val="14"/>
+          <w:szCs w:val="14"/>
+        </w:rPr>
+        <w:t xml:space="preserve">    TelefoneResponsavel NVARCHAR(20)  NULL,</w:t>
+      </w:r>
+    </w:p>
+    <w:p>
+      <w:pPr>
+        <w:spacing w:after="0" w:line="240" w:lineRule="auto"/>
+      </w:pPr>
+      <w:r>
+        <w:rPr>
+          <w:rFonts w:ascii="Courier New" w:hAnsi="Courier New" w:cs="Courier New"/>
+          <w:sz w:val="14"/>
+          <w:szCs w:val="14"/>
+        </w:rPr>
+        <w:t xml:space="preserve">    Observacoes         NVARCHAR(MAX) NULL,</w:t>
+      </w:r>
+    </w:p>
+    <w:p>
+      <w:pPr>
+        <w:spacing w:after="0" w:line="240" w:lineRule="auto"/>
+      </w:pPr>
+      <w:r>
+        <w:rPr>
+          <w:rFonts w:ascii="Courier New" w:hAnsi="Courier New" w:cs="Courier New"/>
+          <w:sz w:val="14"/>
+          <w:szCs w:val="14"/>
+        </w:rPr>
+        <w:t xml:space="preserve">    Ativo               BIT           NOT NULL DEFAULT 1,</w:t>
+      </w:r>
+    </w:p>
+    <w:p>
+      <w:pPr>
+        <w:spacing w:after="0" w:line="240" w:lineRule="auto"/>
+      </w:pPr>
+      <w:r>
+        <w:rPr>
+          <w:rFonts w:ascii="Courier New" w:hAnsi="Courier New" w:cs="Courier New"/>
+          <w:sz w:val="14"/>
+          <w:szCs w:val="14"/>
+        </w:rPr>
+        <w:t xml:space="preserve">    DataCadastro        DATETIME      NOT NULL DEFAULT GETDATE()</w:t>
+      </w:r>
+    </w:p>
+    <w:p>
+      <w:pPr>
+        <w:spacing w:after="0" w:line="240" w:lineRule="auto"/>
+      </w:pPr>
+      <w:r>
+        <w:rPr>
+          <w:rFonts w:ascii="Courier New" w:hAnsi="Courier New" w:cs="Courier New"/>
+          <w:sz w:val="14"/>
+          <w:szCs w:val="14"/>
+        </w:rPr>
+        <w:t>);</w:t>
+      </w:r>
+    </w:p>
+    <w:p>
+      <w:pPr>
+        <w:spacing w:after="0" w:line="240" w:lineRule="auto"/>
+      </w:pPr>
+      <w:r>
+        <w:rPr>
+          <w:rFonts w:ascii="Courier New" w:hAnsi="Courier New" w:cs="Courier New"/>
+          <w:sz w:val="14"/>
+          <w:szCs w:val="14"/>
+        </w:rPr>
+        <w:t>GO</w:t>
+      </w:r>
+    </w:p>
+    <w:p>
+      <w:pPr>
+        <w:spacing w:after="0" w:line="240" w:lineRule="auto"/>
+      </w:pPr>
+    </w:p>
+    <w:p>
+      <w:pPr>
+        <w:spacing w:after="0" w:line="240" w:lineRule="auto"/>
+      </w:pPr>
+      <w:r>
+        <w:rPr>
+          <w:rFonts w:ascii="Courier New" w:hAnsi="Courier New" w:cs="Courier New"/>
+          <w:sz w:val="14"/>
+          <w:szCs w:val="14"/>
+        </w:rPr>
+        <w:t>-- ─── Profissionais ────────────────────────────────────────────────────────────</w:t>
+      </w:r>
+    </w:p>
+    <w:p>
+      <w:pPr>
+        <w:spacing w:after="0" w:line="240" w:lineRule="auto"/>
+      </w:pPr>
+      <w:r>
+        <w:rPr>
+          <w:rFonts w:ascii="Courier New" w:hAnsi="Courier New" w:cs="Courier New"/>
+          <w:sz w:val="14"/>
+          <w:szCs w:val="14"/>
+        </w:rPr>
+        <w:t>-- IDUsuario: opcional — nem todo profissional precisa logar no sistema</w:t>
+      </w:r>
+    </w:p>
+    <w:p>
+      <w:pPr>
+        <w:spacing w:after="0" w:line="240" w:lineRule="auto"/>
+      </w:pPr>
+      <w:r>
+        <w:rPr>
+          <w:rFonts w:ascii="Courier New" w:hAnsi="Courier New" w:cs="Courier New"/>
+          <w:sz w:val="14"/>
+          <w:szCs w:val="14"/>
+        </w:rPr>
+        <w:t>CREATE TABLE Profissionais (</w:t>
+      </w:r>
+    </w:p>
+    <w:p>
+      <w:pPr>
+        <w:spacing w:after="0" w:line="240" w:lineRule="auto"/>
+      </w:pPr>
+      <w:r>
+        <w:rPr>
+          <w:rFonts w:ascii="Courier New" w:hAnsi="Courier New" w:cs="Courier New"/>
+          <w:sz w:val="14"/>
+          <w:szCs w:val="14"/>
+        </w:rPr>
+        <w:t xml:space="preserve">    ID               INT           NOT NULL IDENTITY(1,1) PRIMARY KEY,</w:t>
+      </w:r>
+    </w:p>
+    <w:p>
+      <w:pPr>
+        <w:spacing w:after="0" w:line="240" w:lineRule="auto"/>
+      </w:pPr>
+      <w:r>
+        <w:rPr>
+          <w:rFonts w:ascii="Courier New" w:hAnsi="Courier New" w:cs="Courier New"/>
+          <w:sz w:val="14"/>
+          <w:szCs w:val="14"/>
+        </w:rPr>
+        <w:lastRenderedPageBreak/>
+        <w:t xml:space="preserve">    IDUsuario        INT           NULL REFERENCES Usuarios(ID),</w:t>
+      </w:r>
+    </w:p>
+    <w:p>
+      <w:pPr>
+        <w:spacing w:after="0" w:line="240" w:lineRule="auto"/>
+      </w:pPr>
+      <w:r>
+        <w:rPr>
+          <w:rFonts w:ascii="Courier New" w:hAnsi="Courier New" w:cs="Courier New"/>
+          <w:sz w:val="14"/>
+          <w:szCs w:val="14"/>
+        </w:rPr>
+        <w:t xml:space="preserve">    IDEspecialidade  INT           NOT NULL REFERENCES Especialidades(ID),</w:t>
+      </w:r>
+    </w:p>
+    <w:p>
+      <w:pPr>
+        <w:spacing w:after="0" w:line="240" w:lineRule="auto"/>
+      </w:pPr>
+      <w:r>
+        <w:rPr>
+          <w:rFonts w:ascii="Courier New" w:hAnsi="Courier New" w:cs="Courier New"/>
+          <w:sz w:val="14"/>
+          <w:szCs w:val="14"/>
+        </w:rPr>
+        <w:t xml:space="preserve">    Nome             NVARCHAR(150) NOT NULL,</w:t>
+      </w:r>
+    </w:p>
+    <w:p>
+      <w:pPr>
+        <w:spacing w:after="0" w:line="240" w:lineRule="auto"/>
+      </w:pPr>
+      <w:r>
+        <w:rPr>
+          <w:rFonts w:ascii="Courier New" w:hAnsi="Courier New" w:cs="Courier New"/>
+          <w:sz w:val="14"/>
+          <w:szCs w:val="14"/>
+        </w:rPr>
+        <w:t xml:space="preserve">    NomeSocial       NVARCHAR(150) NULL,</w:t>
+      </w:r>
+    </w:p>
+    <w:p>
+      <w:pPr>
+        <w:spacing w:after="0" w:line="240" w:lineRule="auto"/>
+      </w:pPr>
+      <w:r>
+        <w:rPr>
+          <w:rFonts w:ascii="Courier New" w:hAnsi="Courier New" w:cs="Courier New"/>
+          <w:sz w:val="14"/>
+          <w:szCs w:val="14"/>
+        </w:rPr>
+        <w:t xml:space="preserve">    CPF              CHAR(11)      NULL,</w:t>
+      </w:r>
+    </w:p>
+    <w:p>
+      <w:pPr>
+        <w:spacing w:after="0" w:line="240" w:lineRule="auto"/>
+      </w:pPr>
+      <w:r>
+        <w:rPr>
+          <w:rFonts w:ascii="Courier New" w:hAnsi="Courier New" w:cs="Courier New"/>
+          <w:sz w:val="14"/>
+          <w:szCs w:val="14"/>
+        </w:rPr>
+        <w:t xml:space="preserve">    RegistroConselho NVARCHAR(30)  NULL,</w:t>
+      </w:r>
+    </w:p>
+    <w:p>
+      <w:pPr>
+        <w:spacing w:after="0" w:line="240" w:lineRule="auto"/>
+      </w:pPr>
+      <w:r>
+        <w:rPr>
+          <w:rFonts w:ascii="Courier New" w:hAnsi="Courier New" w:cs="Courier New"/>
+          <w:sz w:val="14"/>
+          <w:szCs w:val="14"/>
+        </w:rPr>
+        <w:t xml:space="preserve">    Telefone         NVARCHAR(20)  NULL,</w:t>
+      </w:r>
+    </w:p>
+    <w:p>
+      <w:pPr>
+        <w:spacing w:after="0" w:line="240" w:lineRule="auto"/>
+      </w:pPr>
+      <w:r>
+        <w:rPr>
+          <w:rFonts w:ascii="Courier New" w:hAnsi="Courier New" w:cs="Courier New"/>
+          <w:sz w:val="14"/>
+          <w:szCs w:val="14"/>
+        </w:rPr>
+        <w:t xml:space="preserve">    Email            NVARCHAR(200) NULL,</w:t>
+      </w:r>
+    </w:p>
+    <w:p>
+      <w:pPr>
+        <w:spacing w:after="0" w:line="240" w:lineRule="auto"/>
+      </w:pPr>
+      <w:r>
+        <w:rPr>
+          <w:rFonts w:ascii="Courier New" w:hAnsi="Courier New" w:cs="Courier New"/>
+          <w:sz w:val="14"/>
+          <w:szCs w:val="14"/>
+        </w:rPr>
+        <w:t xml:space="preserve">    Ativo            BIT           NOT NULL DEFAULT 1</w:t>
+      </w:r>
+    </w:p>
+    <w:p>
+      <w:pPr>
+        <w:spacing w:after="0" w:line="240" w:lineRule="auto"/>
+      </w:pPr>
+      <w:r>
+        <w:rPr>
+          <w:rFonts w:ascii="Courier New" w:hAnsi="Courier New" w:cs="Courier New"/>
+          <w:sz w:val="14"/>
+          <w:szCs w:val="14"/>
+        </w:rPr>
+        <w:t>);</w:t>
+      </w:r>
+    </w:p>
+    <w:p>
+      <w:pPr>
+        <w:spacing w:after="0" w:line="240" w:lineRule="auto"/>
+      </w:pPr>
+      <w:r>
+        <w:rPr>
+          <w:rFonts w:ascii="Courier New" w:hAnsi="Courier New" w:cs="Courier New"/>
+          <w:sz w:val="14"/>
+          <w:szCs w:val="14"/>
+        </w:rPr>
+        <w:t>GO</w:t>
+      </w:r>
+    </w:p>
+    <w:p>
+      <w:pPr>
+        <w:spacing w:after="0" w:line="240" w:lineRule="auto"/>
+      </w:pPr>
+    </w:p>
+    <w:p>
+      <w:pPr>
+        <w:spacing w:after="0" w:line="240" w:lineRule="auto"/>
+      </w:pPr>
+      <w:r>
+        <w:rPr>
+          <w:rFonts w:ascii="Courier New" w:hAnsi="Courier New" w:cs="Courier New"/>
+          <w:sz w:val="14"/>
+          <w:szCs w:val="14"/>
+        </w:rPr>
+        <w:t>-- ─── Salas ────────────────────────────────────────────────────────────────────</w:t>
+      </w:r>
+    </w:p>
+    <w:p>
+      <w:pPr>
+        <w:spacing w:after="0" w:line="240" w:lineRule="auto"/>
+      </w:pPr>
+      <w:r>
+        <w:rPr>
+          <w:rFonts w:ascii="Courier New" w:hAnsi="Courier New" w:cs="Courier New"/>
+          <w:sz w:val="14"/>
+          <w:szCs w:val="14"/>
+        </w:rPr>
+        <w:t>CREATE TABLE Salas (</w:t>
+      </w:r>
+    </w:p>
+    <w:p>
+      <w:pPr>
+        <w:spacing w:after="0" w:line="240" w:lineRule="auto"/>
+      </w:pPr>
+      <w:r>
+        <w:rPr>
+          <w:rFonts w:ascii="Courier New" w:hAnsi="Courier New" w:cs="Courier New"/>
+          <w:sz w:val="14"/>
+          <w:szCs w:val="14"/>
+        </w:rPr>
+        <w:t xml:space="preserve">    ID                  INT           NOT NULL IDENTITY(1,1) PRIMARY KEY,</w:t>
+      </w:r>
+    </w:p>
+    <w:p>
+      <w:pPr>
+        <w:spacing w:after="0" w:line="240" w:lineRule="auto"/>
+      </w:pPr>
+      <w:r>
+        <w:rPr>
+          <w:rFonts w:ascii="Courier New" w:hAnsi="Courier New" w:cs="Courier New"/>
+          <w:sz w:val="14"/>
+          <w:szCs w:val="14"/>
+        </w:rPr>
+        <w:t xml:space="preserve">    Nome                NVARCHAR(80)  NOT NULL,</w:t>
+      </w:r>
+    </w:p>
+    <w:p>
+      <w:pPr>
+        <w:spacing w:after="0" w:line="240" w:lineRule="auto"/>
+      </w:pPr>
+      <w:r>
+        <w:rPr>
+          <w:rFonts w:ascii="Courier New" w:hAnsi="Courier New" w:cs="Courier New"/>
+          <w:sz w:val="14"/>
+          <w:szCs w:val="14"/>
+        </w:rPr>
+        <w:t xml:space="preserve">    Capacidade          INT           NOT NULL DEFAULT 0,</w:t>
+      </w:r>
+    </w:p>
+    <w:p>
+      <w:pPr>
+        <w:spacing w:after="0" w:line="240" w:lineRule="auto"/>
+      </w:pPr>
+      <w:r>
+        <w:rPr>
+          <w:rFonts w:ascii="Courier New" w:hAnsi="Courier New" w:cs="Courier New"/>
+          <w:sz w:val="14"/>
+          <w:szCs w:val="14"/>
+        </w:rPr>
+        <w:t xml:space="preserve">    RecursosSensoriais  NVARCHAR(500) NULL,</w:t>
+      </w:r>
+    </w:p>
+    <w:p>
+      <w:pPr>
+        <w:spacing w:after="0" w:line="240" w:lineRule="auto"/>
+      </w:pPr>
+      <w:r>
+        <w:rPr>
+          <w:rFonts w:ascii="Courier New" w:hAnsi="Courier New" w:cs="Courier New"/>
+          <w:sz w:val="14"/>
+          <w:szCs w:val="14"/>
+        </w:rPr>
+        <w:t xml:space="preserve">    Ativo               BIT           NOT NULL DEFAULT 1</w:t>
+      </w:r>
+    </w:p>
+    <w:p>
+      <w:pPr>
+        <w:spacing w:after="0" w:line="240" w:lineRule="auto"/>
+      </w:pPr>
+      <w:r>
+        <w:rPr>
+          <w:rFonts w:ascii="Courier New" w:hAnsi="Courier New" w:cs="Courier New"/>
+          <w:sz w:val="14"/>
+          <w:szCs w:val="14"/>
+        </w:rPr>
+        <w:t>);</w:t>
+      </w:r>
+    </w:p>
+    <w:p>
+      <w:pPr>
+        <w:spacing w:after="0" w:line="240" w:lineRule="auto"/>
+      </w:pPr>
+      <w:r>
+        <w:rPr>
+          <w:rFonts w:ascii="Courier New" w:hAnsi="Courier New" w:cs="Courier New"/>
+          <w:sz w:val="14"/>
+          <w:szCs w:val="14"/>
+        </w:rPr>
+        <w:t>GO</w:t>
+      </w:r>
+    </w:p>
+    <w:p>
+      <w:pPr>
+        <w:spacing w:after="0" w:line="240" w:lineRule="auto"/>
+      </w:pPr>
+    </w:p>
+    <w:p>
+      <w:pPr>
+        <w:spacing w:after="0" w:line="240" w:lineRule="auto"/>
+      </w:pPr>
+      <w:r>
+        <w:rPr>
+          <w:rFonts w:ascii="Courier New" w:hAnsi="Courier New" w:cs="Courier New"/>
+          <w:sz w:val="14"/>
+          <w:szCs w:val="14"/>
+        </w:rPr>
+        <w:t>-- ─── Agendamentos ─────────────────────────────────────────────────────────────</w:t>
+      </w:r>
+    </w:p>
+    <w:p>
+      <w:pPr>
+        <w:spacing w:after="0" w:line="240" w:lineRule="auto"/>
+      </w:pPr>
+      <w:r>
+        <w:rPr>
+          <w:rFonts w:ascii="Courier New" w:hAnsi="Courier New" w:cs="Courier New"/>
+          <w:sz w:val="14"/>
+          <w:szCs w:val="14"/>
+        </w:rPr>
+        <w:t>-- Status: Agendado | Realizado | Faltou | Cancelado</w:t>
+      </w:r>
+    </w:p>
+    <w:p>
+      <w:pPr>
+        <w:spacing w:after="0" w:line="240" w:lineRule="auto"/>
+      </w:pPr>
+      <w:r>
+        <w:rPr>
+          <w:rFonts w:ascii="Courier New" w:hAnsi="Courier New" w:cs="Courier New"/>
+          <w:sz w:val="14"/>
+          <w:szCs w:val="14"/>
+        </w:rPr>
+        <w:t>-- Conflito: profissional ou sala não podem ter sobreposição de horário</w:t>
+      </w:r>
+    </w:p>
+    <w:p>
+      <w:pPr>
+        <w:spacing w:after="0" w:line="240" w:lineRule="auto"/>
+      </w:pPr>
+      <w:r>
+        <w:rPr>
+          <w:rFonts w:ascii="Courier New" w:hAnsi="Courier New" w:cs="Courier New"/>
+          <w:sz w:val="14"/>
+          <w:szCs w:val="14"/>
+        </w:rPr>
+        <w:t>CREATE TABLE Agendamentos (</w:t>
+      </w:r>
+    </w:p>
+    <w:p>
+      <w:pPr>
+        <w:spacing w:after="0" w:line="240" w:lineRule="auto"/>
+      </w:pPr>
+      <w:r>
+        <w:rPr>
+          <w:rFonts w:ascii="Courier New" w:hAnsi="Courier New" w:cs="Courier New"/>
+          <w:sz w:val="14"/>
+          <w:szCs w:val="14"/>
+        </w:rPr>
+        <w:t xml:space="preserve">    ID               INT           NOT NULL IDENTITY(1,1) PRIMARY KEY,</w:t>
+      </w:r>
+    </w:p>
+    <w:p>
+      <w:pPr>
+        <w:spacing w:after="0" w:line="240" w:lineRule="auto"/>
+      </w:pPr>
+      <w:r>
+        <w:rPr>
+          <w:rFonts w:ascii="Courier New" w:hAnsi="Courier New" w:cs="Courier New"/>
+          <w:sz w:val="14"/>
+          <w:szCs w:val="14"/>
+        </w:rPr>
+        <w:t xml:space="preserve">    IDPaciente       INT           NOT NULL REFERENCES Pacientes(ID),</w:t>
+      </w:r>
+    </w:p>
+    <w:p>
+      <w:pPr>
+        <w:spacing w:after="0" w:line="240" w:lineRule="auto"/>
+      </w:pPr>
+      <w:r>
+        <w:rPr>
+          <w:rFonts w:ascii="Courier New" w:hAnsi="Courier New" w:cs="Courier New"/>
+          <w:sz w:val="14"/>
+          <w:szCs w:val="14"/>
+        </w:rPr>
+        <w:t xml:space="preserve">    IDProfissional   INT           NOT NULL REFERENCES Profissionais(ID),</w:t>
+      </w:r>
+    </w:p>
+    <w:p>
+      <w:pPr>
+        <w:spacing w:after="0" w:line="240" w:lineRule="auto"/>
+      </w:pPr>
+      <w:r>
+        <w:rPr>
+          <w:rFonts w:ascii="Courier New" w:hAnsi="Courier New" w:cs="Courier New"/>
+          <w:sz w:val="14"/>
+          <w:szCs w:val="14"/>
+        </w:rPr>
+        <w:t xml:space="preserve">    IDSala           INT           NOT NULL REFERENCES Salas(ID),</w:t>
+      </w:r>
+    </w:p>
+    <w:p>
+      <w:pPr>
+        <w:spacing w:after="0" w:line="240" w:lineRule="auto"/>
+      </w:pPr>
+      <w:r>
+        <w:rPr>
+          <w:rFonts w:ascii="Courier New" w:hAnsi="Courier New" w:cs="Courier New"/>
+          <w:sz w:val="14"/>
+          <w:szCs w:val="14"/>
+        </w:rPr>
+        <w:t xml:space="preserve">    DataHoraInicio   DATETIME      NOT NULL,</w:t>
+      </w:r>
+    </w:p>
+    <w:p>
+      <w:pPr>
+        <w:spacing w:after="0" w:line="240" w:lineRule="auto"/>
+      </w:pPr>
+      <w:r>
+        <w:rPr>
+          <w:rFonts w:ascii="Courier New" w:hAnsi="Courier New" w:cs="Courier New"/>
+          <w:sz w:val="14"/>
+          <w:szCs w:val="14"/>
+        </w:rPr>
+        <w:t xml:space="preserve">    DataHoraFim      DATETIME      NOT NULL,</w:t>
+      </w:r>
+    </w:p>
+    <w:p>
+      <w:pPr>
+        <w:spacing w:after="0" w:line="240" w:lineRule="auto"/>
+      </w:pPr>
+      <w:r>
+        <w:rPr>
+          <w:rFonts w:ascii="Courier New" w:hAnsi="Courier New" w:cs="Courier New"/>
+          <w:sz w:val="14"/>
+          <w:szCs w:val="14"/>
+        </w:rPr>
+        <w:t xml:space="preserve">    Status           NVARCHAR(20)  NOT NULL DEFAULT 'Agendado',</w:t>
+      </w:r>
+    </w:p>
+    <w:p>
+      <w:pPr>
+        <w:spacing w:after="0" w:line="240" w:lineRule="auto"/>
+      </w:pPr>
+      <w:r>
+        <w:rPr>
+          <w:rFonts w:ascii="Courier New" w:hAnsi="Courier New" w:cs="Courier New"/>
+          <w:sz w:val="14"/>
+          <w:szCs w:val="14"/>
+        </w:rPr>
+        <w:t xml:space="preserve">    Observacao       NVARCHAR(500) NULL,</w:t>
+      </w:r>
+    </w:p>
+    <w:p>
+      <w:pPr>
+        <w:spacing w:after="0" w:line="240" w:lineRule="auto"/>
+      </w:pPr>
+      <w:r>
+        <w:rPr>
+          <w:rFonts w:ascii="Courier New" w:hAnsi="Courier New" w:cs="Courier New"/>
+          <w:sz w:val="14"/>
+          <w:szCs w:val="14"/>
+        </w:rPr>
+        <w:t xml:space="preserve">    IDUsuarioCadastro INT          NOT NULL REFERENCES Usuarios(ID),</w:t>
+      </w:r>
+    </w:p>
+    <w:p>
+      <w:pPr>
+        <w:spacing w:after="0" w:line="240" w:lineRule="auto"/>
+      </w:pPr>
+      <w:r>
+        <w:rPr>
+          <w:rFonts w:ascii="Courier New" w:hAnsi="Courier New" w:cs="Courier New"/>
+          <w:sz w:val="14"/>
+          <w:szCs w:val="14"/>
+        </w:rPr>
+        <w:t xml:space="preserve">    DataCadastro     DATETIME      NOT NULL DEFAULT GETDATE()</w:t>
+      </w:r>
+    </w:p>
+    <w:p>
+      <w:pPr>
+        <w:spacing w:after="0" w:line="240" w:lineRule="auto"/>
+      </w:pPr>
+      <w:r>
+        <w:rPr>
+          <w:rFonts w:ascii="Courier New" w:hAnsi="Courier New" w:cs="Courier New"/>
+          <w:sz w:val="14"/>
+          <w:szCs w:val="14"/>
+        </w:rPr>
+        <w:t>);</w:t>
+      </w:r>
+    </w:p>
+    <w:p>
+      <w:pPr>
+        <w:spacing w:after="0" w:line="240" w:lineRule="auto"/>
+      </w:pPr>
+      <w:r>
+        <w:rPr>
+          <w:rFonts w:ascii="Courier New" w:hAnsi="Courier New" w:cs="Courier New"/>
+          <w:sz w:val="14"/>
+          <w:szCs w:val="14"/>
+        </w:rPr>
+        <w:t>GO</w:t>
+      </w:r>
+    </w:p>
+    <w:p>
+      <w:pPr>
+        <w:spacing w:after="0" w:line="240" w:lineRule="auto"/>
+      </w:pPr>
+    </w:p>
+    <w:p>
+      <w:pPr>
+        <w:spacing w:after="0" w:line="240" w:lineRule="auto"/>
+      </w:pPr>
+      <w:r>
+        <w:rPr>
+          <w:rFonts w:ascii="Courier New" w:hAnsi="Courier New" w:cs="Courier New"/>
+          <w:sz w:val="14"/>
+          <w:szCs w:val="14"/>
+        </w:rPr>
+        <w:t>-- ─── EvolucoesSessao ──────────────────────────────────────────────────────────</w:t>
+      </w:r>
+    </w:p>
+    <w:p>
+      <w:pPr>
+        <w:spacing w:after="0" w:line="240" w:lineRule="auto"/>
+      </w:pPr>
+      <w:r>
+        <w:rPr>
+          <w:rFonts w:ascii="Courier New" w:hAnsi="Courier New" w:cs="Courier New"/>
+          <w:sz w:val="14"/>
+          <w:szCs w:val="14"/>
+        </w:rPr>
+        <w:t>-- HumorPaciente    : 1 (muito desregulado) a 5 (muito regulado)</w:t>
+      </w:r>
+    </w:p>
+    <w:p>
+      <w:pPr>
+        <w:spacing w:after="0" w:line="240" w:lineRule="auto"/>
+      </w:pPr>
+      <w:r>
+        <w:rPr>
+          <w:rFonts w:ascii="Courier New" w:hAnsi="Courier New" w:cs="Courier New"/>
+          <w:sz w:val="14"/>
+          <w:szCs w:val="14"/>
+        </w:rPr>
+        <w:t>-- NivelEngajamento : 1 (sem engajamento) a 5 (totalmente engajado)</w:t>
+      </w:r>
+    </w:p>
+    <w:p>
+      <w:pPr>
+        <w:spacing w:after="0" w:line="240" w:lineRule="auto"/>
+      </w:pPr>
+      <w:r>
+        <w:rPr>
+          <w:rFonts w:ascii="Courier New" w:hAnsi="Courier New" w:cs="Courier New"/>
+          <w:sz w:val="14"/>
+          <w:szCs w:val="14"/>
+        </w:rPr>
+        <w:t>CREATE TABLE EvolucoesSessao (</w:t>
+      </w:r>
+    </w:p>
+    <w:p>
+      <w:pPr>
+        <w:spacing w:after="0" w:line="240" w:lineRule="auto"/>
+      </w:pPr>
+      <w:r>
+        <w:rPr>
+          <w:rFonts w:ascii="Courier New" w:hAnsi="Courier New" w:cs="Courier New"/>
+          <w:sz w:val="14"/>
+          <w:szCs w:val="14"/>
+        </w:rPr>
+        <w:t xml:space="preserve">    ID               INT           NOT NULL IDENTITY(1,1) PRIMARY KEY,</w:t>
+      </w:r>
+    </w:p>
+    <w:p>
+      <w:pPr>
+        <w:spacing w:after="0" w:line="240" w:lineRule="auto"/>
+      </w:pPr>
+      <w:r>
+        <w:rPr>
+          <w:rFonts w:ascii="Courier New" w:hAnsi="Courier New" w:cs="Courier New"/>
+          <w:sz w:val="14"/>
+          <w:szCs w:val="14"/>
+        </w:rPr>
+        <w:t xml:space="preserve">    IDAgendamento    INT           NOT NULL UNIQUE REFERENCES Agendamentos(ID),</w:t>
+      </w:r>
+    </w:p>
+    <w:p>
+      <w:pPr>
+        <w:spacing w:after="0" w:line="240" w:lineRule="auto"/>
+      </w:pPr>
+      <w:r>
+        <w:rPr>
+          <w:rFonts w:ascii="Courier New" w:hAnsi="Courier New" w:cs="Courier New"/>
+          <w:sz w:val="14"/>
+          <w:szCs w:val="14"/>
+        </w:rPr>
+        <w:t xml:space="preserve">    Conteudo         NVARCHAR(MAX) NOT NULL,</w:t>
+      </w:r>
+    </w:p>
+    <w:p>
+      <w:pPr>
+        <w:spacing w:after="0" w:line="240" w:lineRule="auto"/>
+      </w:pPr>
+      <w:r>
+        <w:rPr>
+          <w:rFonts w:ascii="Courier New" w:hAnsi="Courier New" w:cs="Courier New"/>
+          <w:sz w:val="14"/>
+          <w:szCs w:val="14"/>
+        </w:rPr>
+        <w:t xml:space="preserve">    Comportamentos   NVARCHAR(MAX) NULL,</w:t>
+      </w:r>
+    </w:p>
+    <w:p>
+      <w:pPr>
+        <w:spacing w:after="0" w:line="240" w:lineRule="auto"/>
+      </w:pPr>
+      <w:r>
+        <w:rPr>
+          <w:rFonts w:ascii="Courier New" w:hAnsi="Courier New" w:cs="Courier New"/>
+          <w:sz w:val="14"/>
+          <w:szCs w:val="14"/>
+        </w:rPr>
+        <w:t xml:space="preserve">    ProximosObjetivos NVARCHAR(MAX) NULL,</w:t>
+      </w:r>
+    </w:p>
+    <w:p>
+      <w:pPr>
+        <w:spacing w:after="0" w:line="240" w:lineRule="auto"/>
+      </w:pPr>
+      <w:r>
+        <w:rPr>
+          <w:rFonts w:ascii="Courier New" w:hAnsi="Courier New" w:cs="Courier New"/>
+          <w:sz w:val="14"/>
+          <w:szCs w:val="14"/>
+        </w:rPr>
+        <w:t xml:space="preserve">    HumorPaciente    TINYINT       NULL,</w:t>
+      </w:r>
+    </w:p>
+    <w:p>
+      <w:pPr>
+        <w:spacing w:after="0" w:line="240" w:lineRule="auto"/>
+      </w:pPr>
+      <w:r>
+        <w:rPr>
+          <w:rFonts w:ascii="Courier New" w:hAnsi="Courier New" w:cs="Courier New"/>
+          <w:sz w:val="14"/>
+          <w:szCs w:val="14"/>
+        </w:rPr>
+        <w:t xml:space="preserve">    NivelEngajamento TINYINT       NULL,</w:t>
+      </w:r>
+    </w:p>
+    <w:p>
+      <w:pPr>
+        <w:spacing w:after="0" w:line="240" w:lineRule="auto"/>
+      </w:pPr>
+      <w:r>
+        <w:rPr>
+          <w:rFonts w:ascii="Courier New" w:hAnsi="Courier New" w:cs="Courier New"/>
+          <w:sz w:val="14"/>
+          <w:szCs w:val="14"/>
+        </w:rPr>
+        <w:t xml:space="preserve">    DataCadastro     DATETIME      NOT NULL DEFAULT GETDATE()</w:t>
+      </w:r>
+    </w:p>
+    <w:p>
+      <w:pPr>
+        <w:spacing w:after="0" w:line="240" w:lineRule="auto"/>
+      </w:pPr>
+      <w:r>
+        <w:rPr>
+          <w:rFonts w:ascii="Courier New" w:hAnsi="Courier New" w:cs="Courier New"/>
+          <w:sz w:val="14"/>
+          <w:szCs w:val="14"/>
+        </w:rPr>
+        <w:t>);</w:t>
+      </w:r>
+    </w:p>
+    <w:p>
+      <w:pPr>
+        <w:spacing w:after="0" w:line="240" w:lineRule="auto"/>
+      </w:pPr>
+      <w:r>
+        <w:rPr>
+          <w:rFonts w:ascii="Courier New" w:hAnsi="Courier New" w:cs="Courier New"/>
+          <w:sz w:val="14"/>
+          <w:szCs w:val="14"/>
+        </w:rPr>
+        <w:t>GO</w:t>
+      </w:r>
+    </w:p>
+    <w:p>
+      <w:pPr>
+        <w:spacing w:after="0" w:line="240" w:lineRule="auto"/>
+      </w:pPr>
+    </w:p>
+    <w:p>
+      <w:pPr>
+        <w:spacing w:after="0" w:line="240" w:lineRule="auto"/>
+      </w:pPr>
+      <w:r>
+        <w:rPr>
+          <w:rFonts w:ascii="Courier New" w:hAnsi="Courier New" w:cs="Courier New"/>
+          <w:sz w:val="14"/>
+          <w:szCs w:val="14"/>
+        </w:rPr>
+        <w:t>-- ─── ObjetivosTerapeuticos ────────────────────────────────────────────────────</w:t>
+      </w:r>
+    </w:p>
+    <w:p>
+      <w:pPr>
+        <w:spacing w:after="0" w:line="240" w:lineRule="auto"/>
+      </w:pPr>
+      <w:r>
+        <w:rPr>
+          <w:rFonts w:ascii="Courier New" w:hAnsi="Courier New" w:cs="Courier New"/>
+          <w:sz w:val="14"/>
+          <w:szCs w:val="14"/>
+        </w:rPr>
+        <w:t>-- Status: EmProgresso | Concluido | Suspenso</w:t>
+      </w:r>
+    </w:p>
+    <w:p>
+      <w:pPr>
+        <w:spacing w:after="0" w:line="240" w:lineRule="auto"/>
+      </w:pPr>
+      <w:r>
+        <w:rPr>
+          <w:rFonts w:ascii="Courier New" w:hAnsi="Courier New" w:cs="Courier New"/>
+          <w:sz w:val="14"/>
+          <w:szCs w:val="14"/>
+        </w:rPr>
+        <w:t>CREATE TABLE ObjetivosTerapeuticos (</w:t>
+      </w:r>
+    </w:p>
+    <w:p>
+      <w:pPr>
+        <w:spacing w:after="0" w:line="240" w:lineRule="auto"/>
+      </w:pPr>
+      <w:r>
+        <w:rPr>
+          <w:rFonts w:ascii="Courier New" w:hAnsi="Courier New" w:cs="Courier New"/>
+          <w:sz w:val="14"/>
+          <w:szCs w:val="14"/>
+        </w:rPr>
+        <w:t xml:space="preserve">    ID                    INT           NOT NULL IDENTITY(1,1) PRIMARY KEY,</w:t>
+      </w:r>
+    </w:p>
+    <w:p>
+      <w:pPr>
+        <w:spacing w:after="0" w:line="240" w:lineRule="auto"/>
+      </w:pPr>
+      <w:r>
+        <w:rPr>
+          <w:rFonts w:ascii="Courier New" w:hAnsi="Courier New" w:cs="Courier New"/>
+          <w:sz w:val="14"/>
+          <w:szCs w:val="14"/>
+        </w:rPr>
+        <w:t xml:space="preserve">    IDPaciente            INT           NOT NULL REFERENCES Pacientes(ID),</w:t>
+      </w:r>
+    </w:p>
+    <w:p>
+      <w:pPr>
+        <w:spacing w:after="0" w:line="240" w:lineRule="auto"/>
+      </w:pPr>
+      <w:r>
+        <w:rPr>
+          <w:rFonts w:ascii="Courier New" w:hAnsi="Courier New" w:cs="Courier New"/>
+          <w:sz w:val="14"/>
+          <w:szCs w:val="14"/>
+        </w:rPr>
+        <w:t xml:space="preserve">    IDEspecialidade       INT           NOT NULL REFERENCES Especialidades(ID),</w:t>
+      </w:r>
+    </w:p>
+    <w:p>
+      <w:pPr>
+        <w:spacing w:after="0" w:line="240" w:lineRule="auto"/>
+      </w:pPr>
+      <w:r>
+        <w:rPr>
+          <w:rFonts w:ascii="Courier New" w:hAnsi="Courier New" w:cs="Courier New"/>
+          <w:sz w:val="14"/>
+          <w:szCs w:val="14"/>
+        </w:rPr>
+        <w:t xml:space="preserve">    Descricao             NVARCHAR(MAX) NOT NULL,</w:t>
+      </w:r>
+    </w:p>
+    <w:p>
+      <w:pPr>
+        <w:spacing w:after="0" w:line="240" w:lineRule="auto"/>
+      </w:pPr>
+      <w:r>
+        <w:rPr>
+          <w:rFonts w:ascii="Courier New" w:hAnsi="Courier New" w:cs="Courier New"/>
+          <w:sz w:val="14"/>
+          <w:szCs w:val="14"/>
+        </w:rPr>
+        <w:t xml:space="preserve">    DataInicio            DATE          NOT NULL,</w:t>
+      </w:r>
+    </w:p>
+    <w:p>
+      <w:pPr>
+        <w:spacing w:after="0" w:line="240" w:lineRule="auto"/>
+      </w:pPr>
+      <w:r>
+        <w:rPr>
+          <w:rFonts w:ascii="Courier New" w:hAnsi="Courier New" w:cs="Courier New"/>
+          <w:sz w:val="14"/>
+          <w:szCs w:val="14"/>
+        </w:rPr>
+        <w:t xml:space="preserve">    DataPrevisaoFim       DATE          NULL,</w:t>
+      </w:r>
+    </w:p>
+    <w:p>
+      <w:pPr>
+        <w:spacing w:after="0" w:line="240" w:lineRule="auto"/>
+      </w:pPr>
+      <w:r>
+        <w:rPr>
+          <w:rFonts w:ascii="Courier New" w:hAnsi="Courier New" w:cs="Courier New"/>
+          <w:sz w:val="14"/>
+          <w:szCs w:val="14"/>
+        </w:rPr>
+        <w:t xml:space="preserve">    Status                NVARCHAR(20)  NOT NULL DEFAULT 'EmProgresso',</w:t>
+      </w:r>
+    </w:p>
+    <w:p>
+      <w:pPr>
+        <w:spacing w:after="0" w:line="240" w:lineRule="auto"/>
+      </w:pPr>
+      <w:r>
+        <w:rPr>
+          <w:rFonts w:ascii="Courier New" w:hAnsi="Courier New" w:cs="Courier New"/>
+          <w:sz w:val="14"/>
+          <w:szCs w:val="14"/>
+        </w:rPr>
+        <w:t xml:space="preserve">    PercentualAtingimento TINYINT       NOT NULL DEFAULT 0</w:t>
+      </w:r>
+    </w:p>
+    <w:p>
+      <w:pPr>
+        <w:spacing w:after="0" w:line="240" w:lineRule="auto"/>
+      </w:pPr>
+      <w:r>
+        <w:rPr>
+          <w:rFonts w:ascii="Courier New" w:hAnsi="Courier New" w:cs="Courier New"/>
+          <w:sz w:val="14"/>
+          <w:szCs w:val="14"/>
+        </w:rPr>
+        <w:t>);</w:t>
+      </w:r>
+    </w:p>
+    <w:p>
+      <w:pPr>
+        <w:spacing w:after="0" w:line="240" w:lineRule="auto"/>
+      </w:pPr>
+      <w:r>
+        <w:rPr>
+          <w:rFonts w:ascii="Courier New" w:hAnsi="Courier New" w:cs="Courier New"/>
+          <w:sz w:val="14"/>
+          <w:szCs w:val="14"/>
+        </w:rPr>
+        <w:t>GO</w:t>
+      </w:r>
+    </w:p>
+    <w:p>
+      <w:pPr>
+        <w:spacing w:after="0" w:line="240" w:lineRule="auto"/>
+      </w:pPr>
+    </w:p>
+    <w:p>
+      <w:pPr>
+        <w:spacing w:after="0" w:line="240" w:lineRule="auto"/>
+      </w:pPr>
+      <w:r>
+        <w:rPr>
+          <w:rFonts w:ascii="Courier New" w:hAnsi="Courier New" w:cs="Courier New"/>
+          <w:sz w:val="14"/>
+          <w:szCs w:val="14"/>
+        </w:rPr>
+        <w:t>-- =============================================================================</w:t>
+      </w:r>
+    </w:p>
+    <w:p>
+      <w:pPr>
+        <w:spacing w:after="0" w:line="240" w:lineRule="auto"/>
+      </w:pPr>
+      <w:r>
+        <w:rPr>
+          <w:rFonts w:ascii="Courier New" w:hAnsi="Courier New" w:cs="Courier New"/>
+          <w:sz w:val="14"/>
+          <w:szCs w:val="14"/>
+        </w:rPr>
+        <w:t>-- ÍNDICES</w:t>
+      </w:r>
+    </w:p>
+    <w:p>
+      <w:pPr>
+        <w:spacing w:after="0" w:line="240" w:lineRule="auto"/>
+      </w:pPr>
+      <w:r>
+        <w:rPr>
+          <w:rFonts w:ascii="Courier New" w:hAnsi="Courier New" w:cs="Courier New"/>
+          <w:sz w:val="14"/>
+          <w:szCs w:val="14"/>
+        </w:rPr>
+        <w:t>-- =============================================================================</w:t>
+      </w:r>
+    </w:p>
+    <w:p>
+      <w:pPr>
+        <w:spacing w:after="0" w:line="240" w:lineRule="auto"/>
+      </w:pPr>
+    </w:p>
+    <w:p>
+      <w:pPr>
+        <w:spacing w:after="0" w:line="240" w:lineRule="auto"/>
+      </w:pPr>
+      <w:r>
+        <w:rPr>
+          <w:rFonts w:ascii="Courier New" w:hAnsi="Courier New" w:cs="Courier New"/>
+          <w:sz w:val="14"/>
+          <w:szCs w:val="14"/>
+        </w:rPr>
+        <w:t>CREATE INDEX IX_Agendamentos_DataHoraInicio ON Agendamentos(DataHoraInicio);</w:t>
+      </w:r>
+    </w:p>
+    <w:p>
+      <w:pPr>
+        <w:spacing w:after="0" w:line="240" w:lineRule="auto"/>
+      </w:pPr>
+      <w:r>
+        <w:rPr>
+          <w:rFonts w:ascii="Courier New" w:hAnsi="Courier New" w:cs="Courier New"/>
+          <w:sz w:val="14"/>
+          <w:szCs w:val="14"/>
+        </w:rPr>
+        <w:t>CREATE INDEX IX_Agendamentos_IDPaciente     ON Agendamentos(IDPaciente);</w:t>
+      </w:r>
+    </w:p>
+    <w:p>
+      <w:pPr>
+        <w:spacing w:after="0" w:line="240" w:lineRule="auto"/>
+      </w:pPr>
+      <w:r>
+        <w:rPr>
+          <w:rFonts w:ascii="Courier New" w:hAnsi="Courier New" w:cs="Courier New"/>
+          <w:sz w:val="14"/>
+          <w:szCs w:val="14"/>
+        </w:rPr>
+        <w:t>CREATE INDEX IX_Agendamentos_IDProfissional ON Agendamentos(IDProfissional);</w:t>
+      </w:r>
+    </w:p>
+    <w:p>
+      <w:pPr>
+        <w:spacing w:after="0" w:line="240" w:lineRule="auto"/>
+      </w:pPr>
+      <w:r>
+        <w:rPr>
+          <w:rFonts w:ascii="Courier New" w:hAnsi="Courier New" w:cs="Courier New"/>
+          <w:sz w:val="14"/>
+          <w:szCs w:val="14"/>
+        </w:rPr>
+        <w:t>CREATE INDEX IX_Agendamentos_IDSala         ON Agendamentos(IDSala);</w:t>
+      </w:r>
+    </w:p>
+    <w:p>
+      <w:pPr>
+        <w:spacing w:after="0" w:line="240" w:lineRule="auto"/>
+      </w:pPr>
+      <w:r>
+        <w:rPr>
+          <w:rFonts w:ascii="Courier New" w:hAnsi="Courier New" w:cs="Courier New"/>
+          <w:sz w:val="14"/>
+          <w:szCs w:val="14"/>
+        </w:rPr>
+        <w:t>CREATE INDEX IX_Pacientes_Nome              ON Pacientes(Nome);</w:t>
+      </w:r>
+    </w:p>
+    <w:p>
+      <w:pPr>
+        <w:spacing w:after="0" w:line="240" w:lineRule="auto"/>
+      </w:pPr>
+      <w:r>
+        <w:rPr>
+          <w:rFonts w:ascii="Courier New" w:hAnsi="Courier New" w:cs="Courier New"/>
+          <w:sz w:val="14"/>
+          <w:szCs w:val="14"/>
+        </w:rPr>
+        <w:t>CREATE INDEX IX_ObjetivosTerapeuticos_IDPaciente ON ObjetivosTerapeuticos(IDPaciente);</w:t>
+      </w:r>
+    </w:p>
+    <w:p>
+      <w:pPr>
+        <w:spacing w:after="0" w:line="240" w:lineRule="auto"/>
+      </w:pPr>
+      <w:r>
+        <w:rPr>
+          <w:rFonts w:ascii="Courier New" w:hAnsi="Courier New" w:cs="Courier New"/>
+          <w:sz w:val="14"/>
+          <w:szCs w:val="14"/>
+        </w:rPr>
+        <w:t>GO</w:t>
+      </w:r>
+    </w:p>
+    <w:p>
+      <w:pPr>
+        <w:spacing w:after="0" w:line="240" w:lineRule="auto"/>
+      </w:pPr>
+    </w:p>
+    <w:p>
+      <w:pPr>
+        <w:spacing w:after="0" w:line="240" w:lineRule="auto"/>
+      </w:pPr>
+      <w:r>
+        <w:rPr>
+          <w:rFonts w:ascii="Courier New" w:hAnsi="Courier New" w:cs="Courier New"/>
+          <w:sz w:val="14"/>
+          <w:szCs w:val="14"/>
+        </w:rPr>
+        <w:t>-- =============================================================================</w:t>
+      </w:r>
+    </w:p>
+    <w:p>
+      <w:pPr>
+        <w:spacing w:after="0" w:line="240" w:lineRule="auto"/>
+      </w:pPr>
+      <w:r>
+        <w:rPr>
+          <w:rFonts w:ascii="Courier New" w:hAnsi="Courier New" w:cs="Courier New"/>
+          <w:sz w:val="14"/>
+          <w:szCs w:val="14"/>
+        </w:rPr>
+        <w:t>-- SEED INICIAL — usuário administrador (senha: admin123)</w:t>
+      </w:r>
+    </w:p>
+    <w:p>
+      <w:pPr>
+        <w:spacing w:after="0" w:line="240" w:lineRule="auto"/>
+      </w:pPr>
+      <w:r>
+        <w:rPr>
+          <w:rFonts w:ascii="Courier New" w:hAnsi="Courier New" w:cs="Courier New"/>
+          <w:sz w:val="14"/>
+          <w:szCs w:val="14"/>
+        </w:rPr>
+        <w:t>-- Salt e hash gerados por CriptografiaSenha.GerarSalt() / CalcularHash()</w:t>
+      </w:r>
+    </w:p>
+    <w:p>
+      <w:pPr>
+        <w:spacing w:after="0" w:line="240" w:lineRule="auto"/>
+      </w:pPr>
+      <w:r>
+        <w:rPr>
+          <w:rFonts w:ascii="Courier New" w:hAnsi="Courier New" w:cs="Courier New"/>
+          <w:sz w:val="14"/>
+          <w:szCs w:val="14"/>
+        </w:rPr>
+        <w:lastRenderedPageBreak/>
+        <w:t>-- Substitua pelo hash real calculado pela aplicação antes de usar em produção</w:t>
+      </w:r>
+    </w:p>
+    <w:p>
+      <w:pPr>
+        <w:spacing w:after="0" w:line="240" w:lineRule="auto"/>
+      </w:pPr>
+      <w:r>
+        <w:rPr>
+          <w:rFonts w:ascii="Courier New" w:hAnsi="Courier New" w:cs="Courier New"/>
+          <w:sz w:val="14"/>
+          <w:szCs w:val="14"/>
+        </w:rPr>
+        <w:t>-- =============================================================================</w:t>
+      </w:r>
+    </w:p>
+    <w:p>
+      <w:pPr>
+        <w:spacing w:after="0" w:line="240" w:lineRule="auto"/>
+      </w:pPr>
+    </w:p>
+    <w:p>
+      <w:pPr>
+        <w:spacing w:after="0" w:line="240" w:lineRule="auto"/>
+      </w:pPr>
+      <w:r>
+        <w:rPr>
+          <w:rFonts w:ascii="Courier New" w:hAnsi="Courier New" w:cs="Courier New"/>
+          <w:sz w:val="14"/>
+          <w:szCs w:val="14"/>
+        </w:rPr>
+        <w:t>INSERT INTO Cidades (Nome, UF) VALUES</w:t>
+      </w:r>
+    </w:p>
+    <w:p>
+      <w:pPr>
+        <w:spacing w:after="0" w:line="240" w:lineRule="auto"/>
+      </w:pPr>
+      <w:r>
+        <w:rPr>
+          <w:rFonts w:ascii="Courier New" w:hAnsi="Courier New" w:cs="Courier New"/>
+          <w:sz w:val="14"/>
+          <w:szCs w:val="14"/>
+        </w:rPr>
+        <w:t xml:space="preserve">    ('Macaubal',         'SP'),</w:t>
+      </w:r>
+    </w:p>
+    <w:p>
+      <w:pPr>
+        <w:spacing w:after="0" w:line="240" w:lineRule="auto"/>
+      </w:pPr>
+      <w:r>
+        <w:rPr>
+          <w:rFonts w:ascii="Courier New" w:hAnsi="Courier New" w:cs="Courier New"/>
+          <w:sz w:val="14"/>
+          <w:szCs w:val="14"/>
+        </w:rPr>
+        <w:t xml:space="preserve">    ('São José do Rio Preto', 'SP'),</w:t>
+      </w:r>
+    </w:p>
+    <w:p>
+      <w:pPr>
+        <w:spacing w:after="0" w:line="240" w:lineRule="auto"/>
+      </w:pPr>
+      <w:r>
+        <w:rPr>
+          <w:rFonts w:ascii="Courier New" w:hAnsi="Courier New" w:cs="Courier New"/>
+          <w:sz w:val="14"/>
+          <w:szCs w:val="14"/>
+        </w:rPr>
+        <w:t xml:space="preserve">    ('Votuporanga',      'SP'),</w:t>
+      </w:r>
+    </w:p>
+    <w:p>
+      <w:pPr>
+        <w:spacing w:after="0" w:line="240" w:lineRule="auto"/>
+      </w:pPr>
+      <w:r>
+        <w:rPr>
+          <w:rFonts w:ascii="Courier New" w:hAnsi="Courier New" w:cs="Courier New"/>
+          <w:sz w:val="14"/>
+          <w:szCs w:val="14"/>
+        </w:rPr>
+        <w:t xml:space="preserve">    ('Nhandeara',        'SP');</w:t>
+      </w:r>
+    </w:p>
+    <w:p>
+      <w:pPr>
+        <w:spacing w:after="0" w:line="240" w:lineRule="auto"/>
+      </w:pPr>
+      <w:r>
+        <w:rPr>
+          <w:rFonts w:ascii="Courier New" w:hAnsi="Courier New" w:cs="Courier New"/>
+          <w:sz w:val="14"/>
+          <w:szCs w:val="14"/>
+        </w:rPr>
+        <w:t>GO</w:t>
+      </w:r>
+    </w:p>
+    <w:p>
+      <w:pPr>
+        <w:spacing w:after="0" w:line="240" w:lineRule="auto"/>
+      </w:pPr>
+    </w:p>
+    <w:p>
+      <w:pPr>
+        <w:spacing w:after="0" w:line="240" w:lineRule="auto"/>
+      </w:pPr>
+      <w:r>
+        <w:rPr>
+          <w:rFonts w:ascii="Courier New" w:hAnsi="Courier New" w:cs="Courier New"/>
+          <w:sz w:val="14"/>
+          <w:szCs w:val="14"/>
+        </w:rPr>
+        <w:t>INSERT INTO Especialidades (Nome, ConselhoSigla, CorHex, Ativo) VALUES</w:t>
+      </w:r>
+    </w:p>
+    <w:p>
+      <w:pPr>
+        <w:spacing w:after="0" w:line="240" w:lineRule="auto"/>
+      </w:pPr>
+      <w:r>
+        <w:rPr>
+          <w:rFonts w:ascii="Courier New" w:hAnsi="Courier New" w:cs="Courier New"/>
+          <w:sz w:val="14"/>
+          <w:szCs w:val="14"/>
+        </w:rPr>
+        <w:t xml:space="preserve">    ('Psicologia',             'CRP',     '#3B82F6', 1),</w:t>
+      </w:r>
+    </w:p>
+    <w:p>
+      <w:pPr>
+        <w:spacing w:after="0" w:line="240" w:lineRule="auto"/>
+      </w:pPr>
+      <w:r>
+        <w:rPr>
+          <w:rFonts w:ascii="Courier New" w:hAnsi="Courier New" w:cs="Courier New"/>
+          <w:sz w:val="14"/>
+          <w:szCs w:val="14"/>
+        </w:rPr>
+        <w:t xml:space="preserve">    ('Fonoaudiologia',         'CRFa',    '#10B981', 1),</w:t>
+      </w:r>
+    </w:p>
+    <w:p>
+      <w:pPr>
+        <w:spacing w:after="0" w:line="240" w:lineRule="auto"/>
+      </w:pPr>
+      <w:r>
+        <w:rPr>
+          <w:rFonts w:ascii="Courier New" w:hAnsi="Courier New" w:cs="Courier New"/>
+          <w:sz w:val="14"/>
+          <w:szCs w:val="14"/>
+        </w:rPr>
+        <w:t xml:space="preserve">    ('Terapia Ocupacional',    'CREFITO', '#F59E0B', 1),</w:t>
+      </w:r>
+    </w:p>
+    <w:p>
+      <w:pPr>
+        <w:spacing w:after="0" w:line="240" w:lineRule="auto"/>
+      </w:pPr>
+      <w:r>
+        <w:rPr>
+          <w:rFonts w:ascii="Courier New" w:hAnsi="Courier New" w:cs="Courier New"/>
+          <w:sz w:val="14"/>
+          <w:szCs w:val="14"/>
+        </w:rPr>
+        <w:t xml:space="preserve">    ('Fisioterapia',           'CREFITO', '#EF4444', 1),</w:t>
+      </w:r>
+    </w:p>
+    <w:p>
+      <w:pPr>
+        <w:spacing w:after="0" w:line="240" w:lineRule="auto"/>
+      </w:pPr>
+      <w:r>
+        <w:rPr>
+          <w:rFonts w:ascii="Courier New" w:hAnsi="Courier New" w:cs="Courier New"/>
+          <w:sz w:val="14"/>
+          <w:szCs w:val="14"/>
+        </w:rPr>
+        <w:t xml:space="preserve">    ('Psicopedagogia',         'ABPp',    '#8B5CF6', 1),</w:t>
+      </w:r>
+    </w:p>
+    <w:p>
+      <w:pPr>
+        <w:spacing w:after="0" w:line="240" w:lineRule="auto"/>
+      </w:pPr>
+      <w:r>
+        <w:rPr>
+          <w:rFonts w:ascii="Courier New" w:hAnsi="Courier New" w:cs="Courier New"/>
+          <w:sz w:val="14"/>
+          <w:szCs w:val="14"/>
+        </w:rPr>
+        <w:t xml:space="preserve">    ('Neurologia',             'CFM',     '#EC4899', 1);</w:t>
+      </w:r>
+    </w:p>
+    <w:p>
+      <w:pPr>
+        <w:spacing w:after="0" w:line="240" w:lineRule="auto"/>
+      </w:pPr>
+      <w:r>
+        <w:rPr>
+          <w:rFonts w:ascii="Courier New" w:hAnsi="Courier New" w:cs="Courier New"/>
+          <w:sz w:val="14"/>
+          <w:szCs w:val="14"/>
+        </w:rPr>
+        <w:t>GO</w:t>
+      </w:r>
+    </w:p>
+    <w:p>
+      <w:pPr>
+        <w:spacing w:after="0" w:line="240" w:lineRule="auto"/>
+      </w:pPr>
+    </w:p>
+    <w:p>
+      <w:pPr>
+        <w:spacing w:after="0" w:line="240" w:lineRule="auto"/>
+      </w:pPr>
+      <w:r>
+        <w:rPr>
+          <w:rFonts w:ascii="Courier New" w:hAnsi="Courier New" w:cs="Courier New"/>
+          <w:sz w:val="14"/>
+          <w:szCs w:val="14"/>
+        </w:rPr>
+        <w:t>-- Usuário administrador padrão — login: admin | senha: admin123</w:t>
+      </w:r>
+    </w:p>
+    <w:p>
+      <w:pPr>
+        <w:spacing w:after="0" w:line="240" w:lineRule="auto"/>
+      </w:pPr>
+      <w:r>
+        <w:rPr>
+          <w:rFonts w:ascii="Courier New" w:hAnsi="Courier New" w:cs="Courier New"/>
+          <w:sz w:val="14"/>
+          <w:szCs w:val="14"/>
+        </w:rPr>
+        <w:t>-- Hash SHA-256 (UTF-16 LE) gerado pela classe CriptografiaSenha.CalcularHash()</w:t>
+      </w:r>
+    </w:p>
+    <w:p>
+      <w:pPr>
+        <w:spacing w:after="0" w:line="240" w:lineRule="auto"/>
+      </w:pPr>
+      <w:r>
+        <w:rPr>
+          <w:rFonts w:ascii="Courier New" w:hAnsi="Courier New" w:cs="Courier New"/>
+          <w:sz w:val="14"/>
+          <w:szCs w:val="14"/>
+        </w:rPr>
+        <w:t>INSERT INTO Usuarios (Login, SenhaHash, Salt, Nome, Perfil, Ativo) VALUES (</w:t>
+      </w:r>
+    </w:p>
+    <w:p>
+      <w:pPr>
+        <w:spacing w:after="0" w:line="240" w:lineRule="auto"/>
+      </w:pPr>
+      <w:r>
+        <w:rPr>
+          <w:rFonts w:ascii="Courier New" w:hAnsi="Courier New" w:cs="Courier New"/>
+          <w:sz w:val="14"/>
+          <w:szCs w:val="14"/>
+        </w:rPr>
+        <w:t xml:space="preserve">    'admin',</w:t>
+      </w:r>
+    </w:p>
+    <w:p>
+      <w:pPr>
+        <w:spacing w:after="0" w:line="240" w:lineRule="auto"/>
+      </w:pPr>
+      <w:r>
+        <w:rPr>
+          <w:rFonts w:ascii="Courier New" w:hAnsi="Courier New" w:cs="Courier New"/>
+          <w:sz w:val="14"/>
+          <w:szCs w:val="14"/>
+        </w:rPr>
+        <w:t xml:space="preserve">    '068FD459A29B281655624ED9D0D5ABD06BAF27B1CC2D5E633677CADF031DE5E6',</w:t>
+      </w:r>
+    </w:p>
+    <w:p>
+      <w:pPr>
+        <w:spacing w:after="0" w:line="240" w:lineRule="auto"/>
+      </w:pPr>
+      <w:r>
+        <w:rPr>
+          <w:rFonts w:ascii="Courier New" w:hAnsi="Courier New" w:cs="Courier New"/>
+          <w:sz w:val="14"/>
+          <w:szCs w:val="14"/>
+        </w:rPr>
+        <w:t xml:space="preserve">    'a1b2c3d4-e5f6-7890-abcd-ef1234567890',</w:t>
+      </w:r>
+    </w:p>
+    <w:p>
+      <w:pPr>
+        <w:spacing w:after="0" w:line="240" w:lineRule="auto"/>
+      </w:pPr>
+      <w:r>
+        <w:rPr>
+          <w:rFonts w:ascii="Courier New" w:hAnsi="Courier New" w:cs="Courier New"/>
+          <w:sz w:val="14"/>
+          <w:szCs w:val="14"/>
+        </w:rPr>
+        <w:t xml:space="preserve">    'Administrador',</w:t>
+      </w:r>
+    </w:p>
+    <w:p>
+      <w:pPr>
+        <w:spacing w:after="0" w:line="240" w:lineRule="auto"/>
+      </w:pPr>
+      <w:r>
+        <w:rPr>
+          <w:rFonts w:ascii="Courier New" w:hAnsi="Courier New" w:cs="Courier New"/>
+          <w:sz w:val="14"/>
+          <w:szCs w:val="14"/>
+        </w:rPr>
+        <w:t xml:space="preserve">    'Admin',</w:t>
+      </w:r>
+    </w:p>
+    <w:p>
+      <w:pPr>
+        <w:spacing w:after="0" w:line="240" w:lineRule="auto"/>
+      </w:pPr>
+      <w:r>
+        <w:rPr>
+          <w:rFonts w:ascii="Courier New" w:hAnsi="Courier New" w:cs="Courier New"/>
+          <w:sz w:val="14"/>
+          <w:szCs w:val="14"/>
+        </w:rPr>
+        <w:t xml:space="preserve">    1</w:t>
+      </w:r>
+    </w:p>
+    <w:p>
+      <w:pPr>
+        <w:spacing w:after="0" w:line="240" w:lineRule="auto"/>
+      </w:pPr>
+      <w:r>
+        <w:rPr>
+          <w:rFonts w:ascii="Courier New" w:hAnsi="Courier New" w:cs="Courier New"/>
+          <w:sz w:val="14"/>
+          <w:szCs w:val="14"/>
+        </w:rPr>
+        <w:t>);</w:t>
+      </w:r>
+    </w:p>
+    <w:p>
+      <w:pPr>
+        <w:spacing w:after="0" w:line="240" w:lineRule="auto"/>
+      </w:pPr>
+      <w:r>
+        <w:rPr>
+          <w:rFonts w:ascii="Courier New" w:hAnsi="Courier New" w:cs="Courier New"/>
+          <w:sz w:val="14"/>
+          <w:szCs w:val="14"/>
+        </w:rPr>
+        <w:t>GO</w:t>
       </w:r>
     </w:p>
     <w:p>
@@ -3158,7 +6155,7 @@
         <w:spacing w:before="360" w:after="360" w:line="360" w:lineRule="auto"/>
         <w:outlineLvl w:val="1"/>
       </w:pPr>
-      <w:bookmarkStart w:id="7" w:name="_Toc231037136"/>
+      <w:bookmarkStart w:id="7" w:name="_Toc231039351"/>
       <w:r>
         <w:rPr>
           <w:rFonts w:ascii="Times New Roman" w:hAnsi="Times New Roman" w:cs="Times New Roman"/>
@@ -3321,7 +6318,7 @@
         <w:spacing w:before="360" w:after="360" w:line="360" w:lineRule="auto"/>
         <w:outlineLvl w:val="1"/>
       </w:pPr>
-      <w:bookmarkStart w:id="8" w:name="_Toc231037137"/>
+      <w:bookmarkStart w:id="8" w:name="_Toc231039352"/>
       <w:r>
         <w:rPr>
           <w:rFonts w:ascii="Times New Roman" w:hAnsi="Times New Roman" w:cs="Times New Roman"/>
@@ -3484,7 +6481,7 @@
         <w:spacing w:before="360" w:after="360" w:line="360" w:lineRule="auto"/>
         <w:outlineLvl w:val="0"/>
       </w:pPr>
-      <w:bookmarkStart w:id="9" w:name="_Toc231037138"/>
+      <w:bookmarkStart w:id="9" w:name="_Toc231039353"/>
       <w:r>
         <w:rPr>
           <w:rFonts w:ascii="Times New Roman" w:hAnsi="Times New Roman" w:cs="Times New Roman"/>
@@ -3519,7 +6516,7 @@
         <w:spacing w:before="360" w:after="360" w:line="360" w:lineRule="auto"/>
         <w:outlineLvl w:val="1"/>
       </w:pPr>
-      <w:bookmarkStart w:id="10" w:name="_Toc231037139"/>
+      <w:bookmarkStart w:id="10" w:name="_Toc231039354"/>
       <w:r>
         <w:rPr>
           <w:rFonts w:ascii="Times New Roman" w:hAnsi="Times New Roman" w:cs="Times New Roman"/>
@@ -3656,7 +6653,7 @@
         <w:spacing w:before="360" w:after="360" w:line="360" w:lineRule="auto"/>
         <w:outlineLvl w:val="1"/>
       </w:pPr>
-      <w:bookmarkStart w:id="11" w:name="_Toc231037140"/>
+      <w:bookmarkStart w:id="11" w:name="_Toc231039355"/>
       <w:r>
         <w:rPr>
           <w:rFonts w:ascii="Times New Roman" w:hAnsi="Times New Roman" w:cs="Times New Roman"/>
@@ -3793,7 +6790,7 @@
         <w:spacing w:before="360" w:after="360" w:line="360" w:lineRule="auto"/>
         <w:outlineLvl w:val="1"/>
       </w:pPr>
-      <w:bookmarkStart w:id="12" w:name="_Toc231037141"/>
+      <w:bookmarkStart w:id="12" w:name="_Toc231039356"/>
       <w:r>
         <w:rPr>
           <w:rFonts w:ascii="Times New Roman" w:hAnsi="Times New Roman" w:cs="Times New Roman"/>
@@ -3930,7 +6927,7 @@
         <w:spacing w:before="360" w:after="360" w:line="360" w:lineRule="auto"/>
         <w:outlineLvl w:val="1"/>
       </w:pPr>
-      <w:bookmarkStart w:id="13" w:name="_Toc231037142"/>
+      <w:bookmarkStart w:id="13" w:name="_Toc231039357"/>
       <w:r>
         <w:rPr>
           <w:rFonts w:ascii="Times New Roman" w:hAnsi="Times New Roman" w:cs="Times New Roman"/>
@@ -4067,7 +7064,7 @@
         <w:spacing w:before="360" w:after="360" w:line="360" w:lineRule="auto"/>
         <w:outlineLvl w:val="1"/>
       </w:pPr>
-      <w:bookmarkStart w:id="14" w:name="_Toc231037143"/>
+      <w:bookmarkStart w:id="14" w:name="_Toc231039358"/>
       <w:r>
         <w:rPr>
           <w:rFonts w:ascii="Times New Roman" w:hAnsi="Times New Roman" w:cs="Times New Roman"/>
@@ -4204,7 +7201,7 @@
         <w:spacing w:before="360" w:after="360" w:line="360" w:lineRule="auto"/>
         <w:outlineLvl w:val="1"/>
       </w:pPr>
-      <w:bookmarkStart w:id="15" w:name="_Toc231037144"/>
+      <w:bookmarkStart w:id="15" w:name="_Toc231039359"/>
       <w:r>
         <w:rPr>
           <w:rFonts w:ascii="Times New Roman" w:hAnsi="Times New Roman" w:cs="Times New Roman"/>
@@ -4341,7 +7338,7 @@
         <w:spacing w:before="360" w:after="360" w:line="360" w:lineRule="auto"/>
         <w:outlineLvl w:val="1"/>
       </w:pPr>
-      <w:bookmarkStart w:id="16" w:name="_Toc231037145"/>
+      <w:bookmarkStart w:id="16" w:name="_Toc231039360"/>
       <w:r>
         <w:rPr>
           <w:rFonts w:ascii="Times New Roman" w:hAnsi="Times New Roman" w:cs="Times New Roman"/>
@@ -4478,7 +7475,7 @@
         <w:spacing w:before="360" w:after="360" w:line="360" w:lineRule="auto"/>
         <w:outlineLvl w:val="1"/>
       </w:pPr>
-      <w:bookmarkStart w:id="17" w:name="_Toc231037146"/>
+      <w:bookmarkStart w:id="17" w:name="_Toc231039361"/>
       <w:r>
         <w:rPr>
           <w:rFonts w:ascii="Times New Roman" w:hAnsi="Times New Roman" w:cs="Times New Roman"/>
@@ -4615,7 +7612,7 @@
         <w:spacing w:before="360" w:after="360" w:line="360" w:lineRule="auto"/>
         <w:outlineLvl w:val="1"/>
       </w:pPr>
-      <w:bookmarkStart w:id="18" w:name="_Toc231037147"/>
+      <w:bookmarkStart w:id="18" w:name="_Toc231039362"/>
       <w:r>
         <w:rPr>
           <w:rFonts w:ascii="Times New Roman" w:hAnsi="Times New Roman" w:cs="Times New Roman"/>
@@ -4752,7 +7749,7 @@
         <w:spacing w:before="360" w:after="360" w:line="360" w:lineRule="auto"/>
         <w:outlineLvl w:val="1"/>
       </w:pPr>
-      <w:bookmarkStart w:id="19" w:name="_Toc231037148"/>
+      <w:bookmarkStart w:id="19" w:name="_Toc231039363"/>
       <w:r>
         <w:rPr>
           <w:rFonts w:ascii="Times New Roman" w:hAnsi="Times New Roman" w:cs="Times New Roman"/>
@@ -4889,7 +7886,7 @@
         <w:spacing w:before="360" w:after="360" w:line="360" w:lineRule="auto"/>
         <w:outlineLvl w:val="1"/>
       </w:pPr>
-      <w:bookmarkStart w:id="20" w:name="_Toc231037149"/>
+      <w:bookmarkStart w:id="20" w:name="_Toc231039364"/>
       <w:r>
         <w:rPr>
           <w:rFonts w:ascii="Times New Roman" w:hAnsi="Times New Roman" w:cs="Times New Roman"/>
@@ -5026,7 +8023,7 @@
         <w:spacing w:before="360" w:after="360" w:line="360" w:lineRule="auto"/>
         <w:outlineLvl w:val="1"/>
       </w:pPr>
-      <w:bookmarkStart w:id="21" w:name="_Toc231037150"/>
+      <w:bookmarkStart w:id="21" w:name="_Toc231039365"/>
       <w:r>
         <w:rPr>
           <w:rFonts w:ascii="Times New Roman" w:hAnsi="Times New Roman" w:cs="Times New Roman"/>
@@ -5163,7 +8160,7 @@
         <w:spacing w:before="360" w:after="360" w:line="360" w:lineRule="auto"/>
         <w:outlineLvl w:val="1"/>
       </w:pPr>
-      <w:bookmarkStart w:id="22" w:name="_Toc231037151"/>
+      <w:bookmarkStart w:id="22" w:name="_Toc231039366"/>
       <w:r>
         <w:rPr>
           <w:rFonts w:ascii="Times New Roman" w:hAnsi="Times New Roman" w:cs="Times New Roman"/>
@@ -5300,7 +8297,7 @@
         <w:spacing w:before="360" w:after="360" w:line="360" w:lineRule="auto"/>
         <w:outlineLvl w:val="1"/>
       </w:pPr>
-      <w:bookmarkStart w:id="23" w:name="_Toc231037152"/>
+      <w:bookmarkStart w:id="23" w:name="_Toc231039367"/>
       <w:r>
         <w:rPr>
           <w:rFonts w:ascii="Times New Roman" w:hAnsi="Times New Roman" w:cs="Times New Roman"/>
@@ -5437,7 +8434,7 @@
         <w:spacing w:before="360" w:after="360" w:line="360" w:lineRule="auto"/>
         <w:outlineLvl w:val="1"/>
       </w:pPr>
-      <w:bookmarkStart w:id="24" w:name="_Toc231037153"/>
+      <w:bookmarkStart w:id="24" w:name="_Toc231039368"/>
       <w:r>
         <w:rPr>
           <w:rFonts w:ascii="Times New Roman" w:hAnsi="Times New Roman" w:cs="Times New Roman"/>
@@ -5574,7 +8571,7 @@
         <w:spacing w:before="360" w:after="360" w:line="360" w:lineRule="auto"/>
         <w:outlineLvl w:val="1"/>
       </w:pPr>
-      <w:bookmarkStart w:id="25" w:name="_Toc231037154"/>
+      <w:bookmarkStart w:id="25" w:name="_Toc231039369"/>
       <w:r>
         <w:rPr>
           <w:rFonts w:ascii="Times New Roman" w:hAnsi="Times New Roman" w:cs="Times New Roman"/>
@@ -5712,7 +8709,7 @@
         <w:spacing w:before="360" w:after="360" w:line="360" w:lineRule="auto"/>
         <w:outlineLvl w:val="0"/>
       </w:pPr>
-      <w:bookmarkStart w:id="26" w:name="_Toc231037155"/>
+      <w:bookmarkStart w:id="26" w:name="_Toc231039370"/>
       <w:r>
         <w:rPr>
           <w:rFonts w:ascii="Times New Roman" w:hAnsi="Times New Roman" w:cs="Times New Roman"/>
@@ -5748,7 +8745,7 @@
         <w:jc w:val="center"/>
         <w:outlineLvl w:val="0"/>
       </w:pPr>
-      <w:bookmarkStart w:id="27" w:name="_Toc231037156"/>
+      <w:bookmarkStart w:id="27" w:name="_Toc231039371"/>
       <w:r>
         <w:rPr>
           <w:rFonts w:ascii="Times New Roman" w:hAnsi="Times New Roman" w:cs="Times New Roman"/>

</xml_diff>

<commit_message>
docs: introducao em 1 pagina com citacoes ABNT e referencias ampliadas
- reescreve a introducao de forma concisa (1 pagina), com citacoes
  autor-data para definicao do TEA, prevalencia e legislacao
- adiciona referencias reais: APA (DSM-5-TR, 2023), MAENNER et al. (2023),
  BRASIL (Lei 12.764/2012 e Lei 13.977/2020 - CIPTEA)
</commit_message>
<xml_diff>
--- a/SolucaoClinicaTEA/relatorio_final.docx
+++ b/SolucaoClinicaTEA/relatorio_final.docx
@@ -514,7 +514,7 @@
       <w:r>
         <w:fldChar w:fldCharType="separate"/>
       </w:r>
-      <w:hyperlink w:anchor="_Toc231041399" w:history="1">
+      <w:hyperlink w:anchor="_Toc231042173" w:history="1">
         <w:r>
           <w:rPr>
             <w:rStyle w:val="Hyperlink"/>
@@ -544,7 +544,7 @@
             <w:noProof/>
             <w:webHidden/>
           </w:rPr>
-          <w:instrText xml:space="preserve"> PAGEREF _Toc231041399 \h </w:instrText>
+          <w:instrText xml:space="preserve"> PAGEREF _Toc231042173 \h </w:instrText>
         </w:r>
         <w:r>
           <w:rPr>
@@ -589,7 +589,7 @@
           <w:lang w:eastAsia="pt-BR"/>
         </w:rPr>
       </w:pPr>
-      <w:hyperlink w:anchor="_Toc231041400" w:history="1">
+      <w:hyperlink w:anchor="_Toc231042174" w:history="1">
         <w:r>
           <w:rPr>
             <w:rStyle w:val="Hyperlink"/>
@@ -619,7 +619,7 @@
             <w:noProof/>
             <w:webHidden/>
           </w:rPr>
-          <w:instrText xml:space="preserve"> PAGEREF _Toc231041400 \h </w:instrText>
+          <w:instrText xml:space="preserve"> PAGEREF _Toc231042174 \h </w:instrText>
         </w:r>
         <w:r>
           <w:rPr>
@@ -639,7 +639,7 @@
             <w:noProof/>
             <w:webHidden/>
           </w:rPr>
-          <w:t>6</w:t>
+          <w:t>5</w:t>
         </w:r>
         <w:r>
           <w:rPr>
@@ -664,7 +664,7 @@
           <w:lang w:eastAsia="pt-BR"/>
         </w:rPr>
       </w:pPr>
-      <w:hyperlink w:anchor="_Toc231041401" w:history="1">
+      <w:hyperlink w:anchor="_Toc231042175" w:history="1">
         <w:r>
           <w:rPr>
             <w:rStyle w:val="Hyperlink"/>
@@ -693,7 +693,7 @@
             <w:noProof/>
             <w:webHidden/>
           </w:rPr>
-          <w:instrText xml:space="preserve"> PAGEREF _Toc231041401 \h </w:instrText>
+          <w:instrText xml:space="preserve"> PAGEREF _Toc231042175 \h </w:instrText>
         </w:r>
         <w:r>
           <w:rPr>
@@ -713,7 +713,7 @@
             <w:noProof/>
             <w:webHidden/>
           </w:rPr>
-          <w:t>6</w:t>
+          <w:t>5</w:t>
         </w:r>
         <w:r>
           <w:rPr>
@@ -738,7 +738,7 @@
           <w:lang w:eastAsia="pt-BR"/>
         </w:rPr>
       </w:pPr>
-      <w:hyperlink w:anchor="_Toc231041402" w:history="1">
+      <w:hyperlink w:anchor="_Toc231042176" w:history="1">
         <w:r>
           <w:rPr>
             <w:rStyle w:val="Hyperlink"/>
@@ -767,7 +767,7 @@
             <w:noProof/>
             <w:webHidden/>
           </w:rPr>
-          <w:instrText xml:space="preserve"> PAGEREF _Toc231041402 \h </w:instrText>
+          <w:instrText xml:space="preserve"> PAGEREF _Toc231042176 \h </w:instrText>
         </w:r>
         <w:r>
           <w:rPr>
@@ -787,7 +787,7 @@
             <w:noProof/>
             <w:webHidden/>
           </w:rPr>
-          <w:t>7</w:t>
+          <w:t>6</w:t>
         </w:r>
         <w:r>
           <w:rPr>
@@ -812,7 +812,7 @@
           <w:lang w:eastAsia="pt-BR"/>
         </w:rPr>
       </w:pPr>
-      <w:hyperlink w:anchor="_Toc231041403" w:history="1">
+      <w:hyperlink w:anchor="_Toc231042177" w:history="1">
         <w:r>
           <w:rPr>
             <w:rStyle w:val="Hyperlink"/>
@@ -841,7 +841,7 @@
             <w:noProof/>
             <w:webHidden/>
           </w:rPr>
-          <w:instrText xml:space="preserve"> PAGEREF _Toc231041403 \h </w:instrText>
+          <w:instrText xml:space="preserve"> PAGEREF _Toc231042177 \h </w:instrText>
         </w:r>
         <w:r>
           <w:rPr>
@@ -861,7 +861,7 @@
             <w:noProof/>
             <w:webHidden/>
           </w:rPr>
-          <w:t>7</w:t>
+          <w:t>6</w:t>
         </w:r>
         <w:r>
           <w:rPr>
@@ -886,7 +886,7 @@
           <w:lang w:eastAsia="pt-BR"/>
         </w:rPr>
       </w:pPr>
-      <w:hyperlink w:anchor="_Toc231041404" w:history="1">
+      <w:hyperlink w:anchor="_Toc231042178" w:history="1">
         <w:r>
           <w:rPr>
             <w:rStyle w:val="Hyperlink"/>
@@ -915,7 +915,7 @@
             <w:noProof/>
             <w:webHidden/>
           </w:rPr>
-          <w:instrText xml:space="preserve"> PAGEREF _Toc231041404 \h </w:instrText>
+          <w:instrText xml:space="preserve"> PAGEREF _Toc231042178 \h </w:instrText>
         </w:r>
         <w:r>
           <w:rPr>
@@ -935,7 +935,7 @@
             <w:noProof/>
             <w:webHidden/>
           </w:rPr>
-          <w:t>10</w:t>
+          <w:t>9</w:t>
         </w:r>
         <w:r>
           <w:rPr>
@@ -960,7 +960,7 @@
           <w:lang w:eastAsia="pt-BR"/>
         </w:rPr>
       </w:pPr>
-      <w:hyperlink w:anchor="_Toc231041405" w:history="1">
+      <w:hyperlink w:anchor="_Toc231042179" w:history="1">
         <w:r>
           <w:rPr>
             <w:rStyle w:val="Hyperlink"/>
@@ -989,7 +989,7 @@
             <w:noProof/>
             <w:webHidden/>
           </w:rPr>
-          <w:instrText xml:space="preserve"> PAGEREF _Toc231041405 \h </w:instrText>
+          <w:instrText xml:space="preserve"> PAGEREF _Toc231042179 \h </w:instrText>
         </w:r>
         <w:r>
           <w:rPr>
@@ -1009,7 +1009,7 @@
             <w:noProof/>
             <w:webHidden/>
           </w:rPr>
-          <w:t>11</w:t>
+          <w:t>10</w:t>
         </w:r>
         <w:r>
           <w:rPr>
@@ -1034,7 +1034,7 @@
           <w:lang w:eastAsia="pt-BR"/>
         </w:rPr>
       </w:pPr>
-      <w:hyperlink w:anchor="_Toc231041406" w:history="1">
+      <w:hyperlink w:anchor="_Toc231042180" w:history="1">
         <w:r>
           <w:rPr>
             <w:rStyle w:val="Hyperlink"/>
@@ -1064,7 +1064,7 @@
             <w:noProof/>
             <w:webHidden/>
           </w:rPr>
-          <w:instrText xml:space="preserve"> PAGEREF _Toc231041406 \h </w:instrText>
+          <w:instrText xml:space="preserve"> PAGEREF _Toc231042180 \h </w:instrText>
         </w:r>
         <w:r>
           <w:rPr>
@@ -1084,7 +1084,7 @@
             <w:noProof/>
             <w:webHidden/>
           </w:rPr>
-          <w:t>12</w:t>
+          <w:t>11</w:t>
         </w:r>
         <w:r>
           <w:rPr>
@@ -1109,7 +1109,7 @@
           <w:lang w:eastAsia="pt-BR"/>
         </w:rPr>
       </w:pPr>
-      <w:hyperlink w:anchor="_Toc231041407" w:history="1">
+      <w:hyperlink w:anchor="_Toc231042181" w:history="1">
         <w:r>
           <w:rPr>
             <w:rStyle w:val="Hyperlink"/>
@@ -1138,7 +1138,7 @@
             <w:noProof/>
             <w:webHidden/>
           </w:rPr>
-          <w:instrText xml:space="preserve"> PAGEREF _Toc231041407 \h </w:instrText>
+          <w:instrText xml:space="preserve"> PAGEREF _Toc231042181 \h </w:instrText>
         </w:r>
         <w:r>
           <w:rPr>
@@ -1158,7 +1158,7 @@
             <w:noProof/>
             <w:webHidden/>
           </w:rPr>
-          <w:t>12</w:t>
+          <w:t>11</w:t>
         </w:r>
         <w:r>
           <w:rPr>
@@ -1183,7 +1183,7 @@
           <w:lang w:eastAsia="pt-BR"/>
         </w:rPr>
       </w:pPr>
-      <w:hyperlink w:anchor="_Toc231041408" w:history="1">
+      <w:hyperlink w:anchor="_Toc231042182" w:history="1">
         <w:r>
           <w:rPr>
             <w:rStyle w:val="Hyperlink"/>
@@ -1212,7 +1212,7 @@
             <w:noProof/>
             <w:webHidden/>
           </w:rPr>
-          <w:instrText xml:space="preserve"> PAGEREF _Toc231041408 \h </w:instrText>
+          <w:instrText xml:space="preserve"> PAGEREF _Toc231042182 \h </w:instrText>
         </w:r>
         <w:r>
           <w:rPr>
@@ -1232,7 +1232,7 @@
             <w:noProof/>
             <w:webHidden/>
           </w:rPr>
-          <w:t>14</w:t>
+          <w:t>13</w:t>
         </w:r>
         <w:r>
           <w:rPr>
@@ -1257,7 +1257,7 @@
           <w:lang w:eastAsia="pt-BR"/>
         </w:rPr>
       </w:pPr>
-      <w:hyperlink w:anchor="_Toc231041409" w:history="1">
+      <w:hyperlink w:anchor="_Toc231042183" w:history="1">
         <w:r>
           <w:rPr>
             <w:rStyle w:val="Hyperlink"/>
@@ -1286,7 +1286,7 @@
             <w:noProof/>
             <w:webHidden/>
           </w:rPr>
-          <w:instrText xml:space="preserve"> PAGEREF _Toc231041409 \h </w:instrText>
+          <w:instrText xml:space="preserve"> PAGEREF _Toc231042183 \h </w:instrText>
         </w:r>
         <w:r>
           <w:rPr>
@@ -1306,7 +1306,7 @@
             <w:noProof/>
             <w:webHidden/>
           </w:rPr>
-          <w:t>14</w:t>
+          <w:t>13</w:t>
         </w:r>
         <w:r>
           <w:rPr>
@@ -1331,7 +1331,7 @@
           <w:lang w:eastAsia="pt-BR"/>
         </w:rPr>
       </w:pPr>
-      <w:hyperlink w:anchor="_Toc231041410" w:history="1">
+      <w:hyperlink w:anchor="_Toc231042184" w:history="1">
         <w:r>
           <w:rPr>
             <w:rStyle w:val="Hyperlink"/>
@@ -1360,7 +1360,7 @@
             <w:noProof/>
             <w:webHidden/>
           </w:rPr>
-          <w:instrText xml:space="preserve"> PAGEREF _Toc231041410 \h </w:instrText>
+          <w:instrText xml:space="preserve"> PAGEREF _Toc231042184 \h </w:instrText>
         </w:r>
         <w:r>
           <w:rPr>
@@ -1380,7 +1380,7 @@
             <w:noProof/>
             <w:webHidden/>
           </w:rPr>
-          <w:t>15</w:t>
+          <w:t>14</w:t>
         </w:r>
         <w:r>
           <w:rPr>
@@ -1405,7 +1405,7 @@
           <w:lang w:eastAsia="pt-BR"/>
         </w:rPr>
       </w:pPr>
-      <w:hyperlink w:anchor="_Toc231041411" w:history="1">
+      <w:hyperlink w:anchor="_Toc231042185" w:history="1">
         <w:r>
           <w:rPr>
             <w:rStyle w:val="Hyperlink"/>
@@ -1434,7 +1434,7 @@
             <w:noProof/>
             <w:webHidden/>
           </w:rPr>
-          <w:instrText xml:space="preserve"> PAGEREF _Toc231041411 \h </w:instrText>
+          <w:instrText xml:space="preserve"> PAGEREF _Toc231042185 \h </w:instrText>
         </w:r>
         <w:r>
           <w:rPr>
@@ -1454,7 +1454,7 @@
             <w:noProof/>
             <w:webHidden/>
           </w:rPr>
-          <w:t>16</w:t>
+          <w:t>15</w:t>
         </w:r>
         <w:r>
           <w:rPr>
@@ -1479,7 +1479,7 @@
           <w:lang w:eastAsia="pt-BR"/>
         </w:rPr>
       </w:pPr>
-      <w:hyperlink w:anchor="_Toc231041412" w:history="1">
+      <w:hyperlink w:anchor="_Toc231042186" w:history="1">
         <w:r>
           <w:rPr>
             <w:rStyle w:val="Hyperlink"/>
@@ -1508,7 +1508,7 @@
             <w:noProof/>
             <w:webHidden/>
           </w:rPr>
-          <w:instrText xml:space="preserve"> PAGEREF _Toc231041412 \h </w:instrText>
+          <w:instrText xml:space="preserve"> PAGEREF _Toc231042186 \h </w:instrText>
         </w:r>
         <w:r>
           <w:rPr>
@@ -1528,7 +1528,7 @@
             <w:noProof/>
             <w:webHidden/>
           </w:rPr>
-          <w:t>17</w:t>
+          <w:t>16</w:t>
         </w:r>
         <w:r>
           <w:rPr>
@@ -1553,7 +1553,7 @@
           <w:lang w:eastAsia="pt-BR"/>
         </w:rPr>
       </w:pPr>
-      <w:hyperlink w:anchor="_Toc231041413" w:history="1">
+      <w:hyperlink w:anchor="_Toc231042187" w:history="1">
         <w:r>
           <w:rPr>
             <w:rStyle w:val="Hyperlink"/>
@@ -1582,7 +1582,7 @@
             <w:noProof/>
             <w:webHidden/>
           </w:rPr>
-          <w:instrText xml:space="preserve"> PAGEREF _Toc231041413 \h </w:instrText>
+          <w:instrText xml:space="preserve"> PAGEREF _Toc231042187 \h </w:instrText>
         </w:r>
         <w:r>
           <w:rPr>
@@ -1602,7 +1602,7 @@
             <w:noProof/>
             <w:webHidden/>
           </w:rPr>
-          <w:t>18</w:t>
+          <w:t>17</w:t>
         </w:r>
         <w:r>
           <w:rPr>
@@ -1627,7 +1627,7 @@
           <w:lang w:eastAsia="pt-BR"/>
         </w:rPr>
       </w:pPr>
-      <w:hyperlink w:anchor="_Toc231041414" w:history="1">
+      <w:hyperlink w:anchor="_Toc231042188" w:history="1">
         <w:r>
           <w:rPr>
             <w:rStyle w:val="Hyperlink"/>
@@ -1656,7 +1656,7 @@
             <w:noProof/>
             <w:webHidden/>
           </w:rPr>
-          <w:instrText xml:space="preserve"> PAGEREF _Toc231041414 \h </w:instrText>
+          <w:instrText xml:space="preserve"> PAGEREF _Toc231042188 \h </w:instrText>
         </w:r>
         <w:r>
           <w:rPr>
@@ -1676,7 +1676,7 @@
             <w:noProof/>
             <w:webHidden/>
           </w:rPr>
-          <w:t>19</w:t>
+          <w:t>18</w:t>
         </w:r>
         <w:r>
           <w:rPr>
@@ -1701,7 +1701,7 @@
           <w:lang w:eastAsia="pt-BR"/>
         </w:rPr>
       </w:pPr>
-      <w:hyperlink w:anchor="_Toc231041415" w:history="1">
+      <w:hyperlink w:anchor="_Toc231042189" w:history="1">
         <w:r>
           <w:rPr>
             <w:rStyle w:val="Hyperlink"/>
@@ -1730,7 +1730,7 @@
             <w:noProof/>
             <w:webHidden/>
           </w:rPr>
-          <w:instrText xml:space="preserve"> PAGEREF _Toc231041415 \h </w:instrText>
+          <w:instrText xml:space="preserve"> PAGEREF _Toc231042189 \h </w:instrText>
         </w:r>
         <w:r>
           <w:rPr>
@@ -1750,7 +1750,7 @@
             <w:noProof/>
             <w:webHidden/>
           </w:rPr>
-          <w:t>20</w:t>
+          <w:t>19</w:t>
         </w:r>
         <w:r>
           <w:rPr>
@@ -1775,7 +1775,7 @@
           <w:lang w:eastAsia="pt-BR"/>
         </w:rPr>
       </w:pPr>
-      <w:hyperlink w:anchor="_Toc231041416" w:history="1">
+      <w:hyperlink w:anchor="_Toc231042190" w:history="1">
         <w:r>
           <w:rPr>
             <w:rStyle w:val="Hyperlink"/>
@@ -1804,7 +1804,7 @@
             <w:noProof/>
             <w:webHidden/>
           </w:rPr>
-          <w:instrText xml:space="preserve"> PAGEREF _Toc231041416 \h </w:instrText>
+          <w:instrText xml:space="preserve"> PAGEREF _Toc231042190 \h </w:instrText>
         </w:r>
         <w:r>
           <w:rPr>
@@ -1824,7 +1824,7 @@
             <w:noProof/>
             <w:webHidden/>
           </w:rPr>
-          <w:t>21</w:t>
+          <w:t>20</w:t>
         </w:r>
         <w:r>
           <w:rPr>
@@ -1849,7 +1849,7 @@
           <w:lang w:eastAsia="pt-BR"/>
         </w:rPr>
       </w:pPr>
-      <w:hyperlink w:anchor="_Toc231041417" w:history="1">
+      <w:hyperlink w:anchor="_Toc231042191" w:history="1">
         <w:r>
           <w:rPr>
             <w:rStyle w:val="Hyperlink"/>
@@ -1878,7 +1878,7 @@
             <w:noProof/>
             <w:webHidden/>
           </w:rPr>
-          <w:instrText xml:space="preserve"> PAGEREF _Toc231041417 \h </w:instrText>
+          <w:instrText xml:space="preserve"> PAGEREF _Toc231042191 \h </w:instrText>
         </w:r>
         <w:r>
           <w:rPr>
@@ -1898,7 +1898,7 @@
             <w:noProof/>
             <w:webHidden/>
           </w:rPr>
-          <w:t>22</w:t>
+          <w:t>21</w:t>
         </w:r>
         <w:r>
           <w:rPr>
@@ -1923,7 +1923,7 @@
           <w:lang w:eastAsia="pt-BR"/>
         </w:rPr>
       </w:pPr>
-      <w:hyperlink w:anchor="_Toc231041418" w:history="1">
+      <w:hyperlink w:anchor="_Toc231042192" w:history="1">
         <w:r>
           <w:rPr>
             <w:rStyle w:val="Hyperlink"/>
@@ -1952,7 +1952,7 @@
             <w:noProof/>
             <w:webHidden/>
           </w:rPr>
-          <w:instrText xml:space="preserve"> PAGEREF _Toc231041418 \h </w:instrText>
+          <w:instrText xml:space="preserve"> PAGEREF _Toc231042192 \h </w:instrText>
         </w:r>
         <w:r>
           <w:rPr>
@@ -1972,7 +1972,7 @@
             <w:noProof/>
             <w:webHidden/>
           </w:rPr>
-          <w:t>23</w:t>
+          <w:t>22</w:t>
         </w:r>
         <w:r>
           <w:rPr>
@@ -1997,7 +1997,7 @@
           <w:lang w:eastAsia="pt-BR"/>
         </w:rPr>
       </w:pPr>
-      <w:hyperlink w:anchor="_Toc231041419" w:history="1">
+      <w:hyperlink w:anchor="_Toc231042193" w:history="1">
         <w:r>
           <w:rPr>
             <w:rStyle w:val="Hyperlink"/>
@@ -2026,7 +2026,7 @@
             <w:noProof/>
             <w:webHidden/>
           </w:rPr>
-          <w:instrText xml:space="preserve"> PAGEREF _Toc231041419 \h </w:instrText>
+          <w:instrText xml:space="preserve"> PAGEREF _Toc231042193 \h </w:instrText>
         </w:r>
         <w:r>
           <w:rPr>
@@ -2046,7 +2046,7 @@
             <w:noProof/>
             <w:webHidden/>
           </w:rPr>
-          <w:t>24</w:t>
+          <w:t>23</w:t>
         </w:r>
         <w:r>
           <w:rPr>
@@ -2071,7 +2071,7 @@
           <w:lang w:eastAsia="pt-BR"/>
         </w:rPr>
       </w:pPr>
-      <w:hyperlink w:anchor="_Toc231041420" w:history="1">
+      <w:hyperlink w:anchor="_Toc231042194" w:history="1">
         <w:r>
           <w:rPr>
             <w:rStyle w:val="Hyperlink"/>
@@ -2100,7 +2100,7 @@
             <w:noProof/>
             <w:webHidden/>
           </w:rPr>
-          <w:instrText xml:space="preserve"> PAGEREF _Toc231041420 \h </w:instrText>
+          <w:instrText xml:space="preserve"> PAGEREF _Toc231042194 \h </w:instrText>
         </w:r>
         <w:r>
           <w:rPr>
@@ -2120,7 +2120,7 @@
             <w:noProof/>
             <w:webHidden/>
           </w:rPr>
-          <w:t>25</w:t>
+          <w:t>24</w:t>
         </w:r>
         <w:r>
           <w:rPr>
@@ -2145,7 +2145,7 @@
           <w:lang w:eastAsia="pt-BR"/>
         </w:rPr>
       </w:pPr>
-      <w:hyperlink w:anchor="_Toc231041421" w:history="1">
+      <w:hyperlink w:anchor="_Toc231042195" w:history="1">
         <w:r>
           <w:rPr>
             <w:rStyle w:val="Hyperlink"/>
@@ -2174,7 +2174,7 @@
             <w:noProof/>
             <w:webHidden/>
           </w:rPr>
-          <w:instrText xml:space="preserve"> PAGEREF _Toc231041421 \h </w:instrText>
+          <w:instrText xml:space="preserve"> PAGEREF _Toc231042195 \h </w:instrText>
         </w:r>
         <w:r>
           <w:rPr>
@@ -2194,7 +2194,7 @@
             <w:noProof/>
             <w:webHidden/>
           </w:rPr>
-          <w:t>26</w:t>
+          <w:t>25</w:t>
         </w:r>
         <w:r>
           <w:rPr>
@@ -2219,7 +2219,7 @@
           <w:lang w:eastAsia="pt-BR"/>
         </w:rPr>
       </w:pPr>
-      <w:hyperlink w:anchor="_Toc231041422" w:history="1">
+      <w:hyperlink w:anchor="_Toc231042196" w:history="1">
         <w:r>
           <w:rPr>
             <w:rStyle w:val="Hyperlink"/>
@@ -2248,7 +2248,7 @@
             <w:noProof/>
             <w:webHidden/>
           </w:rPr>
-          <w:instrText xml:space="preserve"> PAGEREF _Toc231041422 \h </w:instrText>
+          <w:instrText xml:space="preserve"> PAGEREF _Toc231042196 \h </w:instrText>
         </w:r>
         <w:r>
           <w:rPr>
@@ -2268,7 +2268,7 @@
             <w:noProof/>
             <w:webHidden/>
           </w:rPr>
-          <w:t>27</w:t>
+          <w:t>26</w:t>
         </w:r>
         <w:r>
           <w:rPr>
@@ -2293,7 +2293,7 @@
           <w:lang w:eastAsia="pt-BR"/>
         </w:rPr>
       </w:pPr>
-      <w:hyperlink w:anchor="_Toc231041423" w:history="1">
+      <w:hyperlink w:anchor="_Toc231042197" w:history="1">
         <w:r>
           <w:rPr>
             <w:rStyle w:val="Hyperlink"/>
@@ -2323,7 +2323,7 @@
             <w:noProof/>
             <w:webHidden/>
           </w:rPr>
-          <w:instrText xml:space="preserve"> PAGEREF _Toc231041423 \h </w:instrText>
+          <w:instrText xml:space="preserve"> PAGEREF _Toc231042197 \h </w:instrText>
         </w:r>
         <w:r>
           <w:rPr>
@@ -2343,7 +2343,7 @@
             <w:noProof/>
             <w:webHidden/>
           </w:rPr>
-          <w:t>29</w:t>
+          <w:t>28</w:t>
         </w:r>
         <w:r>
           <w:rPr>
@@ -2368,7 +2368,7 @@
           <w:lang w:eastAsia="pt-BR"/>
         </w:rPr>
       </w:pPr>
-      <w:hyperlink w:anchor="_Toc231041424" w:history="1">
+      <w:hyperlink w:anchor="_Toc231042198" w:history="1">
         <w:r>
           <w:rPr>
             <w:rStyle w:val="Hyperlink"/>
@@ -2398,7 +2398,7 @@
             <w:noProof/>
             <w:webHidden/>
           </w:rPr>
-          <w:instrText xml:space="preserve"> PAGEREF _Toc231041424 \h </w:instrText>
+          <w:instrText xml:space="preserve"> PAGEREF _Toc231042198 \h </w:instrText>
         </w:r>
         <w:r>
           <w:rPr>
@@ -2418,7 +2418,7 @@
             <w:noProof/>
             <w:webHidden/>
           </w:rPr>
-          <w:t>30</w:t>
+          <w:t>29</w:t>
         </w:r>
         <w:r>
           <w:rPr>
@@ -2450,7 +2450,7 @@
         <w:spacing w:before="360" w:after="360" w:line="360" w:lineRule="auto"/>
         <w:outlineLvl w:val="0"/>
       </w:pPr>
-      <w:bookmarkStart w:id="0" w:name="_Toc231041399"/>
+      <w:bookmarkStart w:id="0" w:name="_Toc231042173"/>
       <w:r>
         <w:rPr>
           <w:rFonts w:ascii="Times New Roman" w:hAnsi="Times New Roman" w:cs="Times New Roman"/>
@@ -2476,7 +2476,15 @@
           <w:sz w:val="24"/>
           <w:szCs w:val="24"/>
         </w:rPr>
-        <w:t>O Transtorno do Espectro Autista (TEA) é uma condição neurológica permanente que afeta o desenvolvimento da comunicação, da interação social e do comportamento. No Brasil, estima-se que mais de dois milhões de pessoas sejam diagnosticadas com TEA, número que vem crescendo à medida que os critérios diagnósticos do DSM-5 se consolidam na prática clínica. Clínicas especializadas no atendimento a essas pessoas enfrentam um desafio operacional específico: gerenciar equipes multidisciplinares — psicólogos, fonoaudiólogos, terapeutas ocupacionais, fisioterapeutas e psicopedagogos — que atendem o mesmo paciente de forma simultânea e integrada.</w:t>
+        <w:t>O Transtorno do Espectro Autista (TEA) é um transtorno do neurodesenvolvimento que afeta a comunicação, a interação social e o comportamento, organizado em três níveis de suporte segundo o DSM-5 (AMERICAN PSYCHIATRIC ASSOCIATION, 2023). Estudos de prevalência estimam que o TEA atinja cerca de uma em cada 36 crianças (MAENNER et al., 2023), e sua relevância social levou o Brasil a instituir a Política Nacional de Proteção dos Direitos da Pessoa com TEA (BRASIL, 2012) e a Carteira de Identificação da Pessoa c</w:t>
+      </w:r>
+      <w:r>
+        <w:rPr>
+          <w:rFonts w:ascii="Times New Roman" w:hAnsi="Times New Roman" w:cs="Times New Roman"/>
+          <w:sz w:val="24"/>
+          <w:szCs w:val="24"/>
+        </w:rPr>
+        <w:t>om TEA — CIPTEA (BRASIL, 2020). O atendimento a essas pessoas é, em geral, multidisciplinar, reunindo psicólogos, fonoaudiólogos, terapeutas ocupacionais, fisioterapeutas e psicopedagogos que atuam de forma integrada sobre o mesmo paciente.</w:t>
       </w:r>
     </w:p>
     <w:p>
@@ -2491,7 +2499,15 @@
           <w:sz w:val="24"/>
           <w:szCs w:val="24"/>
         </w:rPr>
-        <w:t>A escolha do tema partiu de uma motivação pessoal: recentemente o autor foi diagnosticado com Transtorno do Espectro Autista e, ao conhecer mais de perto a rotina de acompanhamento terapêutico de pessoas com TEA, identificou-se com a proposta e passou a enxergar na tecnologia um meio de contribuir para um cuidado mais organizado, contínuo e humano. A essa motivação soma-se a observação de que clínicas de pequeno e médio porte frequentemente utilizam planilhas eletrônicas ou agendas em papel para controlar consultas, registrar evoluções e acompanhar objetivos terapêuticos. Esse modelo fragmentado dificulta a comunicação entre especialidades, aumenta o risco de erros de agendamento por sobreposição de horários e impossibilita uma visão gerencial integrada dos atendimentos.</w:t>
+        <w:t>A escolha do tema partiu de uma motivação pessoal: o autor foi recentemente diagnosticado com TEA e, ao conhecer de perto essa rotina de acompanhamento, identificou-se com a proposta e passou a enxergar na tecnologia um meio de tornar o cuidado mais organizado e humano. Soma-se a isso a observação de que clínicas de pequeno e médio porte ainda controlam consultas e evoluções em planilhas ou agendas de papel — modelo fragmentado que dificulta a comunicação entre especialidades e favorece erros de agendamento</w:t>
+      </w:r>
+      <w:r>
+        <w:rPr>
+          <w:rFonts w:ascii="Times New Roman" w:hAnsi="Times New Roman" w:cs="Times New Roman"/>
+          <w:sz w:val="24"/>
+          <w:szCs w:val="24"/>
+        </w:rPr>
+        <w:t xml:space="preserve"> por sobreposição de horários.</w:t>
       </w:r>
     </w:p>
     <w:p>
@@ -2506,7 +2522,7 @@
           <w:sz w:val="24"/>
           <w:szCs w:val="24"/>
         </w:rPr>
-        <w:t xml:space="preserve">A solução proposta é o </w:t>
+        <w:t xml:space="preserve">Como solução, propõe-se o </w:t>
       </w:r>
       <w:r>
         <w:rPr>
@@ -2523,7 +2539,7 @@
           <w:sz w:val="24"/>
           <w:szCs w:val="24"/>
         </w:rPr>
-        <w:t>, um sistema desktop de gestão clínica desenvolvido em C# Windows Forms com banco de dados relacional. O sistema cobre o ciclo completo de um atendimento: desde o cadastro do paciente com dados clínicos específicos do TEA, passando pelo agendamento com verificação automática de conflitos, até o registro de evoluções de sessão e acompanhamento de objetivos terapêuticos por especialidade. Um módulo de relatórios fornece indicadores quantitativos sobre frequência, faltas, ocupação de salas e progresso dos objetivos, apoiando decisões de gestão.</w:t>
+        <w:t>, sistema desktop de gestão clínica desenvolvido em C# Windows Forms com banco de dados relacional. O sistema cobre o ciclo completo do atendimento: cadastro de pacientes com dados clínicos específicos do TEA, agendamento com verificação automática de conflitos, registro de evoluções de sessão e acompanhamento de objetivos terapêuticos por especialidade, além de um módulo de relatórios gerenciais.</w:t>
       </w:r>
     </w:p>
     <w:p>
@@ -2538,16 +2554,7 @@
           <w:sz w:val="24"/>
           <w:szCs w:val="24"/>
         </w:rPr>
-        <w:t xml:space="preserve">O público-alvo são clínicas de reabilitação e centros terapêuticos especializados em TEA. Os usuários diretos do sistema são recepcionistas (responsáveis pelo agendamento e cadastro de pacientes), profissionais de saúde (que registram evoluções e objetivos terapêuticos) e administradores (que gerenciam equipe, salas e relatórios). O cenário de uso típico inicia com a chegada de um novo paciente: a recepcionista cadastra seus dados clínicos, o profissional responsável define objetivos terapêuticos e, a cada sessão realizada, registra uma evolução </w:t>
-      </w:r>
-      <w:r>
-        <w:rPr>
-          <w:rFonts w:ascii="Times New Roman" w:hAnsi="Times New Roman" w:cs="Times New Roman"/>
-          <w:sz w:val="24"/>
-          <w:szCs w:val="24"/>
-        </w:rPr>
-        <w:lastRenderedPageBreak/>
-        <w:t>estruturada. O gestor, ao final do mês, consulta os relatórios para analisar taxa de realização e desempenho da equipe.</w:t>
+        <w:t>O público-alvo são clínicas e centros terapêuticos especializados em TEA, tendo como usuários recepcionistas, profissionais de saúde e administradores. No uso típico, a recepção cadastra o paciente, o profissional define os objetivos e registra uma evolução a cada sessão realizada, e o gestor consulta os relatórios para acompanhar a frequência dos atendimentos e o desempenho da equipe.</w:t>
       </w:r>
     </w:p>
     <w:p>
@@ -2557,7 +2564,7 @@
         <w:spacing w:before="360" w:after="360" w:line="360" w:lineRule="auto"/>
         <w:outlineLvl w:val="0"/>
       </w:pPr>
-      <w:bookmarkStart w:id="1" w:name="_Toc231041400"/>
+      <w:bookmarkStart w:id="1" w:name="_Toc231042174"/>
       <w:r>
         <w:rPr>
           <w:rFonts w:ascii="Times New Roman" w:hAnsi="Times New Roman" w:cs="Times New Roman"/>
@@ -2577,7 +2584,7 @@
         <w:spacing w:before="360" w:after="360" w:line="360" w:lineRule="auto"/>
         <w:outlineLvl w:val="1"/>
       </w:pPr>
-      <w:bookmarkStart w:id="2" w:name="_Toc231041401"/>
+      <w:bookmarkStart w:id="2" w:name="_Toc231042175"/>
       <w:r>
         <w:rPr>
           <w:rFonts w:ascii="Times New Roman" w:hAnsi="Times New Roman" w:cs="Times New Roman"/>
@@ -3717,7 +3724,7 @@
         <w:spacing w:before="360" w:after="360" w:line="360" w:lineRule="auto"/>
         <w:outlineLvl w:val="1"/>
       </w:pPr>
-      <w:bookmarkStart w:id="3" w:name="_Toc231041402"/>
+      <w:bookmarkStart w:id="3" w:name="_Toc231042176"/>
       <w:r>
         <w:rPr>
           <w:rFonts w:ascii="Times New Roman" w:hAnsi="Times New Roman" w:cs="Times New Roman"/>
@@ -3849,7 +3856,7 @@
         <w:spacing w:before="360" w:after="360" w:line="360" w:lineRule="auto"/>
         <w:outlineLvl w:val="1"/>
       </w:pPr>
-      <w:bookmarkStart w:id="4" w:name="_Toc231041403"/>
+      <w:bookmarkStart w:id="4" w:name="_Toc231042177"/>
       <w:r>
         <w:rPr>
           <w:rFonts w:ascii="Times New Roman" w:hAnsi="Times New Roman" w:cs="Times New Roman"/>
@@ -7607,7 +7614,7 @@
         <w:spacing w:before="360" w:after="360" w:line="360" w:lineRule="auto"/>
         <w:outlineLvl w:val="1"/>
       </w:pPr>
-      <w:bookmarkStart w:id="5" w:name="_Toc231041404"/>
+      <w:bookmarkStart w:id="5" w:name="_Toc231042178"/>
       <w:r>
         <w:rPr>
           <w:rFonts w:ascii="Times New Roman" w:hAnsi="Times New Roman" w:cs="Times New Roman"/>
@@ -7778,7 +7785,7 @@
         <w:spacing w:before="360" w:after="360" w:line="360" w:lineRule="auto"/>
         <w:outlineLvl w:val="1"/>
       </w:pPr>
-      <w:bookmarkStart w:id="6" w:name="_Toc231041405"/>
+      <w:bookmarkStart w:id="6" w:name="_Toc231042179"/>
       <w:r>
         <w:rPr>
           <w:rFonts w:ascii="Times New Roman" w:hAnsi="Times New Roman" w:cs="Times New Roman"/>
@@ -7941,7 +7948,7 @@
         <w:spacing w:before="360" w:after="360" w:line="360" w:lineRule="auto"/>
         <w:outlineLvl w:val="0"/>
       </w:pPr>
-      <w:bookmarkStart w:id="7" w:name="_Toc231041406"/>
+      <w:bookmarkStart w:id="7" w:name="_Toc231042180"/>
       <w:r>
         <w:rPr>
           <w:rFonts w:ascii="Times New Roman" w:hAnsi="Times New Roman" w:cs="Times New Roman"/>
@@ -7976,7 +7983,7 @@
         <w:spacing w:before="360" w:after="360" w:line="360" w:lineRule="auto"/>
         <w:outlineLvl w:val="1"/>
       </w:pPr>
-      <w:bookmarkStart w:id="8" w:name="_Toc231041407"/>
+      <w:bookmarkStart w:id="8" w:name="_Toc231042181"/>
       <w:r>
         <w:rPr>
           <w:rFonts w:ascii="Times New Roman" w:hAnsi="Times New Roman" w:cs="Times New Roman"/>
@@ -8113,7 +8120,7 @@
         <w:spacing w:before="360" w:after="360" w:line="360" w:lineRule="auto"/>
         <w:outlineLvl w:val="1"/>
       </w:pPr>
-      <w:bookmarkStart w:id="9" w:name="_Toc231041408"/>
+      <w:bookmarkStart w:id="9" w:name="_Toc231042182"/>
       <w:r>
         <w:rPr>
           <w:rFonts w:ascii="Times New Roman" w:hAnsi="Times New Roman" w:cs="Times New Roman"/>
@@ -8250,7 +8257,7 @@
         <w:spacing w:before="360" w:after="360" w:line="360" w:lineRule="auto"/>
         <w:outlineLvl w:val="1"/>
       </w:pPr>
-      <w:bookmarkStart w:id="10" w:name="_Toc231041409"/>
+      <w:bookmarkStart w:id="10" w:name="_Toc231042183"/>
       <w:r>
         <w:rPr>
           <w:rFonts w:ascii="Times New Roman" w:hAnsi="Times New Roman" w:cs="Times New Roman"/>
@@ -8387,7 +8394,7 @@
         <w:spacing w:before="360" w:after="360" w:line="360" w:lineRule="auto"/>
         <w:outlineLvl w:val="1"/>
       </w:pPr>
-      <w:bookmarkStart w:id="11" w:name="_Toc231041410"/>
+      <w:bookmarkStart w:id="11" w:name="_Toc231042184"/>
       <w:r>
         <w:rPr>
           <w:rFonts w:ascii="Times New Roman" w:hAnsi="Times New Roman" w:cs="Times New Roman"/>
@@ -8524,7 +8531,7 @@
         <w:spacing w:before="360" w:after="360" w:line="360" w:lineRule="auto"/>
         <w:outlineLvl w:val="1"/>
       </w:pPr>
-      <w:bookmarkStart w:id="12" w:name="_Toc231041411"/>
+      <w:bookmarkStart w:id="12" w:name="_Toc231042185"/>
       <w:r>
         <w:rPr>
           <w:rFonts w:ascii="Times New Roman" w:hAnsi="Times New Roman" w:cs="Times New Roman"/>
@@ -8661,7 +8668,7 @@
         <w:spacing w:before="360" w:after="360" w:line="360" w:lineRule="auto"/>
         <w:outlineLvl w:val="1"/>
       </w:pPr>
-      <w:bookmarkStart w:id="13" w:name="_Toc231041412"/>
+      <w:bookmarkStart w:id="13" w:name="_Toc231042186"/>
       <w:r>
         <w:rPr>
           <w:rFonts w:ascii="Times New Roman" w:hAnsi="Times New Roman" w:cs="Times New Roman"/>
@@ -8798,7 +8805,7 @@
         <w:spacing w:before="360" w:after="360" w:line="360" w:lineRule="auto"/>
         <w:outlineLvl w:val="1"/>
       </w:pPr>
-      <w:bookmarkStart w:id="14" w:name="_Toc231041413"/>
+      <w:bookmarkStart w:id="14" w:name="_Toc231042187"/>
       <w:r>
         <w:rPr>
           <w:rFonts w:ascii="Times New Roman" w:hAnsi="Times New Roman" w:cs="Times New Roman"/>
@@ -8935,7 +8942,7 @@
         <w:spacing w:before="360" w:after="360" w:line="360" w:lineRule="auto"/>
         <w:outlineLvl w:val="1"/>
       </w:pPr>
-      <w:bookmarkStart w:id="15" w:name="_Toc231041414"/>
+      <w:bookmarkStart w:id="15" w:name="_Toc231042188"/>
       <w:r>
         <w:rPr>
           <w:rFonts w:ascii="Times New Roman" w:hAnsi="Times New Roman" w:cs="Times New Roman"/>
@@ -9072,7 +9079,7 @@
         <w:spacing w:before="360" w:after="360" w:line="360" w:lineRule="auto"/>
         <w:outlineLvl w:val="1"/>
       </w:pPr>
-      <w:bookmarkStart w:id="16" w:name="_Toc231041415"/>
+      <w:bookmarkStart w:id="16" w:name="_Toc231042189"/>
       <w:r>
         <w:rPr>
           <w:rFonts w:ascii="Times New Roman" w:hAnsi="Times New Roman" w:cs="Times New Roman"/>
@@ -9209,7 +9216,7 @@
         <w:spacing w:before="360" w:after="360" w:line="360" w:lineRule="auto"/>
         <w:outlineLvl w:val="1"/>
       </w:pPr>
-      <w:bookmarkStart w:id="17" w:name="_Toc231041416"/>
+      <w:bookmarkStart w:id="17" w:name="_Toc231042190"/>
       <w:r>
         <w:rPr>
           <w:rFonts w:ascii="Times New Roman" w:hAnsi="Times New Roman" w:cs="Times New Roman"/>
@@ -9346,7 +9353,7 @@
         <w:spacing w:before="360" w:after="360" w:line="360" w:lineRule="auto"/>
         <w:outlineLvl w:val="1"/>
       </w:pPr>
-      <w:bookmarkStart w:id="18" w:name="_Toc231041417"/>
+      <w:bookmarkStart w:id="18" w:name="_Toc231042191"/>
       <w:r>
         <w:rPr>
           <w:rFonts w:ascii="Times New Roman" w:hAnsi="Times New Roman" w:cs="Times New Roman"/>
@@ -9483,7 +9490,7 @@
         <w:spacing w:before="360" w:after="360" w:line="360" w:lineRule="auto"/>
         <w:outlineLvl w:val="1"/>
       </w:pPr>
-      <w:bookmarkStart w:id="19" w:name="_Toc231041418"/>
+      <w:bookmarkStart w:id="19" w:name="_Toc231042192"/>
       <w:r>
         <w:rPr>
           <w:rFonts w:ascii="Times New Roman" w:hAnsi="Times New Roman" w:cs="Times New Roman"/>
@@ -9620,7 +9627,7 @@
         <w:spacing w:before="360" w:after="360" w:line="360" w:lineRule="auto"/>
         <w:outlineLvl w:val="1"/>
       </w:pPr>
-      <w:bookmarkStart w:id="20" w:name="_Toc231041419"/>
+      <w:bookmarkStart w:id="20" w:name="_Toc231042193"/>
       <w:r>
         <w:rPr>
           <w:rFonts w:ascii="Times New Roman" w:hAnsi="Times New Roman" w:cs="Times New Roman"/>
@@ -9757,7 +9764,7 @@
         <w:spacing w:before="360" w:after="360" w:line="360" w:lineRule="auto"/>
         <w:outlineLvl w:val="1"/>
       </w:pPr>
-      <w:bookmarkStart w:id="21" w:name="_Toc231041420"/>
+      <w:bookmarkStart w:id="21" w:name="_Toc231042194"/>
       <w:r>
         <w:rPr>
           <w:rFonts w:ascii="Times New Roman" w:hAnsi="Times New Roman" w:cs="Times New Roman"/>
@@ -9894,7 +9901,7 @@
         <w:spacing w:before="360" w:after="360" w:line="360" w:lineRule="auto"/>
         <w:outlineLvl w:val="1"/>
       </w:pPr>
-      <w:bookmarkStart w:id="22" w:name="_Toc231041421"/>
+      <w:bookmarkStart w:id="22" w:name="_Toc231042195"/>
       <w:r>
         <w:rPr>
           <w:rFonts w:ascii="Times New Roman" w:hAnsi="Times New Roman" w:cs="Times New Roman"/>
@@ -10031,7 +10038,7 @@
         <w:spacing w:before="360" w:after="360" w:line="360" w:lineRule="auto"/>
         <w:outlineLvl w:val="1"/>
       </w:pPr>
-      <w:bookmarkStart w:id="23" w:name="_Toc231041422"/>
+      <w:bookmarkStart w:id="23" w:name="_Toc231042196"/>
       <w:r>
         <w:rPr>
           <w:rFonts w:ascii="Times New Roman" w:hAnsi="Times New Roman" w:cs="Times New Roman"/>
@@ -10169,7 +10176,7 @@
         <w:spacing w:before="360" w:after="360" w:line="360" w:lineRule="auto"/>
         <w:outlineLvl w:val="0"/>
       </w:pPr>
-      <w:bookmarkStart w:id="24" w:name="_Toc231041423"/>
+      <w:bookmarkStart w:id="24" w:name="_Toc231042197"/>
       <w:r>
         <w:rPr>
           <w:rFonts w:ascii="Times New Roman" w:hAnsi="Times New Roman" w:cs="Times New Roman"/>
@@ -10205,7 +10212,7 @@
         <w:jc w:val="center"/>
         <w:outlineLvl w:val="0"/>
       </w:pPr>
-      <w:bookmarkStart w:id="25" w:name="_Toc231041424"/>
+      <w:bookmarkStart w:id="25" w:name="_Toc231042198"/>
       <w:r>
         <w:rPr>
           <w:rFonts w:ascii="Times New Roman" w:hAnsi="Times New Roman" w:cs="Times New Roman"/>
@@ -10230,7 +10237,7 @@
           <w:sz w:val="24"/>
           <w:szCs w:val="24"/>
         </w:rPr>
-        <w:t>ASSOCIAÇÃO BRASILEIRA DE NORMAS TÉCNICAS. NBR 14724: informação e documentação: trabalhos acadêmicos: apresentação. Rio de Janeiro: ABNT, 2011.</w:t>
+        <w:t>AMERICAN PSYCHIATRIC ASSOCIATION. DSM-5-TR: manual diagnóstico e estatístico de transtornos mentais. 5. ed., texto revisado. Porto Alegre: Artmed, 2023.</w:t>
       </w:r>
     </w:p>
     <w:p>
@@ -10244,7 +10251,63 @@
           <w:sz w:val="24"/>
           <w:szCs w:val="24"/>
         </w:rPr>
+        <w:t>ASSOCIAÇÃO BRASILEIRA DE NORMAS TÉCNICAS. NBR 14724: informação e documentação: trabalhos acadêmicos: apresentação. Rio de Janeiro: ABNT, 2011.</w:t>
+      </w:r>
+    </w:p>
+    <w:p>
+      <w:pPr>
+        <w:spacing w:after="240" w:line="240" w:lineRule="auto"/>
+        <w:jc w:val="both"/>
+      </w:pPr>
+      <w:r>
+        <w:rPr>
+          <w:rFonts w:ascii="Times New Roman" w:hAnsi="Times New Roman" w:cs="Times New Roman"/>
+          <w:sz w:val="24"/>
+          <w:szCs w:val="24"/>
+        </w:rPr>
         <w:t>ASSOCIAÇÃO BRASILEIRA DE NORMAS TÉCNICAS. NBR 6023: informação e documentação: referências: elaboração. Rio de Janeiro: ABNT, 2018.</w:t>
+      </w:r>
+    </w:p>
+    <w:p>
+      <w:pPr>
+        <w:spacing w:after="240" w:line="240" w:lineRule="auto"/>
+        <w:jc w:val="both"/>
+      </w:pPr>
+      <w:r>
+        <w:rPr>
+          <w:rFonts w:ascii="Times New Roman" w:hAnsi="Times New Roman" w:cs="Times New Roman"/>
+          <w:sz w:val="24"/>
+          <w:szCs w:val="24"/>
+        </w:rPr>
+        <w:t>BRASIL. Lei nº 12.764, de 27 de dezembro de 2012. Institui a Política Nacional de Proteção dos Direitos da Pessoa com Transtorno do Espectro Autista. Brasília, DF: Presidência da República, 2012.</w:t>
+      </w:r>
+    </w:p>
+    <w:p>
+      <w:pPr>
+        <w:spacing w:after="240" w:line="240" w:lineRule="auto"/>
+        <w:jc w:val="both"/>
+      </w:pPr>
+      <w:r>
+        <w:rPr>
+          <w:rFonts w:ascii="Times New Roman" w:hAnsi="Times New Roman" w:cs="Times New Roman"/>
+          <w:sz w:val="24"/>
+          <w:szCs w:val="24"/>
+        </w:rPr>
+        <w:t>BRASIL. Lei nº 13.977, de 8 de janeiro de 2020. Institui a Carteira de Identificação da Pessoa com Transtorno do Espectro Autista (CIPTEA). Brasília, DF: Presidência da República, 2020.</w:t>
+      </w:r>
+    </w:p>
+    <w:p>
+      <w:pPr>
+        <w:spacing w:after="240" w:line="240" w:lineRule="auto"/>
+        <w:jc w:val="both"/>
+      </w:pPr>
+      <w:r>
+        <w:rPr>
+          <w:rFonts w:ascii="Times New Roman" w:hAnsi="Times New Roman" w:cs="Times New Roman"/>
+          <w:sz w:val="24"/>
+          <w:szCs w:val="24"/>
+        </w:rPr>
+        <w:t>MAENNER, M. J. et al. Prevalence and characteristics of autism spectrum disorder among children aged 8 years — United States, 2020. MMWR Surveillance Summaries, v. 72, n. 2, p. 1-14, 2023.</w:t>
       </w:r>
     </w:p>
     <w:p>

</xml_diff>

<commit_message>
docs: ajusta figuras conforme feedback do professor
- legenda 'Figura N - titulo' sem negrito
- 'Fonte:' sem negrito e alinhada a esquerda (nao centralizada)
- aplicado nas 16 figuras
</commit_message>
<xml_diff>
--- a/SolucaoClinicaTEA/relatorio_final.docx
+++ b/SolucaoClinicaTEA/relatorio_final.docx
@@ -514,7 +514,7 @@
       <w:r>
         <w:fldChar w:fldCharType="separate"/>
       </w:r>
-      <w:hyperlink w:anchor="_Toc231042173" w:history="1">
+      <w:hyperlink w:anchor="_Toc231067165" w:history="1">
         <w:r>
           <w:rPr>
             <w:rStyle w:val="Hyperlink"/>
@@ -544,7 +544,7 @@
             <w:noProof/>
             <w:webHidden/>
           </w:rPr>
-          <w:instrText xml:space="preserve"> PAGEREF _Toc231042173 \h </w:instrText>
+          <w:instrText xml:space="preserve"> PAGEREF _Toc231067165 \h </w:instrText>
         </w:r>
         <w:r>
           <w:rPr>
@@ -589,7 +589,7 @@
           <w:lang w:eastAsia="pt-BR"/>
         </w:rPr>
       </w:pPr>
-      <w:hyperlink w:anchor="_Toc231042174" w:history="1">
+      <w:hyperlink w:anchor="_Toc231067166" w:history="1">
         <w:r>
           <w:rPr>
             <w:rStyle w:val="Hyperlink"/>
@@ -619,7 +619,7 @@
             <w:noProof/>
             <w:webHidden/>
           </w:rPr>
-          <w:instrText xml:space="preserve"> PAGEREF _Toc231042174 \h </w:instrText>
+          <w:instrText xml:space="preserve"> PAGEREF _Toc231067166 \h </w:instrText>
         </w:r>
         <w:r>
           <w:rPr>
@@ -664,7 +664,7 @@
           <w:lang w:eastAsia="pt-BR"/>
         </w:rPr>
       </w:pPr>
-      <w:hyperlink w:anchor="_Toc231042175" w:history="1">
+      <w:hyperlink w:anchor="_Toc231067167" w:history="1">
         <w:r>
           <w:rPr>
             <w:rStyle w:val="Hyperlink"/>
@@ -693,7 +693,7 @@
             <w:noProof/>
             <w:webHidden/>
           </w:rPr>
-          <w:instrText xml:space="preserve"> PAGEREF _Toc231042175 \h </w:instrText>
+          <w:instrText xml:space="preserve"> PAGEREF _Toc231067167 \h </w:instrText>
         </w:r>
         <w:r>
           <w:rPr>
@@ -738,7 +738,7 @@
           <w:lang w:eastAsia="pt-BR"/>
         </w:rPr>
       </w:pPr>
-      <w:hyperlink w:anchor="_Toc231042176" w:history="1">
+      <w:hyperlink w:anchor="_Toc231067168" w:history="1">
         <w:r>
           <w:rPr>
             <w:rStyle w:val="Hyperlink"/>
@@ -767,7 +767,7 @@
             <w:noProof/>
             <w:webHidden/>
           </w:rPr>
-          <w:instrText xml:space="preserve"> PAGEREF _Toc231042176 \h </w:instrText>
+          <w:instrText xml:space="preserve"> PAGEREF _Toc231067168 \h </w:instrText>
         </w:r>
         <w:r>
           <w:rPr>
@@ -812,7 +812,7 @@
           <w:lang w:eastAsia="pt-BR"/>
         </w:rPr>
       </w:pPr>
-      <w:hyperlink w:anchor="_Toc231042177" w:history="1">
+      <w:hyperlink w:anchor="_Toc231067169" w:history="1">
         <w:r>
           <w:rPr>
             <w:rStyle w:val="Hyperlink"/>
@@ -841,7 +841,7 @@
             <w:noProof/>
             <w:webHidden/>
           </w:rPr>
-          <w:instrText xml:space="preserve"> PAGEREF _Toc231042177 \h </w:instrText>
+          <w:instrText xml:space="preserve"> PAGEREF _Toc231067169 \h </w:instrText>
         </w:r>
         <w:r>
           <w:rPr>
@@ -886,7 +886,7 @@
           <w:lang w:eastAsia="pt-BR"/>
         </w:rPr>
       </w:pPr>
-      <w:hyperlink w:anchor="_Toc231042178" w:history="1">
+      <w:hyperlink w:anchor="_Toc231067170" w:history="1">
         <w:r>
           <w:rPr>
             <w:rStyle w:val="Hyperlink"/>
@@ -915,7 +915,7 @@
             <w:noProof/>
             <w:webHidden/>
           </w:rPr>
-          <w:instrText xml:space="preserve"> PAGEREF _Toc231042178 \h </w:instrText>
+          <w:instrText xml:space="preserve"> PAGEREF _Toc231067170 \h </w:instrText>
         </w:r>
         <w:r>
           <w:rPr>
@@ -960,7 +960,7 @@
           <w:lang w:eastAsia="pt-BR"/>
         </w:rPr>
       </w:pPr>
-      <w:hyperlink w:anchor="_Toc231042179" w:history="1">
+      <w:hyperlink w:anchor="_Toc231067171" w:history="1">
         <w:r>
           <w:rPr>
             <w:rStyle w:val="Hyperlink"/>
@@ -989,7 +989,7 @@
             <w:noProof/>
             <w:webHidden/>
           </w:rPr>
-          <w:instrText xml:space="preserve"> PAGEREF _Toc231042179 \h </w:instrText>
+          <w:instrText xml:space="preserve"> PAGEREF _Toc231067171 \h </w:instrText>
         </w:r>
         <w:r>
           <w:rPr>
@@ -1034,7 +1034,7 @@
           <w:lang w:eastAsia="pt-BR"/>
         </w:rPr>
       </w:pPr>
-      <w:hyperlink w:anchor="_Toc231042180" w:history="1">
+      <w:hyperlink w:anchor="_Toc231067172" w:history="1">
         <w:r>
           <w:rPr>
             <w:rStyle w:val="Hyperlink"/>
@@ -1064,7 +1064,7 @@
             <w:noProof/>
             <w:webHidden/>
           </w:rPr>
-          <w:instrText xml:space="preserve"> PAGEREF _Toc231042180 \h </w:instrText>
+          <w:instrText xml:space="preserve"> PAGEREF _Toc231067172 \h </w:instrText>
         </w:r>
         <w:r>
           <w:rPr>
@@ -1109,7 +1109,7 @@
           <w:lang w:eastAsia="pt-BR"/>
         </w:rPr>
       </w:pPr>
-      <w:hyperlink w:anchor="_Toc231042181" w:history="1">
+      <w:hyperlink w:anchor="_Toc231067173" w:history="1">
         <w:r>
           <w:rPr>
             <w:rStyle w:val="Hyperlink"/>
@@ -1138,7 +1138,7 @@
             <w:noProof/>
             <w:webHidden/>
           </w:rPr>
-          <w:instrText xml:space="preserve"> PAGEREF _Toc231042181 \h </w:instrText>
+          <w:instrText xml:space="preserve"> PAGEREF _Toc231067173 \h </w:instrText>
         </w:r>
         <w:r>
           <w:rPr>
@@ -1183,7 +1183,7 @@
           <w:lang w:eastAsia="pt-BR"/>
         </w:rPr>
       </w:pPr>
-      <w:hyperlink w:anchor="_Toc231042182" w:history="1">
+      <w:hyperlink w:anchor="_Toc231067174" w:history="1">
         <w:r>
           <w:rPr>
             <w:rStyle w:val="Hyperlink"/>
@@ -1212,7 +1212,7 @@
             <w:noProof/>
             <w:webHidden/>
           </w:rPr>
-          <w:instrText xml:space="preserve"> PAGEREF _Toc231042182 \h </w:instrText>
+          <w:instrText xml:space="preserve"> PAGEREF _Toc231067174 \h </w:instrText>
         </w:r>
         <w:r>
           <w:rPr>
@@ -1257,7 +1257,7 @@
           <w:lang w:eastAsia="pt-BR"/>
         </w:rPr>
       </w:pPr>
-      <w:hyperlink w:anchor="_Toc231042183" w:history="1">
+      <w:hyperlink w:anchor="_Toc231067175" w:history="1">
         <w:r>
           <w:rPr>
             <w:rStyle w:val="Hyperlink"/>
@@ -1286,7 +1286,7 @@
             <w:noProof/>
             <w:webHidden/>
           </w:rPr>
-          <w:instrText xml:space="preserve"> PAGEREF _Toc231042183 \h </w:instrText>
+          <w:instrText xml:space="preserve"> PAGEREF _Toc231067175 \h </w:instrText>
         </w:r>
         <w:r>
           <w:rPr>
@@ -1331,7 +1331,7 @@
           <w:lang w:eastAsia="pt-BR"/>
         </w:rPr>
       </w:pPr>
-      <w:hyperlink w:anchor="_Toc231042184" w:history="1">
+      <w:hyperlink w:anchor="_Toc231067176" w:history="1">
         <w:r>
           <w:rPr>
             <w:rStyle w:val="Hyperlink"/>
@@ -1360,7 +1360,7 @@
             <w:noProof/>
             <w:webHidden/>
           </w:rPr>
-          <w:instrText xml:space="preserve"> PAGEREF _Toc231042184 \h </w:instrText>
+          <w:instrText xml:space="preserve"> PAGEREF _Toc231067176 \h </w:instrText>
         </w:r>
         <w:r>
           <w:rPr>
@@ -1405,7 +1405,7 @@
           <w:lang w:eastAsia="pt-BR"/>
         </w:rPr>
       </w:pPr>
-      <w:hyperlink w:anchor="_Toc231042185" w:history="1">
+      <w:hyperlink w:anchor="_Toc231067177" w:history="1">
         <w:r>
           <w:rPr>
             <w:rStyle w:val="Hyperlink"/>
@@ -1434,7 +1434,7 @@
             <w:noProof/>
             <w:webHidden/>
           </w:rPr>
-          <w:instrText xml:space="preserve"> PAGEREF _Toc231042185 \h </w:instrText>
+          <w:instrText xml:space="preserve"> PAGEREF _Toc231067177 \h </w:instrText>
         </w:r>
         <w:r>
           <w:rPr>
@@ -1479,7 +1479,7 @@
           <w:lang w:eastAsia="pt-BR"/>
         </w:rPr>
       </w:pPr>
-      <w:hyperlink w:anchor="_Toc231042186" w:history="1">
+      <w:hyperlink w:anchor="_Toc231067178" w:history="1">
         <w:r>
           <w:rPr>
             <w:rStyle w:val="Hyperlink"/>
@@ -1508,7 +1508,7 @@
             <w:noProof/>
             <w:webHidden/>
           </w:rPr>
-          <w:instrText xml:space="preserve"> PAGEREF _Toc231042186 \h </w:instrText>
+          <w:instrText xml:space="preserve"> PAGEREF _Toc231067178 \h </w:instrText>
         </w:r>
         <w:r>
           <w:rPr>
@@ -1553,7 +1553,7 @@
           <w:lang w:eastAsia="pt-BR"/>
         </w:rPr>
       </w:pPr>
-      <w:hyperlink w:anchor="_Toc231042187" w:history="1">
+      <w:hyperlink w:anchor="_Toc231067179" w:history="1">
         <w:r>
           <w:rPr>
             <w:rStyle w:val="Hyperlink"/>
@@ -1582,7 +1582,7 @@
             <w:noProof/>
             <w:webHidden/>
           </w:rPr>
-          <w:instrText xml:space="preserve"> PAGEREF _Toc231042187 \h </w:instrText>
+          <w:instrText xml:space="preserve"> PAGEREF _Toc231067179 \h </w:instrText>
         </w:r>
         <w:r>
           <w:rPr>
@@ -1627,7 +1627,7 @@
           <w:lang w:eastAsia="pt-BR"/>
         </w:rPr>
       </w:pPr>
-      <w:hyperlink w:anchor="_Toc231042188" w:history="1">
+      <w:hyperlink w:anchor="_Toc231067180" w:history="1">
         <w:r>
           <w:rPr>
             <w:rStyle w:val="Hyperlink"/>
@@ -1656,7 +1656,7 @@
             <w:noProof/>
             <w:webHidden/>
           </w:rPr>
-          <w:instrText xml:space="preserve"> PAGEREF _Toc231042188 \h </w:instrText>
+          <w:instrText xml:space="preserve"> PAGEREF _Toc231067180 \h </w:instrText>
         </w:r>
         <w:r>
           <w:rPr>
@@ -1701,7 +1701,7 @@
           <w:lang w:eastAsia="pt-BR"/>
         </w:rPr>
       </w:pPr>
-      <w:hyperlink w:anchor="_Toc231042189" w:history="1">
+      <w:hyperlink w:anchor="_Toc231067181" w:history="1">
         <w:r>
           <w:rPr>
             <w:rStyle w:val="Hyperlink"/>
@@ -1730,7 +1730,7 @@
             <w:noProof/>
             <w:webHidden/>
           </w:rPr>
-          <w:instrText xml:space="preserve"> PAGEREF _Toc231042189 \h </w:instrText>
+          <w:instrText xml:space="preserve"> PAGEREF _Toc231067181 \h </w:instrText>
         </w:r>
         <w:r>
           <w:rPr>
@@ -1775,7 +1775,7 @@
           <w:lang w:eastAsia="pt-BR"/>
         </w:rPr>
       </w:pPr>
-      <w:hyperlink w:anchor="_Toc231042190" w:history="1">
+      <w:hyperlink w:anchor="_Toc231067182" w:history="1">
         <w:r>
           <w:rPr>
             <w:rStyle w:val="Hyperlink"/>
@@ -1804,7 +1804,7 @@
             <w:noProof/>
             <w:webHidden/>
           </w:rPr>
-          <w:instrText xml:space="preserve"> PAGEREF _Toc231042190 \h </w:instrText>
+          <w:instrText xml:space="preserve"> PAGEREF _Toc231067182 \h </w:instrText>
         </w:r>
         <w:r>
           <w:rPr>
@@ -1849,7 +1849,7 @@
           <w:lang w:eastAsia="pt-BR"/>
         </w:rPr>
       </w:pPr>
-      <w:hyperlink w:anchor="_Toc231042191" w:history="1">
+      <w:hyperlink w:anchor="_Toc231067183" w:history="1">
         <w:r>
           <w:rPr>
             <w:rStyle w:val="Hyperlink"/>
@@ -1878,7 +1878,7 @@
             <w:noProof/>
             <w:webHidden/>
           </w:rPr>
-          <w:instrText xml:space="preserve"> PAGEREF _Toc231042191 \h </w:instrText>
+          <w:instrText xml:space="preserve"> PAGEREF _Toc231067183 \h </w:instrText>
         </w:r>
         <w:r>
           <w:rPr>
@@ -1923,7 +1923,7 @@
           <w:lang w:eastAsia="pt-BR"/>
         </w:rPr>
       </w:pPr>
-      <w:hyperlink w:anchor="_Toc231042192" w:history="1">
+      <w:hyperlink w:anchor="_Toc231067184" w:history="1">
         <w:r>
           <w:rPr>
             <w:rStyle w:val="Hyperlink"/>
@@ -1952,7 +1952,7 @@
             <w:noProof/>
             <w:webHidden/>
           </w:rPr>
-          <w:instrText xml:space="preserve"> PAGEREF _Toc231042192 \h </w:instrText>
+          <w:instrText xml:space="preserve"> PAGEREF _Toc231067184 \h </w:instrText>
         </w:r>
         <w:r>
           <w:rPr>
@@ -1997,7 +1997,7 @@
           <w:lang w:eastAsia="pt-BR"/>
         </w:rPr>
       </w:pPr>
-      <w:hyperlink w:anchor="_Toc231042193" w:history="1">
+      <w:hyperlink w:anchor="_Toc231067185" w:history="1">
         <w:r>
           <w:rPr>
             <w:rStyle w:val="Hyperlink"/>
@@ -2026,7 +2026,7 @@
             <w:noProof/>
             <w:webHidden/>
           </w:rPr>
-          <w:instrText xml:space="preserve"> PAGEREF _Toc231042193 \h </w:instrText>
+          <w:instrText xml:space="preserve"> PAGEREF _Toc231067185 \h </w:instrText>
         </w:r>
         <w:r>
           <w:rPr>
@@ -2071,7 +2071,7 @@
           <w:lang w:eastAsia="pt-BR"/>
         </w:rPr>
       </w:pPr>
-      <w:hyperlink w:anchor="_Toc231042194" w:history="1">
+      <w:hyperlink w:anchor="_Toc231067186" w:history="1">
         <w:r>
           <w:rPr>
             <w:rStyle w:val="Hyperlink"/>
@@ -2100,7 +2100,7 @@
             <w:noProof/>
             <w:webHidden/>
           </w:rPr>
-          <w:instrText xml:space="preserve"> PAGEREF _Toc231042194 \h </w:instrText>
+          <w:instrText xml:space="preserve"> PAGEREF _Toc231067186 \h </w:instrText>
         </w:r>
         <w:r>
           <w:rPr>
@@ -2145,7 +2145,7 @@
           <w:lang w:eastAsia="pt-BR"/>
         </w:rPr>
       </w:pPr>
-      <w:hyperlink w:anchor="_Toc231042195" w:history="1">
+      <w:hyperlink w:anchor="_Toc231067187" w:history="1">
         <w:r>
           <w:rPr>
             <w:rStyle w:val="Hyperlink"/>
@@ -2174,7 +2174,7 @@
             <w:noProof/>
             <w:webHidden/>
           </w:rPr>
-          <w:instrText xml:space="preserve"> PAGEREF _Toc231042195 \h </w:instrText>
+          <w:instrText xml:space="preserve"> PAGEREF _Toc231067187 \h </w:instrText>
         </w:r>
         <w:r>
           <w:rPr>
@@ -2219,7 +2219,7 @@
           <w:lang w:eastAsia="pt-BR"/>
         </w:rPr>
       </w:pPr>
-      <w:hyperlink w:anchor="_Toc231042196" w:history="1">
+      <w:hyperlink w:anchor="_Toc231067188" w:history="1">
         <w:r>
           <w:rPr>
             <w:rStyle w:val="Hyperlink"/>
@@ -2248,7 +2248,7 @@
             <w:noProof/>
             <w:webHidden/>
           </w:rPr>
-          <w:instrText xml:space="preserve"> PAGEREF _Toc231042196 \h </w:instrText>
+          <w:instrText xml:space="preserve"> PAGEREF _Toc231067188 \h </w:instrText>
         </w:r>
         <w:r>
           <w:rPr>
@@ -2293,7 +2293,7 @@
           <w:lang w:eastAsia="pt-BR"/>
         </w:rPr>
       </w:pPr>
-      <w:hyperlink w:anchor="_Toc231042197" w:history="1">
+      <w:hyperlink w:anchor="_Toc231067189" w:history="1">
         <w:r>
           <w:rPr>
             <w:rStyle w:val="Hyperlink"/>
@@ -2323,7 +2323,7 @@
             <w:noProof/>
             <w:webHidden/>
           </w:rPr>
-          <w:instrText xml:space="preserve"> PAGEREF _Toc231042197 \h </w:instrText>
+          <w:instrText xml:space="preserve"> PAGEREF _Toc231067189 \h </w:instrText>
         </w:r>
         <w:r>
           <w:rPr>
@@ -2368,7 +2368,7 @@
           <w:lang w:eastAsia="pt-BR"/>
         </w:rPr>
       </w:pPr>
-      <w:hyperlink w:anchor="_Toc231042198" w:history="1">
+      <w:hyperlink w:anchor="_Toc231067190" w:history="1">
         <w:r>
           <w:rPr>
             <w:rStyle w:val="Hyperlink"/>
@@ -2398,7 +2398,7 @@
             <w:noProof/>
             <w:webHidden/>
           </w:rPr>
-          <w:instrText xml:space="preserve"> PAGEREF _Toc231042198 \h </w:instrText>
+          <w:instrText xml:space="preserve"> PAGEREF _Toc231067190 \h </w:instrText>
         </w:r>
         <w:r>
           <w:rPr>
@@ -2450,7 +2450,7 @@
         <w:spacing w:before="360" w:after="360" w:line="360" w:lineRule="auto"/>
         <w:outlineLvl w:val="0"/>
       </w:pPr>
-      <w:bookmarkStart w:id="0" w:name="_Toc231042173"/>
+      <w:bookmarkStart w:id="0" w:name="_Toc231067165"/>
       <w:r>
         <w:rPr>
           <w:rFonts w:ascii="Times New Roman" w:hAnsi="Times New Roman" w:cs="Times New Roman"/>
@@ -2476,15 +2476,7 @@
           <w:sz w:val="24"/>
           <w:szCs w:val="24"/>
         </w:rPr>
-        <w:t>O Transtorno do Espectro Autista (TEA) é um transtorno do neurodesenvolvimento que afeta a comunicação, a interação social e o comportamento, organizado em três níveis de suporte segundo o DSM-5 (AMERICAN PSYCHIATRIC ASSOCIATION, 2023). Estudos de prevalência estimam que o TEA atinja cerca de uma em cada 36 crianças (MAENNER et al., 2023), e sua relevância social levou o Brasil a instituir a Política Nacional de Proteção dos Direitos da Pessoa com TEA (BRASIL, 2012) e a Carteira de Identificação da Pessoa c</w:t>
-      </w:r>
-      <w:r>
-        <w:rPr>
-          <w:rFonts w:ascii="Times New Roman" w:hAnsi="Times New Roman" w:cs="Times New Roman"/>
-          <w:sz w:val="24"/>
-          <w:szCs w:val="24"/>
-        </w:rPr>
-        <w:t>om TEA — CIPTEA (BRASIL, 2020). O atendimento a essas pessoas é, em geral, multidisciplinar, reunindo psicólogos, fonoaudiólogos, terapeutas ocupacionais, fisioterapeutas e psicopedagogos que atuam de forma integrada sobre o mesmo paciente.</w:t>
+        <w:t>O Transtorno do Espectro Autista (TEA) é um transtorno do neurodesenvolvimento que afeta a comunicação, a interação social e o comportamento, organizado em três níveis de suporte segundo o DSM-5 (AMERICAN PSYCHIATRIC ASSOCIATION, 2023). Estudos de prevalência estimam que o TEA atinja cerca de uma em cada 36 crianças (MAENNER et al., 2023), e sua relevância social levou o Brasil a instituir a Política Nacional de Proteção dos Direitos da Pessoa com TEA (BRASIL, 2012) e a Carteira de Identificação da Pessoa com TEA — CIPTEA (BRASIL, 2020). O atendimento a essas pessoas é, em geral, multidisciplinar, reunindo psicólogos, fonoaudiólogos, terapeutas ocupacionais, fisioterapeutas e psicopedagogos que atuam de forma integrada sobre o mesmo paciente.</w:t>
       </w:r>
     </w:p>
     <w:p>
@@ -2499,15 +2491,7 @@
           <w:sz w:val="24"/>
           <w:szCs w:val="24"/>
         </w:rPr>
-        <w:t>A escolha do tema partiu de uma motivação pessoal: o autor foi recentemente diagnosticado com TEA e, ao conhecer de perto essa rotina de acompanhamento, identificou-se com a proposta e passou a enxergar na tecnologia um meio de tornar o cuidado mais organizado e humano. Soma-se a isso a observação de que clínicas de pequeno e médio porte ainda controlam consultas e evoluções em planilhas ou agendas de papel — modelo fragmentado que dificulta a comunicação entre especialidades e favorece erros de agendamento</w:t>
-      </w:r>
-      <w:r>
-        <w:rPr>
-          <w:rFonts w:ascii="Times New Roman" w:hAnsi="Times New Roman" w:cs="Times New Roman"/>
-          <w:sz w:val="24"/>
-          <w:szCs w:val="24"/>
-        </w:rPr>
-        <w:t xml:space="preserve"> por sobreposição de horários.</w:t>
+        <w:t>A escolha do tema partiu de uma motivação pessoal: o autor foi recentemente diagnosticado com TEA e, ao conhecer de perto essa rotina de acompanhamento, identificou-se com a proposta e passou a enxergar na tecnologia um meio de tornar o cuidado mais organizado e humano. Soma-se a isso a observação de que clínicas de pequeno e médio porte ainda controlam consultas e evoluções em planilhas ou agendas de papel — modelo fragmentado que dificulta a comunicação entre especialidades e favorece erros de agendamento por sobreposição de horários.</w:t>
       </w:r>
     </w:p>
     <w:p>
@@ -2564,7 +2548,7 @@
         <w:spacing w:before="360" w:after="360" w:line="360" w:lineRule="auto"/>
         <w:outlineLvl w:val="0"/>
       </w:pPr>
-      <w:bookmarkStart w:id="1" w:name="_Toc231042174"/>
+      <w:bookmarkStart w:id="1" w:name="_Toc231067166"/>
       <w:r>
         <w:rPr>
           <w:rFonts w:ascii="Times New Roman" w:hAnsi="Times New Roman" w:cs="Times New Roman"/>
@@ -2584,7 +2568,7 @@
         <w:spacing w:before="360" w:after="360" w:line="360" w:lineRule="auto"/>
         <w:outlineLvl w:val="1"/>
       </w:pPr>
-      <w:bookmarkStart w:id="2" w:name="_Toc231042175"/>
+      <w:bookmarkStart w:id="2" w:name="_Toc231067167"/>
       <w:r>
         <w:rPr>
           <w:rFonts w:ascii="Times New Roman" w:hAnsi="Times New Roman" w:cs="Times New Roman"/>
@@ -3724,7 +3708,7 @@
         <w:spacing w:before="360" w:after="360" w:line="360" w:lineRule="auto"/>
         <w:outlineLvl w:val="1"/>
       </w:pPr>
-      <w:bookmarkStart w:id="3" w:name="_Toc231042176"/>
+      <w:bookmarkStart w:id="3" w:name="_Toc231067168"/>
       <w:r>
         <w:rPr>
           <w:rFonts w:ascii="Times New Roman" w:hAnsi="Times New Roman" w:cs="Times New Roman"/>
@@ -3856,7 +3840,7 @@
         <w:spacing w:before="360" w:after="360" w:line="360" w:lineRule="auto"/>
         <w:outlineLvl w:val="1"/>
       </w:pPr>
-      <w:bookmarkStart w:id="4" w:name="_Toc231042177"/>
+      <w:bookmarkStart w:id="4" w:name="_Toc231067169"/>
       <w:r>
         <w:rPr>
           <w:rFonts w:ascii="Times New Roman" w:hAnsi="Times New Roman" w:cs="Times New Roman"/>
@@ -7614,7 +7598,7 @@
         <w:spacing w:before="360" w:after="360" w:line="360" w:lineRule="auto"/>
         <w:outlineLvl w:val="1"/>
       </w:pPr>
-      <w:bookmarkStart w:id="5" w:name="_Toc231042178"/>
+      <w:bookmarkStart w:id="5" w:name="_Toc231067170"/>
       <w:r>
         <w:rPr>
           <w:rFonts w:ascii="Times New Roman" w:hAnsi="Times New Roman" w:cs="Times New Roman"/>
@@ -7785,7 +7769,7 @@
         <w:spacing w:before="360" w:after="360" w:line="360" w:lineRule="auto"/>
         <w:outlineLvl w:val="1"/>
       </w:pPr>
-      <w:bookmarkStart w:id="6" w:name="_Toc231042179"/>
+      <w:bookmarkStart w:id="6" w:name="_Toc231067171"/>
       <w:r>
         <w:rPr>
           <w:rFonts w:ascii="Times New Roman" w:hAnsi="Times New Roman" w:cs="Times New Roman"/>
@@ -7948,7 +7932,7 @@
         <w:spacing w:before="360" w:after="360" w:line="360" w:lineRule="auto"/>
         <w:outlineLvl w:val="0"/>
       </w:pPr>
-      <w:bookmarkStart w:id="7" w:name="_Toc231042180"/>
+      <w:bookmarkStart w:id="7" w:name="_Toc231067172"/>
       <w:r>
         <w:rPr>
           <w:rFonts w:ascii="Times New Roman" w:hAnsi="Times New Roman" w:cs="Times New Roman"/>
@@ -7983,7 +7967,7 @@
         <w:spacing w:before="360" w:after="360" w:line="360" w:lineRule="auto"/>
         <w:outlineLvl w:val="1"/>
       </w:pPr>
-      <w:bookmarkStart w:id="8" w:name="_Toc231042181"/>
+      <w:bookmarkStart w:id="8" w:name="_Toc231067173"/>
       <w:r>
         <w:rPr>
           <w:rFonts w:ascii="Times New Roman" w:hAnsi="Times New Roman" w:cs="Times New Roman"/>
@@ -8028,20 +8012,11 @@
       <w:r>
         <w:rPr>
           <w:rFonts w:ascii="Times New Roman" w:hAnsi="Times New Roman" w:cs="Times New Roman"/>
-          <w:b/>
           <w:sz w:val="24"/>
           <w:szCs w:val="24"/>
         </w:rPr>
         <w:lastRenderedPageBreak/>
-        <w:t>Figura 1</w:t>
-      </w:r>
-      <w:r>
-        <w:rPr>
-          <w:rFonts w:ascii="Times New Roman" w:hAnsi="Times New Roman" w:cs="Times New Roman"/>
-          <w:sz w:val="24"/>
-          <w:szCs w:val="24"/>
-        </w:rPr>
-        <w:t xml:space="preserve"> – Tela de Login</w:t>
+        <w:t>Figura 1 – Tela de Login</w:t>
       </w:r>
     </w:p>
     <w:p>
@@ -8094,24 +8069,14 @@
     <w:p>
       <w:pPr>
         <w:spacing w:after="240" w:line="240" w:lineRule="auto"/>
-        <w:jc w:val="center"/>
-      </w:pPr>
-      <w:r>
-        <w:rPr>
-          <w:rFonts w:ascii="Times New Roman" w:hAnsi="Times New Roman" w:cs="Times New Roman"/>
-          <w:b/>
+      </w:pPr>
+      <w:r>
+        <w:rPr>
+          <w:rFonts w:ascii="Times New Roman" w:hAnsi="Times New Roman" w:cs="Times New Roman"/>
           <w:sz w:val="20"/>
           <w:szCs w:val="20"/>
         </w:rPr>
-        <w:t xml:space="preserve">Fonte: </w:t>
-      </w:r>
-      <w:r>
-        <w:rPr>
-          <w:rFonts w:ascii="Times New Roman" w:hAnsi="Times New Roman" w:cs="Times New Roman"/>
-          <w:sz w:val="20"/>
-          <w:szCs w:val="20"/>
-        </w:rPr>
-        <w:t>o autor (2026).</w:t>
+        <w:t>Fonte: o autor (2026).</w:t>
       </w:r>
     </w:p>
     <w:p>
@@ -8120,7 +8085,7 @@
         <w:spacing w:before="360" w:after="360" w:line="360" w:lineRule="auto"/>
         <w:outlineLvl w:val="1"/>
       </w:pPr>
-      <w:bookmarkStart w:id="9" w:name="_Toc231042182"/>
+      <w:bookmarkStart w:id="9" w:name="_Toc231067174"/>
       <w:r>
         <w:rPr>
           <w:rFonts w:ascii="Times New Roman" w:hAnsi="Times New Roman" w:cs="Times New Roman"/>
@@ -8166,19 +8131,10 @@
       <w:r>
         <w:rPr>
           <w:rFonts w:ascii="Times New Roman" w:hAnsi="Times New Roman" w:cs="Times New Roman"/>
-          <w:b/>
-          <w:sz w:val="24"/>
-          <w:szCs w:val="24"/>
-        </w:rPr>
-        <w:t>Figura 2</w:t>
-      </w:r>
-      <w:r>
-        <w:rPr>
-          <w:rFonts w:ascii="Times New Roman" w:hAnsi="Times New Roman" w:cs="Times New Roman"/>
-          <w:sz w:val="24"/>
-          <w:szCs w:val="24"/>
-        </w:rPr>
-        <w:t xml:space="preserve"> – Dashboard Principal</w:t>
+          <w:sz w:val="24"/>
+          <w:szCs w:val="24"/>
+        </w:rPr>
+        <w:t>Figura 2 – Dashboard Principal</w:t>
       </w:r>
     </w:p>
     <w:p>
@@ -8231,24 +8187,14 @@
     <w:p>
       <w:pPr>
         <w:spacing w:after="240" w:line="240" w:lineRule="auto"/>
-        <w:jc w:val="center"/>
-      </w:pPr>
-      <w:r>
-        <w:rPr>
-          <w:rFonts w:ascii="Times New Roman" w:hAnsi="Times New Roman" w:cs="Times New Roman"/>
-          <w:b/>
+      </w:pPr>
+      <w:r>
+        <w:rPr>
+          <w:rFonts w:ascii="Times New Roman" w:hAnsi="Times New Roman" w:cs="Times New Roman"/>
           <w:sz w:val="20"/>
           <w:szCs w:val="20"/>
         </w:rPr>
-        <w:t xml:space="preserve">Fonte: </w:t>
-      </w:r>
-      <w:r>
-        <w:rPr>
-          <w:rFonts w:ascii="Times New Roman" w:hAnsi="Times New Roman" w:cs="Times New Roman"/>
-          <w:sz w:val="20"/>
-          <w:szCs w:val="20"/>
-        </w:rPr>
-        <w:t>o autor (2026).</w:t>
+        <w:t>Fonte: o autor (2026).</w:t>
       </w:r>
     </w:p>
     <w:p>
@@ -8257,7 +8203,7 @@
         <w:spacing w:before="360" w:after="360" w:line="360" w:lineRule="auto"/>
         <w:outlineLvl w:val="1"/>
       </w:pPr>
-      <w:bookmarkStart w:id="10" w:name="_Toc231042183"/>
+      <w:bookmarkStart w:id="10" w:name="_Toc231067175"/>
       <w:r>
         <w:rPr>
           <w:rFonts w:ascii="Times New Roman" w:hAnsi="Times New Roman" w:cs="Times New Roman"/>
@@ -8302,20 +8248,11 @@
       <w:r>
         <w:rPr>
           <w:rFonts w:ascii="Times New Roman" w:hAnsi="Times New Roman" w:cs="Times New Roman"/>
-          <w:b/>
           <w:sz w:val="24"/>
           <w:szCs w:val="24"/>
         </w:rPr>
         <w:lastRenderedPageBreak/>
-        <w:t>Figura 3</w:t>
-      </w:r>
-      <w:r>
-        <w:rPr>
-          <w:rFonts w:ascii="Times New Roman" w:hAnsi="Times New Roman" w:cs="Times New Roman"/>
-          <w:sz w:val="24"/>
-          <w:szCs w:val="24"/>
-        </w:rPr>
-        <w:t xml:space="preserve"> – Módulo de Pacientes</w:t>
+        <w:t>Figura 3 – Módulo de Pacientes</w:t>
       </w:r>
     </w:p>
     <w:p>
@@ -8368,24 +8305,14 @@
     <w:p>
       <w:pPr>
         <w:spacing w:after="240" w:line="240" w:lineRule="auto"/>
-        <w:jc w:val="center"/>
-      </w:pPr>
-      <w:r>
-        <w:rPr>
-          <w:rFonts w:ascii="Times New Roman" w:hAnsi="Times New Roman" w:cs="Times New Roman"/>
-          <w:b/>
+      </w:pPr>
+      <w:r>
+        <w:rPr>
+          <w:rFonts w:ascii="Times New Roman" w:hAnsi="Times New Roman" w:cs="Times New Roman"/>
           <w:sz w:val="20"/>
           <w:szCs w:val="20"/>
         </w:rPr>
-        <w:t xml:space="preserve">Fonte: </w:t>
-      </w:r>
-      <w:r>
-        <w:rPr>
-          <w:rFonts w:ascii="Times New Roman" w:hAnsi="Times New Roman" w:cs="Times New Roman"/>
-          <w:sz w:val="20"/>
-          <w:szCs w:val="20"/>
-        </w:rPr>
-        <w:t>o autor (2026).</w:t>
+        <w:t>Fonte: o autor (2026).</w:t>
       </w:r>
     </w:p>
     <w:p>
@@ -8394,7 +8321,7 @@
         <w:spacing w:before="360" w:after="360" w:line="360" w:lineRule="auto"/>
         <w:outlineLvl w:val="1"/>
       </w:pPr>
-      <w:bookmarkStart w:id="11" w:name="_Toc231042184"/>
+      <w:bookmarkStart w:id="11" w:name="_Toc231067176"/>
       <w:r>
         <w:rPr>
           <w:rFonts w:ascii="Times New Roman" w:hAnsi="Times New Roman" w:cs="Times New Roman"/>
@@ -8439,20 +8366,11 @@
       <w:r>
         <w:rPr>
           <w:rFonts w:ascii="Times New Roman" w:hAnsi="Times New Roman" w:cs="Times New Roman"/>
-          <w:b/>
           <w:sz w:val="24"/>
           <w:szCs w:val="24"/>
         </w:rPr>
         <w:lastRenderedPageBreak/>
-        <w:t>Figura 4</w:t>
-      </w:r>
-      <w:r>
-        <w:rPr>
-          <w:rFonts w:ascii="Times New Roman" w:hAnsi="Times New Roman" w:cs="Times New Roman"/>
-          <w:sz w:val="24"/>
-          <w:szCs w:val="24"/>
-        </w:rPr>
-        <w:t xml:space="preserve"> – Formulário de Cadastro/Edição de Paciente</w:t>
+        <w:t>Figura 4 – Formulário de Cadastro/Edição de Paciente</w:t>
       </w:r>
     </w:p>
     <w:p>
@@ -8505,24 +8423,14 @@
     <w:p>
       <w:pPr>
         <w:spacing w:after="240" w:line="240" w:lineRule="auto"/>
-        <w:jc w:val="center"/>
-      </w:pPr>
-      <w:r>
-        <w:rPr>
-          <w:rFonts w:ascii="Times New Roman" w:hAnsi="Times New Roman" w:cs="Times New Roman"/>
-          <w:b/>
+      </w:pPr>
+      <w:r>
+        <w:rPr>
+          <w:rFonts w:ascii="Times New Roman" w:hAnsi="Times New Roman" w:cs="Times New Roman"/>
           <w:sz w:val="20"/>
           <w:szCs w:val="20"/>
         </w:rPr>
-        <w:t xml:space="preserve">Fonte: </w:t>
-      </w:r>
-      <w:r>
-        <w:rPr>
-          <w:rFonts w:ascii="Times New Roman" w:hAnsi="Times New Roman" w:cs="Times New Roman"/>
-          <w:sz w:val="20"/>
-          <w:szCs w:val="20"/>
-        </w:rPr>
-        <w:t>o autor (2026).</w:t>
+        <w:t>Fonte: o autor (2026).</w:t>
       </w:r>
     </w:p>
     <w:p>
@@ -8531,7 +8439,7 @@
         <w:spacing w:before="360" w:after="360" w:line="360" w:lineRule="auto"/>
         <w:outlineLvl w:val="1"/>
       </w:pPr>
-      <w:bookmarkStart w:id="12" w:name="_Toc231042185"/>
+      <w:bookmarkStart w:id="12" w:name="_Toc231067177"/>
       <w:r>
         <w:rPr>
           <w:rFonts w:ascii="Times New Roman" w:hAnsi="Times New Roman" w:cs="Times New Roman"/>
@@ -8576,20 +8484,11 @@
       <w:r>
         <w:rPr>
           <w:rFonts w:ascii="Times New Roman" w:hAnsi="Times New Roman" w:cs="Times New Roman"/>
-          <w:b/>
           <w:sz w:val="24"/>
           <w:szCs w:val="24"/>
         </w:rPr>
         <w:lastRenderedPageBreak/>
-        <w:t>Figura 5</w:t>
-      </w:r>
-      <w:r>
-        <w:rPr>
-          <w:rFonts w:ascii="Times New Roman" w:hAnsi="Times New Roman" w:cs="Times New Roman"/>
-          <w:sz w:val="24"/>
-          <w:szCs w:val="24"/>
-        </w:rPr>
-        <w:t xml:space="preserve"> – Módulo de Profissionais</w:t>
+        <w:t>Figura 5 – Módulo de Profissionais</w:t>
       </w:r>
     </w:p>
     <w:p>
@@ -8642,24 +8541,14 @@
     <w:p>
       <w:pPr>
         <w:spacing w:after="240" w:line="240" w:lineRule="auto"/>
-        <w:jc w:val="center"/>
-      </w:pPr>
-      <w:r>
-        <w:rPr>
-          <w:rFonts w:ascii="Times New Roman" w:hAnsi="Times New Roman" w:cs="Times New Roman"/>
-          <w:b/>
+      </w:pPr>
+      <w:r>
+        <w:rPr>
+          <w:rFonts w:ascii="Times New Roman" w:hAnsi="Times New Roman" w:cs="Times New Roman"/>
           <w:sz w:val="20"/>
           <w:szCs w:val="20"/>
         </w:rPr>
-        <w:t xml:space="preserve">Fonte: </w:t>
-      </w:r>
-      <w:r>
-        <w:rPr>
-          <w:rFonts w:ascii="Times New Roman" w:hAnsi="Times New Roman" w:cs="Times New Roman"/>
-          <w:sz w:val="20"/>
-          <w:szCs w:val="20"/>
-        </w:rPr>
-        <w:t>o autor (2026).</w:t>
+        <w:t>Fonte: o autor (2026).</w:t>
       </w:r>
     </w:p>
     <w:p>
@@ -8668,7 +8557,7 @@
         <w:spacing w:before="360" w:after="360" w:line="360" w:lineRule="auto"/>
         <w:outlineLvl w:val="1"/>
       </w:pPr>
-      <w:bookmarkStart w:id="13" w:name="_Toc231042186"/>
+      <w:bookmarkStart w:id="13" w:name="_Toc231067178"/>
       <w:r>
         <w:rPr>
           <w:rFonts w:ascii="Times New Roman" w:hAnsi="Times New Roman" w:cs="Times New Roman"/>
@@ -8713,20 +8602,11 @@
       <w:r>
         <w:rPr>
           <w:rFonts w:ascii="Times New Roman" w:hAnsi="Times New Roman" w:cs="Times New Roman"/>
-          <w:b/>
           <w:sz w:val="24"/>
           <w:szCs w:val="24"/>
         </w:rPr>
         <w:lastRenderedPageBreak/>
-        <w:t>Figura 6</w:t>
-      </w:r>
-      <w:r>
-        <w:rPr>
-          <w:rFonts w:ascii="Times New Roman" w:hAnsi="Times New Roman" w:cs="Times New Roman"/>
-          <w:sz w:val="24"/>
-          <w:szCs w:val="24"/>
-        </w:rPr>
-        <w:t xml:space="preserve"> – Formulário de Cadastro/Edição de Profissional</w:t>
+        <w:t>Figura 6 – Formulário de Cadastro/Edição de Profissional</w:t>
       </w:r>
     </w:p>
     <w:p>
@@ -8779,24 +8659,14 @@
     <w:p>
       <w:pPr>
         <w:spacing w:after="240" w:line="240" w:lineRule="auto"/>
-        <w:jc w:val="center"/>
-      </w:pPr>
-      <w:r>
-        <w:rPr>
-          <w:rFonts w:ascii="Times New Roman" w:hAnsi="Times New Roman" w:cs="Times New Roman"/>
-          <w:b/>
+      </w:pPr>
+      <w:r>
+        <w:rPr>
+          <w:rFonts w:ascii="Times New Roman" w:hAnsi="Times New Roman" w:cs="Times New Roman"/>
           <w:sz w:val="20"/>
           <w:szCs w:val="20"/>
         </w:rPr>
-        <w:t xml:space="preserve">Fonte: </w:t>
-      </w:r>
-      <w:r>
-        <w:rPr>
-          <w:rFonts w:ascii="Times New Roman" w:hAnsi="Times New Roman" w:cs="Times New Roman"/>
-          <w:sz w:val="20"/>
-          <w:szCs w:val="20"/>
-        </w:rPr>
-        <w:t>o autor (2026).</w:t>
+        <w:t>Fonte: o autor (2026).</w:t>
       </w:r>
     </w:p>
     <w:p>
@@ -8805,7 +8675,7 @@
         <w:spacing w:before="360" w:after="360" w:line="360" w:lineRule="auto"/>
         <w:outlineLvl w:val="1"/>
       </w:pPr>
-      <w:bookmarkStart w:id="14" w:name="_Toc231042187"/>
+      <w:bookmarkStart w:id="14" w:name="_Toc231067179"/>
       <w:r>
         <w:rPr>
           <w:rFonts w:ascii="Times New Roman" w:hAnsi="Times New Roman" w:cs="Times New Roman"/>
@@ -8850,20 +8720,11 @@
       <w:r>
         <w:rPr>
           <w:rFonts w:ascii="Times New Roman" w:hAnsi="Times New Roman" w:cs="Times New Roman"/>
-          <w:b/>
           <w:sz w:val="24"/>
           <w:szCs w:val="24"/>
         </w:rPr>
         <w:lastRenderedPageBreak/>
-        <w:t>Figura 7</w:t>
-      </w:r>
-      <w:r>
-        <w:rPr>
-          <w:rFonts w:ascii="Times New Roman" w:hAnsi="Times New Roman" w:cs="Times New Roman"/>
-          <w:sz w:val="24"/>
-          <w:szCs w:val="24"/>
-        </w:rPr>
-        <w:t xml:space="preserve"> – Módulo de Especialidades</w:t>
+        <w:t>Figura 7 – Módulo de Especialidades</w:t>
       </w:r>
     </w:p>
     <w:p>
@@ -8916,24 +8777,14 @@
     <w:p>
       <w:pPr>
         <w:spacing w:after="240" w:line="240" w:lineRule="auto"/>
-        <w:jc w:val="center"/>
-      </w:pPr>
-      <w:r>
-        <w:rPr>
-          <w:rFonts w:ascii="Times New Roman" w:hAnsi="Times New Roman" w:cs="Times New Roman"/>
-          <w:b/>
+      </w:pPr>
+      <w:r>
+        <w:rPr>
+          <w:rFonts w:ascii="Times New Roman" w:hAnsi="Times New Roman" w:cs="Times New Roman"/>
           <w:sz w:val="20"/>
           <w:szCs w:val="20"/>
         </w:rPr>
-        <w:t xml:space="preserve">Fonte: </w:t>
-      </w:r>
-      <w:r>
-        <w:rPr>
-          <w:rFonts w:ascii="Times New Roman" w:hAnsi="Times New Roman" w:cs="Times New Roman"/>
-          <w:sz w:val="20"/>
-          <w:szCs w:val="20"/>
-        </w:rPr>
-        <w:t>o autor (2026).</w:t>
+        <w:t>Fonte: o autor (2026).</w:t>
       </w:r>
     </w:p>
     <w:p>
@@ -8942,7 +8793,7 @@
         <w:spacing w:before="360" w:after="360" w:line="360" w:lineRule="auto"/>
         <w:outlineLvl w:val="1"/>
       </w:pPr>
-      <w:bookmarkStart w:id="15" w:name="_Toc231042188"/>
+      <w:bookmarkStart w:id="15" w:name="_Toc231067180"/>
       <w:r>
         <w:rPr>
           <w:rFonts w:ascii="Times New Roman" w:hAnsi="Times New Roman" w:cs="Times New Roman"/>
@@ -8987,20 +8838,11 @@
       <w:r>
         <w:rPr>
           <w:rFonts w:ascii="Times New Roman" w:hAnsi="Times New Roman" w:cs="Times New Roman"/>
-          <w:b/>
           <w:sz w:val="24"/>
           <w:szCs w:val="24"/>
         </w:rPr>
         <w:lastRenderedPageBreak/>
-        <w:t>Figura 8</w:t>
-      </w:r>
-      <w:r>
-        <w:rPr>
-          <w:rFonts w:ascii="Times New Roman" w:hAnsi="Times New Roman" w:cs="Times New Roman"/>
-          <w:sz w:val="24"/>
-          <w:szCs w:val="24"/>
-        </w:rPr>
-        <w:t xml:space="preserve"> – Formulário de Cadastro/Edição de Especialidade</w:t>
+        <w:t>Figura 8 – Formulário de Cadastro/Edição de Especialidade</w:t>
       </w:r>
     </w:p>
     <w:p>
@@ -9053,24 +8895,14 @@
     <w:p>
       <w:pPr>
         <w:spacing w:after="240" w:line="240" w:lineRule="auto"/>
-        <w:jc w:val="center"/>
-      </w:pPr>
-      <w:r>
-        <w:rPr>
-          <w:rFonts w:ascii="Times New Roman" w:hAnsi="Times New Roman" w:cs="Times New Roman"/>
-          <w:b/>
+      </w:pPr>
+      <w:r>
+        <w:rPr>
+          <w:rFonts w:ascii="Times New Roman" w:hAnsi="Times New Roman" w:cs="Times New Roman"/>
           <w:sz w:val="20"/>
           <w:szCs w:val="20"/>
         </w:rPr>
-        <w:t xml:space="preserve">Fonte: </w:t>
-      </w:r>
-      <w:r>
-        <w:rPr>
-          <w:rFonts w:ascii="Times New Roman" w:hAnsi="Times New Roman" w:cs="Times New Roman"/>
-          <w:sz w:val="20"/>
-          <w:szCs w:val="20"/>
-        </w:rPr>
-        <w:t>o autor (2026).</w:t>
+        <w:t>Fonte: o autor (2026).</w:t>
       </w:r>
     </w:p>
     <w:p>
@@ -9079,7 +8911,7 @@
         <w:spacing w:before="360" w:after="360" w:line="360" w:lineRule="auto"/>
         <w:outlineLvl w:val="1"/>
       </w:pPr>
-      <w:bookmarkStart w:id="16" w:name="_Toc231042189"/>
+      <w:bookmarkStart w:id="16" w:name="_Toc231067181"/>
       <w:r>
         <w:rPr>
           <w:rFonts w:ascii="Times New Roman" w:hAnsi="Times New Roman" w:cs="Times New Roman"/>
@@ -9124,20 +8956,11 @@
       <w:r>
         <w:rPr>
           <w:rFonts w:ascii="Times New Roman" w:hAnsi="Times New Roman" w:cs="Times New Roman"/>
-          <w:b/>
           <w:sz w:val="24"/>
           <w:szCs w:val="24"/>
         </w:rPr>
         <w:lastRenderedPageBreak/>
-        <w:t>Figura 9</w:t>
-      </w:r>
-      <w:r>
-        <w:rPr>
-          <w:rFonts w:ascii="Times New Roman" w:hAnsi="Times New Roman" w:cs="Times New Roman"/>
-          <w:sz w:val="24"/>
-          <w:szCs w:val="24"/>
-        </w:rPr>
-        <w:t xml:space="preserve"> – Módulo de Salas</w:t>
+        <w:t>Figura 9 – Módulo de Salas</w:t>
       </w:r>
     </w:p>
     <w:p>
@@ -9190,24 +9013,14 @@
     <w:p>
       <w:pPr>
         <w:spacing w:after="240" w:line="240" w:lineRule="auto"/>
-        <w:jc w:val="center"/>
-      </w:pPr>
-      <w:r>
-        <w:rPr>
-          <w:rFonts w:ascii="Times New Roman" w:hAnsi="Times New Roman" w:cs="Times New Roman"/>
-          <w:b/>
+      </w:pPr>
+      <w:r>
+        <w:rPr>
+          <w:rFonts w:ascii="Times New Roman" w:hAnsi="Times New Roman" w:cs="Times New Roman"/>
           <w:sz w:val="20"/>
           <w:szCs w:val="20"/>
         </w:rPr>
-        <w:t xml:space="preserve">Fonte: </w:t>
-      </w:r>
-      <w:r>
-        <w:rPr>
-          <w:rFonts w:ascii="Times New Roman" w:hAnsi="Times New Roman" w:cs="Times New Roman"/>
-          <w:sz w:val="20"/>
-          <w:szCs w:val="20"/>
-        </w:rPr>
-        <w:t>o autor (2026).</w:t>
+        <w:t>Fonte: o autor (2026).</w:t>
       </w:r>
     </w:p>
     <w:p>
@@ -9216,7 +9029,7 @@
         <w:spacing w:before="360" w:after="360" w:line="360" w:lineRule="auto"/>
         <w:outlineLvl w:val="1"/>
       </w:pPr>
-      <w:bookmarkStart w:id="17" w:name="_Toc231042190"/>
+      <w:bookmarkStart w:id="17" w:name="_Toc231067182"/>
       <w:r>
         <w:rPr>
           <w:rFonts w:ascii="Times New Roman" w:hAnsi="Times New Roman" w:cs="Times New Roman"/>
@@ -9261,20 +9074,11 @@
       <w:r>
         <w:rPr>
           <w:rFonts w:ascii="Times New Roman" w:hAnsi="Times New Roman" w:cs="Times New Roman"/>
-          <w:b/>
           <w:sz w:val="24"/>
           <w:szCs w:val="24"/>
         </w:rPr>
         <w:lastRenderedPageBreak/>
-        <w:t>Figura 10</w:t>
-      </w:r>
-      <w:r>
-        <w:rPr>
-          <w:rFonts w:ascii="Times New Roman" w:hAnsi="Times New Roman" w:cs="Times New Roman"/>
-          <w:sz w:val="24"/>
-          <w:szCs w:val="24"/>
-        </w:rPr>
-        <w:t xml:space="preserve"> – Módulo de Agenda</w:t>
+        <w:t>Figura 10 – Módulo de Agenda</w:t>
       </w:r>
     </w:p>
     <w:p>
@@ -9327,24 +9131,14 @@
     <w:p>
       <w:pPr>
         <w:spacing w:after="240" w:line="240" w:lineRule="auto"/>
-        <w:jc w:val="center"/>
-      </w:pPr>
-      <w:r>
-        <w:rPr>
-          <w:rFonts w:ascii="Times New Roman" w:hAnsi="Times New Roman" w:cs="Times New Roman"/>
-          <w:b/>
+      </w:pPr>
+      <w:r>
+        <w:rPr>
+          <w:rFonts w:ascii="Times New Roman" w:hAnsi="Times New Roman" w:cs="Times New Roman"/>
           <w:sz w:val="20"/>
           <w:szCs w:val="20"/>
         </w:rPr>
-        <w:t xml:space="preserve">Fonte: </w:t>
-      </w:r>
-      <w:r>
-        <w:rPr>
-          <w:rFonts w:ascii="Times New Roman" w:hAnsi="Times New Roman" w:cs="Times New Roman"/>
-          <w:sz w:val="20"/>
-          <w:szCs w:val="20"/>
-        </w:rPr>
-        <w:t>o autor (2026).</w:t>
+        <w:t>Fonte: o autor (2026).</w:t>
       </w:r>
     </w:p>
     <w:p>
@@ -9353,7 +9147,7 @@
         <w:spacing w:before="360" w:after="360" w:line="360" w:lineRule="auto"/>
         <w:outlineLvl w:val="1"/>
       </w:pPr>
-      <w:bookmarkStart w:id="18" w:name="_Toc231042191"/>
+      <w:bookmarkStart w:id="18" w:name="_Toc231067183"/>
       <w:r>
         <w:rPr>
           <w:rFonts w:ascii="Times New Roman" w:hAnsi="Times New Roman" w:cs="Times New Roman"/>
@@ -9398,20 +9192,11 @@
       <w:r>
         <w:rPr>
           <w:rFonts w:ascii="Times New Roman" w:hAnsi="Times New Roman" w:cs="Times New Roman"/>
-          <w:b/>
           <w:sz w:val="24"/>
           <w:szCs w:val="24"/>
         </w:rPr>
         <w:lastRenderedPageBreak/>
-        <w:t>Figura 11</w:t>
-      </w:r>
-      <w:r>
-        <w:rPr>
-          <w:rFonts w:ascii="Times New Roman" w:hAnsi="Times New Roman" w:cs="Times New Roman"/>
-          <w:sz w:val="24"/>
-          <w:szCs w:val="24"/>
-        </w:rPr>
-        <w:t xml:space="preserve"> – Formulário de Novo/Editar Agendamento</w:t>
+        <w:t>Figura 11 – Formulário de Novo/Editar Agendamento</w:t>
       </w:r>
     </w:p>
     <w:p>
@@ -9464,24 +9249,14 @@
     <w:p>
       <w:pPr>
         <w:spacing w:after="240" w:line="240" w:lineRule="auto"/>
-        <w:jc w:val="center"/>
-      </w:pPr>
-      <w:r>
-        <w:rPr>
-          <w:rFonts w:ascii="Times New Roman" w:hAnsi="Times New Roman" w:cs="Times New Roman"/>
-          <w:b/>
+      </w:pPr>
+      <w:r>
+        <w:rPr>
+          <w:rFonts w:ascii="Times New Roman" w:hAnsi="Times New Roman" w:cs="Times New Roman"/>
           <w:sz w:val="20"/>
           <w:szCs w:val="20"/>
         </w:rPr>
-        <w:t xml:space="preserve">Fonte: </w:t>
-      </w:r>
-      <w:r>
-        <w:rPr>
-          <w:rFonts w:ascii="Times New Roman" w:hAnsi="Times New Roman" w:cs="Times New Roman"/>
-          <w:sz w:val="20"/>
-          <w:szCs w:val="20"/>
-        </w:rPr>
-        <w:t>o autor (2026).</w:t>
+        <w:t>Fonte: o autor (2026).</w:t>
       </w:r>
     </w:p>
     <w:p>
@@ -9490,7 +9265,7 @@
         <w:spacing w:before="360" w:after="360" w:line="360" w:lineRule="auto"/>
         <w:outlineLvl w:val="1"/>
       </w:pPr>
-      <w:bookmarkStart w:id="19" w:name="_Toc231042192"/>
+      <w:bookmarkStart w:id="19" w:name="_Toc231067184"/>
       <w:r>
         <w:rPr>
           <w:rFonts w:ascii="Times New Roman" w:hAnsi="Times New Roman" w:cs="Times New Roman"/>
@@ -9535,20 +9310,11 @@
       <w:r>
         <w:rPr>
           <w:rFonts w:ascii="Times New Roman" w:hAnsi="Times New Roman" w:cs="Times New Roman"/>
-          <w:b/>
           <w:sz w:val="24"/>
           <w:szCs w:val="24"/>
         </w:rPr>
         <w:lastRenderedPageBreak/>
-        <w:t>Figura 12</w:t>
-      </w:r>
-      <w:r>
-        <w:rPr>
-          <w:rFonts w:ascii="Times New Roman" w:hAnsi="Times New Roman" w:cs="Times New Roman"/>
-          <w:sz w:val="24"/>
-          <w:szCs w:val="24"/>
-        </w:rPr>
-        <w:t xml:space="preserve"> – Formulário de Evolução de Sessão</w:t>
+        <w:t>Figura 12 – Formulário de Evolução de Sessão</w:t>
       </w:r>
     </w:p>
     <w:p>
@@ -9601,24 +9367,14 @@
     <w:p>
       <w:pPr>
         <w:spacing w:after="240" w:line="240" w:lineRule="auto"/>
-        <w:jc w:val="center"/>
-      </w:pPr>
-      <w:r>
-        <w:rPr>
-          <w:rFonts w:ascii="Times New Roman" w:hAnsi="Times New Roman" w:cs="Times New Roman"/>
-          <w:b/>
+      </w:pPr>
+      <w:r>
+        <w:rPr>
+          <w:rFonts w:ascii="Times New Roman" w:hAnsi="Times New Roman" w:cs="Times New Roman"/>
           <w:sz w:val="20"/>
           <w:szCs w:val="20"/>
         </w:rPr>
-        <w:t xml:space="preserve">Fonte: </w:t>
-      </w:r>
-      <w:r>
-        <w:rPr>
-          <w:rFonts w:ascii="Times New Roman" w:hAnsi="Times New Roman" w:cs="Times New Roman"/>
-          <w:sz w:val="20"/>
-          <w:szCs w:val="20"/>
-        </w:rPr>
-        <w:t>o autor (2026).</w:t>
+        <w:t>Fonte: o autor (2026).</w:t>
       </w:r>
     </w:p>
     <w:p>
@@ -9627,7 +9383,7 @@
         <w:spacing w:before="360" w:after="360" w:line="360" w:lineRule="auto"/>
         <w:outlineLvl w:val="1"/>
       </w:pPr>
-      <w:bookmarkStart w:id="20" w:name="_Toc231042193"/>
+      <w:bookmarkStart w:id="20" w:name="_Toc231067185"/>
       <w:r>
         <w:rPr>
           <w:rFonts w:ascii="Times New Roman" w:hAnsi="Times New Roman" w:cs="Times New Roman"/>
@@ -9672,20 +9428,11 @@
       <w:r>
         <w:rPr>
           <w:rFonts w:ascii="Times New Roman" w:hAnsi="Times New Roman" w:cs="Times New Roman"/>
-          <w:b/>
           <w:sz w:val="24"/>
           <w:szCs w:val="24"/>
         </w:rPr>
         <w:lastRenderedPageBreak/>
-        <w:t>Figura 13</w:t>
-      </w:r>
-      <w:r>
-        <w:rPr>
-          <w:rFonts w:ascii="Times New Roman" w:hAnsi="Times New Roman" w:cs="Times New Roman"/>
-          <w:sz w:val="24"/>
-          <w:szCs w:val="24"/>
-        </w:rPr>
-        <w:t xml:space="preserve"> – Tela de Objetivos Terapêuticos</w:t>
+        <w:t>Figura 13 – Tela de Objetivos Terapêuticos</w:t>
       </w:r>
     </w:p>
     <w:p>
@@ -9738,24 +9485,14 @@
     <w:p>
       <w:pPr>
         <w:spacing w:after="240" w:line="240" w:lineRule="auto"/>
-        <w:jc w:val="center"/>
-      </w:pPr>
-      <w:r>
-        <w:rPr>
-          <w:rFonts w:ascii="Times New Roman" w:hAnsi="Times New Roman" w:cs="Times New Roman"/>
-          <w:b/>
+      </w:pPr>
+      <w:r>
+        <w:rPr>
+          <w:rFonts w:ascii="Times New Roman" w:hAnsi="Times New Roman" w:cs="Times New Roman"/>
           <w:sz w:val="20"/>
           <w:szCs w:val="20"/>
         </w:rPr>
-        <w:t xml:space="preserve">Fonte: </w:t>
-      </w:r>
-      <w:r>
-        <w:rPr>
-          <w:rFonts w:ascii="Times New Roman" w:hAnsi="Times New Roman" w:cs="Times New Roman"/>
-          <w:sz w:val="20"/>
-          <w:szCs w:val="20"/>
-        </w:rPr>
-        <w:t>o autor (2026).</w:t>
+        <w:t>Fonte: o autor (2026).</w:t>
       </w:r>
     </w:p>
     <w:p>
@@ -9764,7 +9501,7 @@
         <w:spacing w:before="360" w:after="360" w:line="360" w:lineRule="auto"/>
         <w:outlineLvl w:val="1"/>
       </w:pPr>
-      <w:bookmarkStart w:id="21" w:name="_Toc231042194"/>
+      <w:bookmarkStart w:id="21" w:name="_Toc231067186"/>
       <w:r>
         <w:rPr>
           <w:rFonts w:ascii="Times New Roman" w:hAnsi="Times New Roman" w:cs="Times New Roman"/>
@@ -9809,20 +9546,11 @@
       <w:r>
         <w:rPr>
           <w:rFonts w:ascii="Times New Roman" w:hAnsi="Times New Roman" w:cs="Times New Roman"/>
-          <w:b/>
           <w:sz w:val="24"/>
           <w:szCs w:val="24"/>
         </w:rPr>
         <w:lastRenderedPageBreak/>
-        <w:t>Figura 14</w:t>
-      </w:r>
-      <w:r>
-        <w:rPr>
-          <w:rFonts w:ascii="Times New Roman" w:hAnsi="Times New Roman" w:cs="Times New Roman"/>
-          <w:sz w:val="24"/>
-          <w:szCs w:val="24"/>
-        </w:rPr>
-        <w:t xml:space="preserve"> – Formulário de Objetivo Terapêutico</w:t>
+        <w:t>Figura 14 – Formulário de Objetivo Terapêutico</w:t>
       </w:r>
     </w:p>
     <w:p>
@@ -9875,24 +9603,14 @@
     <w:p>
       <w:pPr>
         <w:spacing w:after="240" w:line="240" w:lineRule="auto"/>
-        <w:jc w:val="center"/>
-      </w:pPr>
-      <w:r>
-        <w:rPr>
-          <w:rFonts w:ascii="Times New Roman" w:hAnsi="Times New Roman" w:cs="Times New Roman"/>
-          <w:b/>
+      </w:pPr>
+      <w:r>
+        <w:rPr>
+          <w:rFonts w:ascii="Times New Roman" w:hAnsi="Times New Roman" w:cs="Times New Roman"/>
           <w:sz w:val="20"/>
           <w:szCs w:val="20"/>
         </w:rPr>
-        <w:t xml:space="preserve">Fonte: </w:t>
-      </w:r>
-      <w:r>
-        <w:rPr>
-          <w:rFonts w:ascii="Times New Roman" w:hAnsi="Times New Roman" w:cs="Times New Roman"/>
-          <w:sz w:val="20"/>
-          <w:szCs w:val="20"/>
-        </w:rPr>
-        <w:t>o autor (2026).</w:t>
+        <w:t>Fonte: o autor (2026).</w:t>
       </w:r>
     </w:p>
     <w:p>
@@ -9901,7 +9619,7 @@
         <w:spacing w:before="360" w:after="360" w:line="360" w:lineRule="auto"/>
         <w:outlineLvl w:val="1"/>
       </w:pPr>
-      <w:bookmarkStart w:id="22" w:name="_Toc231042195"/>
+      <w:bookmarkStart w:id="22" w:name="_Toc231067187"/>
       <w:r>
         <w:rPr>
           <w:rFonts w:ascii="Times New Roman" w:hAnsi="Times New Roman" w:cs="Times New Roman"/>
@@ -9946,20 +9664,11 @@
       <w:r>
         <w:rPr>
           <w:rFonts w:ascii="Times New Roman" w:hAnsi="Times New Roman" w:cs="Times New Roman"/>
-          <w:b/>
           <w:sz w:val="24"/>
           <w:szCs w:val="24"/>
         </w:rPr>
         <w:lastRenderedPageBreak/>
-        <w:t>Figura 15</w:t>
-      </w:r>
-      <w:r>
-        <w:rPr>
-          <w:rFonts w:ascii="Times New Roman" w:hAnsi="Times New Roman" w:cs="Times New Roman"/>
-          <w:sz w:val="24"/>
-          <w:szCs w:val="24"/>
-        </w:rPr>
-        <w:t xml:space="preserve"> – Módulo de Relatórios</w:t>
+        <w:t>Figura 15 – Módulo de Relatórios</w:t>
       </w:r>
     </w:p>
     <w:p>
@@ -10012,24 +9721,14 @@
     <w:p>
       <w:pPr>
         <w:spacing w:after="240" w:line="240" w:lineRule="auto"/>
-        <w:jc w:val="center"/>
-      </w:pPr>
-      <w:r>
-        <w:rPr>
-          <w:rFonts w:ascii="Times New Roman" w:hAnsi="Times New Roman" w:cs="Times New Roman"/>
-          <w:b/>
+      </w:pPr>
+      <w:r>
+        <w:rPr>
+          <w:rFonts w:ascii="Times New Roman" w:hAnsi="Times New Roman" w:cs="Times New Roman"/>
           <w:sz w:val="20"/>
           <w:szCs w:val="20"/>
         </w:rPr>
-        <w:t xml:space="preserve">Fonte: </w:t>
-      </w:r>
-      <w:r>
-        <w:rPr>
-          <w:rFonts w:ascii="Times New Roman" w:hAnsi="Times New Roman" w:cs="Times New Roman"/>
-          <w:sz w:val="20"/>
-          <w:szCs w:val="20"/>
-        </w:rPr>
-        <w:t>o autor (2026).</w:t>
+        <w:t>Fonte: o autor (2026).</w:t>
       </w:r>
     </w:p>
     <w:p>
@@ -10038,7 +9737,7 @@
         <w:spacing w:before="360" w:after="360" w:line="360" w:lineRule="auto"/>
         <w:outlineLvl w:val="1"/>
       </w:pPr>
-      <w:bookmarkStart w:id="23" w:name="_Toc231042196"/>
+      <w:bookmarkStart w:id="23" w:name="_Toc231067188"/>
       <w:r>
         <w:rPr>
           <w:rFonts w:ascii="Times New Roman" w:hAnsi="Times New Roman" w:cs="Times New Roman"/>
@@ -10083,20 +9782,11 @@
       <w:r>
         <w:rPr>
           <w:rFonts w:ascii="Times New Roman" w:hAnsi="Times New Roman" w:cs="Times New Roman"/>
-          <w:b/>
           <w:sz w:val="24"/>
           <w:szCs w:val="24"/>
         </w:rPr>
         <w:lastRenderedPageBreak/>
-        <w:t>Figura 16</w:t>
-      </w:r>
-      <w:r>
-        <w:rPr>
-          <w:rFonts w:ascii="Times New Roman" w:hAnsi="Times New Roman" w:cs="Times New Roman"/>
-          <w:sz w:val="24"/>
-          <w:szCs w:val="24"/>
-        </w:rPr>
-        <w:t xml:space="preserve"> – Visualizador de Relatórios</w:t>
+        <w:t>Figura 16 – Visualizador de Relatórios</w:t>
       </w:r>
     </w:p>
     <w:p>
@@ -10149,24 +9839,14 @@
     <w:p>
       <w:pPr>
         <w:spacing w:after="240" w:line="240" w:lineRule="auto"/>
-        <w:jc w:val="center"/>
-      </w:pPr>
-      <w:r>
-        <w:rPr>
-          <w:rFonts w:ascii="Times New Roman" w:hAnsi="Times New Roman" w:cs="Times New Roman"/>
-          <w:b/>
+      </w:pPr>
+      <w:r>
+        <w:rPr>
+          <w:rFonts w:ascii="Times New Roman" w:hAnsi="Times New Roman" w:cs="Times New Roman"/>
           <w:sz w:val="20"/>
           <w:szCs w:val="20"/>
         </w:rPr>
-        <w:t xml:space="preserve">Fonte: </w:t>
-      </w:r>
-      <w:r>
-        <w:rPr>
-          <w:rFonts w:ascii="Times New Roman" w:hAnsi="Times New Roman" w:cs="Times New Roman"/>
-          <w:sz w:val="20"/>
-          <w:szCs w:val="20"/>
-        </w:rPr>
-        <w:t>o autor (2026).</w:t>
+        <w:t>Fonte: o autor (2026).</w:t>
       </w:r>
     </w:p>
     <w:p>
@@ -10176,7 +9856,7 @@
         <w:spacing w:before="360" w:after="360" w:line="360" w:lineRule="auto"/>
         <w:outlineLvl w:val="0"/>
       </w:pPr>
-      <w:bookmarkStart w:id="24" w:name="_Toc231042197"/>
+      <w:bookmarkStart w:id="24" w:name="_Toc231067189"/>
       <w:r>
         <w:rPr>
           <w:rFonts w:ascii="Times New Roman" w:hAnsi="Times New Roman" w:cs="Times New Roman"/>
@@ -10212,7 +9892,7 @@
         <w:jc w:val="center"/>
         <w:outlineLvl w:val="0"/>
       </w:pPr>
-      <w:bookmarkStart w:id="25" w:name="_Toc231042198"/>
+      <w:bookmarkStart w:id="25" w:name="_Toc231067190"/>
       <w:r>
         <w:rPr>
           <w:rFonts w:ascii="Times New Roman" w:hAnsi="Times New Roman" w:cs="Times New Roman"/>

</xml_diff>

<commit_message>
docs: envio da solucao - repositorio publico e Prof. Fernando Datorre
</commit_message>
<xml_diff>
--- a/SolucaoClinicaTEA/relatorio_final.docx
+++ b/SolucaoClinicaTEA/relatorio_final.docx
@@ -514,7 +514,7 @@
       <w:r>
         <w:fldChar w:fldCharType="separate"/>
       </w:r>
-      <w:hyperlink w:anchor="_Toc231067165" w:history="1">
+      <w:hyperlink w:anchor="_Toc231067560" w:history="1">
         <w:r>
           <w:rPr>
             <w:rStyle w:val="Hyperlink"/>
@@ -544,7 +544,7 @@
             <w:noProof/>
             <w:webHidden/>
           </w:rPr>
-          <w:instrText xml:space="preserve"> PAGEREF _Toc231067165 \h </w:instrText>
+          <w:instrText xml:space="preserve"> PAGEREF _Toc231067560 \h </w:instrText>
         </w:r>
         <w:r>
           <w:rPr>
@@ -589,7 +589,7 @@
           <w:lang w:eastAsia="pt-BR"/>
         </w:rPr>
       </w:pPr>
-      <w:hyperlink w:anchor="_Toc231067166" w:history="1">
+      <w:hyperlink w:anchor="_Toc231067561" w:history="1">
         <w:r>
           <w:rPr>
             <w:rStyle w:val="Hyperlink"/>
@@ -619,7 +619,7 @@
             <w:noProof/>
             <w:webHidden/>
           </w:rPr>
-          <w:instrText xml:space="preserve"> PAGEREF _Toc231067166 \h </w:instrText>
+          <w:instrText xml:space="preserve"> PAGEREF _Toc231067561 \h </w:instrText>
         </w:r>
         <w:r>
           <w:rPr>
@@ -664,7 +664,7 @@
           <w:lang w:eastAsia="pt-BR"/>
         </w:rPr>
       </w:pPr>
-      <w:hyperlink w:anchor="_Toc231067167" w:history="1">
+      <w:hyperlink w:anchor="_Toc231067562" w:history="1">
         <w:r>
           <w:rPr>
             <w:rStyle w:val="Hyperlink"/>
@@ -693,7 +693,7 @@
             <w:noProof/>
             <w:webHidden/>
           </w:rPr>
-          <w:instrText xml:space="preserve"> PAGEREF _Toc231067167 \h </w:instrText>
+          <w:instrText xml:space="preserve"> PAGEREF _Toc231067562 \h </w:instrText>
         </w:r>
         <w:r>
           <w:rPr>
@@ -738,7 +738,7 @@
           <w:lang w:eastAsia="pt-BR"/>
         </w:rPr>
       </w:pPr>
-      <w:hyperlink w:anchor="_Toc231067168" w:history="1">
+      <w:hyperlink w:anchor="_Toc231067563" w:history="1">
         <w:r>
           <w:rPr>
             <w:rStyle w:val="Hyperlink"/>
@@ -767,7 +767,7 @@
             <w:noProof/>
             <w:webHidden/>
           </w:rPr>
-          <w:instrText xml:space="preserve"> PAGEREF _Toc231067168 \h </w:instrText>
+          <w:instrText xml:space="preserve"> PAGEREF _Toc231067563 \h </w:instrText>
         </w:r>
         <w:r>
           <w:rPr>
@@ -812,7 +812,7 @@
           <w:lang w:eastAsia="pt-BR"/>
         </w:rPr>
       </w:pPr>
-      <w:hyperlink w:anchor="_Toc231067169" w:history="1">
+      <w:hyperlink w:anchor="_Toc231067564" w:history="1">
         <w:r>
           <w:rPr>
             <w:rStyle w:val="Hyperlink"/>
@@ -841,7 +841,7 @@
             <w:noProof/>
             <w:webHidden/>
           </w:rPr>
-          <w:instrText xml:space="preserve"> PAGEREF _Toc231067169 \h </w:instrText>
+          <w:instrText xml:space="preserve"> PAGEREF _Toc231067564 \h </w:instrText>
         </w:r>
         <w:r>
           <w:rPr>
@@ -886,7 +886,7 @@
           <w:lang w:eastAsia="pt-BR"/>
         </w:rPr>
       </w:pPr>
-      <w:hyperlink w:anchor="_Toc231067170" w:history="1">
+      <w:hyperlink w:anchor="_Toc231067565" w:history="1">
         <w:r>
           <w:rPr>
             <w:rStyle w:val="Hyperlink"/>
@@ -915,7 +915,7 @@
             <w:noProof/>
             <w:webHidden/>
           </w:rPr>
-          <w:instrText xml:space="preserve"> PAGEREF _Toc231067170 \h </w:instrText>
+          <w:instrText xml:space="preserve"> PAGEREF _Toc231067565 \h </w:instrText>
         </w:r>
         <w:r>
           <w:rPr>
@@ -960,7 +960,7 @@
           <w:lang w:eastAsia="pt-BR"/>
         </w:rPr>
       </w:pPr>
-      <w:hyperlink w:anchor="_Toc231067171" w:history="1">
+      <w:hyperlink w:anchor="_Toc231067566" w:history="1">
         <w:r>
           <w:rPr>
             <w:rStyle w:val="Hyperlink"/>
@@ -989,7 +989,7 @@
             <w:noProof/>
             <w:webHidden/>
           </w:rPr>
-          <w:instrText xml:space="preserve"> PAGEREF _Toc231067171 \h </w:instrText>
+          <w:instrText xml:space="preserve"> PAGEREF _Toc231067566 \h </w:instrText>
         </w:r>
         <w:r>
           <w:rPr>
@@ -1034,7 +1034,7 @@
           <w:lang w:eastAsia="pt-BR"/>
         </w:rPr>
       </w:pPr>
-      <w:hyperlink w:anchor="_Toc231067172" w:history="1">
+      <w:hyperlink w:anchor="_Toc231067567" w:history="1">
         <w:r>
           <w:rPr>
             <w:rStyle w:val="Hyperlink"/>
@@ -1064,7 +1064,7 @@
             <w:noProof/>
             <w:webHidden/>
           </w:rPr>
-          <w:instrText xml:space="preserve"> PAGEREF _Toc231067172 \h </w:instrText>
+          <w:instrText xml:space="preserve"> PAGEREF _Toc231067567 \h </w:instrText>
         </w:r>
         <w:r>
           <w:rPr>
@@ -1109,7 +1109,7 @@
           <w:lang w:eastAsia="pt-BR"/>
         </w:rPr>
       </w:pPr>
-      <w:hyperlink w:anchor="_Toc231067173" w:history="1">
+      <w:hyperlink w:anchor="_Toc231067568" w:history="1">
         <w:r>
           <w:rPr>
             <w:rStyle w:val="Hyperlink"/>
@@ -1138,7 +1138,7 @@
             <w:noProof/>
             <w:webHidden/>
           </w:rPr>
-          <w:instrText xml:space="preserve"> PAGEREF _Toc231067173 \h </w:instrText>
+          <w:instrText xml:space="preserve"> PAGEREF _Toc231067568 \h </w:instrText>
         </w:r>
         <w:r>
           <w:rPr>
@@ -1183,7 +1183,7 @@
           <w:lang w:eastAsia="pt-BR"/>
         </w:rPr>
       </w:pPr>
-      <w:hyperlink w:anchor="_Toc231067174" w:history="1">
+      <w:hyperlink w:anchor="_Toc231067569" w:history="1">
         <w:r>
           <w:rPr>
             <w:rStyle w:val="Hyperlink"/>
@@ -1212,7 +1212,7 @@
             <w:noProof/>
             <w:webHidden/>
           </w:rPr>
-          <w:instrText xml:space="preserve"> PAGEREF _Toc231067174 \h </w:instrText>
+          <w:instrText xml:space="preserve"> PAGEREF _Toc231067569 \h </w:instrText>
         </w:r>
         <w:r>
           <w:rPr>
@@ -1257,7 +1257,7 @@
           <w:lang w:eastAsia="pt-BR"/>
         </w:rPr>
       </w:pPr>
-      <w:hyperlink w:anchor="_Toc231067175" w:history="1">
+      <w:hyperlink w:anchor="_Toc231067570" w:history="1">
         <w:r>
           <w:rPr>
             <w:rStyle w:val="Hyperlink"/>
@@ -1286,7 +1286,7 @@
             <w:noProof/>
             <w:webHidden/>
           </w:rPr>
-          <w:instrText xml:space="preserve"> PAGEREF _Toc231067175 \h </w:instrText>
+          <w:instrText xml:space="preserve"> PAGEREF _Toc231067570 \h </w:instrText>
         </w:r>
         <w:r>
           <w:rPr>
@@ -1331,7 +1331,7 @@
           <w:lang w:eastAsia="pt-BR"/>
         </w:rPr>
       </w:pPr>
-      <w:hyperlink w:anchor="_Toc231067176" w:history="1">
+      <w:hyperlink w:anchor="_Toc231067571" w:history="1">
         <w:r>
           <w:rPr>
             <w:rStyle w:val="Hyperlink"/>
@@ -1360,7 +1360,7 @@
             <w:noProof/>
             <w:webHidden/>
           </w:rPr>
-          <w:instrText xml:space="preserve"> PAGEREF _Toc231067176 \h </w:instrText>
+          <w:instrText xml:space="preserve"> PAGEREF _Toc231067571 \h </w:instrText>
         </w:r>
         <w:r>
           <w:rPr>
@@ -1405,7 +1405,7 @@
           <w:lang w:eastAsia="pt-BR"/>
         </w:rPr>
       </w:pPr>
-      <w:hyperlink w:anchor="_Toc231067177" w:history="1">
+      <w:hyperlink w:anchor="_Toc231067572" w:history="1">
         <w:r>
           <w:rPr>
             <w:rStyle w:val="Hyperlink"/>
@@ -1434,7 +1434,7 @@
             <w:noProof/>
             <w:webHidden/>
           </w:rPr>
-          <w:instrText xml:space="preserve"> PAGEREF _Toc231067177 \h </w:instrText>
+          <w:instrText xml:space="preserve"> PAGEREF _Toc231067572 \h </w:instrText>
         </w:r>
         <w:r>
           <w:rPr>
@@ -1479,7 +1479,7 @@
           <w:lang w:eastAsia="pt-BR"/>
         </w:rPr>
       </w:pPr>
-      <w:hyperlink w:anchor="_Toc231067178" w:history="1">
+      <w:hyperlink w:anchor="_Toc231067573" w:history="1">
         <w:r>
           <w:rPr>
             <w:rStyle w:val="Hyperlink"/>
@@ -1508,7 +1508,7 @@
             <w:noProof/>
             <w:webHidden/>
           </w:rPr>
-          <w:instrText xml:space="preserve"> PAGEREF _Toc231067178 \h </w:instrText>
+          <w:instrText xml:space="preserve"> PAGEREF _Toc231067573 \h </w:instrText>
         </w:r>
         <w:r>
           <w:rPr>
@@ -1553,7 +1553,7 @@
           <w:lang w:eastAsia="pt-BR"/>
         </w:rPr>
       </w:pPr>
-      <w:hyperlink w:anchor="_Toc231067179" w:history="1">
+      <w:hyperlink w:anchor="_Toc231067574" w:history="1">
         <w:r>
           <w:rPr>
             <w:rStyle w:val="Hyperlink"/>
@@ -1582,7 +1582,7 @@
             <w:noProof/>
             <w:webHidden/>
           </w:rPr>
-          <w:instrText xml:space="preserve"> PAGEREF _Toc231067179 \h </w:instrText>
+          <w:instrText xml:space="preserve"> PAGEREF _Toc231067574 \h </w:instrText>
         </w:r>
         <w:r>
           <w:rPr>
@@ -1627,7 +1627,7 @@
           <w:lang w:eastAsia="pt-BR"/>
         </w:rPr>
       </w:pPr>
-      <w:hyperlink w:anchor="_Toc231067180" w:history="1">
+      <w:hyperlink w:anchor="_Toc231067575" w:history="1">
         <w:r>
           <w:rPr>
             <w:rStyle w:val="Hyperlink"/>
@@ -1656,7 +1656,7 @@
             <w:noProof/>
             <w:webHidden/>
           </w:rPr>
-          <w:instrText xml:space="preserve"> PAGEREF _Toc231067180 \h </w:instrText>
+          <w:instrText xml:space="preserve"> PAGEREF _Toc231067575 \h </w:instrText>
         </w:r>
         <w:r>
           <w:rPr>
@@ -1701,7 +1701,7 @@
           <w:lang w:eastAsia="pt-BR"/>
         </w:rPr>
       </w:pPr>
-      <w:hyperlink w:anchor="_Toc231067181" w:history="1">
+      <w:hyperlink w:anchor="_Toc231067576" w:history="1">
         <w:r>
           <w:rPr>
             <w:rStyle w:val="Hyperlink"/>
@@ -1730,7 +1730,7 @@
             <w:noProof/>
             <w:webHidden/>
           </w:rPr>
-          <w:instrText xml:space="preserve"> PAGEREF _Toc231067181 \h </w:instrText>
+          <w:instrText xml:space="preserve"> PAGEREF _Toc231067576 \h </w:instrText>
         </w:r>
         <w:r>
           <w:rPr>
@@ -1775,7 +1775,7 @@
           <w:lang w:eastAsia="pt-BR"/>
         </w:rPr>
       </w:pPr>
-      <w:hyperlink w:anchor="_Toc231067182" w:history="1">
+      <w:hyperlink w:anchor="_Toc231067577" w:history="1">
         <w:r>
           <w:rPr>
             <w:rStyle w:val="Hyperlink"/>
@@ -1804,7 +1804,7 @@
             <w:noProof/>
             <w:webHidden/>
           </w:rPr>
-          <w:instrText xml:space="preserve"> PAGEREF _Toc231067182 \h </w:instrText>
+          <w:instrText xml:space="preserve"> PAGEREF _Toc231067577 \h </w:instrText>
         </w:r>
         <w:r>
           <w:rPr>
@@ -1849,7 +1849,7 @@
           <w:lang w:eastAsia="pt-BR"/>
         </w:rPr>
       </w:pPr>
-      <w:hyperlink w:anchor="_Toc231067183" w:history="1">
+      <w:hyperlink w:anchor="_Toc231067578" w:history="1">
         <w:r>
           <w:rPr>
             <w:rStyle w:val="Hyperlink"/>
@@ -1878,7 +1878,7 @@
             <w:noProof/>
             <w:webHidden/>
           </w:rPr>
-          <w:instrText xml:space="preserve"> PAGEREF _Toc231067183 \h </w:instrText>
+          <w:instrText xml:space="preserve"> PAGEREF _Toc231067578 \h </w:instrText>
         </w:r>
         <w:r>
           <w:rPr>
@@ -1923,7 +1923,7 @@
           <w:lang w:eastAsia="pt-BR"/>
         </w:rPr>
       </w:pPr>
-      <w:hyperlink w:anchor="_Toc231067184" w:history="1">
+      <w:hyperlink w:anchor="_Toc231067579" w:history="1">
         <w:r>
           <w:rPr>
             <w:rStyle w:val="Hyperlink"/>
@@ -1952,7 +1952,7 @@
             <w:noProof/>
             <w:webHidden/>
           </w:rPr>
-          <w:instrText xml:space="preserve"> PAGEREF _Toc231067184 \h </w:instrText>
+          <w:instrText xml:space="preserve"> PAGEREF _Toc231067579 \h </w:instrText>
         </w:r>
         <w:r>
           <w:rPr>
@@ -1997,7 +1997,7 @@
           <w:lang w:eastAsia="pt-BR"/>
         </w:rPr>
       </w:pPr>
-      <w:hyperlink w:anchor="_Toc231067185" w:history="1">
+      <w:hyperlink w:anchor="_Toc231067580" w:history="1">
         <w:r>
           <w:rPr>
             <w:rStyle w:val="Hyperlink"/>
@@ -2026,7 +2026,7 @@
             <w:noProof/>
             <w:webHidden/>
           </w:rPr>
-          <w:instrText xml:space="preserve"> PAGEREF _Toc231067185 \h </w:instrText>
+          <w:instrText xml:space="preserve"> PAGEREF _Toc231067580 \h </w:instrText>
         </w:r>
         <w:r>
           <w:rPr>
@@ -2071,7 +2071,7 @@
           <w:lang w:eastAsia="pt-BR"/>
         </w:rPr>
       </w:pPr>
-      <w:hyperlink w:anchor="_Toc231067186" w:history="1">
+      <w:hyperlink w:anchor="_Toc231067581" w:history="1">
         <w:r>
           <w:rPr>
             <w:rStyle w:val="Hyperlink"/>
@@ -2100,7 +2100,7 @@
             <w:noProof/>
             <w:webHidden/>
           </w:rPr>
-          <w:instrText xml:space="preserve"> PAGEREF _Toc231067186 \h </w:instrText>
+          <w:instrText xml:space="preserve"> PAGEREF _Toc231067581 \h </w:instrText>
         </w:r>
         <w:r>
           <w:rPr>
@@ -2145,7 +2145,7 @@
           <w:lang w:eastAsia="pt-BR"/>
         </w:rPr>
       </w:pPr>
-      <w:hyperlink w:anchor="_Toc231067187" w:history="1">
+      <w:hyperlink w:anchor="_Toc231067582" w:history="1">
         <w:r>
           <w:rPr>
             <w:rStyle w:val="Hyperlink"/>
@@ -2174,7 +2174,7 @@
             <w:noProof/>
             <w:webHidden/>
           </w:rPr>
-          <w:instrText xml:space="preserve"> PAGEREF _Toc231067187 \h </w:instrText>
+          <w:instrText xml:space="preserve"> PAGEREF _Toc231067582 \h </w:instrText>
         </w:r>
         <w:r>
           <w:rPr>
@@ -2219,7 +2219,7 @@
           <w:lang w:eastAsia="pt-BR"/>
         </w:rPr>
       </w:pPr>
-      <w:hyperlink w:anchor="_Toc231067188" w:history="1">
+      <w:hyperlink w:anchor="_Toc231067583" w:history="1">
         <w:r>
           <w:rPr>
             <w:rStyle w:val="Hyperlink"/>
@@ -2248,7 +2248,7 @@
             <w:noProof/>
             <w:webHidden/>
           </w:rPr>
-          <w:instrText xml:space="preserve"> PAGEREF _Toc231067188 \h </w:instrText>
+          <w:instrText xml:space="preserve"> PAGEREF _Toc231067583 \h </w:instrText>
         </w:r>
         <w:r>
           <w:rPr>
@@ -2293,7 +2293,7 @@
           <w:lang w:eastAsia="pt-BR"/>
         </w:rPr>
       </w:pPr>
-      <w:hyperlink w:anchor="_Toc231067189" w:history="1">
+      <w:hyperlink w:anchor="_Toc231067584" w:history="1">
         <w:r>
           <w:rPr>
             <w:rStyle w:val="Hyperlink"/>
@@ -2323,7 +2323,7 @@
             <w:noProof/>
             <w:webHidden/>
           </w:rPr>
-          <w:instrText xml:space="preserve"> PAGEREF _Toc231067189 \h </w:instrText>
+          <w:instrText xml:space="preserve"> PAGEREF _Toc231067584 \h </w:instrText>
         </w:r>
         <w:r>
           <w:rPr>
@@ -2368,7 +2368,7 @@
           <w:lang w:eastAsia="pt-BR"/>
         </w:rPr>
       </w:pPr>
-      <w:hyperlink w:anchor="_Toc231067190" w:history="1">
+      <w:hyperlink w:anchor="_Toc231067585" w:history="1">
         <w:r>
           <w:rPr>
             <w:rStyle w:val="Hyperlink"/>
@@ -2398,7 +2398,7 @@
             <w:noProof/>
             <w:webHidden/>
           </w:rPr>
-          <w:instrText xml:space="preserve"> PAGEREF _Toc231067190 \h </w:instrText>
+          <w:instrText xml:space="preserve"> PAGEREF _Toc231067585 \h </w:instrText>
         </w:r>
         <w:r>
           <w:rPr>
@@ -2450,7 +2450,7 @@
         <w:spacing w:before="360" w:after="360" w:line="360" w:lineRule="auto"/>
         <w:outlineLvl w:val="0"/>
       </w:pPr>
-      <w:bookmarkStart w:id="0" w:name="_Toc231067165"/>
+      <w:bookmarkStart w:id="0" w:name="_Toc231067560"/>
       <w:r>
         <w:rPr>
           <w:rFonts w:ascii="Times New Roman" w:hAnsi="Times New Roman" w:cs="Times New Roman"/>
@@ -2548,7 +2548,7 @@
         <w:spacing w:before="360" w:after="360" w:line="360" w:lineRule="auto"/>
         <w:outlineLvl w:val="0"/>
       </w:pPr>
-      <w:bookmarkStart w:id="1" w:name="_Toc231067166"/>
+      <w:bookmarkStart w:id="1" w:name="_Toc231067561"/>
       <w:r>
         <w:rPr>
           <w:rFonts w:ascii="Times New Roman" w:hAnsi="Times New Roman" w:cs="Times New Roman"/>
@@ -2568,7 +2568,7 @@
         <w:spacing w:before="360" w:after="360" w:line="360" w:lineRule="auto"/>
         <w:outlineLvl w:val="1"/>
       </w:pPr>
-      <w:bookmarkStart w:id="2" w:name="_Toc231067167"/>
+      <w:bookmarkStart w:id="2" w:name="_Toc231067562"/>
       <w:r>
         <w:rPr>
           <w:rFonts w:ascii="Times New Roman" w:hAnsi="Times New Roman" w:cs="Times New Roman"/>
@@ -3708,7 +3708,7 @@
         <w:spacing w:before="360" w:after="360" w:line="360" w:lineRule="auto"/>
         <w:outlineLvl w:val="1"/>
       </w:pPr>
-      <w:bookmarkStart w:id="3" w:name="_Toc231067168"/>
+      <w:bookmarkStart w:id="3" w:name="_Toc231067563"/>
       <w:r>
         <w:rPr>
           <w:rFonts w:ascii="Times New Roman" w:hAnsi="Times New Roman" w:cs="Times New Roman"/>
@@ -3840,7 +3840,7 @@
         <w:spacing w:before="360" w:after="360" w:line="360" w:lineRule="auto"/>
         <w:outlineLvl w:val="1"/>
       </w:pPr>
-      <w:bookmarkStart w:id="4" w:name="_Toc231067169"/>
+      <w:bookmarkStart w:id="4" w:name="_Toc231067564"/>
       <w:r>
         <w:rPr>
           <w:rFonts w:ascii="Times New Roman" w:hAnsi="Times New Roman" w:cs="Times New Roman"/>
@@ -7598,7 +7598,7 @@
         <w:spacing w:before="360" w:after="360" w:line="360" w:lineRule="auto"/>
         <w:outlineLvl w:val="1"/>
       </w:pPr>
-      <w:bookmarkStart w:id="5" w:name="_Toc231067170"/>
+      <w:bookmarkStart w:id="5" w:name="_Toc231067565"/>
       <w:r>
         <w:rPr>
           <w:rFonts w:ascii="Times New Roman" w:hAnsi="Times New Roman" w:cs="Times New Roman"/>
@@ -7769,7 +7769,7 @@
         <w:spacing w:before="360" w:after="360" w:line="360" w:lineRule="auto"/>
         <w:outlineLvl w:val="1"/>
       </w:pPr>
-      <w:bookmarkStart w:id="6" w:name="_Toc231067171"/>
+      <w:bookmarkStart w:id="6" w:name="_Toc231067566"/>
       <w:r>
         <w:rPr>
           <w:rFonts w:ascii="Times New Roman" w:hAnsi="Times New Roman" w:cs="Times New Roman"/>
@@ -7932,7 +7932,7 @@
         <w:spacing w:before="360" w:after="360" w:line="360" w:lineRule="auto"/>
         <w:outlineLvl w:val="0"/>
       </w:pPr>
-      <w:bookmarkStart w:id="7" w:name="_Toc231067172"/>
+      <w:bookmarkStart w:id="7" w:name="_Toc231067567"/>
       <w:r>
         <w:rPr>
           <w:rFonts w:ascii="Times New Roman" w:hAnsi="Times New Roman" w:cs="Times New Roman"/>
@@ -7967,7 +7967,7 @@
         <w:spacing w:before="360" w:after="360" w:line="360" w:lineRule="auto"/>
         <w:outlineLvl w:val="1"/>
       </w:pPr>
-      <w:bookmarkStart w:id="8" w:name="_Toc231067173"/>
+      <w:bookmarkStart w:id="8" w:name="_Toc231067568"/>
       <w:r>
         <w:rPr>
           <w:rFonts w:ascii="Times New Roman" w:hAnsi="Times New Roman" w:cs="Times New Roman"/>
@@ -8085,7 +8085,7 @@
         <w:spacing w:before="360" w:after="360" w:line="360" w:lineRule="auto"/>
         <w:outlineLvl w:val="1"/>
       </w:pPr>
-      <w:bookmarkStart w:id="9" w:name="_Toc231067174"/>
+      <w:bookmarkStart w:id="9" w:name="_Toc231067569"/>
       <w:r>
         <w:rPr>
           <w:rFonts w:ascii="Times New Roman" w:hAnsi="Times New Roman" w:cs="Times New Roman"/>
@@ -8203,7 +8203,7 @@
         <w:spacing w:before="360" w:after="360" w:line="360" w:lineRule="auto"/>
         <w:outlineLvl w:val="1"/>
       </w:pPr>
-      <w:bookmarkStart w:id="10" w:name="_Toc231067175"/>
+      <w:bookmarkStart w:id="10" w:name="_Toc231067570"/>
       <w:r>
         <w:rPr>
           <w:rFonts w:ascii="Times New Roman" w:hAnsi="Times New Roman" w:cs="Times New Roman"/>
@@ -8321,7 +8321,7 @@
         <w:spacing w:before="360" w:after="360" w:line="360" w:lineRule="auto"/>
         <w:outlineLvl w:val="1"/>
       </w:pPr>
-      <w:bookmarkStart w:id="11" w:name="_Toc231067176"/>
+      <w:bookmarkStart w:id="11" w:name="_Toc231067571"/>
       <w:r>
         <w:rPr>
           <w:rFonts w:ascii="Times New Roman" w:hAnsi="Times New Roman" w:cs="Times New Roman"/>
@@ -8439,7 +8439,7 @@
         <w:spacing w:before="360" w:after="360" w:line="360" w:lineRule="auto"/>
         <w:outlineLvl w:val="1"/>
       </w:pPr>
-      <w:bookmarkStart w:id="12" w:name="_Toc231067177"/>
+      <w:bookmarkStart w:id="12" w:name="_Toc231067572"/>
       <w:r>
         <w:rPr>
           <w:rFonts w:ascii="Times New Roman" w:hAnsi="Times New Roman" w:cs="Times New Roman"/>
@@ -8557,7 +8557,7 @@
         <w:spacing w:before="360" w:after="360" w:line="360" w:lineRule="auto"/>
         <w:outlineLvl w:val="1"/>
       </w:pPr>
-      <w:bookmarkStart w:id="13" w:name="_Toc231067178"/>
+      <w:bookmarkStart w:id="13" w:name="_Toc231067573"/>
       <w:r>
         <w:rPr>
           <w:rFonts w:ascii="Times New Roman" w:hAnsi="Times New Roman" w:cs="Times New Roman"/>
@@ -8675,7 +8675,7 @@
         <w:spacing w:before="360" w:after="360" w:line="360" w:lineRule="auto"/>
         <w:outlineLvl w:val="1"/>
       </w:pPr>
-      <w:bookmarkStart w:id="14" w:name="_Toc231067179"/>
+      <w:bookmarkStart w:id="14" w:name="_Toc231067574"/>
       <w:r>
         <w:rPr>
           <w:rFonts w:ascii="Times New Roman" w:hAnsi="Times New Roman" w:cs="Times New Roman"/>
@@ -8793,7 +8793,7 @@
         <w:spacing w:before="360" w:after="360" w:line="360" w:lineRule="auto"/>
         <w:outlineLvl w:val="1"/>
       </w:pPr>
-      <w:bookmarkStart w:id="15" w:name="_Toc231067180"/>
+      <w:bookmarkStart w:id="15" w:name="_Toc231067575"/>
       <w:r>
         <w:rPr>
           <w:rFonts w:ascii="Times New Roman" w:hAnsi="Times New Roman" w:cs="Times New Roman"/>
@@ -8911,7 +8911,7 @@
         <w:spacing w:before="360" w:after="360" w:line="360" w:lineRule="auto"/>
         <w:outlineLvl w:val="1"/>
       </w:pPr>
-      <w:bookmarkStart w:id="16" w:name="_Toc231067181"/>
+      <w:bookmarkStart w:id="16" w:name="_Toc231067576"/>
       <w:r>
         <w:rPr>
           <w:rFonts w:ascii="Times New Roman" w:hAnsi="Times New Roman" w:cs="Times New Roman"/>
@@ -9029,7 +9029,7 @@
         <w:spacing w:before="360" w:after="360" w:line="360" w:lineRule="auto"/>
         <w:outlineLvl w:val="1"/>
       </w:pPr>
-      <w:bookmarkStart w:id="17" w:name="_Toc231067182"/>
+      <w:bookmarkStart w:id="17" w:name="_Toc231067577"/>
       <w:r>
         <w:rPr>
           <w:rFonts w:ascii="Times New Roman" w:hAnsi="Times New Roman" w:cs="Times New Roman"/>
@@ -9147,7 +9147,7 @@
         <w:spacing w:before="360" w:after="360" w:line="360" w:lineRule="auto"/>
         <w:outlineLvl w:val="1"/>
       </w:pPr>
-      <w:bookmarkStart w:id="18" w:name="_Toc231067183"/>
+      <w:bookmarkStart w:id="18" w:name="_Toc231067578"/>
       <w:r>
         <w:rPr>
           <w:rFonts w:ascii="Times New Roman" w:hAnsi="Times New Roman" w:cs="Times New Roman"/>
@@ -9265,7 +9265,7 @@
         <w:spacing w:before="360" w:after="360" w:line="360" w:lineRule="auto"/>
         <w:outlineLvl w:val="1"/>
       </w:pPr>
-      <w:bookmarkStart w:id="19" w:name="_Toc231067184"/>
+      <w:bookmarkStart w:id="19" w:name="_Toc231067579"/>
       <w:r>
         <w:rPr>
           <w:rFonts w:ascii="Times New Roman" w:hAnsi="Times New Roman" w:cs="Times New Roman"/>
@@ -9383,7 +9383,7 @@
         <w:spacing w:before="360" w:after="360" w:line="360" w:lineRule="auto"/>
         <w:outlineLvl w:val="1"/>
       </w:pPr>
-      <w:bookmarkStart w:id="20" w:name="_Toc231067185"/>
+      <w:bookmarkStart w:id="20" w:name="_Toc231067580"/>
       <w:r>
         <w:rPr>
           <w:rFonts w:ascii="Times New Roman" w:hAnsi="Times New Roman" w:cs="Times New Roman"/>
@@ -9501,7 +9501,7 @@
         <w:spacing w:before="360" w:after="360" w:line="360" w:lineRule="auto"/>
         <w:outlineLvl w:val="1"/>
       </w:pPr>
-      <w:bookmarkStart w:id="21" w:name="_Toc231067186"/>
+      <w:bookmarkStart w:id="21" w:name="_Toc231067581"/>
       <w:r>
         <w:rPr>
           <w:rFonts w:ascii="Times New Roman" w:hAnsi="Times New Roman" w:cs="Times New Roman"/>
@@ -9619,7 +9619,7 @@
         <w:spacing w:before="360" w:after="360" w:line="360" w:lineRule="auto"/>
         <w:outlineLvl w:val="1"/>
       </w:pPr>
-      <w:bookmarkStart w:id="22" w:name="_Toc231067187"/>
+      <w:bookmarkStart w:id="22" w:name="_Toc231067582"/>
       <w:r>
         <w:rPr>
           <w:rFonts w:ascii="Times New Roman" w:hAnsi="Times New Roman" w:cs="Times New Roman"/>
@@ -9737,7 +9737,7 @@
         <w:spacing w:before="360" w:after="360" w:line="360" w:lineRule="auto"/>
         <w:outlineLvl w:val="1"/>
       </w:pPr>
-      <w:bookmarkStart w:id="23" w:name="_Toc231067188"/>
+      <w:bookmarkStart w:id="23" w:name="_Toc231067583"/>
       <w:r>
         <w:rPr>
           <w:rFonts w:ascii="Times New Roman" w:hAnsi="Times New Roman" w:cs="Times New Roman"/>
@@ -9856,7 +9856,7 @@
         <w:spacing w:before="360" w:after="360" w:line="360" w:lineRule="auto"/>
         <w:outlineLvl w:val="0"/>
       </w:pPr>
-      <w:bookmarkStart w:id="24" w:name="_Toc231067189"/>
+      <w:bookmarkStart w:id="24" w:name="_Toc231067584"/>
       <w:r>
         <w:rPr>
           <w:rFonts w:ascii="Times New Roman" w:hAnsi="Times New Roman" w:cs="Times New Roman"/>
@@ -9882,7 +9882,7 @@
           <w:sz w:val="24"/>
           <w:szCs w:val="24"/>
         </w:rPr>
-        <w:t>O código-fonte completo deste projeto, incluindo os scripts SQL de criação do schema, os binários necessários para compilação e este documento, está disponível em repositório público no GitHub, no endereço https://github.com/JVissani/SolucaoClinicaTEA. O repositório foi compartilhado com o e-mail datorre@gmail.com e está organizado nos diretórios de código-fonte (CT_Negocio e CT_Win), scripts de banco de dados, o relatório final e o arquivo README com instruções de compilação e configuração do ambiente.</w:t>
+        <w:t>O código-fonte completo deste projeto, incluindo os scripts SQL de criação do schema, os binários necessários para compilação e este documento, está disponível em repositório público no GitHub, no endereço https://github.com/JVissani/SolucaoClinicaTEA. O repositório está configurado como público e o acesso foi compartilhado com o Prof. Fernando Datorre, pelo e-mail datorre@gmail.com. O projeto está organizado nos diretórios de código-fonte (CT_Negocio e CT_Win), scripts de banco de dados, o relatório final e o arquivo README com instruções de compilação e configuração do ambiente.</w:t>
       </w:r>
     </w:p>
     <w:p>
@@ -9892,7 +9892,7 @@
         <w:jc w:val="center"/>
         <w:outlineLvl w:val="0"/>
       </w:pPr>
-      <w:bookmarkStart w:id="25" w:name="_Toc231067190"/>
+      <w:bookmarkStart w:id="25" w:name="_Toc231067585"/>
       <w:r>
         <w:rPr>
           <w:rFonts w:ascii="Times New Roman" w:hAnsi="Times New Roman" w:cs="Times New Roman"/>

</xml_diff>

<commit_message>
docs: remove link da capa e ajusta Envio (publico, sem mencao ao professor)
</commit_message>
<xml_diff>
--- a/SolucaoClinicaTEA/relatorio_final.docx
+++ b/SolucaoClinicaTEA/relatorio_final.docx
@@ -65,22 +65,6 @@
     <w:p>
       <w:pPr>
         <w:spacing w:after="0" w:line="360" w:lineRule="auto"/>
-        <w:jc w:val="center"/>
-      </w:pPr>
-      <w:hyperlink r:id="rId7" w:history="1">
-        <w:r>
-          <w:rPr>
-            <w:rFonts w:ascii="Times New Roman" w:hAnsi="Times New Roman" w:cs="Times New Roman"/>
-            <w:color w:val="0563C1"/>
-            <w:u w:val="single"/>
-          </w:rPr>
-          <w:t>https://github.com/JVissani/SolucaoClinicaTEA</w:t>
-        </w:r>
-      </w:hyperlink>
-    </w:p>
-    <w:p>
-      <w:pPr>
-        <w:spacing w:after="0" w:line="360" w:lineRule="auto"/>
       </w:pPr>
     </w:p>
     <w:p>
@@ -514,7 +498,7 @@
       <w:r>
         <w:fldChar w:fldCharType="separate"/>
       </w:r>
-      <w:hyperlink w:anchor="_Toc231067560" w:history="1">
+      <w:hyperlink w:anchor="_Toc231067767" w:history="1">
         <w:r>
           <w:rPr>
             <w:rStyle w:val="Hyperlink"/>
@@ -544,7 +528,7 @@
             <w:noProof/>
             <w:webHidden/>
           </w:rPr>
-          <w:instrText xml:space="preserve"> PAGEREF _Toc231067560 \h </w:instrText>
+          <w:instrText xml:space="preserve"> PAGEREF _Toc231067767 \h </w:instrText>
         </w:r>
         <w:r>
           <w:rPr>
@@ -589,7 +573,7 @@
           <w:lang w:eastAsia="pt-BR"/>
         </w:rPr>
       </w:pPr>
-      <w:hyperlink w:anchor="_Toc231067561" w:history="1">
+      <w:hyperlink w:anchor="_Toc231067768" w:history="1">
         <w:r>
           <w:rPr>
             <w:rStyle w:val="Hyperlink"/>
@@ -619,7 +603,7 @@
             <w:noProof/>
             <w:webHidden/>
           </w:rPr>
-          <w:instrText xml:space="preserve"> PAGEREF _Toc231067561 \h </w:instrText>
+          <w:instrText xml:space="preserve"> PAGEREF _Toc231067768 \h </w:instrText>
         </w:r>
         <w:r>
           <w:rPr>
@@ -664,7 +648,7 @@
           <w:lang w:eastAsia="pt-BR"/>
         </w:rPr>
       </w:pPr>
-      <w:hyperlink w:anchor="_Toc231067562" w:history="1">
+      <w:hyperlink w:anchor="_Toc231067769" w:history="1">
         <w:r>
           <w:rPr>
             <w:rStyle w:val="Hyperlink"/>
@@ -693,7 +677,7 @@
             <w:noProof/>
             <w:webHidden/>
           </w:rPr>
-          <w:instrText xml:space="preserve"> PAGEREF _Toc231067562 \h </w:instrText>
+          <w:instrText xml:space="preserve"> PAGEREF _Toc231067769 \h </w:instrText>
         </w:r>
         <w:r>
           <w:rPr>
@@ -738,7 +722,7 @@
           <w:lang w:eastAsia="pt-BR"/>
         </w:rPr>
       </w:pPr>
-      <w:hyperlink w:anchor="_Toc231067563" w:history="1">
+      <w:hyperlink w:anchor="_Toc231067770" w:history="1">
         <w:r>
           <w:rPr>
             <w:rStyle w:val="Hyperlink"/>
@@ -767,7 +751,7 @@
             <w:noProof/>
             <w:webHidden/>
           </w:rPr>
-          <w:instrText xml:space="preserve"> PAGEREF _Toc231067563 \h </w:instrText>
+          <w:instrText xml:space="preserve"> PAGEREF _Toc231067770 \h </w:instrText>
         </w:r>
         <w:r>
           <w:rPr>
@@ -812,7 +796,7 @@
           <w:lang w:eastAsia="pt-BR"/>
         </w:rPr>
       </w:pPr>
-      <w:hyperlink w:anchor="_Toc231067564" w:history="1">
+      <w:hyperlink w:anchor="_Toc231067771" w:history="1">
         <w:r>
           <w:rPr>
             <w:rStyle w:val="Hyperlink"/>
@@ -841,7 +825,7 @@
             <w:noProof/>
             <w:webHidden/>
           </w:rPr>
-          <w:instrText xml:space="preserve"> PAGEREF _Toc231067564 \h </w:instrText>
+          <w:instrText xml:space="preserve"> PAGEREF _Toc231067771 \h </w:instrText>
         </w:r>
         <w:r>
           <w:rPr>
@@ -886,7 +870,7 @@
           <w:lang w:eastAsia="pt-BR"/>
         </w:rPr>
       </w:pPr>
-      <w:hyperlink w:anchor="_Toc231067565" w:history="1">
+      <w:hyperlink w:anchor="_Toc231067772" w:history="1">
         <w:r>
           <w:rPr>
             <w:rStyle w:val="Hyperlink"/>
@@ -915,7 +899,7 @@
             <w:noProof/>
             <w:webHidden/>
           </w:rPr>
-          <w:instrText xml:space="preserve"> PAGEREF _Toc231067565 \h </w:instrText>
+          <w:instrText xml:space="preserve"> PAGEREF _Toc231067772 \h </w:instrText>
         </w:r>
         <w:r>
           <w:rPr>
@@ -960,7 +944,7 @@
           <w:lang w:eastAsia="pt-BR"/>
         </w:rPr>
       </w:pPr>
-      <w:hyperlink w:anchor="_Toc231067566" w:history="1">
+      <w:hyperlink w:anchor="_Toc231067773" w:history="1">
         <w:r>
           <w:rPr>
             <w:rStyle w:val="Hyperlink"/>
@@ -989,7 +973,7 @@
             <w:noProof/>
             <w:webHidden/>
           </w:rPr>
-          <w:instrText xml:space="preserve"> PAGEREF _Toc231067566 \h </w:instrText>
+          <w:instrText xml:space="preserve"> PAGEREF _Toc231067773 \h </w:instrText>
         </w:r>
         <w:r>
           <w:rPr>
@@ -1034,7 +1018,7 @@
           <w:lang w:eastAsia="pt-BR"/>
         </w:rPr>
       </w:pPr>
-      <w:hyperlink w:anchor="_Toc231067567" w:history="1">
+      <w:hyperlink w:anchor="_Toc231067774" w:history="1">
         <w:r>
           <w:rPr>
             <w:rStyle w:val="Hyperlink"/>
@@ -1064,7 +1048,7 @@
             <w:noProof/>
             <w:webHidden/>
           </w:rPr>
-          <w:instrText xml:space="preserve"> PAGEREF _Toc231067567 \h </w:instrText>
+          <w:instrText xml:space="preserve"> PAGEREF _Toc231067774 \h </w:instrText>
         </w:r>
         <w:r>
           <w:rPr>
@@ -1109,7 +1093,7 @@
           <w:lang w:eastAsia="pt-BR"/>
         </w:rPr>
       </w:pPr>
-      <w:hyperlink w:anchor="_Toc231067568" w:history="1">
+      <w:hyperlink w:anchor="_Toc231067775" w:history="1">
         <w:r>
           <w:rPr>
             <w:rStyle w:val="Hyperlink"/>
@@ -1138,7 +1122,7 @@
             <w:noProof/>
             <w:webHidden/>
           </w:rPr>
-          <w:instrText xml:space="preserve"> PAGEREF _Toc231067568 \h </w:instrText>
+          <w:instrText xml:space="preserve"> PAGEREF _Toc231067775 \h </w:instrText>
         </w:r>
         <w:r>
           <w:rPr>
@@ -1183,7 +1167,7 @@
           <w:lang w:eastAsia="pt-BR"/>
         </w:rPr>
       </w:pPr>
-      <w:hyperlink w:anchor="_Toc231067569" w:history="1">
+      <w:hyperlink w:anchor="_Toc231067776" w:history="1">
         <w:r>
           <w:rPr>
             <w:rStyle w:val="Hyperlink"/>
@@ -1212,7 +1196,7 @@
             <w:noProof/>
             <w:webHidden/>
           </w:rPr>
-          <w:instrText xml:space="preserve"> PAGEREF _Toc231067569 \h </w:instrText>
+          <w:instrText xml:space="preserve"> PAGEREF _Toc231067776 \h </w:instrText>
         </w:r>
         <w:r>
           <w:rPr>
@@ -1257,7 +1241,7 @@
           <w:lang w:eastAsia="pt-BR"/>
         </w:rPr>
       </w:pPr>
-      <w:hyperlink w:anchor="_Toc231067570" w:history="1">
+      <w:hyperlink w:anchor="_Toc231067777" w:history="1">
         <w:r>
           <w:rPr>
             <w:rStyle w:val="Hyperlink"/>
@@ -1286,7 +1270,7 @@
             <w:noProof/>
             <w:webHidden/>
           </w:rPr>
-          <w:instrText xml:space="preserve"> PAGEREF _Toc231067570 \h </w:instrText>
+          <w:instrText xml:space="preserve"> PAGEREF _Toc231067777 \h </w:instrText>
         </w:r>
         <w:r>
           <w:rPr>
@@ -1331,7 +1315,7 @@
           <w:lang w:eastAsia="pt-BR"/>
         </w:rPr>
       </w:pPr>
-      <w:hyperlink w:anchor="_Toc231067571" w:history="1">
+      <w:hyperlink w:anchor="_Toc231067778" w:history="1">
         <w:r>
           <w:rPr>
             <w:rStyle w:val="Hyperlink"/>
@@ -1360,7 +1344,7 @@
             <w:noProof/>
             <w:webHidden/>
           </w:rPr>
-          <w:instrText xml:space="preserve"> PAGEREF _Toc231067571 \h </w:instrText>
+          <w:instrText xml:space="preserve"> PAGEREF _Toc231067778 \h </w:instrText>
         </w:r>
         <w:r>
           <w:rPr>
@@ -1405,7 +1389,7 @@
           <w:lang w:eastAsia="pt-BR"/>
         </w:rPr>
       </w:pPr>
-      <w:hyperlink w:anchor="_Toc231067572" w:history="1">
+      <w:hyperlink w:anchor="_Toc231067779" w:history="1">
         <w:r>
           <w:rPr>
             <w:rStyle w:val="Hyperlink"/>
@@ -1434,7 +1418,7 @@
             <w:noProof/>
             <w:webHidden/>
           </w:rPr>
-          <w:instrText xml:space="preserve"> PAGEREF _Toc231067572 \h </w:instrText>
+          <w:instrText xml:space="preserve"> PAGEREF _Toc231067779 \h </w:instrText>
         </w:r>
         <w:r>
           <w:rPr>
@@ -1479,7 +1463,7 @@
           <w:lang w:eastAsia="pt-BR"/>
         </w:rPr>
       </w:pPr>
-      <w:hyperlink w:anchor="_Toc231067573" w:history="1">
+      <w:hyperlink w:anchor="_Toc231067780" w:history="1">
         <w:r>
           <w:rPr>
             <w:rStyle w:val="Hyperlink"/>
@@ -1508,7 +1492,7 @@
             <w:noProof/>
             <w:webHidden/>
           </w:rPr>
-          <w:instrText xml:space="preserve"> PAGEREF _Toc231067573 \h </w:instrText>
+          <w:instrText xml:space="preserve"> PAGEREF _Toc231067780 \h </w:instrText>
         </w:r>
         <w:r>
           <w:rPr>
@@ -1553,7 +1537,7 @@
           <w:lang w:eastAsia="pt-BR"/>
         </w:rPr>
       </w:pPr>
-      <w:hyperlink w:anchor="_Toc231067574" w:history="1">
+      <w:hyperlink w:anchor="_Toc231067781" w:history="1">
         <w:r>
           <w:rPr>
             <w:rStyle w:val="Hyperlink"/>
@@ -1582,7 +1566,7 @@
             <w:noProof/>
             <w:webHidden/>
           </w:rPr>
-          <w:instrText xml:space="preserve"> PAGEREF _Toc231067574 \h </w:instrText>
+          <w:instrText xml:space="preserve"> PAGEREF _Toc231067781 \h </w:instrText>
         </w:r>
         <w:r>
           <w:rPr>
@@ -1627,7 +1611,7 @@
           <w:lang w:eastAsia="pt-BR"/>
         </w:rPr>
       </w:pPr>
-      <w:hyperlink w:anchor="_Toc231067575" w:history="1">
+      <w:hyperlink w:anchor="_Toc231067782" w:history="1">
         <w:r>
           <w:rPr>
             <w:rStyle w:val="Hyperlink"/>
@@ -1656,7 +1640,7 @@
             <w:noProof/>
             <w:webHidden/>
           </w:rPr>
-          <w:instrText xml:space="preserve"> PAGEREF _Toc231067575 \h </w:instrText>
+          <w:instrText xml:space="preserve"> PAGEREF _Toc231067782 \h </w:instrText>
         </w:r>
         <w:r>
           <w:rPr>
@@ -1701,7 +1685,7 @@
           <w:lang w:eastAsia="pt-BR"/>
         </w:rPr>
       </w:pPr>
-      <w:hyperlink w:anchor="_Toc231067576" w:history="1">
+      <w:hyperlink w:anchor="_Toc231067783" w:history="1">
         <w:r>
           <w:rPr>
             <w:rStyle w:val="Hyperlink"/>
@@ -1730,7 +1714,7 @@
             <w:noProof/>
             <w:webHidden/>
           </w:rPr>
-          <w:instrText xml:space="preserve"> PAGEREF _Toc231067576 \h </w:instrText>
+          <w:instrText xml:space="preserve"> PAGEREF _Toc231067783 \h </w:instrText>
         </w:r>
         <w:r>
           <w:rPr>
@@ -1775,7 +1759,7 @@
           <w:lang w:eastAsia="pt-BR"/>
         </w:rPr>
       </w:pPr>
-      <w:hyperlink w:anchor="_Toc231067577" w:history="1">
+      <w:hyperlink w:anchor="_Toc231067784" w:history="1">
         <w:r>
           <w:rPr>
             <w:rStyle w:val="Hyperlink"/>
@@ -1804,7 +1788,7 @@
             <w:noProof/>
             <w:webHidden/>
           </w:rPr>
-          <w:instrText xml:space="preserve"> PAGEREF _Toc231067577 \h </w:instrText>
+          <w:instrText xml:space="preserve"> PAGEREF _Toc231067784 \h </w:instrText>
         </w:r>
         <w:r>
           <w:rPr>
@@ -1849,7 +1833,7 @@
           <w:lang w:eastAsia="pt-BR"/>
         </w:rPr>
       </w:pPr>
-      <w:hyperlink w:anchor="_Toc231067578" w:history="1">
+      <w:hyperlink w:anchor="_Toc231067785" w:history="1">
         <w:r>
           <w:rPr>
             <w:rStyle w:val="Hyperlink"/>
@@ -1878,7 +1862,7 @@
             <w:noProof/>
             <w:webHidden/>
           </w:rPr>
-          <w:instrText xml:space="preserve"> PAGEREF _Toc231067578 \h </w:instrText>
+          <w:instrText xml:space="preserve"> PAGEREF _Toc231067785 \h </w:instrText>
         </w:r>
         <w:r>
           <w:rPr>
@@ -1923,7 +1907,7 @@
           <w:lang w:eastAsia="pt-BR"/>
         </w:rPr>
       </w:pPr>
-      <w:hyperlink w:anchor="_Toc231067579" w:history="1">
+      <w:hyperlink w:anchor="_Toc231067786" w:history="1">
         <w:r>
           <w:rPr>
             <w:rStyle w:val="Hyperlink"/>
@@ -1952,7 +1936,7 @@
             <w:noProof/>
             <w:webHidden/>
           </w:rPr>
-          <w:instrText xml:space="preserve"> PAGEREF _Toc231067579 \h </w:instrText>
+          <w:instrText xml:space="preserve"> PAGEREF _Toc231067786 \h </w:instrText>
         </w:r>
         <w:r>
           <w:rPr>
@@ -1997,7 +1981,7 @@
           <w:lang w:eastAsia="pt-BR"/>
         </w:rPr>
       </w:pPr>
-      <w:hyperlink w:anchor="_Toc231067580" w:history="1">
+      <w:hyperlink w:anchor="_Toc231067787" w:history="1">
         <w:r>
           <w:rPr>
             <w:rStyle w:val="Hyperlink"/>
@@ -2026,7 +2010,7 @@
             <w:noProof/>
             <w:webHidden/>
           </w:rPr>
-          <w:instrText xml:space="preserve"> PAGEREF _Toc231067580 \h </w:instrText>
+          <w:instrText xml:space="preserve"> PAGEREF _Toc231067787 \h </w:instrText>
         </w:r>
         <w:r>
           <w:rPr>
@@ -2071,7 +2055,7 @@
           <w:lang w:eastAsia="pt-BR"/>
         </w:rPr>
       </w:pPr>
-      <w:hyperlink w:anchor="_Toc231067581" w:history="1">
+      <w:hyperlink w:anchor="_Toc231067788" w:history="1">
         <w:r>
           <w:rPr>
             <w:rStyle w:val="Hyperlink"/>
@@ -2100,7 +2084,7 @@
             <w:noProof/>
             <w:webHidden/>
           </w:rPr>
-          <w:instrText xml:space="preserve"> PAGEREF _Toc231067581 \h </w:instrText>
+          <w:instrText xml:space="preserve"> PAGEREF _Toc231067788 \h </w:instrText>
         </w:r>
         <w:r>
           <w:rPr>
@@ -2145,7 +2129,7 @@
           <w:lang w:eastAsia="pt-BR"/>
         </w:rPr>
       </w:pPr>
-      <w:hyperlink w:anchor="_Toc231067582" w:history="1">
+      <w:hyperlink w:anchor="_Toc231067789" w:history="1">
         <w:r>
           <w:rPr>
             <w:rStyle w:val="Hyperlink"/>
@@ -2174,7 +2158,7 @@
             <w:noProof/>
             <w:webHidden/>
           </w:rPr>
-          <w:instrText xml:space="preserve"> PAGEREF _Toc231067582 \h </w:instrText>
+          <w:instrText xml:space="preserve"> PAGEREF _Toc231067789 \h </w:instrText>
         </w:r>
         <w:r>
           <w:rPr>
@@ -2219,7 +2203,7 @@
           <w:lang w:eastAsia="pt-BR"/>
         </w:rPr>
       </w:pPr>
-      <w:hyperlink w:anchor="_Toc231067583" w:history="1">
+      <w:hyperlink w:anchor="_Toc231067790" w:history="1">
         <w:r>
           <w:rPr>
             <w:rStyle w:val="Hyperlink"/>
@@ -2248,7 +2232,7 @@
             <w:noProof/>
             <w:webHidden/>
           </w:rPr>
-          <w:instrText xml:space="preserve"> PAGEREF _Toc231067583 \h </w:instrText>
+          <w:instrText xml:space="preserve"> PAGEREF _Toc231067790 \h </w:instrText>
         </w:r>
         <w:r>
           <w:rPr>
@@ -2293,7 +2277,7 @@
           <w:lang w:eastAsia="pt-BR"/>
         </w:rPr>
       </w:pPr>
-      <w:hyperlink w:anchor="_Toc231067584" w:history="1">
+      <w:hyperlink w:anchor="_Toc231067791" w:history="1">
         <w:r>
           <w:rPr>
             <w:rStyle w:val="Hyperlink"/>
@@ -2323,7 +2307,7 @@
             <w:noProof/>
             <w:webHidden/>
           </w:rPr>
-          <w:instrText xml:space="preserve"> PAGEREF _Toc231067584 \h </w:instrText>
+          <w:instrText xml:space="preserve"> PAGEREF _Toc231067791 \h </w:instrText>
         </w:r>
         <w:r>
           <w:rPr>
@@ -2368,7 +2352,7 @@
           <w:lang w:eastAsia="pt-BR"/>
         </w:rPr>
       </w:pPr>
-      <w:hyperlink w:anchor="_Toc231067585" w:history="1">
+      <w:hyperlink w:anchor="_Toc231067792" w:history="1">
         <w:r>
           <w:rPr>
             <w:rStyle w:val="Hyperlink"/>
@@ -2398,7 +2382,7 @@
             <w:noProof/>
             <w:webHidden/>
           </w:rPr>
-          <w:instrText xml:space="preserve"> PAGEREF _Toc231067585 \h </w:instrText>
+          <w:instrText xml:space="preserve"> PAGEREF _Toc231067792 \h </w:instrText>
         </w:r>
         <w:r>
           <w:rPr>
@@ -2433,7 +2417,7 @@
       <w:pPr>
         <w:spacing w:line="360" w:lineRule="auto"/>
         <w:sectPr>
-          <w:headerReference w:type="default" r:id="rId8"/>
+          <w:headerReference w:type="default" r:id="rId7"/>
           <w:pgSz w:w="11920" w:h="16838"/>
           <w:pgMar w:top="1701" w:right="1134" w:bottom="1701" w:left="1701" w:header="709" w:footer="720" w:gutter="0"/>
           <w:cols w:space="720"/>
@@ -2450,7 +2434,7 @@
         <w:spacing w:before="360" w:after="360" w:line="360" w:lineRule="auto"/>
         <w:outlineLvl w:val="0"/>
       </w:pPr>
-      <w:bookmarkStart w:id="0" w:name="_Toc231067560"/>
+      <w:bookmarkStart w:id="0" w:name="_Toc231067767"/>
       <w:r>
         <w:rPr>
           <w:rFonts w:ascii="Times New Roman" w:hAnsi="Times New Roman" w:cs="Times New Roman"/>
@@ -2548,7 +2532,7 @@
         <w:spacing w:before="360" w:after="360" w:line="360" w:lineRule="auto"/>
         <w:outlineLvl w:val="0"/>
       </w:pPr>
-      <w:bookmarkStart w:id="1" w:name="_Toc231067561"/>
+      <w:bookmarkStart w:id="1" w:name="_Toc231067768"/>
       <w:r>
         <w:rPr>
           <w:rFonts w:ascii="Times New Roman" w:hAnsi="Times New Roman" w:cs="Times New Roman"/>
@@ -2568,7 +2552,7 @@
         <w:spacing w:before="360" w:after="360" w:line="360" w:lineRule="auto"/>
         <w:outlineLvl w:val="1"/>
       </w:pPr>
-      <w:bookmarkStart w:id="2" w:name="_Toc231067562"/>
+      <w:bookmarkStart w:id="2" w:name="_Toc231067769"/>
       <w:r>
         <w:rPr>
           <w:rFonts w:ascii="Times New Roman" w:hAnsi="Times New Roman" w:cs="Times New Roman"/>
@@ -3708,7 +3692,7 @@
         <w:spacing w:before="360" w:after="360" w:line="360" w:lineRule="auto"/>
         <w:outlineLvl w:val="1"/>
       </w:pPr>
-      <w:bookmarkStart w:id="3" w:name="_Toc231067563"/>
+      <w:bookmarkStart w:id="3" w:name="_Toc231067770"/>
       <w:r>
         <w:rPr>
           <w:rFonts w:ascii="Times New Roman" w:hAnsi="Times New Roman" w:cs="Times New Roman"/>
@@ -3840,7 +3824,7 @@
         <w:spacing w:before="360" w:after="360" w:line="360" w:lineRule="auto"/>
         <w:outlineLvl w:val="1"/>
       </w:pPr>
-      <w:bookmarkStart w:id="4" w:name="_Toc231067564"/>
+      <w:bookmarkStart w:id="4" w:name="_Toc231067771"/>
       <w:r>
         <w:rPr>
           <w:rFonts w:ascii="Times New Roman" w:hAnsi="Times New Roman" w:cs="Times New Roman"/>
@@ -7598,7 +7582,7 @@
         <w:spacing w:before="360" w:after="360" w:line="360" w:lineRule="auto"/>
         <w:outlineLvl w:val="1"/>
       </w:pPr>
-      <w:bookmarkStart w:id="5" w:name="_Toc231067565"/>
+      <w:bookmarkStart w:id="5" w:name="_Toc231067772"/>
       <w:r>
         <w:rPr>
           <w:rFonts w:ascii="Times New Roman" w:hAnsi="Times New Roman" w:cs="Times New Roman"/>
@@ -7769,7 +7753,7 @@
         <w:spacing w:before="360" w:after="360" w:line="360" w:lineRule="auto"/>
         <w:outlineLvl w:val="1"/>
       </w:pPr>
-      <w:bookmarkStart w:id="6" w:name="_Toc231067566"/>
+      <w:bookmarkStart w:id="6" w:name="_Toc231067773"/>
       <w:r>
         <w:rPr>
           <w:rFonts w:ascii="Times New Roman" w:hAnsi="Times New Roman" w:cs="Times New Roman"/>
@@ -7932,7 +7916,7 @@
         <w:spacing w:before="360" w:after="360" w:line="360" w:lineRule="auto"/>
         <w:outlineLvl w:val="0"/>
       </w:pPr>
-      <w:bookmarkStart w:id="7" w:name="_Toc231067567"/>
+      <w:bookmarkStart w:id="7" w:name="_Toc231067774"/>
       <w:r>
         <w:rPr>
           <w:rFonts w:ascii="Times New Roman" w:hAnsi="Times New Roman" w:cs="Times New Roman"/>
@@ -7967,7 +7951,7 @@
         <w:spacing w:before="360" w:after="360" w:line="360" w:lineRule="auto"/>
         <w:outlineLvl w:val="1"/>
       </w:pPr>
-      <w:bookmarkStart w:id="8" w:name="_Toc231067568"/>
+      <w:bookmarkStart w:id="8" w:name="_Toc231067775"/>
       <w:r>
         <w:rPr>
           <w:rFonts w:ascii="Times New Roman" w:hAnsi="Times New Roman" w:cs="Times New Roman"/>
@@ -8045,7 +8029,7 @@
                     <pic:cNvPicPr/>
                   </pic:nvPicPr>
                   <pic:blipFill>
-                    <a:blip r:embed="rId9"/>
+                    <a:blip r:embed="rId8"/>
                     <a:stretch>
                       <a:fillRect/>
                     </a:stretch>
@@ -8085,7 +8069,7 @@
         <w:spacing w:before="360" w:after="360" w:line="360" w:lineRule="auto"/>
         <w:outlineLvl w:val="1"/>
       </w:pPr>
-      <w:bookmarkStart w:id="9" w:name="_Toc231067569"/>
+      <w:bookmarkStart w:id="9" w:name="_Toc231067776"/>
       <w:r>
         <w:rPr>
           <w:rFonts w:ascii="Times New Roman" w:hAnsi="Times New Roman" w:cs="Times New Roman"/>
@@ -8163,7 +8147,7 @@
                     <pic:cNvPicPr/>
                   </pic:nvPicPr>
                   <pic:blipFill>
-                    <a:blip r:embed="rId10"/>
+                    <a:blip r:embed="rId9"/>
                     <a:stretch>
                       <a:fillRect/>
                     </a:stretch>
@@ -8203,7 +8187,7 @@
         <w:spacing w:before="360" w:after="360" w:line="360" w:lineRule="auto"/>
         <w:outlineLvl w:val="1"/>
       </w:pPr>
-      <w:bookmarkStart w:id="10" w:name="_Toc231067570"/>
+      <w:bookmarkStart w:id="10" w:name="_Toc231067777"/>
       <w:r>
         <w:rPr>
           <w:rFonts w:ascii="Times New Roman" w:hAnsi="Times New Roman" w:cs="Times New Roman"/>
@@ -8281,7 +8265,7 @@
                     <pic:cNvPicPr/>
                   </pic:nvPicPr>
                   <pic:blipFill>
-                    <a:blip r:embed="rId11"/>
+                    <a:blip r:embed="rId10"/>
                     <a:stretch>
                       <a:fillRect/>
                     </a:stretch>
@@ -8321,7 +8305,7 @@
         <w:spacing w:before="360" w:after="360" w:line="360" w:lineRule="auto"/>
         <w:outlineLvl w:val="1"/>
       </w:pPr>
-      <w:bookmarkStart w:id="11" w:name="_Toc231067571"/>
+      <w:bookmarkStart w:id="11" w:name="_Toc231067778"/>
       <w:r>
         <w:rPr>
           <w:rFonts w:ascii="Times New Roman" w:hAnsi="Times New Roman" w:cs="Times New Roman"/>
@@ -8399,7 +8383,7 @@
                     <pic:cNvPicPr/>
                   </pic:nvPicPr>
                   <pic:blipFill>
-                    <a:blip r:embed="rId12"/>
+                    <a:blip r:embed="rId11"/>
                     <a:stretch>
                       <a:fillRect/>
                     </a:stretch>
@@ -8439,7 +8423,7 @@
         <w:spacing w:before="360" w:after="360" w:line="360" w:lineRule="auto"/>
         <w:outlineLvl w:val="1"/>
       </w:pPr>
-      <w:bookmarkStart w:id="12" w:name="_Toc231067572"/>
+      <w:bookmarkStart w:id="12" w:name="_Toc231067779"/>
       <w:r>
         <w:rPr>
           <w:rFonts w:ascii="Times New Roman" w:hAnsi="Times New Roman" w:cs="Times New Roman"/>
@@ -8514,6 +8498,124 @@
                 <pic:pic xmlns:pic="http://schemas.openxmlformats.org/drawingml/2006/picture">
                   <pic:nvPicPr>
                     <pic:cNvPr id="1005" name="Figura 5"/>
+                    <pic:cNvPicPr/>
+                  </pic:nvPicPr>
+                  <pic:blipFill>
+                    <a:blip r:embed="rId12"/>
+                    <a:stretch>
+                      <a:fillRect/>
+                    </a:stretch>
+                  </pic:blipFill>
+                  <pic:spPr>
+                    <a:xfrm>
+                      <a:off x="0" y="0"/>
+                      <a:ext cx="5768975" cy="3386791"/>
+                    </a:xfrm>
+                    <a:prstGeom prst="rect">
+                      <a:avLst/>
+                    </a:prstGeom>
+                  </pic:spPr>
+                </pic:pic>
+              </a:graphicData>
+            </a:graphic>
+          </wp:inline>
+        </w:drawing>
+      </w:r>
+    </w:p>
+    <w:p>
+      <w:pPr>
+        <w:spacing w:after="240" w:line="240" w:lineRule="auto"/>
+      </w:pPr>
+      <w:r>
+        <w:rPr>
+          <w:rFonts w:ascii="Times New Roman" w:hAnsi="Times New Roman" w:cs="Times New Roman"/>
+          <w:sz w:val="20"/>
+          <w:szCs w:val="20"/>
+        </w:rPr>
+        <w:t>Fonte: o autor (2026).</w:t>
+      </w:r>
+    </w:p>
+    <w:p>
+      <w:pPr>
+        <w:keepNext/>
+        <w:spacing w:before="360" w:after="360" w:line="360" w:lineRule="auto"/>
+        <w:outlineLvl w:val="1"/>
+      </w:pPr>
+      <w:bookmarkStart w:id="13" w:name="_Toc231067780"/>
+      <w:r>
+        <w:rPr>
+          <w:rFonts w:ascii="Times New Roman" w:hAnsi="Times New Roman" w:cs="Times New Roman"/>
+          <w:caps/>
+          <w:sz w:val="24"/>
+          <w:szCs w:val="24"/>
+        </w:rPr>
+        <w:t>3.6 Formulário de Cadastro/Edição de Profissional</w:t>
+      </w:r>
+      <w:bookmarkEnd w:id="13"/>
+    </w:p>
+    <w:p>
+      <w:pPr>
+        <w:spacing w:after="0" w:line="360" w:lineRule="auto"/>
+        <w:ind w:firstLine="709"/>
+        <w:jc w:val="both"/>
+      </w:pPr>
+      <w:r>
+        <w:rPr>
+          <w:rFonts w:ascii="Times New Roman" w:hAnsi="Times New Roman" w:cs="Times New Roman"/>
+          <w:b/>
+          <w:sz w:val="24"/>
+          <w:szCs w:val="24"/>
+        </w:rPr>
+        <w:t xml:space="preserve">Objetivo e funcionamento. </w:t>
+      </w:r>
+      <w:r>
+        <w:rPr>
+          <w:rFonts w:ascii="Times New Roman" w:hAnsi="Times New Roman" w:cs="Times New Roman"/>
+          <w:sz w:val="24"/>
+          <w:szCs w:val="24"/>
+        </w:rPr>
+        <w:t>Registrar ou atualizar os dados de um membro da equipe, com nome, registro de conselho, contato e especialidade (selecionada entre as ativas).</w:t>
+      </w:r>
+    </w:p>
+    <w:p>
+      <w:pPr>
+        <w:keepNext/>
+        <w:spacing w:before="240" w:after="60" w:line="240" w:lineRule="auto"/>
+        <w:jc w:val="center"/>
+      </w:pPr>
+      <w:r>
+        <w:rPr>
+          <w:rFonts w:ascii="Times New Roman" w:hAnsi="Times New Roman" w:cs="Times New Roman"/>
+          <w:sz w:val="24"/>
+          <w:szCs w:val="24"/>
+        </w:rPr>
+        <w:lastRenderedPageBreak/>
+        <w:t>Figura 6 – Formulário de Cadastro/Edição de Profissional</w:t>
+      </w:r>
+    </w:p>
+    <w:p>
+      <w:pPr>
+        <w:keepNext/>
+        <w:spacing w:after="60" w:line="240" w:lineRule="auto"/>
+        <w:jc w:val="center"/>
+      </w:pPr>
+      <w:r>
+        <w:rPr>
+          <w:noProof/>
+        </w:rPr>
+        <w:drawing>
+          <wp:inline distT="0" distB="0" distL="0" distR="0" wp14:anchorId="5A37EE1D" wp14:editId="2EB6A36E">
+            <wp:extent cx="5768975" cy="3386791"/>
+            <wp:effectExtent l="0" t="0" r="0" b="0"/>
+            <wp:docPr id="1006" name="Figura 6"/>
+            <wp:cNvGraphicFramePr>
+              <a:graphicFrameLocks xmlns:a="http://schemas.openxmlformats.org/drawingml/2006/main" noChangeAspect="1"/>
+            </wp:cNvGraphicFramePr>
+            <a:graphic xmlns:a="http://schemas.openxmlformats.org/drawingml/2006/main">
+              <a:graphicData uri="http://schemas.openxmlformats.org/drawingml/2006/picture">
+                <pic:pic xmlns:pic="http://schemas.openxmlformats.org/drawingml/2006/picture">
+                  <pic:nvPicPr>
+                    <pic:cNvPr id="1006" name="Figura 6"/>
                     <pic:cNvPicPr/>
                   </pic:nvPicPr>
                   <pic:blipFill>
@@ -8557,7 +8659,7 @@
         <w:spacing w:before="360" w:after="360" w:line="360" w:lineRule="auto"/>
         <w:outlineLvl w:val="1"/>
       </w:pPr>
-      <w:bookmarkStart w:id="13" w:name="_Toc231067573"/>
+      <w:bookmarkStart w:id="14" w:name="_Toc231067781"/>
       <w:r>
         <w:rPr>
           <w:rFonts w:ascii="Times New Roman" w:hAnsi="Times New Roman" w:cs="Times New Roman"/>
@@ -8565,9 +8667,9 @@
           <w:sz w:val="24"/>
           <w:szCs w:val="24"/>
         </w:rPr>
-        <w:t>3.6 Formulário de Cadastro/Edição de Profissional</w:t>
-      </w:r>
-      <w:bookmarkEnd w:id="13"/>
+        <w:t>3.7 Módulo de Especialidades</w:t>
+      </w:r>
+      <w:bookmarkEnd w:id="14"/>
     </w:p>
     <w:p>
       <w:pPr>
@@ -8590,7 +8692,7 @@
           <w:sz w:val="24"/>
           <w:szCs w:val="24"/>
         </w:rPr>
-        <w:t>Registrar ou atualizar os dados de um membro da equipe, com nome, registro de conselho, contato e especialidade (selecionada entre as ativas).</w:t>
+        <w:t>Gerenciar as especialidades clínicas cadastradas (ex.: Psicologia, Fonoaudiologia), cada uma com cor de identificação visual e sigla de conselho.</w:t>
       </w:r>
     </w:p>
     <w:p>
@@ -8606,7 +8708,7 @@
           <w:szCs w:val="24"/>
         </w:rPr>
         <w:lastRenderedPageBreak/>
-        <w:t>Figura 6 – Formulário de Cadastro/Edição de Profissional</w:t>
+        <w:t>Figura 7 – Módulo de Especialidades</w:t>
       </w:r>
     </w:p>
     <w:p>
@@ -8620,10 +8722,10 @@
           <w:noProof/>
         </w:rPr>
         <w:drawing>
-          <wp:inline distT="0" distB="0" distL="0" distR="0" wp14:anchorId="5A37EE1D" wp14:editId="2EB6A36E">
+          <wp:inline distT="0" distB="0" distL="0" distR="0" wp14:anchorId="2FA88515" wp14:editId="6F065376">
             <wp:extent cx="5768975" cy="3386791"/>
             <wp:effectExtent l="0" t="0" r="0" b="0"/>
-            <wp:docPr id="1006" name="Figura 6"/>
+            <wp:docPr id="1007" name="Figura 7"/>
             <wp:cNvGraphicFramePr>
               <a:graphicFrameLocks xmlns:a="http://schemas.openxmlformats.org/drawingml/2006/main" noChangeAspect="1"/>
             </wp:cNvGraphicFramePr>
@@ -8631,7 +8733,7 @@
               <a:graphicData uri="http://schemas.openxmlformats.org/drawingml/2006/picture">
                 <pic:pic xmlns:pic="http://schemas.openxmlformats.org/drawingml/2006/picture">
                   <pic:nvPicPr>
-                    <pic:cNvPr id="1006" name="Figura 6"/>
+                    <pic:cNvPr id="1007" name="Figura 7"/>
                     <pic:cNvPicPr/>
                   </pic:nvPicPr>
                   <pic:blipFill>
@@ -8675,7 +8777,7 @@
         <w:spacing w:before="360" w:after="360" w:line="360" w:lineRule="auto"/>
         <w:outlineLvl w:val="1"/>
       </w:pPr>
-      <w:bookmarkStart w:id="14" w:name="_Toc231067574"/>
+      <w:bookmarkStart w:id="15" w:name="_Toc231067782"/>
       <w:r>
         <w:rPr>
           <w:rFonts w:ascii="Times New Roman" w:hAnsi="Times New Roman" w:cs="Times New Roman"/>
@@ -8683,9 +8785,9 @@
           <w:sz w:val="24"/>
           <w:szCs w:val="24"/>
         </w:rPr>
-        <w:t>3.7 Módulo de Especialidades</w:t>
-      </w:r>
-      <w:bookmarkEnd w:id="14"/>
+        <w:t>3.8 Formulário de Cadastro/Edição de Especialidade</w:t>
+      </w:r>
+      <w:bookmarkEnd w:id="15"/>
     </w:p>
     <w:p>
       <w:pPr>
@@ -8708,7 +8810,7 @@
           <w:sz w:val="24"/>
           <w:szCs w:val="24"/>
         </w:rPr>
-        <w:t>Gerenciar as especialidades clínicas cadastradas (ex.: Psicologia, Fonoaudiologia), cada uma com cor de identificação visual e sigla de conselho.</w:t>
+        <w:t>Registrar ou atualizar uma especialidade, com nome, sigla do conselho e cor em hexadecimal, exibida em preview em tempo real.</w:t>
       </w:r>
     </w:p>
     <w:p>
@@ -8724,7 +8826,7 @@
           <w:szCs w:val="24"/>
         </w:rPr>
         <w:lastRenderedPageBreak/>
-        <w:t>Figura 7 – Módulo de Especialidades</w:t>
+        <w:t>Figura 8 – Formulário de Cadastro/Edição de Especialidade</w:t>
       </w:r>
     </w:p>
     <w:p>
@@ -8738,10 +8840,10 @@
           <w:noProof/>
         </w:rPr>
         <w:drawing>
-          <wp:inline distT="0" distB="0" distL="0" distR="0" wp14:anchorId="2FA88515" wp14:editId="6F065376">
-            <wp:extent cx="5768975" cy="3386791"/>
+          <wp:inline distT="0" distB="0" distL="0" distR="0" wp14:anchorId="60BCD817" wp14:editId="47BADEDE">
+            <wp:extent cx="5768975" cy="3395815"/>
             <wp:effectExtent l="0" t="0" r="0" b="0"/>
-            <wp:docPr id="1007" name="Figura 7"/>
+            <wp:docPr id="1008" name="Figura 8"/>
             <wp:cNvGraphicFramePr>
               <a:graphicFrameLocks xmlns:a="http://schemas.openxmlformats.org/drawingml/2006/main" noChangeAspect="1"/>
             </wp:cNvGraphicFramePr>
@@ -8749,11 +8851,837 @@
               <a:graphicData uri="http://schemas.openxmlformats.org/drawingml/2006/picture">
                 <pic:pic xmlns:pic="http://schemas.openxmlformats.org/drawingml/2006/picture">
                   <pic:nvPicPr>
-                    <pic:cNvPr id="1007" name="Figura 7"/>
+                    <pic:cNvPr id="1008" name="Figura 8"/>
                     <pic:cNvPicPr/>
                   </pic:nvPicPr>
                   <pic:blipFill>
                     <a:blip r:embed="rId15"/>
+                    <a:stretch>
+                      <a:fillRect/>
+                    </a:stretch>
+                  </pic:blipFill>
+                  <pic:spPr>
+                    <a:xfrm>
+                      <a:off x="0" y="0"/>
+                      <a:ext cx="5768975" cy="3395815"/>
+                    </a:xfrm>
+                    <a:prstGeom prst="rect">
+                      <a:avLst/>
+                    </a:prstGeom>
+                  </pic:spPr>
+                </pic:pic>
+              </a:graphicData>
+            </a:graphic>
+          </wp:inline>
+        </w:drawing>
+      </w:r>
+    </w:p>
+    <w:p>
+      <w:pPr>
+        <w:spacing w:after="240" w:line="240" w:lineRule="auto"/>
+      </w:pPr>
+      <w:r>
+        <w:rPr>
+          <w:rFonts w:ascii="Times New Roman" w:hAnsi="Times New Roman" w:cs="Times New Roman"/>
+          <w:sz w:val="20"/>
+          <w:szCs w:val="20"/>
+        </w:rPr>
+        <w:t>Fonte: o autor (2026).</w:t>
+      </w:r>
+    </w:p>
+    <w:p>
+      <w:pPr>
+        <w:keepNext/>
+        <w:spacing w:before="360" w:after="360" w:line="360" w:lineRule="auto"/>
+        <w:outlineLvl w:val="1"/>
+      </w:pPr>
+      <w:bookmarkStart w:id="16" w:name="_Toc231067783"/>
+      <w:r>
+        <w:rPr>
+          <w:rFonts w:ascii="Times New Roman" w:hAnsi="Times New Roman" w:cs="Times New Roman"/>
+          <w:caps/>
+          <w:sz w:val="24"/>
+          <w:szCs w:val="24"/>
+        </w:rPr>
+        <w:t>3.9 Módulo de Salas</w:t>
+      </w:r>
+      <w:bookmarkEnd w:id="16"/>
+    </w:p>
+    <w:p>
+      <w:pPr>
+        <w:spacing w:after="0" w:line="360" w:lineRule="auto"/>
+        <w:ind w:firstLine="709"/>
+        <w:jc w:val="both"/>
+      </w:pPr>
+      <w:r>
+        <w:rPr>
+          <w:rFonts w:ascii="Times New Roman" w:hAnsi="Times New Roman" w:cs="Times New Roman"/>
+          <w:b/>
+          <w:sz w:val="24"/>
+          <w:szCs w:val="24"/>
+        </w:rPr>
+        <w:t xml:space="preserve">Objetivo e funcionamento. </w:t>
+      </w:r>
+      <w:r>
+        <w:rPr>
+          <w:rFonts w:ascii="Times New Roman" w:hAnsi="Times New Roman" w:cs="Times New Roman"/>
+          <w:sz w:val="24"/>
+          <w:szCs w:val="24"/>
+        </w:rPr>
+        <w:t>Gerenciar os espaços físicos de atendimento, registrando capacidade e recursos sensoriais relevantes ao perfil de pacientes com TEA.</w:t>
+      </w:r>
+    </w:p>
+    <w:p>
+      <w:pPr>
+        <w:keepNext/>
+        <w:spacing w:before="240" w:after="60" w:line="240" w:lineRule="auto"/>
+        <w:jc w:val="center"/>
+      </w:pPr>
+      <w:r>
+        <w:rPr>
+          <w:rFonts w:ascii="Times New Roman" w:hAnsi="Times New Roman" w:cs="Times New Roman"/>
+          <w:sz w:val="24"/>
+          <w:szCs w:val="24"/>
+        </w:rPr>
+        <w:lastRenderedPageBreak/>
+        <w:t>Figura 9 – Módulo de Salas</w:t>
+      </w:r>
+    </w:p>
+    <w:p>
+      <w:pPr>
+        <w:keepNext/>
+        <w:spacing w:after="60" w:line="240" w:lineRule="auto"/>
+        <w:jc w:val="center"/>
+      </w:pPr>
+      <w:r>
+        <w:rPr>
+          <w:noProof/>
+        </w:rPr>
+        <w:drawing>
+          <wp:inline distT="0" distB="0" distL="0" distR="0" wp14:anchorId="6704D5CB" wp14:editId="3F8AC335">
+            <wp:extent cx="5768975" cy="3377768"/>
+            <wp:effectExtent l="0" t="0" r="0" b="0"/>
+            <wp:docPr id="1009" name="Figura 9"/>
+            <wp:cNvGraphicFramePr>
+              <a:graphicFrameLocks xmlns:a="http://schemas.openxmlformats.org/drawingml/2006/main" noChangeAspect="1"/>
+            </wp:cNvGraphicFramePr>
+            <a:graphic xmlns:a="http://schemas.openxmlformats.org/drawingml/2006/main">
+              <a:graphicData uri="http://schemas.openxmlformats.org/drawingml/2006/picture">
+                <pic:pic xmlns:pic="http://schemas.openxmlformats.org/drawingml/2006/picture">
+                  <pic:nvPicPr>
+                    <pic:cNvPr id="1009" name="Figura 9"/>
+                    <pic:cNvPicPr/>
+                  </pic:nvPicPr>
+                  <pic:blipFill>
+                    <a:blip r:embed="rId16"/>
+                    <a:stretch>
+                      <a:fillRect/>
+                    </a:stretch>
+                  </pic:blipFill>
+                  <pic:spPr>
+                    <a:xfrm>
+                      <a:off x="0" y="0"/>
+                      <a:ext cx="5768975" cy="3377768"/>
+                    </a:xfrm>
+                    <a:prstGeom prst="rect">
+                      <a:avLst/>
+                    </a:prstGeom>
+                  </pic:spPr>
+                </pic:pic>
+              </a:graphicData>
+            </a:graphic>
+          </wp:inline>
+        </w:drawing>
+      </w:r>
+    </w:p>
+    <w:p>
+      <w:pPr>
+        <w:spacing w:after="240" w:line="240" w:lineRule="auto"/>
+      </w:pPr>
+      <w:r>
+        <w:rPr>
+          <w:rFonts w:ascii="Times New Roman" w:hAnsi="Times New Roman" w:cs="Times New Roman"/>
+          <w:sz w:val="20"/>
+          <w:szCs w:val="20"/>
+        </w:rPr>
+        <w:t>Fonte: o autor (2026).</w:t>
+      </w:r>
+    </w:p>
+    <w:p>
+      <w:pPr>
+        <w:keepNext/>
+        <w:spacing w:before="360" w:after="360" w:line="360" w:lineRule="auto"/>
+        <w:outlineLvl w:val="1"/>
+      </w:pPr>
+      <w:bookmarkStart w:id="17" w:name="_Toc231067784"/>
+      <w:r>
+        <w:rPr>
+          <w:rFonts w:ascii="Times New Roman" w:hAnsi="Times New Roman" w:cs="Times New Roman"/>
+          <w:caps/>
+          <w:sz w:val="24"/>
+          <w:szCs w:val="24"/>
+        </w:rPr>
+        <w:t>3.10 Módulo de Agenda</w:t>
+      </w:r>
+      <w:bookmarkEnd w:id="17"/>
+    </w:p>
+    <w:p>
+      <w:pPr>
+        <w:spacing w:after="0" w:line="360" w:lineRule="auto"/>
+        <w:ind w:firstLine="709"/>
+        <w:jc w:val="both"/>
+      </w:pPr>
+      <w:r>
+        <w:rPr>
+          <w:rFonts w:ascii="Times New Roman" w:hAnsi="Times New Roman" w:cs="Times New Roman"/>
+          <w:b/>
+          <w:sz w:val="24"/>
+          <w:szCs w:val="24"/>
+        </w:rPr>
+        <w:t xml:space="preserve">Objetivo e funcionamento. </w:t>
+      </w:r>
+      <w:r>
+        <w:rPr>
+          <w:rFonts w:ascii="Times New Roman" w:hAnsi="Times New Roman" w:cs="Times New Roman"/>
+          <w:sz w:val="24"/>
+          <w:szCs w:val="24"/>
+        </w:rPr>
+        <w:t>Visualizar, criar, editar e gerenciar o status dos agendamentos, agrupados por data e identificados por dot colorido de status e chip de especialidade.</w:t>
+      </w:r>
+    </w:p>
+    <w:p>
+      <w:pPr>
+        <w:keepNext/>
+        <w:spacing w:before="240" w:after="60" w:line="240" w:lineRule="auto"/>
+        <w:jc w:val="center"/>
+      </w:pPr>
+      <w:r>
+        <w:rPr>
+          <w:rFonts w:ascii="Times New Roman" w:hAnsi="Times New Roman" w:cs="Times New Roman"/>
+          <w:sz w:val="24"/>
+          <w:szCs w:val="24"/>
+        </w:rPr>
+        <w:lastRenderedPageBreak/>
+        <w:t>Figura 10 – Módulo de Agenda</w:t>
+      </w:r>
+    </w:p>
+    <w:p>
+      <w:pPr>
+        <w:keepNext/>
+        <w:spacing w:after="60" w:line="240" w:lineRule="auto"/>
+        <w:jc w:val="center"/>
+      </w:pPr>
+      <w:r>
+        <w:rPr>
+          <w:noProof/>
+        </w:rPr>
+        <w:drawing>
+          <wp:inline distT="0" distB="0" distL="0" distR="0" wp14:anchorId="496FA8C3" wp14:editId="5BAA18E1">
+            <wp:extent cx="5768975" cy="3374760"/>
+            <wp:effectExtent l="0" t="0" r="0" b="0"/>
+            <wp:docPr id="1010" name="Figura 10"/>
+            <wp:cNvGraphicFramePr>
+              <a:graphicFrameLocks xmlns:a="http://schemas.openxmlformats.org/drawingml/2006/main" noChangeAspect="1"/>
+            </wp:cNvGraphicFramePr>
+            <a:graphic xmlns:a="http://schemas.openxmlformats.org/drawingml/2006/main">
+              <a:graphicData uri="http://schemas.openxmlformats.org/drawingml/2006/picture">
+                <pic:pic xmlns:pic="http://schemas.openxmlformats.org/drawingml/2006/picture">
+                  <pic:nvPicPr>
+                    <pic:cNvPr id="1010" name="Figura 10"/>
+                    <pic:cNvPicPr/>
+                  </pic:nvPicPr>
+                  <pic:blipFill>
+                    <a:blip r:embed="rId17"/>
+                    <a:stretch>
+                      <a:fillRect/>
+                    </a:stretch>
+                  </pic:blipFill>
+                  <pic:spPr>
+                    <a:xfrm>
+                      <a:off x="0" y="0"/>
+                      <a:ext cx="5768975" cy="3374760"/>
+                    </a:xfrm>
+                    <a:prstGeom prst="rect">
+                      <a:avLst/>
+                    </a:prstGeom>
+                  </pic:spPr>
+                </pic:pic>
+              </a:graphicData>
+            </a:graphic>
+          </wp:inline>
+        </w:drawing>
+      </w:r>
+    </w:p>
+    <w:p>
+      <w:pPr>
+        <w:spacing w:after="240" w:line="240" w:lineRule="auto"/>
+      </w:pPr>
+      <w:r>
+        <w:rPr>
+          <w:rFonts w:ascii="Times New Roman" w:hAnsi="Times New Roman" w:cs="Times New Roman"/>
+          <w:sz w:val="20"/>
+          <w:szCs w:val="20"/>
+        </w:rPr>
+        <w:t>Fonte: o autor (2026).</w:t>
+      </w:r>
+    </w:p>
+    <w:p>
+      <w:pPr>
+        <w:keepNext/>
+        <w:spacing w:before="360" w:after="360" w:line="360" w:lineRule="auto"/>
+        <w:outlineLvl w:val="1"/>
+      </w:pPr>
+      <w:bookmarkStart w:id="18" w:name="_Toc231067785"/>
+      <w:r>
+        <w:rPr>
+          <w:rFonts w:ascii="Times New Roman" w:hAnsi="Times New Roman" w:cs="Times New Roman"/>
+          <w:caps/>
+          <w:sz w:val="24"/>
+          <w:szCs w:val="24"/>
+        </w:rPr>
+        <w:t>3.11 Formulário de Novo/Editar Agendamento</w:t>
+      </w:r>
+      <w:bookmarkEnd w:id="18"/>
+    </w:p>
+    <w:p>
+      <w:pPr>
+        <w:spacing w:after="0" w:line="360" w:lineRule="auto"/>
+        <w:ind w:firstLine="709"/>
+        <w:jc w:val="both"/>
+      </w:pPr>
+      <w:r>
+        <w:rPr>
+          <w:rFonts w:ascii="Times New Roman" w:hAnsi="Times New Roman" w:cs="Times New Roman"/>
+          <w:b/>
+          <w:sz w:val="24"/>
+          <w:szCs w:val="24"/>
+        </w:rPr>
+        <w:t xml:space="preserve">Objetivo e funcionamento. </w:t>
+      </w:r>
+      <w:r>
+        <w:rPr>
+          <w:rFonts w:ascii="Times New Roman" w:hAnsi="Times New Roman" w:cs="Times New Roman"/>
+          <w:sz w:val="24"/>
+          <w:szCs w:val="24"/>
+        </w:rPr>
+        <w:t>Cadastrar ou editar um agendamento. A validação verifica campos obrigatórios, horário de fim posterior ao início e ausência de conflito de horário.</w:t>
+      </w:r>
+    </w:p>
+    <w:p>
+      <w:pPr>
+        <w:keepNext/>
+        <w:spacing w:before="240" w:after="60" w:line="240" w:lineRule="auto"/>
+        <w:jc w:val="center"/>
+      </w:pPr>
+      <w:r>
+        <w:rPr>
+          <w:rFonts w:ascii="Times New Roman" w:hAnsi="Times New Roman" w:cs="Times New Roman"/>
+          <w:sz w:val="24"/>
+          <w:szCs w:val="24"/>
+        </w:rPr>
+        <w:lastRenderedPageBreak/>
+        <w:t>Figura 11 – Formulário de Novo/Editar Agendamento</w:t>
+      </w:r>
+    </w:p>
+    <w:p>
+      <w:pPr>
+        <w:keepNext/>
+        <w:spacing w:after="60" w:line="240" w:lineRule="auto"/>
+        <w:jc w:val="center"/>
+      </w:pPr>
+      <w:r>
+        <w:rPr>
+          <w:noProof/>
+        </w:rPr>
+        <w:drawing>
+          <wp:inline distT="0" distB="0" distL="0" distR="0" wp14:anchorId="278959FD" wp14:editId="5B4E081D">
+            <wp:extent cx="5768975" cy="3395815"/>
+            <wp:effectExtent l="0" t="0" r="0" b="0"/>
+            <wp:docPr id="1011" name="Figura 11"/>
+            <wp:cNvGraphicFramePr>
+              <a:graphicFrameLocks xmlns:a="http://schemas.openxmlformats.org/drawingml/2006/main" noChangeAspect="1"/>
+            </wp:cNvGraphicFramePr>
+            <a:graphic xmlns:a="http://schemas.openxmlformats.org/drawingml/2006/main">
+              <a:graphicData uri="http://schemas.openxmlformats.org/drawingml/2006/picture">
+                <pic:pic xmlns:pic="http://schemas.openxmlformats.org/drawingml/2006/picture">
+                  <pic:nvPicPr>
+                    <pic:cNvPr id="1011" name="Figura 11"/>
+                    <pic:cNvPicPr/>
+                  </pic:nvPicPr>
+                  <pic:blipFill>
+                    <a:blip r:embed="rId18"/>
+                    <a:stretch>
+                      <a:fillRect/>
+                    </a:stretch>
+                  </pic:blipFill>
+                  <pic:spPr>
+                    <a:xfrm>
+                      <a:off x="0" y="0"/>
+                      <a:ext cx="5768975" cy="3395815"/>
+                    </a:xfrm>
+                    <a:prstGeom prst="rect">
+                      <a:avLst/>
+                    </a:prstGeom>
+                  </pic:spPr>
+                </pic:pic>
+              </a:graphicData>
+            </a:graphic>
+          </wp:inline>
+        </w:drawing>
+      </w:r>
+    </w:p>
+    <w:p>
+      <w:pPr>
+        <w:spacing w:after="240" w:line="240" w:lineRule="auto"/>
+      </w:pPr>
+      <w:r>
+        <w:rPr>
+          <w:rFonts w:ascii="Times New Roman" w:hAnsi="Times New Roman" w:cs="Times New Roman"/>
+          <w:sz w:val="20"/>
+          <w:szCs w:val="20"/>
+        </w:rPr>
+        <w:t>Fonte: o autor (2026).</w:t>
+      </w:r>
+    </w:p>
+    <w:p>
+      <w:pPr>
+        <w:keepNext/>
+        <w:spacing w:before="360" w:after="360" w:line="360" w:lineRule="auto"/>
+        <w:outlineLvl w:val="1"/>
+      </w:pPr>
+      <w:bookmarkStart w:id="19" w:name="_Toc231067786"/>
+      <w:r>
+        <w:rPr>
+          <w:rFonts w:ascii="Times New Roman" w:hAnsi="Times New Roman" w:cs="Times New Roman"/>
+          <w:caps/>
+          <w:sz w:val="24"/>
+          <w:szCs w:val="24"/>
+        </w:rPr>
+        <w:t>3.12 Formulário de Evolução de Sessão</w:t>
+      </w:r>
+      <w:bookmarkEnd w:id="19"/>
+    </w:p>
+    <w:p>
+      <w:pPr>
+        <w:spacing w:after="0" w:line="360" w:lineRule="auto"/>
+        <w:ind w:firstLine="709"/>
+        <w:jc w:val="both"/>
+      </w:pPr>
+      <w:r>
+        <w:rPr>
+          <w:rFonts w:ascii="Times New Roman" w:hAnsi="Times New Roman" w:cs="Times New Roman"/>
+          <w:b/>
+          <w:sz w:val="24"/>
+          <w:szCs w:val="24"/>
+        </w:rPr>
+        <w:t xml:space="preserve">Objetivo e funcionamento. </w:t>
+      </w:r>
+      <w:r>
+        <w:rPr>
+          <w:rFonts w:ascii="Times New Roman" w:hAnsi="Times New Roman" w:cs="Times New Roman"/>
+          <w:sz w:val="24"/>
+          <w:szCs w:val="24"/>
+        </w:rPr>
+        <w:t>Registrar o relato clínico de uma sessão realizada, com conteúdo, comportamentos observados, próximos objetivos e escalas de humor e engajamento.</w:t>
+      </w:r>
+    </w:p>
+    <w:p>
+      <w:pPr>
+        <w:keepNext/>
+        <w:spacing w:before="240" w:after="60" w:line="240" w:lineRule="auto"/>
+        <w:jc w:val="center"/>
+      </w:pPr>
+      <w:r>
+        <w:rPr>
+          <w:rFonts w:ascii="Times New Roman" w:hAnsi="Times New Roman" w:cs="Times New Roman"/>
+          <w:sz w:val="24"/>
+          <w:szCs w:val="24"/>
+        </w:rPr>
+        <w:lastRenderedPageBreak/>
+        <w:t>Figura 12 – Formulário de Evolução de Sessão</w:t>
+      </w:r>
+    </w:p>
+    <w:p>
+      <w:pPr>
+        <w:keepNext/>
+        <w:spacing w:after="60" w:line="240" w:lineRule="auto"/>
+        <w:jc w:val="center"/>
+      </w:pPr>
+      <w:r>
+        <w:rPr>
+          <w:noProof/>
+        </w:rPr>
+        <w:drawing>
+          <wp:inline distT="0" distB="0" distL="0" distR="0" wp14:anchorId="5B9A2C21" wp14:editId="449BE7E6">
+            <wp:extent cx="5768975" cy="3377768"/>
+            <wp:effectExtent l="0" t="0" r="0" b="0"/>
+            <wp:docPr id="1012" name="Figura 12"/>
+            <wp:cNvGraphicFramePr>
+              <a:graphicFrameLocks xmlns:a="http://schemas.openxmlformats.org/drawingml/2006/main" noChangeAspect="1"/>
+            </wp:cNvGraphicFramePr>
+            <a:graphic xmlns:a="http://schemas.openxmlformats.org/drawingml/2006/main">
+              <a:graphicData uri="http://schemas.openxmlformats.org/drawingml/2006/picture">
+                <pic:pic xmlns:pic="http://schemas.openxmlformats.org/drawingml/2006/picture">
+                  <pic:nvPicPr>
+                    <pic:cNvPr id="1012" name="Figura 12"/>
+                    <pic:cNvPicPr/>
+                  </pic:nvPicPr>
+                  <pic:blipFill>
+                    <a:blip r:embed="rId19"/>
+                    <a:stretch>
+                      <a:fillRect/>
+                    </a:stretch>
+                  </pic:blipFill>
+                  <pic:spPr>
+                    <a:xfrm>
+                      <a:off x="0" y="0"/>
+                      <a:ext cx="5768975" cy="3377768"/>
+                    </a:xfrm>
+                    <a:prstGeom prst="rect">
+                      <a:avLst/>
+                    </a:prstGeom>
+                  </pic:spPr>
+                </pic:pic>
+              </a:graphicData>
+            </a:graphic>
+          </wp:inline>
+        </w:drawing>
+      </w:r>
+    </w:p>
+    <w:p>
+      <w:pPr>
+        <w:spacing w:after="240" w:line="240" w:lineRule="auto"/>
+      </w:pPr>
+      <w:r>
+        <w:rPr>
+          <w:rFonts w:ascii="Times New Roman" w:hAnsi="Times New Roman" w:cs="Times New Roman"/>
+          <w:sz w:val="20"/>
+          <w:szCs w:val="20"/>
+        </w:rPr>
+        <w:t>Fonte: o autor (2026).</w:t>
+      </w:r>
+    </w:p>
+    <w:p>
+      <w:pPr>
+        <w:keepNext/>
+        <w:spacing w:before="360" w:after="360" w:line="360" w:lineRule="auto"/>
+        <w:outlineLvl w:val="1"/>
+      </w:pPr>
+      <w:bookmarkStart w:id="20" w:name="_Toc231067787"/>
+      <w:r>
+        <w:rPr>
+          <w:rFonts w:ascii="Times New Roman" w:hAnsi="Times New Roman" w:cs="Times New Roman"/>
+          <w:caps/>
+          <w:sz w:val="24"/>
+          <w:szCs w:val="24"/>
+        </w:rPr>
+        <w:t>3.13 Tela de Objetivos Terapêuticos</w:t>
+      </w:r>
+      <w:bookmarkEnd w:id="20"/>
+    </w:p>
+    <w:p>
+      <w:pPr>
+        <w:spacing w:after="0" w:line="360" w:lineRule="auto"/>
+        <w:ind w:firstLine="709"/>
+        <w:jc w:val="both"/>
+      </w:pPr>
+      <w:r>
+        <w:rPr>
+          <w:rFonts w:ascii="Times New Roman" w:hAnsi="Times New Roman" w:cs="Times New Roman"/>
+          <w:b/>
+          <w:sz w:val="24"/>
+          <w:szCs w:val="24"/>
+        </w:rPr>
+        <w:t xml:space="preserve">Objetivo e funcionamento. </w:t>
+      </w:r>
+      <w:r>
+        <w:rPr>
+          <w:rFonts w:ascii="Times New Roman" w:hAnsi="Times New Roman" w:cs="Times New Roman"/>
+          <w:sz w:val="24"/>
+          <w:szCs w:val="24"/>
+        </w:rPr>
+        <w:t>Listar e gerenciar os objetivos terapêuticos de um paciente, organizados por especialidade, com status e percentual atingido.</w:t>
+      </w:r>
+    </w:p>
+    <w:p>
+      <w:pPr>
+        <w:keepNext/>
+        <w:spacing w:before="240" w:after="60" w:line="240" w:lineRule="auto"/>
+        <w:jc w:val="center"/>
+      </w:pPr>
+      <w:r>
+        <w:rPr>
+          <w:rFonts w:ascii="Times New Roman" w:hAnsi="Times New Roman" w:cs="Times New Roman"/>
+          <w:sz w:val="24"/>
+          <w:szCs w:val="24"/>
+        </w:rPr>
+        <w:lastRenderedPageBreak/>
+        <w:t>Figura 13 – Tela de Objetivos Terapêuticos</w:t>
+      </w:r>
+    </w:p>
+    <w:p>
+      <w:pPr>
+        <w:keepNext/>
+        <w:spacing w:after="60" w:line="240" w:lineRule="auto"/>
+        <w:jc w:val="center"/>
+      </w:pPr>
+      <w:r>
+        <w:rPr>
+          <w:noProof/>
+        </w:rPr>
+        <w:drawing>
+          <wp:inline distT="0" distB="0" distL="0" distR="0" wp14:anchorId="2C1C2A56" wp14:editId="4F90FF88">
+            <wp:extent cx="5768975" cy="3395815"/>
+            <wp:effectExtent l="0" t="0" r="0" b="0"/>
+            <wp:docPr id="1013" name="Figura 13"/>
+            <wp:cNvGraphicFramePr>
+              <a:graphicFrameLocks xmlns:a="http://schemas.openxmlformats.org/drawingml/2006/main" noChangeAspect="1"/>
+            </wp:cNvGraphicFramePr>
+            <a:graphic xmlns:a="http://schemas.openxmlformats.org/drawingml/2006/main">
+              <a:graphicData uri="http://schemas.openxmlformats.org/drawingml/2006/picture">
+                <pic:pic xmlns:pic="http://schemas.openxmlformats.org/drawingml/2006/picture">
+                  <pic:nvPicPr>
+                    <pic:cNvPr id="1013" name="Figura 13"/>
+                    <pic:cNvPicPr/>
+                  </pic:nvPicPr>
+                  <pic:blipFill>
+                    <a:blip r:embed="rId20"/>
+                    <a:stretch>
+                      <a:fillRect/>
+                    </a:stretch>
+                  </pic:blipFill>
+                  <pic:spPr>
+                    <a:xfrm>
+                      <a:off x="0" y="0"/>
+                      <a:ext cx="5768975" cy="3395815"/>
+                    </a:xfrm>
+                    <a:prstGeom prst="rect">
+                      <a:avLst/>
+                    </a:prstGeom>
+                  </pic:spPr>
+                </pic:pic>
+              </a:graphicData>
+            </a:graphic>
+          </wp:inline>
+        </w:drawing>
+      </w:r>
+    </w:p>
+    <w:p>
+      <w:pPr>
+        <w:spacing w:after="240" w:line="240" w:lineRule="auto"/>
+      </w:pPr>
+      <w:r>
+        <w:rPr>
+          <w:rFonts w:ascii="Times New Roman" w:hAnsi="Times New Roman" w:cs="Times New Roman"/>
+          <w:sz w:val="20"/>
+          <w:szCs w:val="20"/>
+        </w:rPr>
+        <w:t>Fonte: o autor (2026).</w:t>
+      </w:r>
+    </w:p>
+    <w:p>
+      <w:pPr>
+        <w:keepNext/>
+        <w:spacing w:before="360" w:after="360" w:line="360" w:lineRule="auto"/>
+        <w:outlineLvl w:val="1"/>
+      </w:pPr>
+      <w:bookmarkStart w:id="21" w:name="_Toc231067788"/>
+      <w:r>
+        <w:rPr>
+          <w:rFonts w:ascii="Times New Roman" w:hAnsi="Times New Roman" w:cs="Times New Roman"/>
+          <w:caps/>
+          <w:sz w:val="24"/>
+          <w:szCs w:val="24"/>
+        </w:rPr>
+        <w:t>3.14 Formulário de Objetivo Terapêutico</w:t>
+      </w:r>
+      <w:bookmarkEnd w:id="21"/>
+    </w:p>
+    <w:p>
+      <w:pPr>
+        <w:spacing w:after="0" w:line="360" w:lineRule="auto"/>
+        <w:ind w:firstLine="709"/>
+        <w:jc w:val="both"/>
+      </w:pPr>
+      <w:r>
+        <w:rPr>
+          <w:rFonts w:ascii="Times New Roman" w:hAnsi="Times New Roman" w:cs="Times New Roman"/>
+          <w:b/>
+          <w:sz w:val="24"/>
+          <w:szCs w:val="24"/>
+        </w:rPr>
+        <w:t xml:space="preserve">Objetivo e funcionamento. </w:t>
+      </w:r>
+      <w:r>
+        <w:rPr>
+          <w:rFonts w:ascii="Times New Roman" w:hAnsi="Times New Roman" w:cs="Times New Roman"/>
+          <w:sz w:val="24"/>
+          <w:szCs w:val="24"/>
+        </w:rPr>
+        <w:t>Criar ou editar um objetivo vinculado a paciente e especialidade, com descrição, datas, status e percentual de atingimento.</w:t>
+      </w:r>
+    </w:p>
+    <w:p>
+      <w:pPr>
+        <w:keepNext/>
+        <w:spacing w:before="240" w:after="60" w:line="240" w:lineRule="auto"/>
+        <w:jc w:val="center"/>
+      </w:pPr>
+      <w:r>
+        <w:rPr>
+          <w:rFonts w:ascii="Times New Roman" w:hAnsi="Times New Roman" w:cs="Times New Roman"/>
+          <w:sz w:val="24"/>
+          <w:szCs w:val="24"/>
+        </w:rPr>
+        <w:lastRenderedPageBreak/>
+        <w:t>Figura 14 – Formulário de Objetivo Terapêutico</w:t>
+      </w:r>
+    </w:p>
+    <w:p>
+      <w:pPr>
+        <w:keepNext/>
+        <w:spacing w:after="60" w:line="240" w:lineRule="auto"/>
+        <w:jc w:val="center"/>
+      </w:pPr>
+      <w:r>
+        <w:rPr>
+          <w:noProof/>
+        </w:rPr>
+        <w:drawing>
+          <wp:inline distT="0" distB="0" distL="0" distR="0" wp14:anchorId="08A7D987" wp14:editId="2A50D0B5">
+            <wp:extent cx="5768975" cy="3392807"/>
+            <wp:effectExtent l="0" t="0" r="0" b="0"/>
+            <wp:docPr id="1014" name="Figura 14"/>
+            <wp:cNvGraphicFramePr>
+              <a:graphicFrameLocks xmlns:a="http://schemas.openxmlformats.org/drawingml/2006/main" noChangeAspect="1"/>
+            </wp:cNvGraphicFramePr>
+            <a:graphic xmlns:a="http://schemas.openxmlformats.org/drawingml/2006/main">
+              <a:graphicData uri="http://schemas.openxmlformats.org/drawingml/2006/picture">
+                <pic:pic xmlns:pic="http://schemas.openxmlformats.org/drawingml/2006/picture">
+                  <pic:nvPicPr>
+                    <pic:cNvPr id="1014" name="Figura 14"/>
+                    <pic:cNvPicPr/>
+                  </pic:nvPicPr>
+                  <pic:blipFill>
+                    <a:blip r:embed="rId21"/>
+                    <a:stretch>
+                      <a:fillRect/>
+                    </a:stretch>
+                  </pic:blipFill>
+                  <pic:spPr>
+                    <a:xfrm>
+                      <a:off x="0" y="0"/>
+                      <a:ext cx="5768975" cy="3392807"/>
+                    </a:xfrm>
+                    <a:prstGeom prst="rect">
+                      <a:avLst/>
+                    </a:prstGeom>
+                  </pic:spPr>
+                </pic:pic>
+              </a:graphicData>
+            </a:graphic>
+          </wp:inline>
+        </w:drawing>
+      </w:r>
+    </w:p>
+    <w:p>
+      <w:pPr>
+        <w:spacing w:after="240" w:line="240" w:lineRule="auto"/>
+      </w:pPr>
+      <w:r>
+        <w:rPr>
+          <w:rFonts w:ascii="Times New Roman" w:hAnsi="Times New Roman" w:cs="Times New Roman"/>
+          <w:sz w:val="20"/>
+          <w:szCs w:val="20"/>
+        </w:rPr>
+        <w:t>Fonte: o autor (2026).</w:t>
+      </w:r>
+    </w:p>
+    <w:p>
+      <w:pPr>
+        <w:keepNext/>
+        <w:spacing w:before="360" w:after="360" w:line="360" w:lineRule="auto"/>
+        <w:outlineLvl w:val="1"/>
+      </w:pPr>
+      <w:bookmarkStart w:id="22" w:name="_Toc231067789"/>
+      <w:r>
+        <w:rPr>
+          <w:rFonts w:ascii="Times New Roman" w:hAnsi="Times New Roman" w:cs="Times New Roman"/>
+          <w:caps/>
+          <w:sz w:val="24"/>
+          <w:szCs w:val="24"/>
+        </w:rPr>
+        <w:t>3.15 Módulo de Relatórios</w:t>
+      </w:r>
+      <w:bookmarkEnd w:id="22"/>
+    </w:p>
+    <w:p>
+      <w:pPr>
+        <w:spacing w:after="0" w:line="360" w:lineRule="auto"/>
+        <w:ind w:firstLine="709"/>
+        <w:jc w:val="both"/>
+      </w:pPr>
+      <w:r>
+        <w:rPr>
+          <w:rFonts w:ascii="Times New Roman" w:hAnsi="Times New Roman" w:cs="Times New Roman"/>
+          <w:b/>
+          <w:sz w:val="24"/>
+          <w:szCs w:val="24"/>
+        </w:rPr>
+        <w:t xml:space="preserve">Objetivo e funcionamento. </w:t>
+      </w:r>
+      <w:r>
+        <w:rPr>
+          <w:rFonts w:ascii="Times New Roman" w:hAnsi="Times New Roman" w:cs="Times New Roman"/>
+          <w:sz w:val="24"/>
+          <w:szCs w:val="24"/>
+        </w:rPr>
+        <w:t>Oferecer ao gestor uma visão analítica dos atendimentos por período, com cards de seleção para os sete tipos de relatório.</w:t>
+      </w:r>
+    </w:p>
+    <w:p>
+      <w:pPr>
+        <w:keepNext/>
+        <w:spacing w:before="240" w:after="60" w:line="240" w:lineRule="auto"/>
+        <w:jc w:val="center"/>
+      </w:pPr>
+      <w:r>
+        <w:rPr>
+          <w:rFonts w:ascii="Times New Roman" w:hAnsi="Times New Roman" w:cs="Times New Roman"/>
+          <w:sz w:val="24"/>
+          <w:szCs w:val="24"/>
+        </w:rPr>
+        <w:lastRenderedPageBreak/>
+        <w:t>Figura 15 – Módulo de Relatórios</w:t>
+      </w:r>
+    </w:p>
+    <w:p>
+      <w:pPr>
+        <w:keepNext/>
+        <w:spacing w:after="60" w:line="240" w:lineRule="auto"/>
+        <w:jc w:val="center"/>
+      </w:pPr>
+      <w:r>
+        <w:rPr>
+          <w:noProof/>
+        </w:rPr>
+        <w:drawing>
+          <wp:inline distT="0" distB="0" distL="0" distR="0" wp14:anchorId="79638039" wp14:editId="793B0E0E">
+            <wp:extent cx="5768975" cy="3386791"/>
+            <wp:effectExtent l="0" t="0" r="0" b="0"/>
+            <wp:docPr id="1015" name="Figura 15"/>
+            <wp:cNvGraphicFramePr>
+              <a:graphicFrameLocks xmlns:a="http://schemas.openxmlformats.org/drawingml/2006/main" noChangeAspect="1"/>
+            </wp:cNvGraphicFramePr>
+            <a:graphic xmlns:a="http://schemas.openxmlformats.org/drawingml/2006/main">
+              <a:graphicData uri="http://schemas.openxmlformats.org/drawingml/2006/picture">
+                <pic:pic xmlns:pic="http://schemas.openxmlformats.org/drawingml/2006/picture">
+                  <pic:nvPicPr>
+                    <pic:cNvPr id="1015" name="Figura 15"/>
+                    <pic:cNvPicPr/>
+                  </pic:nvPicPr>
+                  <pic:blipFill>
+                    <a:blip r:embed="rId22"/>
                     <a:stretch>
                       <a:fillRect/>
                     </a:stretch>
@@ -8793,7 +9721,7 @@
         <w:spacing w:before="360" w:after="360" w:line="360" w:lineRule="auto"/>
         <w:outlineLvl w:val="1"/>
       </w:pPr>
-      <w:bookmarkStart w:id="15" w:name="_Toc231067575"/>
+      <w:bookmarkStart w:id="23" w:name="_Toc231067790"/>
       <w:r>
         <w:rPr>
           <w:rFonts w:ascii="Times New Roman" w:hAnsi="Times New Roman" w:cs="Times New Roman"/>
@@ -8801,9 +9729,9 @@
           <w:sz w:val="24"/>
           <w:szCs w:val="24"/>
         </w:rPr>
-        <w:t>3.8 Formulário de Cadastro/Edição de Especialidade</w:t>
-      </w:r>
-      <w:bookmarkEnd w:id="15"/>
+        <w:t>3.16 Visualizador de Relatórios</w:t>
+      </w:r>
+      <w:bookmarkEnd w:id="23"/>
     </w:p>
     <w:p>
       <w:pPr>
@@ -8826,7 +9754,7 @@
           <w:sz w:val="24"/>
           <w:szCs w:val="24"/>
         </w:rPr>
-        <w:t>Registrar ou atualizar uma especialidade, com nome, sigla do conselho e cor em hexadecimal, exibida em preview em tempo real.</w:t>
+        <w:t>Exibir o resultado de um relatório em formato tabular, com filtros de período e impressão paginada via PrintDocument.</w:t>
       </w:r>
     </w:p>
     <w:p>
@@ -8842,7 +9770,7 @@
           <w:szCs w:val="24"/>
         </w:rPr>
         <w:lastRenderedPageBreak/>
-        <w:t>Figura 8 – Formulário de Cadastro/Edição de Especialidade</w:t>
+        <w:t>Figura 16 – Visualizador de Relatórios</w:t>
       </w:r>
     </w:p>
     <w:p>
@@ -8856,10 +9784,10 @@
           <w:noProof/>
         </w:rPr>
         <w:drawing>
-          <wp:inline distT="0" distB="0" distL="0" distR="0" wp14:anchorId="60BCD817" wp14:editId="47BADEDE">
-            <wp:extent cx="5768975" cy="3395815"/>
+          <wp:inline distT="0" distB="0" distL="0" distR="0" wp14:anchorId="699718F5" wp14:editId="64A5622B">
+            <wp:extent cx="5768975" cy="3392807"/>
             <wp:effectExtent l="0" t="0" r="0" b="0"/>
-            <wp:docPr id="1008" name="Figura 8"/>
+            <wp:docPr id="1016" name="Figura 16"/>
             <wp:cNvGraphicFramePr>
               <a:graphicFrameLocks xmlns:a="http://schemas.openxmlformats.org/drawingml/2006/main" noChangeAspect="1"/>
             </wp:cNvGraphicFramePr>
@@ -8867,719 +9795,11 @@
               <a:graphicData uri="http://schemas.openxmlformats.org/drawingml/2006/picture">
                 <pic:pic xmlns:pic="http://schemas.openxmlformats.org/drawingml/2006/picture">
                   <pic:nvPicPr>
-                    <pic:cNvPr id="1008" name="Figura 8"/>
+                    <pic:cNvPr id="1016" name="Figura 16"/>
                     <pic:cNvPicPr/>
                   </pic:nvPicPr>
                   <pic:blipFill>
-                    <a:blip r:embed="rId16"/>
-                    <a:stretch>
-                      <a:fillRect/>
-                    </a:stretch>
-                  </pic:blipFill>
-                  <pic:spPr>
-                    <a:xfrm>
-                      <a:off x="0" y="0"/>
-                      <a:ext cx="5768975" cy="3395815"/>
-                    </a:xfrm>
-                    <a:prstGeom prst="rect">
-                      <a:avLst/>
-                    </a:prstGeom>
-                  </pic:spPr>
-                </pic:pic>
-              </a:graphicData>
-            </a:graphic>
-          </wp:inline>
-        </w:drawing>
-      </w:r>
-    </w:p>
-    <w:p>
-      <w:pPr>
-        <w:spacing w:after="240" w:line="240" w:lineRule="auto"/>
-      </w:pPr>
-      <w:r>
-        <w:rPr>
-          <w:rFonts w:ascii="Times New Roman" w:hAnsi="Times New Roman" w:cs="Times New Roman"/>
-          <w:sz w:val="20"/>
-          <w:szCs w:val="20"/>
-        </w:rPr>
-        <w:t>Fonte: o autor (2026).</w:t>
-      </w:r>
-    </w:p>
-    <w:p>
-      <w:pPr>
-        <w:keepNext/>
-        <w:spacing w:before="360" w:after="360" w:line="360" w:lineRule="auto"/>
-        <w:outlineLvl w:val="1"/>
-      </w:pPr>
-      <w:bookmarkStart w:id="16" w:name="_Toc231067576"/>
-      <w:r>
-        <w:rPr>
-          <w:rFonts w:ascii="Times New Roman" w:hAnsi="Times New Roman" w:cs="Times New Roman"/>
-          <w:caps/>
-          <w:sz w:val="24"/>
-          <w:szCs w:val="24"/>
-        </w:rPr>
-        <w:t>3.9 Módulo de Salas</w:t>
-      </w:r>
-      <w:bookmarkEnd w:id="16"/>
-    </w:p>
-    <w:p>
-      <w:pPr>
-        <w:spacing w:after="0" w:line="360" w:lineRule="auto"/>
-        <w:ind w:firstLine="709"/>
-        <w:jc w:val="both"/>
-      </w:pPr>
-      <w:r>
-        <w:rPr>
-          <w:rFonts w:ascii="Times New Roman" w:hAnsi="Times New Roman" w:cs="Times New Roman"/>
-          <w:b/>
-          <w:sz w:val="24"/>
-          <w:szCs w:val="24"/>
-        </w:rPr>
-        <w:t xml:space="preserve">Objetivo e funcionamento. </w:t>
-      </w:r>
-      <w:r>
-        <w:rPr>
-          <w:rFonts w:ascii="Times New Roman" w:hAnsi="Times New Roman" w:cs="Times New Roman"/>
-          <w:sz w:val="24"/>
-          <w:szCs w:val="24"/>
-        </w:rPr>
-        <w:t>Gerenciar os espaços físicos de atendimento, registrando capacidade e recursos sensoriais relevantes ao perfil de pacientes com TEA.</w:t>
-      </w:r>
-    </w:p>
-    <w:p>
-      <w:pPr>
-        <w:keepNext/>
-        <w:spacing w:before="240" w:after="60" w:line="240" w:lineRule="auto"/>
-        <w:jc w:val="center"/>
-      </w:pPr>
-      <w:r>
-        <w:rPr>
-          <w:rFonts w:ascii="Times New Roman" w:hAnsi="Times New Roman" w:cs="Times New Roman"/>
-          <w:sz w:val="24"/>
-          <w:szCs w:val="24"/>
-        </w:rPr>
-        <w:lastRenderedPageBreak/>
-        <w:t>Figura 9 – Módulo de Salas</w:t>
-      </w:r>
-    </w:p>
-    <w:p>
-      <w:pPr>
-        <w:keepNext/>
-        <w:spacing w:after="60" w:line="240" w:lineRule="auto"/>
-        <w:jc w:val="center"/>
-      </w:pPr>
-      <w:r>
-        <w:rPr>
-          <w:noProof/>
-        </w:rPr>
-        <w:drawing>
-          <wp:inline distT="0" distB="0" distL="0" distR="0" wp14:anchorId="6704D5CB" wp14:editId="3F8AC335">
-            <wp:extent cx="5768975" cy="3377768"/>
-            <wp:effectExtent l="0" t="0" r="0" b="0"/>
-            <wp:docPr id="1009" name="Figura 9"/>
-            <wp:cNvGraphicFramePr>
-              <a:graphicFrameLocks xmlns:a="http://schemas.openxmlformats.org/drawingml/2006/main" noChangeAspect="1"/>
-            </wp:cNvGraphicFramePr>
-            <a:graphic xmlns:a="http://schemas.openxmlformats.org/drawingml/2006/main">
-              <a:graphicData uri="http://schemas.openxmlformats.org/drawingml/2006/picture">
-                <pic:pic xmlns:pic="http://schemas.openxmlformats.org/drawingml/2006/picture">
-                  <pic:nvPicPr>
-                    <pic:cNvPr id="1009" name="Figura 9"/>
-                    <pic:cNvPicPr/>
-                  </pic:nvPicPr>
-                  <pic:blipFill>
-                    <a:blip r:embed="rId17"/>
-                    <a:stretch>
-                      <a:fillRect/>
-                    </a:stretch>
-                  </pic:blipFill>
-                  <pic:spPr>
-                    <a:xfrm>
-                      <a:off x="0" y="0"/>
-                      <a:ext cx="5768975" cy="3377768"/>
-                    </a:xfrm>
-                    <a:prstGeom prst="rect">
-                      <a:avLst/>
-                    </a:prstGeom>
-                  </pic:spPr>
-                </pic:pic>
-              </a:graphicData>
-            </a:graphic>
-          </wp:inline>
-        </w:drawing>
-      </w:r>
-    </w:p>
-    <w:p>
-      <w:pPr>
-        <w:spacing w:after="240" w:line="240" w:lineRule="auto"/>
-      </w:pPr>
-      <w:r>
-        <w:rPr>
-          <w:rFonts w:ascii="Times New Roman" w:hAnsi="Times New Roman" w:cs="Times New Roman"/>
-          <w:sz w:val="20"/>
-          <w:szCs w:val="20"/>
-        </w:rPr>
-        <w:t>Fonte: o autor (2026).</w:t>
-      </w:r>
-    </w:p>
-    <w:p>
-      <w:pPr>
-        <w:keepNext/>
-        <w:spacing w:before="360" w:after="360" w:line="360" w:lineRule="auto"/>
-        <w:outlineLvl w:val="1"/>
-      </w:pPr>
-      <w:bookmarkStart w:id="17" w:name="_Toc231067577"/>
-      <w:r>
-        <w:rPr>
-          <w:rFonts w:ascii="Times New Roman" w:hAnsi="Times New Roman" w:cs="Times New Roman"/>
-          <w:caps/>
-          <w:sz w:val="24"/>
-          <w:szCs w:val="24"/>
-        </w:rPr>
-        <w:t>3.10 Módulo de Agenda</w:t>
-      </w:r>
-      <w:bookmarkEnd w:id="17"/>
-    </w:p>
-    <w:p>
-      <w:pPr>
-        <w:spacing w:after="0" w:line="360" w:lineRule="auto"/>
-        <w:ind w:firstLine="709"/>
-        <w:jc w:val="both"/>
-      </w:pPr>
-      <w:r>
-        <w:rPr>
-          <w:rFonts w:ascii="Times New Roman" w:hAnsi="Times New Roman" w:cs="Times New Roman"/>
-          <w:b/>
-          <w:sz w:val="24"/>
-          <w:szCs w:val="24"/>
-        </w:rPr>
-        <w:t xml:space="preserve">Objetivo e funcionamento. </w:t>
-      </w:r>
-      <w:r>
-        <w:rPr>
-          <w:rFonts w:ascii="Times New Roman" w:hAnsi="Times New Roman" w:cs="Times New Roman"/>
-          <w:sz w:val="24"/>
-          <w:szCs w:val="24"/>
-        </w:rPr>
-        <w:t>Visualizar, criar, editar e gerenciar o status dos agendamentos, agrupados por data e identificados por dot colorido de status e chip de especialidade.</w:t>
-      </w:r>
-    </w:p>
-    <w:p>
-      <w:pPr>
-        <w:keepNext/>
-        <w:spacing w:before="240" w:after="60" w:line="240" w:lineRule="auto"/>
-        <w:jc w:val="center"/>
-      </w:pPr>
-      <w:r>
-        <w:rPr>
-          <w:rFonts w:ascii="Times New Roman" w:hAnsi="Times New Roman" w:cs="Times New Roman"/>
-          <w:sz w:val="24"/>
-          <w:szCs w:val="24"/>
-        </w:rPr>
-        <w:lastRenderedPageBreak/>
-        <w:t>Figura 10 – Módulo de Agenda</w:t>
-      </w:r>
-    </w:p>
-    <w:p>
-      <w:pPr>
-        <w:keepNext/>
-        <w:spacing w:after="60" w:line="240" w:lineRule="auto"/>
-        <w:jc w:val="center"/>
-      </w:pPr>
-      <w:r>
-        <w:rPr>
-          <w:noProof/>
-        </w:rPr>
-        <w:drawing>
-          <wp:inline distT="0" distB="0" distL="0" distR="0" wp14:anchorId="496FA8C3" wp14:editId="5BAA18E1">
-            <wp:extent cx="5768975" cy="3374760"/>
-            <wp:effectExtent l="0" t="0" r="0" b="0"/>
-            <wp:docPr id="1010" name="Figura 10"/>
-            <wp:cNvGraphicFramePr>
-              <a:graphicFrameLocks xmlns:a="http://schemas.openxmlformats.org/drawingml/2006/main" noChangeAspect="1"/>
-            </wp:cNvGraphicFramePr>
-            <a:graphic xmlns:a="http://schemas.openxmlformats.org/drawingml/2006/main">
-              <a:graphicData uri="http://schemas.openxmlformats.org/drawingml/2006/picture">
-                <pic:pic xmlns:pic="http://schemas.openxmlformats.org/drawingml/2006/picture">
-                  <pic:nvPicPr>
-                    <pic:cNvPr id="1010" name="Figura 10"/>
-                    <pic:cNvPicPr/>
-                  </pic:nvPicPr>
-                  <pic:blipFill>
-                    <a:blip r:embed="rId18"/>
-                    <a:stretch>
-                      <a:fillRect/>
-                    </a:stretch>
-                  </pic:blipFill>
-                  <pic:spPr>
-                    <a:xfrm>
-                      <a:off x="0" y="0"/>
-                      <a:ext cx="5768975" cy="3374760"/>
-                    </a:xfrm>
-                    <a:prstGeom prst="rect">
-                      <a:avLst/>
-                    </a:prstGeom>
-                  </pic:spPr>
-                </pic:pic>
-              </a:graphicData>
-            </a:graphic>
-          </wp:inline>
-        </w:drawing>
-      </w:r>
-    </w:p>
-    <w:p>
-      <w:pPr>
-        <w:spacing w:after="240" w:line="240" w:lineRule="auto"/>
-      </w:pPr>
-      <w:r>
-        <w:rPr>
-          <w:rFonts w:ascii="Times New Roman" w:hAnsi="Times New Roman" w:cs="Times New Roman"/>
-          <w:sz w:val="20"/>
-          <w:szCs w:val="20"/>
-        </w:rPr>
-        <w:t>Fonte: o autor (2026).</w:t>
-      </w:r>
-    </w:p>
-    <w:p>
-      <w:pPr>
-        <w:keepNext/>
-        <w:spacing w:before="360" w:after="360" w:line="360" w:lineRule="auto"/>
-        <w:outlineLvl w:val="1"/>
-      </w:pPr>
-      <w:bookmarkStart w:id="18" w:name="_Toc231067578"/>
-      <w:r>
-        <w:rPr>
-          <w:rFonts w:ascii="Times New Roman" w:hAnsi="Times New Roman" w:cs="Times New Roman"/>
-          <w:caps/>
-          <w:sz w:val="24"/>
-          <w:szCs w:val="24"/>
-        </w:rPr>
-        <w:t>3.11 Formulário de Novo/Editar Agendamento</w:t>
-      </w:r>
-      <w:bookmarkEnd w:id="18"/>
-    </w:p>
-    <w:p>
-      <w:pPr>
-        <w:spacing w:after="0" w:line="360" w:lineRule="auto"/>
-        <w:ind w:firstLine="709"/>
-        <w:jc w:val="both"/>
-      </w:pPr>
-      <w:r>
-        <w:rPr>
-          <w:rFonts w:ascii="Times New Roman" w:hAnsi="Times New Roman" w:cs="Times New Roman"/>
-          <w:b/>
-          <w:sz w:val="24"/>
-          <w:szCs w:val="24"/>
-        </w:rPr>
-        <w:t xml:space="preserve">Objetivo e funcionamento. </w:t>
-      </w:r>
-      <w:r>
-        <w:rPr>
-          <w:rFonts w:ascii="Times New Roman" w:hAnsi="Times New Roman" w:cs="Times New Roman"/>
-          <w:sz w:val="24"/>
-          <w:szCs w:val="24"/>
-        </w:rPr>
-        <w:t>Cadastrar ou editar um agendamento. A validação verifica campos obrigatórios, horário de fim posterior ao início e ausência de conflito de horário.</w:t>
-      </w:r>
-    </w:p>
-    <w:p>
-      <w:pPr>
-        <w:keepNext/>
-        <w:spacing w:before="240" w:after="60" w:line="240" w:lineRule="auto"/>
-        <w:jc w:val="center"/>
-      </w:pPr>
-      <w:r>
-        <w:rPr>
-          <w:rFonts w:ascii="Times New Roman" w:hAnsi="Times New Roman" w:cs="Times New Roman"/>
-          <w:sz w:val="24"/>
-          <w:szCs w:val="24"/>
-        </w:rPr>
-        <w:lastRenderedPageBreak/>
-        <w:t>Figura 11 – Formulário de Novo/Editar Agendamento</w:t>
-      </w:r>
-    </w:p>
-    <w:p>
-      <w:pPr>
-        <w:keepNext/>
-        <w:spacing w:after="60" w:line="240" w:lineRule="auto"/>
-        <w:jc w:val="center"/>
-      </w:pPr>
-      <w:r>
-        <w:rPr>
-          <w:noProof/>
-        </w:rPr>
-        <w:drawing>
-          <wp:inline distT="0" distB="0" distL="0" distR="0" wp14:anchorId="278959FD" wp14:editId="5B4E081D">
-            <wp:extent cx="5768975" cy="3395815"/>
-            <wp:effectExtent l="0" t="0" r="0" b="0"/>
-            <wp:docPr id="1011" name="Figura 11"/>
-            <wp:cNvGraphicFramePr>
-              <a:graphicFrameLocks xmlns:a="http://schemas.openxmlformats.org/drawingml/2006/main" noChangeAspect="1"/>
-            </wp:cNvGraphicFramePr>
-            <a:graphic xmlns:a="http://schemas.openxmlformats.org/drawingml/2006/main">
-              <a:graphicData uri="http://schemas.openxmlformats.org/drawingml/2006/picture">
-                <pic:pic xmlns:pic="http://schemas.openxmlformats.org/drawingml/2006/picture">
-                  <pic:nvPicPr>
-                    <pic:cNvPr id="1011" name="Figura 11"/>
-                    <pic:cNvPicPr/>
-                  </pic:nvPicPr>
-                  <pic:blipFill>
-                    <a:blip r:embed="rId19"/>
-                    <a:stretch>
-                      <a:fillRect/>
-                    </a:stretch>
-                  </pic:blipFill>
-                  <pic:spPr>
-                    <a:xfrm>
-                      <a:off x="0" y="0"/>
-                      <a:ext cx="5768975" cy="3395815"/>
-                    </a:xfrm>
-                    <a:prstGeom prst="rect">
-                      <a:avLst/>
-                    </a:prstGeom>
-                  </pic:spPr>
-                </pic:pic>
-              </a:graphicData>
-            </a:graphic>
-          </wp:inline>
-        </w:drawing>
-      </w:r>
-    </w:p>
-    <w:p>
-      <w:pPr>
-        <w:spacing w:after="240" w:line="240" w:lineRule="auto"/>
-      </w:pPr>
-      <w:r>
-        <w:rPr>
-          <w:rFonts w:ascii="Times New Roman" w:hAnsi="Times New Roman" w:cs="Times New Roman"/>
-          <w:sz w:val="20"/>
-          <w:szCs w:val="20"/>
-        </w:rPr>
-        <w:t>Fonte: o autor (2026).</w:t>
-      </w:r>
-    </w:p>
-    <w:p>
-      <w:pPr>
-        <w:keepNext/>
-        <w:spacing w:before="360" w:after="360" w:line="360" w:lineRule="auto"/>
-        <w:outlineLvl w:val="1"/>
-      </w:pPr>
-      <w:bookmarkStart w:id="19" w:name="_Toc231067579"/>
-      <w:r>
-        <w:rPr>
-          <w:rFonts w:ascii="Times New Roman" w:hAnsi="Times New Roman" w:cs="Times New Roman"/>
-          <w:caps/>
-          <w:sz w:val="24"/>
-          <w:szCs w:val="24"/>
-        </w:rPr>
-        <w:t>3.12 Formulário de Evolução de Sessão</w:t>
-      </w:r>
-      <w:bookmarkEnd w:id="19"/>
-    </w:p>
-    <w:p>
-      <w:pPr>
-        <w:spacing w:after="0" w:line="360" w:lineRule="auto"/>
-        <w:ind w:firstLine="709"/>
-        <w:jc w:val="both"/>
-      </w:pPr>
-      <w:r>
-        <w:rPr>
-          <w:rFonts w:ascii="Times New Roman" w:hAnsi="Times New Roman" w:cs="Times New Roman"/>
-          <w:b/>
-          <w:sz w:val="24"/>
-          <w:szCs w:val="24"/>
-        </w:rPr>
-        <w:t xml:space="preserve">Objetivo e funcionamento. </w:t>
-      </w:r>
-      <w:r>
-        <w:rPr>
-          <w:rFonts w:ascii="Times New Roman" w:hAnsi="Times New Roman" w:cs="Times New Roman"/>
-          <w:sz w:val="24"/>
-          <w:szCs w:val="24"/>
-        </w:rPr>
-        <w:t>Registrar o relato clínico de uma sessão realizada, com conteúdo, comportamentos observados, próximos objetivos e escalas de humor e engajamento.</w:t>
-      </w:r>
-    </w:p>
-    <w:p>
-      <w:pPr>
-        <w:keepNext/>
-        <w:spacing w:before="240" w:after="60" w:line="240" w:lineRule="auto"/>
-        <w:jc w:val="center"/>
-      </w:pPr>
-      <w:r>
-        <w:rPr>
-          <w:rFonts w:ascii="Times New Roman" w:hAnsi="Times New Roman" w:cs="Times New Roman"/>
-          <w:sz w:val="24"/>
-          <w:szCs w:val="24"/>
-        </w:rPr>
-        <w:lastRenderedPageBreak/>
-        <w:t>Figura 12 – Formulário de Evolução de Sessão</w:t>
-      </w:r>
-    </w:p>
-    <w:p>
-      <w:pPr>
-        <w:keepNext/>
-        <w:spacing w:after="60" w:line="240" w:lineRule="auto"/>
-        <w:jc w:val="center"/>
-      </w:pPr>
-      <w:r>
-        <w:rPr>
-          <w:noProof/>
-        </w:rPr>
-        <w:drawing>
-          <wp:inline distT="0" distB="0" distL="0" distR="0" wp14:anchorId="5B9A2C21" wp14:editId="449BE7E6">
-            <wp:extent cx="5768975" cy="3377768"/>
-            <wp:effectExtent l="0" t="0" r="0" b="0"/>
-            <wp:docPr id="1012" name="Figura 12"/>
-            <wp:cNvGraphicFramePr>
-              <a:graphicFrameLocks xmlns:a="http://schemas.openxmlformats.org/drawingml/2006/main" noChangeAspect="1"/>
-            </wp:cNvGraphicFramePr>
-            <a:graphic xmlns:a="http://schemas.openxmlformats.org/drawingml/2006/main">
-              <a:graphicData uri="http://schemas.openxmlformats.org/drawingml/2006/picture">
-                <pic:pic xmlns:pic="http://schemas.openxmlformats.org/drawingml/2006/picture">
-                  <pic:nvPicPr>
-                    <pic:cNvPr id="1012" name="Figura 12"/>
-                    <pic:cNvPicPr/>
-                  </pic:nvPicPr>
-                  <pic:blipFill>
-                    <a:blip r:embed="rId20"/>
-                    <a:stretch>
-                      <a:fillRect/>
-                    </a:stretch>
-                  </pic:blipFill>
-                  <pic:spPr>
-                    <a:xfrm>
-                      <a:off x="0" y="0"/>
-                      <a:ext cx="5768975" cy="3377768"/>
-                    </a:xfrm>
-                    <a:prstGeom prst="rect">
-                      <a:avLst/>
-                    </a:prstGeom>
-                  </pic:spPr>
-                </pic:pic>
-              </a:graphicData>
-            </a:graphic>
-          </wp:inline>
-        </w:drawing>
-      </w:r>
-    </w:p>
-    <w:p>
-      <w:pPr>
-        <w:spacing w:after="240" w:line="240" w:lineRule="auto"/>
-      </w:pPr>
-      <w:r>
-        <w:rPr>
-          <w:rFonts w:ascii="Times New Roman" w:hAnsi="Times New Roman" w:cs="Times New Roman"/>
-          <w:sz w:val="20"/>
-          <w:szCs w:val="20"/>
-        </w:rPr>
-        <w:t>Fonte: o autor (2026).</w:t>
-      </w:r>
-    </w:p>
-    <w:p>
-      <w:pPr>
-        <w:keepNext/>
-        <w:spacing w:before="360" w:after="360" w:line="360" w:lineRule="auto"/>
-        <w:outlineLvl w:val="1"/>
-      </w:pPr>
-      <w:bookmarkStart w:id="20" w:name="_Toc231067580"/>
-      <w:r>
-        <w:rPr>
-          <w:rFonts w:ascii="Times New Roman" w:hAnsi="Times New Roman" w:cs="Times New Roman"/>
-          <w:caps/>
-          <w:sz w:val="24"/>
-          <w:szCs w:val="24"/>
-        </w:rPr>
-        <w:t>3.13 Tela de Objetivos Terapêuticos</w:t>
-      </w:r>
-      <w:bookmarkEnd w:id="20"/>
-    </w:p>
-    <w:p>
-      <w:pPr>
-        <w:spacing w:after="0" w:line="360" w:lineRule="auto"/>
-        <w:ind w:firstLine="709"/>
-        <w:jc w:val="both"/>
-      </w:pPr>
-      <w:r>
-        <w:rPr>
-          <w:rFonts w:ascii="Times New Roman" w:hAnsi="Times New Roman" w:cs="Times New Roman"/>
-          <w:b/>
-          <w:sz w:val="24"/>
-          <w:szCs w:val="24"/>
-        </w:rPr>
-        <w:t xml:space="preserve">Objetivo e funcionamento. </w:t>
-      </w:r>
-      <w:r>
-        <w:rPr>
-          <w:rFonts w:ascii="Times New Roman" w:hAnsi="Times New Roman" w:cs="Times New Roman"/>
-          <w:sz w:val="24"/>
-          <w:szCs w:val="24"/>
-        </w:rPr>
-        <w:t>Listar e gerenciar os objetivos terapêuticos de um paciente, organizados por especialidade, com status e percentual atingido.</w:t>
-      </w:r>
-    </w:p>
-    <w:p>
-      <w:pPr>
-        <w:keepNext/>
-        <w:spacing w:before="240" w:after="60" w:line="240" w:lineRule="auto"/>
-        <w:jc w:val="center"/>
-      </w:pPr>
-      <w:r>
-        <w:rPr>
-          <w:rFonts w:ascii="Times New Roman" w:hAnsi="Times New Roman" w:cs="Times New Roman"/>
-          <w:sz w:val="24"/>
-          <w:szCs w:val="24"/>
-        </w:rPr>
-        <w:lastRenderedPageBreak/>
-        <w:t>Figura 13 – Tela de Objetivos Terapêuticos</w:t>
-      </w:r>
-    </w:p>
-    <w:p>
-      <w:pPr>
-        <w:keepNext/>
-        <w:spacing w:after="60" w:line="240" w:lineRule="auto"/>
-        <w:jc w:val="center"/>
-      </w:pPr>
-      <w:r>
-        <w:rPr>
-          <w:noProof/>
-        </w:rPr>
-        <w:drawing>
-          <wp:inline distT="0" distB="0" distL="0" distR="0" wp14:anchorId="2C1C2A56" wp14:editId="4F90FF88">
-            <wp:extent cx="5768975" cy="3395815"/>
-            <wp:effectExtent l="0" t="0" r="0" b="0"/>
-            <wp:docPr id="1013" name="Figura 13"/>
-            <wp:cNvGraphicFramePr>
-              <a:graphicFrameLocks xmlns:a="http://schemas.openxmlformats.org/drawingml/2006/main" noChangeAspect="1"/>
-            </wp:cNvGraphicFramePr>
-            <a:graphic xmlns:a="http://schemas.openxmlformats.org/drawingml/2006/main">
-              <a:graphicData uri="http://schemas.openxmlformats.org/drawingml/2006/picture">
-                <pic:pic xmlns:pic="http://schemas.openxmlformats.org/drawingml/2006/picture">
-                  <pic:nvPicPr>
-                    <pic:cNvPr id="1013" name="Figura 13"/>
-                    <pic:cNvPicPr/>
-                  </pic:nvPicPr>
-                  <pic:blipFill>
-                    <a:blip r:embed="rId21"/>
-                    <a:stretch>
-                      <a:fillRect/>
-                    </a:stretch>
-                  </pic:blipFill>
-                  <pic:spPr>
-                    <a:xfrm>
-                      <a:off x="0" y="0"/>
-                      <a:ext cx="5768975" cy="3395815"/>
-                    </a:xfrm>
-                    <a:prstGeom prst="rect">
-                      <a:avLst/>
-                    </a:prstGeom>
-                  </pic:spPr>
-                </pic:pic>
-              </a:graphicData>
-            </a:graphic>
-          </wp:inline>
-        </w:drawing>
-      </w:r>
-    </w:p>
-    <w:p>
-      <w:pPr>
-        <w:spacing w:after="240" w:line="240" w:lineRule="auto"/>
-      </w:pPr>
-      <w:r>
-        <w:rPr>
-          <w:rFonts w:ascii="Times New Roman" w:hAnsi="Times New Roman" w:cs="Times New Roman"/>
-          <w:sz w:val="20"/>
-          <w:szCs w:val="20"/>
-        </w:rPr>
-        <w:t>Fonte: o autor (2026).</w:t>
-      </w:r>
-    </w:p>
-    <w:p>
-      <w:pPr>
-        <w:keepNext/>
-        <w:spacing w:before="360" w:after="360" w:line="360" w:lineRule="auto"/>
-        <w:outlineLvl w:val="1"/>
-      </w:pPr>
-      <w:bookmarkStart w:id="21" w:name="_Toc231067581"/>
-      <w:r>
-        <w:rPr>
-          <w:rFonts w:ascii="Times New Roman" w:hAnsi="Times New Roman" w:cs="Times New Roman"/>
-          <w:caps/>
-          <w:sz w:val="24"/>
-          <w:szCs w:val="24"/>
-        </w:rPr>
-        <w:t>3.14 Formulário de Objetivo Terapêutico</w:t>
-      </w:r>
-      <w:bookmarkEnd w:id="21"/>
-    </w:p>
-    <w:p>
-      <w:pPr>
-        <w:spacing w:after="0" w:line="360" w:lineRule="auto"/>
-        <w:ind w:firstLine="709"/>
-        <w:jc w:val="both"/>
-      </w:pPr>
-      <w:r>
-        <w:rPr>
-          <w:rFonts w:ascii="Times New Roman" w:hAnsi="Times New Roman" w:cs="Times New Roman"/>
-          <w:b/>
-          <w:sz w:val="24"/>
-          <w:szCs w:val="24"/>
-        </w:rPr>
-        <w:t xml:space="preserve">Objetivo e funcionamento. </w:t>
-      </w:r>
-      <w:r>
-        <w:rPr>
-          <w:rFonts w:ascii="Times New Roman" w:hAnsi="Times New Roman" w:cs="Times New Roman"/>
-          <w:sz w:val="24"/>
-          <w:szCs w:val="24"/>
-        </w:rPr>
-        <w:t>Criar ou editar um objetivo vinculado a paciente e especialidade, com descrição, datas, status e percentual de atingimento.</w:t>
-      </w:r>
-    </w:p>
-    <w:p>
-      <w:pPr>
-        <w:keepNext/>
-        <w:spacing w:before="240" w:after="60" w:line="240" w:lineRule="auto"/>
-        <w:jc w:val="center"/>
-      </w:pPr>
-      <w:r>
-        <w:rPr>
-          <w:rFonts w:ascii="Times New Roman" w:hAnsi="Times New Roman" w:cs="Times New Roman"/>
-          <w:sz w:val="24"/>
-          <w:szCs w:val="24"/>
-        </w:rPr>
-        <w:lastRenderedPageBreak/>
-        <w:t>Figura 14 – Formulário de Objetivo Terapêutico</w:t>
-      </w:r>
-    </w:p>
-    <w:p>
-      <w:pPr>
-        <w:keepNext/>
-        <w:spacing w:after="60" w:line="240" w:lineRule="auto"/>
-        <w:jc w:val="center"/>
-      </w:pPr>
-      <w:r>
-        <w:rPr>
-          <w:noProof/>
-        </w:rPr>
-        <w:drawing>
-          <wp:inline distT="0" distB="0" distL="0" distR="0" wp14:anchorId="08A7D987" wp14:editId="2A50D0B5">
-            <wp:extent cx="5768975" cy="3392807"/>
-            <wp:effectExtent l="0" t="0" r="0" b="0"/>
-            <wp:docPr id="1014" name="Figura 14"/>
-            <wp:cNvGraphicFramePr>
-              <a:graphicFrameLocks xmlns:a="http://schemas.openxmlformats.org/drawingml/2006/main" noChangeAspect="1"/>
-            </wp:cNvGraphicFramePr>
-            <a:graphic xmlns:a="http://schemas.openxmlformats.org/drawingml/2006/main">
-              <a:graphicData uri="http://schemas.openxmlformats.org/drawingml/2006/picture">
-                <pic:pic xmlns:pic="http://schemas.openxmlformats.org/drawingml/2006/picture">
-                  <pic:nvPicPr>
-                    <pic:cNvPr id="1014" name="Figura 14"/>
-                    <pic:cNvPicPr/>
-                  </pic:nvPicPr>
-                  <pic:blipFill>
-                    <a:blip r:embed="rId22"/>
+                    <a:blip r:embed="rId23"/>
                     <a:stretch>
                       <a:fillRect/>
                     </a:stretch>
@@ -9616,20 +9836,23 @@
     <w:p>
       <w:pPr>
         <w:keepNext/>
+        <w:pageBreakBefore/>
         <w:spacing w:before="360" w:after="360" w:line="360" w:lineRule="auto"/>
-        <w:outlineLvl w:val="1"/>
-      </w:pPr>
-      <w:bookmarkStart w:id="22" w:name="_Toc231067582"/>
-      <w:r>
-        <w:rPr>
-          <w:rFonts w:ascii="Times New Roman" w:hAnsi="Times New Roman" w:cs="Times New Roman"/>
+        <w:outlineLvl w:val="0"/>
+      </w:pPr>
+      <w:bookmarkStart w:id="24" w:name="_Toc231067791"/>
+      <w:r>
+        <w:rPr>
+          <w:rFonts w:ascii="Times New Roman" w:hAnsi="Times New Roman" w:cs="Times New Roman"/>
+          <w:b/>
           <w:caps/>
           <w:sz w:val="24"/>
           <w:szCs w:val="24"/>
         </w:rPr>
-        <w:t>3.15 Módulo de Relatórios</w:t>
-      </w:r>
-      <w:bookmarkEnd w:id="22"/>
+        <w:lastRenderedPageBreak/>
+        <w:t>4 Envio da Solução</w:t>
+      </w:r>
+      <w:bookmarkEnd w:id="24"/>
     </w:p>
     <w:p>
       <w:pPr>
@@ -9640,249 +9863,10 @@
       <w:r>
         <w:rPr>
           <w:rFonts w:ascii="Times New Roman" w:hAnsi="Times New Roman" w:cs="Times New Roman"/>
-          <w:b/>
-          <w:sz w:val="24"/>
-          <w:szCs w:val="24"/>
-        </w:rPr>
-        <w:t xml:space="preserve">Objetivo e funcionamento. </w:t>
-      </w:r>
-      <w:r>
-        <w:rPr>
-          <w:rFonts w:ascii="Times New Roman" w:hAnsi="Times New Roman" w:cs="Times New Roman"/>
-          <w:sz w:val="24"/>
-          <w:szCs w:val="24"/>
-        </w:rPr>
-        <w:t>Oferecer ao gestor uma visão analítica dos atendimentos por período, com cards de seleção para os sete tipos de relatório.</w:t>
-      </w:r>
-    </w:p>
-    <w:p>
-      <w:pPr>
-        <w:keepNext/>
-        <w:spacing w:before="240" w:after="60" w:line="240" w:lineRule="auto"/>
-        <w:jc w:val="center"/>
-      </w:pPr>
-      <w:r>
-        <w:rPr>
-          <w:rFonts w:ascii="Times New Roman" w:hAnsi="Times New Roman" w:cs="Times New Roman"/>
-          <w:sz w:val="24"/>
-          <w:szCs w:val="24"/>
-        </w:rPr>
-        <w:lastRenderedPageBreak/>
-        <w:t>Figura 15 – Módulo de Relatórios</w:t>
-      </w:r>
-    </w:p>
-    <w:p>
-      <w:pPr>
-        <w:keepNext/>
-        <w:spacing w:after="60" w:line="240" w:lineRule="auto"/>
-        <w:jc w:val="center"/>
-      </w:pPr>
-      <w:r>
-        <w:rPr>
-          <w:noProof/>
-        </w:rPr>
-        <w:drawing>
-          <wp:inline distT="0" distB="0" distL="0" distR="0" wp14:anchorId="79638039" wp14:editId="793B0E0E">
-            <wp:extent cx="5768975" cy="3386791"/>
-            <wp:effectExtent l="0" t="0" r="0" b="0"/>
-            <wp:docPr id="1015" name="Figura 15"/>
-            <wp:cNvGraphicFramePr>
-              <a:graphicFrameLocks xmlns:a="http://schemas.openxmlformats.org/drawingml/2006/main" noChangeAspect="1"/>
-            </wp:cNvGraphicFramePr>
-            <a:graphic xmlns:a="http://schemas.openxmlformats.org/drawingml/2006/main">
-              <a:graphicData uri="http://schemas.openxmlformats.org/drawingml/2006/picture">
-                <pic:pic xmlns:pic="http://schemas.openxmlformats.org/drawingml/2006/picture">
-                  <pic:nvPicPr>
-                    <pic:cNvPr id="1015" name="Figura 15"/>
-                    <pic:cNvPicPr/>
-                  </pic:nvPicPr>
-                  <pic:blipFill>
-                    <a:blip r:embed="rId23"/>
-                    <a:stretch>
-                      <a:fillRect/>
-                    </a:stretch>
-                  </pic:blipFill>
-                  <pic:spPr>
-                    <a:xfrm>
-                      <a:off x="0" y="0"/>
-                      <a:ext cx="5768975" cy="3386791"/>
-                    </a:xfrm>
-                    <a:prstGeom prst="rect">
-                      <a:avLst/>
-                    </a:prstGeom>
-                  </pic:spPr>
-                </pic:pic>
-              </a:graphicData>
-            </a:graphic>
-          </wp:inline>
-        </w:drawing>
-      </w:r>
-    </w:p>
-    <w:p>
-      <w:pPr>
-        <w:spacing w:after="240" w:line="240" w:lineRule="auto"/>
-      </w:pPr>
-      <w:r>
-        <w:rPr>
-          <w:rFonts w:ascii="Times New Roman" w:hAnsi="Times New Roman" w:cs="Times New Roman"/>
-          <w:sz w:val="20"/>
-          <w:szCs w:val="20"/>
-        </w:rPr>
-        <w:t>Fonte: o autor (2026).</w:t>
-      </w:r>
-    </w:p>
-    <w:p>
-      <w:pPr>
-        <w:keepNext/>
-        <w:spacing w:before="360" w:after="360" w:line="360" w:lineRule="auto"/>
-        <w:outlineLvl w:val="1"/>
-      </w:pPr>
-      <w:bookmarkStart w:id="23" w:name="_Toc231067583"/>
-      <w:r>
-        <w:rPr>
-          <w:rFonts w:ascii="Times New Roman" w:hAnsi="Times New Roman" w:cs="Times New Roman"/>
-          <w:caps/>
-          <w:sz w:val="24"/>
-          <w:szCs w:val="24"/>
-        </w:rPr>
-        <w:t>3.16 Visualizador de Relatórios</w:t>
-      </w:r>
-      <w:bookmarkEnd w:id="23"/>
-    </w:p>
-    <w:p>
-      <w:pPr>
-        <w:spacing w:after="0" w:line="360" w:lineRule="auto"/>
-        <w:ind w:firstLine="709"/>
-        <w:jc w:val="both"/>
-      </w:pPr>
-      <w:r>
-        <w:rPr>
-          <w:rFonts w:ascii="Times New Roman" w:hAnsi="Times New Roman" w:cs="Times New Roman"/>
-          <w:b/>
-          <w:sz w:val="24"/>
-          <w:szCs w:val="24"/>
-        </w:rPr>
-        <w:t xml:space="preserve">Objetivo e funcionamento. </w:t>
-      </w:r>
-      <w:r>
-        <w:rPr>
-          <w:rFonts w:ascii="Times New Roman" w:hAnsi="Times New Roman" w:cs="Times New Roman"/>
-          <w:sz w:val="24"/>
-          <w:szCs w:val="24"/>
-        </w:rPr>
-        <w:t>Exibir o resultado de um relatório em formato tabular, com filtros de período e impressão paginada via PrintDocument.</w:t>
-      </w:r>
-    </w:p>
-    <w:p>
-      <w:pPr>
-        <w:keepNext/>
-        <w:spacing w:before="240" w:after="60" w:line="240" w:lineRule="auto"/>
-        <w:jc w:val="center"/>
-      </w:pPr>
-      <w:r>
-        <w:rPr>
-          <w:rFonts w:ascii="Times New Roman" w:hAnsi="Times New Roman" w:cs="Times New Roman"/>
-          <w:sz w:val="24"/>
-          <w:szCs w:val="24"/>
-        </w:rPr>
-        <w:lastRenderedPageBreak/>
-        <w:t>Figura 16 – Visualizador de Relatórios</w:t>
-      </w:r>
-    </w:p>
-    <w:p>
-      <w:pPr>
-        <w:keepNext/>
-        <w:spacing w:after="60" w:line="240" w:lineRule="auto"/>
-        <w:jc w:val="center"/>
-      </w:pPr>
-      <w:r>
-        <w:rPr>
-          <w:noProof/>
-        </w:rPr>
-        <w:drawing>
-          <wp:inline distT="0" distB="0" distL="0" distR="0" wp14:anchorId="699718F5" wp14:editId="64A5622B">
-            <wp:extent cx="5768975" cy="3392807"/>
-            <wp:effectExtent l="0" t="0" r="0" b="0"/>
-            <wp:docPr id="1016" name="Figura 16"/>
-            <wp:cNvGraphicFramePr>
-              <a:graphicFrameLocks xmlns:a="http://schemas.openxmlformats.org/drawingml/2006/main" noChangeAspect="1"/>
-            </wp:cNvGraphicFramePr>
-            <a:graphic xmlns:a="http://schemas.openxmlformats.org/drawingml/2006/main">
-              <a:graphicData uri="http://schemas.openxmlformats.org/drawingml/2006/picture">
-                <pic:pic xmlns:pic="http://schemas.openxmlformats.org/drawingml/2006/picture">
-                  <pic:nvPicPr>
-                    <pic:cNvPr id="1016" name="Figura 16"/>
-                    <pic:cNvPicPr/>
-                  </pic:nvPicPr>
-                  <pic:blipFill>
-                    <a:blip r:embed="rId24"/>
-                    <a:stretch>
-                      <a:fillRect/>
-                    </a:stretch>
-                  </pic:blipFill>
-                  <pic:spPr>
-                    <a:xfrm>
-                      <a:off x="0" y="0"/>
-                      <a:ext cx="5768975" cy="3392807"/>
-                    </a:xfrm>
-                    <a:prstGeom prst="rect">
-                      <a:avLst/>
-                    </a:prstGeom>
-                  </pic:spPr>
-                </pic:pic>
-              </a:graphicData>
-            </a:graphic>
-          </wp:inline>
-        </w:drawing>
-      </w:r>
-    </w:p>
-    <w:p>
-      <w:pPr>
-        <w:spacing w:after="240" w:line="240" w:lineRule="auto"/>
-      </w:pPr>
-      <w:r>
-        <w:rPr>
-          <w:rFonts w:ascii="Times New Roman" w:hAnsi="Times New Roman" w:cs="Times New Roman"/>
-          <w:sz w:val="20"/>
-          <w:szCs w:val="20"/>
-        </w:rPr>
-        <w:t>Fonte: o autor (2026).</w:t>
-      </w:r>
-    </w:p>
-    <w:p>
-      <w:pPr>
-        <w:keepNext/>
-        <w:pageBreakBefore/>
-        <w:spacing w:before="360" w:after="360" w:line="360" w:lineRule="auto"/>
-        <w:outlineLvl w:val="0"/>
-      </w:pPr>
-      <w:bookmarkStart w:id="24" w:name="_Toc231067584"/>
-      <w:r>
-        <w:rPr>
-          <w:rFonts w:ascii="Times New Roman" w:hAnsi="Times New Roman" w:cs="Times New Roman"/>
-          <w:b/>
-          <w:caps/>
-          <w:sz w:val="24"/>
-          <w:szCs w:val="24"/>
-        </w:rPr>
-        <w:lastRenderedPageBreak/>
-        <w:t>4 Envio da Solução</w:t>
-      </w:r>
-      <w:bookmarkEnd w:id="24"/>
-    </w:p>
-    <w:p>
-      <w:pPr>
-        <w:spacing w:after="0" w:line="360" w:lineRule="auto"/>
-        <w:ind w:firstLine="709"/>
-        <w:jc w:val="both"/>
-      </w:pPr>
-      <w:r>
-        <w:rPr>
-          <w:rFonts w:ascii="Times New Roman" w:hAnsi="Times New Roman" w:cs="Times New Roman"/>
-          <w:sz w:val="24"/>
-          <w:szCs w:val="24"/>
-        </w:rPr>
-        <w:t>O código-fonte completo deste projeto, incluindo os scripts SQL de criação do schema, os binários necessários para compilação e este documento, está disponível em repositório público no GitHub, no endereço https://github.com/JVissani/SolucaoClinicaTEA. O repositório está configurado como público e o acesso foi compartilhado com o Prof. Fernando Datorre, pelo e-mail datorre@gmail.com. O projeto está organizado nos diretórios de código-fonte (CT_Negocio e CT_Win), scripts de banco de dados, o relatório final e o arquivo README com instruções de compilação e configuração do ambiente.</w:t>
+          <w:sz w:val="24"/>
+          <w:szCs w:val="24"/>
+        </w:rPr>
+        <w:t>O código-fonte completo deste projeto, incluindo os scripts SQL de criação do schema, os binários necessários para compilação e este documento, está disponível em repositório público no GitHub, no endereço https://github.com/JVissani/SolucaoClinicaTEA. O repositório está configurado como público. O projeto está organizado nos diretórios de código-fonte (CT_Negocio e CT_Win), scripts de banco de dados, o relatório final e o arquivo README com instruções de compilação e configuração do ambiente.</w:t>
       </w:r>
     </w:p>
     <w:p>
@@ -9892,7 +9876,7 @@
         <w:jc w:val="center"/>
         <w:outlineLvl w:val="0"/>
       </w:pPr>
-      <w:bookmarkStart w:id="25" w:name="_Toc231067585"/>
+      <w:bookmarkStart w:id="25" w:name="_Toc231067792"/>
       <w:r>
         <w:rPr>
           <w:rFonts w:ascii="Times New Roman" w:hAnsi="Times New Roman" w:cs="Times New Roman"/>
@@ -10019,7 +10003,7 @@
       </w:r>
     </w:p>
     <w:sectPr>
-      <w:headerReference w:type="default" r:id="rId25"/>
+      <w:headerReference w:type="default" r:id="rId24"/>
       <w:pgSz w:w="11920" w:h="16838"/>
       <w:pgMar w:top="1701" w:right="1134" w:bottom="1701" w:left="1701" w:header="709" w:footer="720" w:gutter="0"/>
       <w:pgNumType w:start="4"/>

</xml_diff>

<commit_message>
docs: folha de rosto - Prof. Fernando Datorre (nome completo)
</commit_message>
<xml_diff>
--- a/SolucaoClinicaTEA/relatorio_final.docx
+++ b/SolucaoClinicaTEA/relatorio_final.docx
@@ -305,7 +305,7 @@
         <w:rPr>
           <w:rFonts w:ascii="Times New Roman" w:hAnsi="Times New Roman" w:cs="Times New Roman"/>
         </w:rPr>
-        <w:t>Trabalho acadêmico apresentado ao Curso de Engenharia de Computação do Centro Universitário de Votuporanga – Unifev, na disciplina Tópicos em Linguagem de Programação I, como requisito de avaliação, sob orientação do Prof. Datorre.</w:t>
+        <w:t>Trabalho acadêmico apresentado ao Curso de Engenharia de Computação do Centro Universitário de Votuporanga – Unifev, na disciplina Tópicos em Linguagem de Programação I, como requisito de avaliação, sob orientação do Prof. Fernando Datorre.</w:t>
       </w:r>
     </w:p>
     <w:p>
@@ -498,7 +498,7 @@
       <w:r>
         <w:fldChar w:fldCharType="separate"/>
       </w:r>
-      <w:hyperlink w:anchor="_Toc231067767" w:history="1">
+      <w:hyperlink w:anchor="_Toc231067930" w:history="1">
         <w:r>
           <w:rPr>
             <w:rStyle w:val="Hyperlink"/>
@@ -528,7 +528,7 @@
             <w:noProof/>
             <w:webHidden/>
           </w:rPr>
-          <w:instrText xml:space="preserve"> PAGEREF _Toc231067767 \h </w:instrText>
+          <w:instrText xml:space="preserve"> PAGEREF _Toc231067930 \h </w:instrText>
         </w:r>
         <w:r>
           <w:rPr>
@@ -573,7 +573,7 @@
           <w:lang w:eastAsia="pt-BR"/>
         </w:rPr>
       </w:pPr>
-      <w:hyperlink w:anchor="_Toc231067768" w:history="1">
+      <w:hyperlink w:anchor="_Toc231067931" w:history="1">
         <w:r>
           <w:rPr>
             <w:rStyle w:val="Hyperlink"/>
@@ -603,7 +603,7 @@
             <w:noProof/>
             <w:webHidden/>
           </w:rPr>
-          <w:instrText xml:space="preserve"> PAGEREF _Toc231067768 \h </w:instrText>
+          <w:instrText xml:space="preserve"> PAGEREF _Toc231067931 \h </w:instrText>
         </w:r>
         <w:r>
           <w:rPr>
@@ -648,7 +648,7 @@
           <w:lang w:eastAsia="pt-BR"/>
         </w:rPr>
       </w:pPr>
-      <w:hyperlink w:anchor="_Toc231067769" w:history="1">
+      <w:hyperlink w:anchor="_Toc231067932" w:history="1">
         <w:r>
           <w:rPr>
             <w:rStyle w:val="Hyperlink"/>
@@ -677,7 +677,7 @@
             <w:noProof/>
             <w:webHidden/>
           </w:rPr>
-          <w:instrText xml:space="preserve"> PAGEREF _Toc231067769 \h </w:instrText>
+          <w:instrText xml:space="preserve"> PAGEREF _Toc231067932 \h </w:instrText>
         </w:r>
         <w:r>
           <w:rPr>
@@ -722,7 +722,7 @@
           <w:lang w:eastAsia="pt-BR"/>
         </w:rPr>
       </w:pPr>
-      <w:hyperlink w:anchor="_Toc231067770" w:history="1">
+      <w:hyperlink w:anchor="_Toc231067933" w:history="1">
         <w:r>
           <w:rPr>
             <w:rStyle w:val="Hyperlink"/>
@@ -751,7 +751,7 @@
             <w:noProof/>
             <w:webHidden/>
           </w:rPr>
-          <w:instrText xml:space="preserve"> PAGEREF _Toc231067770 \h </w:instrText>
+          <w:instrText xml:space="preserve"> PAGEREF _Toc231067933 \h </w:instrText>
         </w:r>
         <w:r>
           <w:rPr>
@@ -796,7 +796,7 @@
           <w:lang w:eastAsia="pt-BR"/>
         </w:rPr>
       </w:pPr>
-      <w:hyperlink w:anchor="_Toc231067771" w:history="1">
+      <w:hyperlink w:anchor="_Toc231067934" w:history="1">
         <w:r>
           <w:rPr>
             <w:rStyle w:val="Hyperlink"/>
@@ -825,7 +825,7 @@
             <w:noProof/>
             <w:webHidden/>
           </w:rPr>
-          <w:instrText xml:space="preserve"> PAGEREF _Toc231067771 \h </w:instrText>
+          <w:instrText xml:space="preserve"> PAGEREF _Toc231067934 \h </w:instrText>
         </w:r>
         <w:r>
           <w:rPr>
@@ -870,7 +870,7 @@
           <w:lang w:eastAsia="pt-BR"/>
         </w:rPr>
       </w:pPr>
-      <w:hyperlink w:anchor="_Toc231067772" w:history="1">
+      <w:hyperlink w:anchor="_Toc231067935" w:history="1">
         <w:r>
           <w:rPr>
             <w:rStyle w:val="Hyperlink"/>
@@ -899,7 +899,7 @@
             <w:noProof/>
             <w:webHidden/>
           </w:rPr>
-          <w:instrText xml:space="preserve"> PAGEREF _Toc231067772 \h </w:instrText>
+          <w:instrText xml:space="preserve"> PAGEREF _Toc231067935 \h </w:instrText>
         </w:r>
         <w:r>
           <w:rPr>
@@ -944,7 +944,7 @@
           <w:lang w:eastAsia="pt-BR"/>
         </w:rPr>
       </w:pPr>
-      <w:hyperlink w:anchor="_Toc231067773" w:history="1">
+      <w:hyperlink w:anchor="_Toc231067936" w:history="1">
         <w:r>
           <w:rPr>
             <w:rStyle w:val="Hyperlink"/>
@@ -973,7 +973,7 @@
             <w:noProof/>
             <w:webHidden/>
           </w:rPr>
-          <w:instrText xml:space="preserve"> PAGEREF _Toc231067773 \h </w:instrText>
+          <w:instrText xml:space="preserve"> PAGEREF _Toc231067936 \h </w:instrText>
         </w:r>
         <w:r>
           <w:rPr>
@@ -1018,7 +1018,7 @@
           <w:lang w:eastAsia="pt-BR"/>
         </w:rPr>
       </w:pPr>
-      <w:hyperlink w:anchor="_Toc231067774" w:history="1">
+      <w:hyperlink w:anchor="_Toc231067937" w:history="1">
         <w:r>
           <w:rPr>
             <w:rStyle w:val="Hyperlink"/>
@@ -1048,7 +1048,7 @@
             <w:noProof/>
             <w:webHidden/>
           </w:rPr>
-          <w:instrText xml:space="preserve"> PAGEREF _Toc231067774 \h </w:instrText>
+          <w:instrText xml:space="preserve"> PAGEREF _Toc231067937 \h </w:instrText>
         </w:r>
         <w:r>
           <w:rPr>
@@ -1093,7 +1093,7 @@
           <w:lang w:eastAsia="pt-BR"/>
         </w:rPr>
       </w:pPr>
-      <w:hyperlink w:anchor="_Toc231067775" w:history="1">
+      <w:hyperlink w:anchor="_Toc231067938" w:history="1">
         <w:r>
           <w:rPr>
             <w:rStyle w:val="Hyperlink"/>
@@ -1122,7 +1122,7 @@
             <w:noProof/>
             <w:webHidden/>
           </w:rPr>
-          <w:instrText xml:space="preserve"> PAGEREF _Toc231067775 \h </w:instrText>
+          <w:instrText xml:space="preserve"> PAGEREF _Toc231067938 \h </w:instrText>
         </w:r>
         <w:r>
           <w:rPr>
@@ -1167,7 +1167,7 @@
           <w:lang w:eastAsia="pt-BR"/>
         </w:rPr>
       </w:pPr>
-      <w:hyperlink w:anchor="_Toc231067776" w:history="1">
+      <w:hyperlink w:anchor="_Toc231067939" w:history="1">
         <w:r>
           <w:rPr>
             <w:rStyle w:val="Hyperlink"/>
@@ -1196,7 +1196,7 @@
             <w:noProof/>
             <w:webHidden/>
           </w:rPr>
-          <w:instrText xml:space="preserve"> PAGEREF _Toc231067776 \h </w:instrText>
+          <w:instrText xml:space="preserve"> PAGEREF _Toc231067939 \h </w:instrText>
         </w:r>
         <w:r>
           <w:rPr>
@@ -1241,7 +1241,7 @@
           <w:lang w:eastAsia="pt-BR"/>
         </w:rPr>
       </w:pPr>
-      <w:hyperlink w:anchor="_Toc231067777" w:history="1">
+      <w:hyperlink w:anchor="_Toc231067940" w:history="1">
         <w:r>
           <w:rPr>
             <w:rStyle w:val="Hyperlink"/>
@@ -1270,7 +1270,7 @@
             <w:noProof/>
             <w:webHidden/>
           </w:rPr>
-          <w:instrText xml:space="preserve"> PAGEREF _Toc231067777 \h </w:instrText>
+          <w:instrText xml:space="preserve"> PAGEREF _Toc231067940 \h </w:instrText>
         </w:r>
         <w:r>
           <w:rPr>
@@ -1315,7 +1315,7 @@
           <w:lang w:eastAsia="pt-BR"/>
         </w:rPr>
       </w:pPr>
-      <w:hyperlink w:anchor="_Toc231067778" w:history="1">
+      <w:hyperlink w:anchor="_Toc231067941" w:history="1">
         <w:r>
           <w:rPr>
             <w:rStyle w:val="Hyperlink"/>
@@ -1344,7 +1344,7 @@
             <w:noProof/>
             <w:webHidden/>
           </w:rPr>
-          <w:instrText xml:space="preserve"> PAGEREF _Toc231067778 \h </w:instrText>
+          <w:instrText xml:space="preserve"> PAGEREF _Toc231067941 \h </w:instrText>
         </w:r>
         <w:r>
           <w:rPr>
@@ -1389,7 +1389,7 @@
           <w:lang w:eastAsia="pt-BR"/>
         </w:rPr>
       </w:pPr>
-      <w:hyperlink w:anchor="_Toc231067779" w:history="1">
+      <w:hyperlink w:anchor="_Toc231067942" w:history="1">
         <w:r>
           <w:rPr>
             <w:rStyle w:val="Hyperlink"/>
@@ -1418,7 +1418,7 @@
             <w:noProof/>
             <w:webHidden/>
           </w:rPr>
-          <w:instrText xml:space="preserve"> PAGEREF _Toc231067779 \h </w:instrText>
+          <w:instrText xml:space="preserve"> PAGEREF _Toc231067942 \h </w:instrText>
         </w:r>
         <w:r>
           <w:rPr>
@@ -1463,7 +1463,7 @@
           <w:lang w:eastAsia="pt-BR"/>
         </w:rPr>
       </w:pPr>
-      <w:hyperlink w:anchor="_Toc231067780" w:history="1">
+      <w:hyperlink w:anchor="_Toc231067943" w:history="1">
         <w:r>
           <w:rPr>
             <w:rStyle w:val="Hyperlink"/>
@@ -1492,7 +1492,7 @@
             <w:noProof/>
             <w:webHidden/>
           </w:rPr>
-          <w:instrText xml:space="preserve"> PAGEREF _Toc231067780 \h </w:instrText>
+          <w:instrText xml:space="preserve"> PAGEREF _Toc231067943 \h </w:instrText>
         </w:r>
         <w:r>
           <w:rPr>
@@ -1537,7 +1537,7 @@
           <w:lang w:eastAsia="pt-BR"/>
         </w:rPr>
       </w:pPr>
-      <w:hyperlink w:anchor="_Toc231067781" w:history="1">
+      <w:hyperlink w:anchor="_Toc231067944" w:history="1">
         <w:r>
           <w:rPr>
             <w:rStyle w:val="Hyperlink"/>
@@ -1566,7 +1566,7 @@
             <w:noProof/>
             <w:webHidden/>
           </w:rPr>
-          <w:instrText xml:space="preserve"> PAGEREF _Toc231067781 \h </w:instrText>
+          <w:instrText xml:space="preserve"> PAGEREF _Toc231067944 \h </w:instrText>
         </w:r>
         <w:r>
           <w:rPr>
@@ -1611,7 +1611,7 @@
           <w:lang w:eastAsia="pt-BR"/>
         </w:rPr>
       </w:pPr>
-      <w:hyperlink w:anchor="_Toc231067782" w:history="1">
+      <w:hyperlink w:anchor="_Toc231067945" w:history="1">
         <w:r>
           <w:rPr>
             <w:rStyle w:val="Hyperlink"/>
@@ -1640,7 +1640,7 @@
             <w:noProof/>
             <w:webHidden/>
           </w:rPr>
-          <w:instrText xml:space="preserve"> PAGEREF _Toc231067782 \h </w:instrText>
+          <w:instrText xml:space="preserve"> PAGEREF _Toc231067945 \h </w:instrText>
         </w:r>
         <w:r>
           <w:rPr>
@@ -1685,7 +1685,7 @@
           <w:lang w:eastAsia="pt-BR"/>
         </w:rPr>
       </w:pPr>
-      <w:hyperlink w:anchor="_Toc231067783" w:history="1">
+      <w:hyperlink w:anchor="_Toc231067946" w:history="1">
         <w:r>
           <w:rPr>
             <w:rStyle w:val="Hyperlink"/>
@@ -1714,7 +1714,7 @@
             <w:noProof/>
             <w:webHidden/>
           </w:rPr>
-          <w:instrText xml:space="preserve"> PAGEREF _Toc231067783 \h </w:instrText>
+          <w:instrText xml:space="preserve"> PAGEREF _Toc231067946 \h </w:instrText>
         </w:r>
         <w:r>
           <w:rPr>
@@ -1759,7 +1759,7 @@
           <w:lang w:eastAsia="pt-BR"/>
         </w:rPr>
       </w:pPr>
-      <w:hyperlink w:anchor="_Toc231067784" w:history="1">
+      <w:hyperlink w:anchor="_Toc231067947" w:history="1">
         <w:r>
           <w:rPr>
             <w:rStyle w:val="Hyperlink"/>
@@ -1788,7 +1788,7 @@
             <w:noProof/>
             <w:webHidden/>
           </w:rPr>
-          <w:instrText xml:space="preserve"> PAGEREF _Toc231067784 \h </w:instrText>
+          <w:instrText xml:space="preserve"> PAGEREF _Toc231067947 \h </w:instrText>
         </w:r>
         <w:r>
           <w:rPr>
@@ -1833,7 +1833,7 @@
           <w:lang w:eastAsia="pt-BR"/>
         </w:rPr>
       </w:pPr>
-      <w:hyperlink w:anchor="_Toc231067785" w:history="1">
+      <w:hyperlink w:anchor="_Toc231067948" w:history="1">
         <w:r>
           <w:rPr>
             <w:rStyle w:val="Hyperlink"/>
@@ -1862,7 +1862,7 @@
             <w:noProof/>
             <w:webHidden/>
           </w:rPr>
-          <w:instrText xml:space="preserve"> PAGEREF _Toc231067785 \h </w:instrText>
+          <w:instrText xml:space="preserve"> PAGEREF _Toc231067948 \h </w:instrText>
         </w:r>
         <w:r>
           <w:rPr>
@@ -1907,7 +1907,7 @@
           <w:lang w:eastAsia="pt-BR"/>
         </w:rPr>
       </w:pPr>
-      <w:hyperlink w:anchor="_Toc231067786" w:history="1">
+      <w:hyperlink w:anchor="_Toc231067949" w:history="1">
         <w:r>
           <w:rPr>
             <w:rStyle w:val="Hyperlink"/>
@@ -1936,7 +1936,7 @@
             <w:noProof/>
             <w:webHidden/>
           </w:rPr>
-          <w:instrText xml:space="preserve"> PAGEREF _Toc231067786 \h </w:instrText>
+          <w:instrText xml:space="preserve"> PAGEREF _Toc231067949 \h </w:instrText>
         </w:r>
         <w:r>
           <w:rPr>
@@ -1981,7 +1981,7 @@
           <w:lang w:eastAsia="pt-BR"/>
         </w:rPr>
       </w:pPr>
-      <w:hyperlink w:anchor="_Toc231067787" w:history="1">
+      <w:hyperlink w:anchor="_Toc231067950" w:history="1">
         <w:r>
           <w:rPr>
             <w:rStyle w:val="Hyperlink"/>
@@ -2010,7 +2010,7 @@
             <w:noProof/>
             <w:webHidden/>
           </w:rPr>
-          <w:instrText xml:space="preserve"> PAGEREF _Toc231067787 \h </w:instrText>
+          <w:instrText xml:space="preserve"> PAGEREF _Toc231067950 \h </w:instrText>
         </w:r>
         <w:r>
           <w:rPr>
@@ -2055,7 +2055,7 @@
           <w:lang w:eastAsia="pt-BR"/>
         </w:rPr>
       </w:pPr>
-      <w:hyperlink w:anchor="_Toc231067788" w:history="1">
+      <w:hyperlink w:anchor="_Toc231067951" w:history="1">
         <w:r>
           <w:rPr>
             <w:rStyle w:val="Hyperlink"/>
@@ -2084,7 +2084,7 @@
             <w:noProof/>
             <w:webHidden/>
           </w:rPr>
-          <w:instrText xml:space="preserve"> PAGEREF _Toc231067788 \h </w:instrText>
+          <w:instrText xml:space="preserve"> PAGEREF _Toc231067951 \h </w:instrText>
         </w:r>
         <w:r>
           <w:rPr>
@@ -2129,7 +2129,7 @@
           <w:lang w:eastAsia="pt-BR"/>
         </w:rPr>
       </w:pPr>
-      <w:hyperlink w:anchor="_Toc231067789" w:history="1">
+      <w:hyperlink w:anchor="_Toc231067952" w:history="1">
         <w:r>
           <w:rPr>
             <w:rStyle w:val="Hyperlink"/>
@@ -2158,7 +2158,7 @@
             <w:noProof/>
             <w:webHidden/>
           </w:rPr>
-          <w:instrText xml:space="preserve"> PAGEREF _Toc231067789 \h </w:instrText>
+          <w:instrText xml:space="preserve"> PAGEREF _Toc231067952 \h </w:instrText>
         </w:r>
         <w:r>
           <w:rPr>
@@ -2203,7 +2203,7 @@
           <w:lang w:eastAsia="pt-BR"/>
         </w:rPr>
       </w:pPr>
-      <w:hyperlink w:anchor="_Toc231067790" w:history="1">
+      <w:hyperlink w:anchor="_Toc231067953" w:history="1">
         <w:r>
           <w:rPr>
             <w:rStyle w:val="Hyperlink"/>
@@ -2232,7 +2232,7 @@
             <w:noProof/>
             <w:webHidden/>
           </w:rPr>
-          <w:instrText xml:space="preserve"> PAGEREF _Toc231067790 \h </w:instrText>
+          <w:instrText xml:space="preserve"> PAGEREF _Toc231067953 \h </w:instrText>
         </w:r>
         <w:r>
           <w:rPr>
@@ -2277,7 +2277,7 @@
           <w:lang w:eastAsia="pt-BR"/>
         </w:rPr>
       </w:pPr>
-      <w:hyperlink w:anchor="_Toc231067791" w:history="1">
+      <w:hyperlink w:anchor="_Toc231067954" w:history="1">
         <w:r>
           <w:rPr>
             <w:rStyle w:val="Hyperlink"/>
@@ -2307,7 +2307,7 @@
             <w:noProof/>
             <w:webHidden/>
           </w:rPr>
-          <w:instrText xml:space="preserve"> PAGEREF _Toc231067791 \h </w:instrText>
+          <w:instrText xml:space="preserve"> PAGEREF _Toc231067954 \h </w:instrText>
         </w:r>
         <w:r>
           <w:rPr>
@@ -2352,7 +2352,7 @@
           <w:lang w:eastAsia="pt-BR"/>
         </w:rPr>
       </w:pPr>
-      <w:hyperlink w:anchor="_Toc231067792" w:history="1">
+      <w:hyperlink w:anchor="_Toc231067955" w:history="1">
         <w:r>
           <w:rPr>
             <w:rStyle w:val="Hyperlink"/>
@@ -2382,7 +2382,7 @@
             <w:noProof/>
             <w:webHidden/>
           </w:rPr>
-          <w:instrText xml:space="preserve"> PAGEREF _Toc231067792 \h </w:instrText>
+          <w:instrText xml:space="preserve"> PAGEREF _Toc231067955 \h </w:instrText>
         </w:r>
         <w:r>
           <w:rPr>
@@ -2434,7 +2434,7 @@
         <w:spacing w:before="360" w:after="360" w:line="360" w:lineRule="auto"/>
         <w:outlineLvl w:val="0"/>
       </w:pPr>
-      <w:bookmarkStart w:id="0" w:name="_Toc231067767"/>
+      <w:bookmarkStart w:id="0" w:name="_Toc231067930"/>
       <w:r>
         <w:rPr>
           <w:rFonts w:ascii="Times New Roman" w:hAnsi="Times New Roman" w:cs="Times New Roman"/>
@@ -2532,7 +2532,7 @@
         <w:spacing w:before="360" w:after="360" w:line="360" w:lineRule="auto"/>
         <w:outlineLvl w:val="0"/>
       </w:pPr>
-      <w:bookmarkStart w:id="1" w:name="_Toc231067768"/>
+      <w:bookmarkStart w:id="1" w:name="_Toc231067931"/>
       <w:r>
         <w:rPr>
           <w:rFonts w:ascii="Times New Roman" w:hAnsi="Times New Roman" w:cs="Times New Roman"/>
@@ -2552,7 +2552,7 @@
         <w:spacing w:before="360" w:after="360" w:line="360" w:lineRule="auto"/>
         <w:outlineLvl w:val="1"/>
       </w:pPr>
-      <w:bookmarkStart w:id="2" w:name="_Toc231067769"/>
+      <w:bookmarkStart w:id="2" w:name="_Toc231067932"/>
       <w:r>
         <w:rPr>
           <w:rFonts w:ascii="Times New Roman" w:hAnsi="Times New Roman" w:cs="Times New Roman"/>
@@ -3692,7 +3692,7 @@
         <w:spacing w:before="360" w:after="360" w:line="360" w:lineRule="auto"/>
         <w:outlineLvl w:val="1"/>
       </w:pPr>
-      <w:bookmarkStart w:id="3" w:name="_Toc231067770"/>
+      <w:bookmarkStart w:id="3" w:name="_Toc231067933"/>
       <w:r>
         <w:rPr>
           <w:rFonts w:ascii="Times New Roman" w:hAnsi="Times New Roman" w:cs="Times New Roman"/>
@@ -3824,7 +3824,7 @@
         <w:spacing w:before="360" w:after="360" w:line="360" w:lineRule="auto"/>
         <w:outlineLvl w:val="1"/>
       </w:pPr>
-      <w:bookmarkStart w:id="4" w:name="_Toc231067771"/>
+      <w:bookmarkStart w:id="4" w:name="_Toc231067934"/>
       <w:r>
         <w:rPr>
           <w:rFonts w:ascii="Times New Roman" w:hAnsi="Times New Roman" w:cs="Times New Roman"/>
@@ -7582,7 +7582,7 @@
         <w:spacing w:before="360" w:after="360" w:line="360" w:lineRule="auto"/>
         <w:outlineLvl w:val="1"/>
       </w:pPr>
-      <w:bookmarkStart w:id="5" w:name="_Toc231067772"/>
+      <w:bookmarkStart w:id="5" w:name="_Toc231067935"/>
       <w:r>
         <w:rPr>
           <w:rFonts w:ascii="Times New Roman" w:hAnsi="Times New Roman" w:cs="Times New Roman"/>
@@ -7753,7 +7753,7 @@
         <w:spacing w:before="360" w:after="360" w:line="360" w:lineRule="auto"/>
         <w:outlineLvl w:val="1"/>
       </w:pPr>
-      <w:bookmarkStart w:id="6" w:name="_Toc231067773"/>
+      <w:bookmarkStart w:id="6" w:name="_Toc231067936"/>
       <w:r>
         <w:rPr>
           <w:rFonts w:ascii="Times New Roman" w:hAnsi="Times New Roman" w:cs="Times New Roman"/>
@@ -7916,7 +7916,7 @@
         <w:spacing w:before="360" w:after="360" w:line="360" w:lineRule="auto"/>
         <w:outlineLvl w:val="0"/>
       </w:pPr>
-      <w:bookmarkStart w:id="7" w:name="_Toc231067774"/>
+      <w:bookmarkStart w:id="7" w:name="_Toc231067937"/>
       <w:r>
         <w:rPr>
           <w:rFonts w:ascii="Times New Roman" w:hAnsi="Times New Roman" w:cs="Times New Roman"/>
@@ -7951,7 +7951,7 @@
         <w:spacing w:before="360" w:after="360" w:line="360" w:lineRule="auto"/>
         <w:outlineLvl w:val="1"/>
       </w:pPr>
-      <w:bookmarkStart w:id="8" w:name="_Toc231067775"/>
+      <w:bookmarkStart w:id="8" w:name="_Toc231067938"/>
       <w:r>
         <w:rPr>
           <w:rFonts w:ascii="Times New Roman" w:hAnsi="Times New Roman" w:cs="Times New Roman"/>
@@ -8069,7 +8069,7 @@
         <w:spacing w:before="360" w:after="360" w:line="360" w:lineRule="auto"/>
         <w:outlineLvl w:val="1"/>
       </w:pPr>
-      <w:bookmarkStart w:id="9" w:name="_Toc231067776"/>
+      <w:bookmarkStart w:id="9" w:name="_Toc231067939"/>
       <w:r>
         <w:rPr>
           <w:rFonts w:ascii="Times New Roman" w:hAnsi="Times New Roman" w:cs="Times New Roman"/>
@@ -8187,7 +8187,7 @@
         <w:spacing w:before="360" w:after="360" w:line="360" w:lineRule="auto"/>
         <w:outlineLvl w:val="1"/>
       </w:pPr>
-      <w:bookmarkStart w:id="10" w:name="_Toc231067777"/>
+      <w:bookmarkStart w:id="10" w:name="_Toc231067940"/>
       <w:r>
         <w:rPr>
           <w:rFonts w:ascii="Times New Roman" w:hAnsi="Times New Roman" w:cs="Times New Roman"/>
@@ -8305,7 +8305,7 @@
         <w:spacing w:before="360" w:after="360" w:line="360" w:lineRule="auto"/>
         <w:outlineLvl w:val="1"/>
       </w:pPr>
-      <w:bookmarkStart w:id="11" w:name="_Toc231067778"/>
+      <w:bookmarkStart w:id="11" w:name="_Toc231067941"/>
       <w:r>
         <w:rPr>
           <w:rFonts w:ascii="Times New Roman" w:hAnsi="Times New Roman" w:cs="Times New Roman"/>
@@ -8423,7 +8423,7 @@
         <w:spacing w:before="360" w:after="360" w:line="360" w:lineRule="auto"/>
         <w:outlineLvl w:val="1"/>
       </w:pPr>
-      <w:bookmarkStart w:id="12" w:name="_Toc231067779"/>
+      <w:bookmarkStart w:id="12" w:name="_Toc231067942"/>
       <w:r>
         <w:rPr>
           <w:rFonts w:ascii="Times New Roman" w:hAnsi="Times New Roman" w:cs="Times New Roman"/>
@@ -8541,7 +8541,7 @@
         <w:spacing w:before="360" w:after="360" w:line="360" w:lineRule="auto"/>
         <w:outlineLvl w:val="1"/>
       </w:pPr>
-      <w:bookmarkStart w:id="13" w:name="_Toc231067780"/>
+      <w:bookmarkStart w:id="13" w:name="_Toc231067943"/>
       <w:r>
         <w:rPr>
           <w:rFonts w:ascii="Times New Roman" w:hAnsi="Times New Roman" w:cs="Times New Roman"/>
@@ -8659,7 +8659,7 @@
         <w:spacing w:before="360" w:after="360" w:line="360" w:lineRule="auto"/>
         <w:outlineLvl w:val="1"/>
       </w:pPr>
-      <w:bookmarkStart w:id="14" w:name="_Toc231067781"/>
+      <w:bookmarkStart w:id="14" w:name="_Toc231067944"/>
       <w:r>
         <w:rPr>
           <w:rFonts w:ascii="Times New Roman" w:hAnsi="Times New Roman" w:cs="Times New Roman"/>
@@ -8777,7 +8777,7 @@
         <w:spacing w:before="360" w:after="360" w:line="360" w:lineRule="auto"/>
         <w:outlineLvl w:val="1"/>
       </w:pPr>
-      <w:bookmarkStart w:id="15" w:name="_Toc231067782"/>
+      <w:bookmarkStart w:id="15" w:name="_Toc231067945"/>
       <w:r>
         <w:rPr>
           <w:rFonts w:ascii="Times New Roman" w:hAnsi="Times New Roman" w:cs="Times New Roman"/>
@@ -8895,7 +8895,7 @@
         <w:spacing w:before="360" w:after="360" w:line="360" w:lineRule="auto"/>
         <w:outlineLvl w:val="1"/>
       </w:pPr>
-      <w:bookmarkStart w:id="16" w:name="_Toc231067783"/>
+      <w:bookmarkStart w:id="16" w:name="_Toc231067946"/>
       <w:r>
         <w:rPr>
           <w:rFonts w:ascii="Times New Roman" w:hAnsi="Times New Roman" w:cs="Times New Roman"/>
@@ -9013,7 +9013,7 @@
         <w:spacing w:before="360" w:after="360" w:line="360" w:lineRule="auto"/>
         <w:outlineLvl w:val="1"/>
       </w:pPr>
-      <w:bookmarkStart w:id="17" w:name="_Toc231067784"/>
+      <w:bookmarkStart w:id="17" w:name="_Toc231067947"/>
       <w:r>
         <w:rPr>
           <w:rFonts w:ascii="Times New Roman" w:hAnsi="Times New Roman" w:cs="Times New Roman"/>
@@ -9131,7 +9131,7 @@
         <w:spacing w:before="360" w:after="360" w:line="360" w:lineRule="auto"/>
         <w:outlineLvl w:val="1"/>
       </w:pPr>
-      <w:bookmarkStart w:id="18" w:name="_Toc231067785"/>
+      <w:bookmarkStart w:id="18" w:name="_Toc231067948"/>
       <w:r>
         <w:rPr>
           <w:rFonts w:ascii="Times New Roman" w:hAnsi="Times New Roman" w:cs="Times New Roman"/>
@@ -9249,7 +9249,7 @@
         <w:spacing w:before="360" w:after="360" w:line="360" w:lineRule="auto"/>
         <w:outlineLvl w:val="1"/>
       </w:pPr>
-      <w:bookmarkStart w:id="19" w:name="_Toc231067786"/>
+      <w:bookmarkStart w:id="19" w:name="_Toc231067949"/>
       <w:r>
         <w:rPr>
           <w:rFonts w:ascii="Times New Roman" w:hAnsi="Times New Roman" w:cs="Times New Roman"/>
@@ -9367,7 +9367,7 @@
         <w:spacing w:before="360" w:after="360" w:line="360" w:lineRule="auto"/>
         <w:outlineLvl w:val="1"/>
       </w:pPr>
-      <w:bookmarkStart w:id="20" w:name="_Toc231067787"/>
+      <w:bookmarkStart w:id="20" w:name="_Toc231067950"/>
       <w:r>
         <w:rPr>
           <w:rFonts w:ascii="Times New Roman" w:hAnsi="Times New Roman" w:cs="Times New Roman"/>
@@ -9485,7 +9485,7 @@
         <w:spacing w:before="360" w:after="360" w:line="360" w:lineRule="auto"/>
         <w:outlineLvl w:val="1"/>
       </w:pPr>
-      <w:bookmarkStart w:id="21" w:name="_Toc231067788"/>
+      <w:bookmarkStart w:id="21" w:name="_Toc231067951"/>
       <w:r>
         <w:rPr>
           <w:rFonts w:ascii="Times New Roman" w:hAnsi="Times New Roman" w:cs="Times New Roman"/>
@@ -9603,7 +9603,7 @@
         <w:spacing w:before="360" w:after="360" w:line="360" w:lineRule="auto"/>
         <w:outlineLvl w:val="1"/>
       </w:pPr>
-      <w:bookmarkStart w:id="22" w:name="_Toc231067789"/>
+      <w:bookmarkStart w:id="22" w:name="_Toc231067952"/>
       <w:r>
         <w:rPr>
           <w:rFonts w:ascii="Times New Roman" w:hAnsi="Times New Roman" w:cs="Times New Roman"/>
@@ -9721,7 +9721,7 @@
         <w:spacing w:before="360" w:after="360" w:line="360" w:lineRule="auto"/>
         <w:outlineLvl w:val="1"/>
       </w:pPr>
-      <w:bookmarkStart w:id="23" w:name="_Toc231067790"/>
+      <w:bookmarkStart w:id="23" w:name="_Toc231067953"/>
       <w:r>
         <w:rPr>
           <w:rFonts w:ascii="Times New Roman" w:hAnsi="Times New Roman" w:cs="Times New Roman"/>
@@ -9840,7 +9840,7 @@
         <w:spacing w:before="360" w:after="360" w:line="360" w:lineRule="auto"/>
         <w:outlineLvl w:val="0"/>
       </w:pPr>
-      <w:bookmarkStart w:id="24" w:name="_Toc231067791"/>
+      <w:bookmarkStart w:id="24" w:name="_Toc231067954"/>
       <w:r>
         <w:rPr>
           <w:rFonts w:ascii="Times New Roman" w:hAnsi="Times New Roman" w:cs="Times New Roman"/>
@@ -9876,7 +9876,7 @@
         <w:jc w:val="center"/>
         <w:outlineLvl w:val="0"/>
       </w:pPr>
-      <w:bookmarkStart w:id="25" w:name="_Toc231067792"/>
+      <w:bookmarkStart w:id="25" w:name="_Toc231067955"/>
       <w:r>
         <w:rPr>
           <w:rFonts w:ascii="Times New Roman" w:hAnsi="Times New Roman" w:cs="Times New Roman"/>

</xml_diff>